<commit_message>
docs: polish Step120 experiment report typography and tables
</commit_message>
<xml_diff>
--- a/汇报材料/Step120物流知识能力诊断与优化实验阶段报告_20260907.docx
+++ b/汇报材料/Step120物流知识能力诊断与优化实验阶段报告_20260907.docx
@@ -19,6 +19,9 @@
       </w:r>
     </w:p>
     <w:p>
+      <w:pPr>
+        <w:jc w:val="both"/>
+      </w:pPr>
       <w:r>
         <w:t>Step120 已完成既有 GRPO 训练，但在物流知识问答上与原生开源模型仍处于相近水平。我们围绕知识储备、知识吸收和问答利用开展了分层探测，并完成评测题语料 CPT 及原始模型对照。现有证据支持知识利用不足是重要问题，但不能排除局部知识范围和概念掌握不完整。</w:t>
       </w:r>
@@ -28,15 +31,24 @@
         <w:pStyle w:val="Heading1"/>
       </w:pPr>
       <w:r>
+        <w:rPr>
+          <w:rFonts w:eastAsia="Microsoft YaHei"/>
+        </w:rPr>
         <w:t>一 背景与问题</w:t>
       </w:r>
     </w:p>
     <w:p>
+      <w:pPr>
+        <w:jc w:val="both"/>
+      </w:pPr>
       <w:r>
         <w:t>本报告的 Step120 指 2026年8月25日开源数据续训后的模型，实验标识为 llin-step120-opensource-20260825-02。按训练记录，该模型先接受100步垂域轨迹 GRPO，再完成20步开源数据更新；此前训练未专门引入本轮物流书籍知识。[1]</w:t>
       </w:r>
     </w:p>
     <w:p>
+      <w:pPr>
+        <w:jc w:val="both"/>
+      </w:pPr>
       <w:r>
         <w:t>为检查垂域 Agent 训练是否同时带来物流知识收益，我们比较同机、同推理栈的原生 Qwen3.6-27B 与 Step120。结果均在80多分，差距不到半个百分点。[2]</w:t>
       </w:r>
@@ -49,10 +61,10 @@
         <w:tblLook w:firstColumn="1" w:firstRow="1" w:lastColumn="0" w:lastRow="0" w:noHBand="0" w:noVBand="1" w:val="04A0"/>
       </w:tblPr>
       <w:tblGrid>
-        <w:gridCol w:w="3685"/>
-        <w:gridCol w:w="1871"/>
-        <w:gridCol w:w="1871"/>
-        <w:gridCol w:w="2098"/>
+        <w:gridCol w:w="3572"/>
+        <w:gridCol w:w="1928"/>
+        <w:gridCol w:w="1928"/>
+        <w:gridCol w:w="1984"/>
       </w:tblGrid>
       <w:tr>
         <w:trPr>
@@ -61,7 +73,7 @@
         </w:trPr>
         <w:tc>
           <w:tcPr>
-            <w:tcW w:type="dxa" w:w="3685"/>
+            <w:tcW w:type="dxa" w:w="3572"/>
             <w:vAlign w:val="center"/>
             <w:tcBorders>
               <w:top w:val="single" w:sz="4" w:color="D9D9D9"/>
@@ -69,23 +81,26 @@
               <w:bottom w:val="single" w:sz="4" w:color="D9D9D9"/>
               <w:right w:val="single" w:sz="4" w:color="D9D9D9"/>
             </w:tcBorders>
+            <w:shd w:fill="243E56"/>
             <w:tcMar>
-              <w:top w:w="90" w:type="dxa"/>
-              <w:left w:w="90" w:type="dxa"/>
-              <w:bottom w:w="90" w:type="dxa"/>
-              <w:right w:w="90" w:type="dxa"/>
+              <w:top w:w="135" w:type="dxa"/>
+              <w:bottom w:w="135" w:type="dxa"/>
+              <w:left w:w="125" w:type="dxa"/>
+              <w:right w:w="125" w:type="dxa"/>
             </w:tcMar>
-            <w:shd w:fill="DCE6EF"/>
           </w:tcPr>
           <w:p>
             <w:pPr>
-              <w:spacing w:after="0" w:line="269" w:lineRule="auto"/>
+              <w:keepNext/>
+              <w:spacing w:after="0" w:line="280" w:lineRule="exact"/>
               <w:jc w:val="left"/>
             </w:pPr>
             <w:r>
               <w:rPr>
+                <w:rFonts w:ascii="Arial" w:hAnsi="Arial" w:eastAsia="Microsoft YaHei"/>
                 <w:b/>
-                <w:sz w:val="20"/>
+                <w:color w:val="FFFFFF"/>
+                <w:sz w:val="21"/>
               </w:rPr>
               <w:t>评测范围</w:t>
             </w:r>
@@ -93,7 +108,7 @@
         </w:tc>
         <w:tc>
           <w:tcPr>
-            <w:tcW w:type="dxa" w:w="1871"/>
+            <w:tcW w:type="dxa" w:w="1928"/>
             <w:vAlign w:val="center"/>
             <w:tcBorders>
               <w:top w:val="single" w:sz="4" w:color="D9D9D9"/>
@@ -101,23 +116,26 @@
               <w:bottom w:val="single" w:sz="4" w:color="D9D9D9"/>
               <w:right w:val="single" w:sz="4" w:color="D9D9D9"/>
             </w:tcBorders>
+            <w:shd w:fill="243E56"/>
             <w:tcMar>
-              <w:top w:w="90" w:type="dxa"/>
-              <w:left w:w="90" w:type="dxa"/>
-              <w:bottom w:w="90" w:type="dxa"/>
-              <w:right w:w="90" w:type="dxa"/>
+              <w:top w:w="135" w:type="dxa"/>
+              <w:bottom w:w="135" w:type="dxa"/>
+              <w:left w:w="125" w:type="dxa"/>
+              <w:right w:w="125" w:type="dxa"/>
             </w:tcMar>
-            <w:shd w:fill="DCE6EF"/>
           </w:tcPr>
           <w:p>
             <w:pPr>
-              <w:spacing w:after="0" w:line="269" w:lineRule="auto"/>
+              <w:keepNext/>
+              <w:spacing w:after="0" w:line="280" w:lineRule="exact"/>
               <w:jc w:val="center"/>
             </w:pPr>
             <w:r>
               <w:rPr>
+                <w:rFonts w:ascii="Arial" w:hAnsi="Arial" w:eastAsia="Microsoft YaHei"/>
                 <w:b/>
-                <w:sz w:val="20"/>
+                <w:color w:val="FFFFFF"/>
+                <w:sz w:val="21"/>
               </w:rPr>
               <w:t>原生模型</w:t>
             </w:r>
@@ -125,7 +143,7 @@
         </w:tc>
         <w:tc>
           <w:tcPr>
-            <w:tcW w:type="dxa" w:w="1871"/>
+            <w:tcW w:type="dxa" w:w="1928"/>
             <w:vAlign w:val="center"/>
             <w:tcBorders>
               <w:top w:val="single" w:sz="4" w:color="D9D9D9"/>
@@ -133,23 +151,26 @@
               <w:bottom w:val="single" w:sz="4" w:color="D9D9D9"/>
               <w:right w:val="single" w:sz="4" w:color="D9D9D9"/>
             </w:tcBorders>
+            <w:shd w:fill="243E56"/>
             <w:tcMar>
-              <w:top w:w="90" w:type="dxa"/>
-              <w:left w:w="90" w:type="dxa"/>
-              <w:bottom w:w="90" w:type="dxa"/>
-              <w:right w:w="90" w:type="dxa"/>
+              <w:top w:w="135" w:type="dxa"/>
+              <w:bottom w:w="135" w:type="dxa"/>
+              <w:left w:w="125" w:type="dxa"/>
+              <w:right w:w="125" w:type="dxa"/>
             </w:tcMar>
-            <w:shd w:fill="DCE6EF"/>
           </w:tcPr>
           <w:p>
             <w:pPr>
-              <w:spacing w:after="0" w:line="269" w:lineRule="auto"/>
+              <w:keepNext/>
+              <w:spacing w:after="0" w:line="280" w:lineRule="exact"/>
               <w:jc w:val="center"/>
             </w:pPr>
             <w:r>
               <w:rPr>
+                <w:rFonts w:ascii="Arial" w:hAnsi="Arial" w:eastAsia="Microsoft YaHei"/>
                 <w:b/>
-                <w:sz w:val="20"/>
+                <w:color w:val="FFFFFF"/>
+                <w:sz w:val="21"/>
               </w:rPr>
               <w:t>Step120</w:t>
             </w:r>
@@ -157,7 +178,7 @@
         </w:tc>
         <w:tc>
           <w:tcPr>
-            <w:tcW w:type="dxa" w:w="2098"/>
+            <w:tcW w:type="dxa" w:w="1984"/>
             <w:vAlign w:val="center"/>
             <w:tcBorders>
               <w:top w:val="single" w:sz="4" w:color="D9D9D9"/>
@@ -165,23 +186,26 @@
               <w:bottom w:val="single" w:sz="4" w:color="D9D9D9"/>
               <w:right w:val="single" w:sz="4" w:color="D9D9D9"/>
             </w:tcBorders>
+            <w:shd w:fill="243E56"/>
             <w:tcMar>
-              <w:top w:w="90" w:type="dxa"/>
-              <w:left w:w="90" w:type="dxa"/>
-              <w:bottom w:w="90" w:type="dxa"/>
-              <w:right w:w="90" w:type="dxa"/>
+              <w:top w:w="135" w:type="dxa"/>
+              <w:bottom w:w="135" w:type="dxa"/>
+              <w:left w:w="125" w:type="dxa"/>
+              <w:right w:w="125" w:type="dxa"/>
             </w:tcMar>
-            <w:shd w:fill="DCE6EF"/>
           </w:tcPr>
           <w:p>
             <w:pPr>
-              <w:spacing w:after="0" w:line="269" w:lineRule="auto"/>
+              <w:keepNext/>
+              <w:spacing w:after="0" w:line="280" w:lineRule="exact"/>
               <w:jc w:val="center"/>
             </w:pPr>
             <w:r>
               <w:rPr>
+                <w:rFonts w:ascii="Arial" w:hAnsi="Arial" w:eastAsia="Microsoft YaHei"/>
                 <w:b/>
-                <w:sz w:val="20"/>
+                <w:color w:val="FFFFFF"/>
+                <w:sz w:val="21"/>
               </w:rPr>
               <w:t>变化</w:t>
             </w:r>
@@ -194,7 +218,7 @@
         </w:trPr>
         <w:tc>
           <w:tcPr>
-            <w:tcW w:type="dxa" w:w="3685"/>
+            <w:tcW w:type="dxa" w:w="3572"/>
             <w:vAlign w:val="center"/>
             <w:tcBorders>
               <w:top w:val="single" w:sz="4" w:color="D9D9D9"/>
@@ -202,22 +226,26 @@
               <w:bottom w:val="single" w:sz="4" w:color="D9D9D9"/>
               <w:right w:val="single" w:sz="4" w:color="D9D9D9"/>
             </w:tcBorders>
+            <w:shd w:fill="F0F4F7"/>
             <w:tcMar>
-              <w:top w:w="90" w:type="dxa"/>
-              <w:left w:w="90" w:type="dxa"/>
-              <w:bottom w:w="90" w:type="dxa"/>
-              <w:right w:w="90" w:type="dxa"/>
+              <w:top w:w="135" w:type="dxa"/>
+              <w:bottom w:w="135" w:type="dxa"/>
+              <w:left w:w="125" w:type="dxa"/>
+              <w:right w:w="125" w:type="dxa"/>
             </w:tcMar>
           </w:tcPr>
           <w:p>
             <w:pPr>
-              <w:spacing w:after="0" w:line="269" w:lineRule="auto"/>
+              <w:keepNext/>
+              <w:spacing w:after="0" w:line="280" w:lineRule="exact"/>
               <w:jc w:val="left"/>
             </w:pPr>
             <w:r>
               <w:rPr>
+                <w:rFonts w:ascii="Arial" w:hAnsi="Arial" w:eastAsia="Microsoft YaHei"/>
                 <w:b w:val="0"/>
-                <w:sz w:val="20"/>
+                <w:color w:val="202020"/>
+                <w:sz w:val="21"/>
               </w:rPr>
               <w:t>LogistikaBench  1446题</w:t>
             </w:r>
@@ -225,7 +253,7 @@
         </w:tc>
         <w:tc>
           <w:tcPr>
-            <w:tcW w:type="dxa" w:w="1871"/>
+            <w:tcW w:type="dxa" w:w="1928"/>
             <w:vAlign w:val="center"/>
             <w:tcBorders>
               <w:top w:val="single" w:sz="4" w:color="D9D9D9"/>
@@ -233,22 +261,26 @@
               <w:bottom w:val="single" w:sz="4" w:color="D9D9D9"/>
               <w:right w:val="single" w:sz="4" w:color="D9D9D9"/>
             </w:tcBorders>
+            <w:shd w:fill="F0F4F7"/>
             <w:tcMar>
-              <w:top w:w="90" w:type="dxa"/>
-              <w:left w:w="90" w:type="dxa"/>
-              <w:bottom w:w="90" w:type="dxa"/>
-              <w:right w:w="90" w:type="dxa"/>
+              <w:top w:w="135" w:type="dxa"/>
+              <w:bottom w:w="135" w:type="dxa"/>
+              <w:left w:w="125" w:type="dxa"/>
+              <w:right w:w="125" w:type="dxa"/>
             </w:tcMar>
           </w:tcPr>
           <w:p>
             <w:pPr>
-              <w:spacing w:after="0" w:line="269" w:lineRule="auto"/>
+              <w:keepNext/>
+              <w:spacing w:after="0" w:line="280" w:lineRule="exact"/>
               <w:jc w:val="center"/>
             </w:pPr>
             <w:r>
               <w:rPr>
+                <w:rFonts w:ascii="Arial" w:hAnsi="Arial" w:eastAsia="Microsoft YaHei"/>
                 <w:b w:val="0"/>
-                <w:sz w:val="20"/>
+                <w:color w:val="202020"/>
+                <w:sz w:val="21"/>
               </w:rPr>
               <w:t>81.26%</w:t>
             </w:r>
@@ -256,7 +288,7 @@
         </w:tc>
         <w:tc>
           <w:tcPr>
-            <w:tcW w:type="dxa" w:w="1871"/>
+            <w:tcW w:type="dxa" w:w="1928"/>
             <w:vAlign w:val="center"/>
             <w:tcBorders>
               <w:top w:val="single" w:sz="4" w:color="D9D9D9"/>
@@ -264,22 +296,26 @@
               <w:bottom w:val="single" w:sz="4" w:color="D9D9D9"/>
               <w:right w:val="single" w:sz="4" w:color="D9D9D9"/>
             </w:tcBorders>
+            <w:shd w:fill="F0F4F7"/>
             <w:tcMar>
-              <w:top w:w="90" w:type="dxa"/>
-              <w:left w:w="90" w:type="dxa"/>
-              <w:bottom w:w="90" w:type="dxa"/>
-              <w:right w:w="90" w:type="dxa"/>
+              <w:top w:w="135" w:type="dxa"/>
+              <w:bottom w:w="135" w:type="dxa"/>
+              <w:left w:w="125" w:type="dxa"/>
+              <w:right w:w="125" w:type="dxa"/>
             </w:tcMar>
           </w:tcPr>
           <w:p>
             <w:pPr>
-              <w:spacing w:after="0" w:line="269" w:lineRule="auto"/>
+              <w:keepNext/>
+              <w:spacing w:after="0" w:line="280" w:lineRule="exact"/>
               <w:jc w:val="center"/>
             </w:pPr>
             <w:r>
               <w:rPr>
+                <w:rFonts w:ascii="Arial" w:hAnsi="Arial" w:eastAsia="Microsoft YaHei"/>
                 <w:b w:val="0"/>
-                <w:sz w:val="20"/>
+                <w:color w:val="202020"/>
+                <w:sz w:val="21"/>
               </w:rPr>
               <w:t>81.60%</w:t>
             </w:r>
@@ -287,7 +323,7 @@
         </w:tc>
         <w:tc>
           <w:tcPr>
-            <w:tcW w:type="dxa" w:w="2098"/>
+            <w:tcW w:type="dxa" w:w="1984"/>
             <w:vAlign w:val="center"/>
             <w:tcBorders>
               <w:top w:val="single" w:sz="4" w:color="D9D9D9"/>
@@ -295,22 +331,26 @@
               <w:bottom w:val="single" w:sz="4" w:color="D9D9D9"/>
               <w:right w:val="single" w:sz="4" w:color="D9D9D9"/>
             </w:tcBorders>
+            <w:shd w:fill="F0F4F7"/>
             <w:tcMar>
-              <w:top w:w="90" w:type="dxa"/>
-              <w:left w:w="90" w:type="dxa"/>
-              <w:bottom w:w="90" w:type="dxa"/>
-              <w:right w:w="90" w:type="dxa"/>
+              <w:top w:w="135" w:type="dxa"/>
+              <w:bottom w:w="135" w:type="dxa"/>
+              <w:left w:w="125" w:type="dxa"/>
+              <w:right w:w="125" w:type="dxa"/>
             </w:tcMar>
           </w:tcPr>
           <w:p>
             <w:pPr>
-              <w:spacing w:after="0" w:line="269" w:lineRule="auto"/>
+              <w:keepNext/>
+              <w:spacing w:after="0" w:line="280" w:lineRule="exact"/>
               <w:jc w:val="center"/>
             </w:pPr>
             <w:r>
               <w:rPr>
+                <w:rFonts w:ascii="Arial" w:hAnsi="Arial" w:eastAsia="Microsoft YaHei"/>
                 <w:b w:val="0"/>
-                <w:sz w:val="20"/>
+                <w:color w:val="202020"/>
+                <w:sz w:val="21"/>
               </w:rPr>
               <w:t>+0.35点</w:t>
             </w:r>
@@ -323,7 +363,7 @@
         </w:trPr>
         <w:tc>
           <w:tcPr>
-            <w:tcW w:type="dxa" w:w="3685"/>
+            <w:tcW w:type="dxa" w:w="3572"/>
             <w:vAlign w:val="center"/>
             <w:tcBorders>
               <w:top w:val="single" w:sz="4" w:color="D9D9D9"/>
@@ -331,22 +371,26 @@
               <w:bottom w:val="single" w:sz="4" w:color="D9D9D9"/>
               <w:right w:val="single" w:sz="4" w:color="D9D9D9"/>
             </w:tcBorders>
+            <w:shd w:fill="FFFFFF"/>
             <w:tcMar>
-              <w:top w:w="90" w:type="dxa"/>
-              <w:left w:w="90" w:type="dxa"/>
-              <w:bottom w:w="90" w:type="dxa"/>
-              <w:right w:w="90" w:type="dxa"/>
+              <w:top w:w="135" w:type="dxa"/>
+              <w:bottom w:w="135" w:type="dxa"/>
+              <w:left w:w="125" w:type="dxa"/>
+              <w:right w:w="125" w:type="dxa"/>
             </w:tcMar>
           </w:tcPr>
           <w:p>
             <w:pPr>
-              <w:spacing w:after="0" w:line="269" w:lineRule="auto"/>
+              <w:keepNext/>
+              <w:spacing w:after="0" w:line="280" w:lineRule="exact"/>
               <w:jc w:val="left"/>
             </w:pPr>
             <w:r>
               <w:rPr>
+                <w:rFonts w:ascii="Arial" w:hAnsi="Arial" w:eastAsia="Microsoft YaHei"/>
                 <w:b w:val="0"/>
-                <w:sz w:val="20"/>
+                <w:color w:val="202020"/>
+                <w:sz w:val="21"/>
               </w:rPr>
               <w:t>SC-bench知识题  226题</w:t>
             </w:r>
@@ -354,7 +398,7 @@
         </w:tc>
         <w:tc>
           <w:tcPr>
-            <w:tcW w:type="dxa" w:w="1871"/>
+            <w:tcW w:type="dxa" w:w="1928"/>
             <w:vAlign w:val="center"/>
             <w:tcBorders>
               <w:top w:val="single" w:sz="4" w:color="D9D9D9"/>
@@ -362,22 +406,26 @@
               <w:bottom w:val="single" w:sz="4" w:color="D9D9D9"/>
               <w:right w:val="single" w:sz="4" w:color="D9D9D9"/>
             </w:tcBorders>
+            <w:shd w:fill="FFFFFF"/>
             <w:tcMar>
-              <w:top w:w="90" w:type="dxa"/>
-              <w:left w:w="90" w:type="dxa"/>
-              <w:bottom w:w="90" w:type="dxa"/>
-              <w:right w:w="90" w:type="dxa"/>
+              <w:top w:w="135" w:type="dxa"/>
+              <w:bottom w:w="135" w:type="dxa"/>
+              <w:left w:w="125" w:type="dxa"/>
+              <w:right w:w="125" w:type="dxa"/>
             </w:tcMar>
           </w:tcPr>
           <w:p>
             <w:pPr>
-              <w:spacing w:after="0" w:line="269" w:lineRule="auto"/>
+              <w:keepNext/>
+              <w:spacing w:after="0" w:line="280" w:lineRule="exact"/>
               <w:jc w:val="center"/>
             </w:pPr>
             <w:r>
               <w:rPr>
+                <w:rFonts w:ascii="Arial" w:hAnsi="Arial" w:eastAsia="Microsoft YaHei"/>
                 <w:b w:val="0"/>
-                <w:sz w:val="20"/>
+                <w:color w:val="202020"/>
+                <w:sz w:val="21"/>
               </w:rPr>
               <w:t>83.19%</w:t>
             </w:r>
@@ -385,7 +433,7 @@
         </w:tc>
         <w:tc>
           <w:tcPr>
-            <w:tcW w:type="dxa" w:w="1871"/>
+            <w:tcW w:type="dxa" w:w="1928"/>
             <w:vAlign w:val="center"/>
             <w:tcBorders>
               <w:top w:val="single" w:sz="4" w:color="D9D9D9"/>
@@ -393,22 +441,26 @@
               <w:bottom w:val="single" w:sz="4" w:color="D9D9D9"/>
               <w:right w:val="single" w:sz="4" w:color="D9D9D9"/>
             </w:tcBorders>
+            <w:shd w:fill="FFFFFF"/>
             <w:tcMar>
-              <w:top w:w="90" w:type="dxa"/>
-              <w:left w:w="90" w:type="dxa"/>
-              <w:bottom w:w="90" w:type="dxa"/>
-              <w:right w:w="90" w:type="dxa"/>
+              <w:top w:w="135" w:type="dxa"/>
+              <w:bottom w:w="135" w:type="dxa"/>
+              <w:left w:w="125" w:type="dxa"/>
+              <w:right w:w="125" w:type="dxa"/>
             </w:tcMar>
           </w:tcPr>
           <w:p>
             <w:pPr>
-              <w:spacing w:after="0" w:line="269" w:lineRule="auto"/>
+              <w:keepNext/>
+              <w:spacing w:after="0" w:line="280" w:lineRule="exact"/>
               <w:jc w:val="center"/>
             </w:pPr>
             <w:r>
               <w:rPr>
+                <w:rFonts w:ascii="Arial" w:hAnsi="Arial" w:eastAsia="Microsoft YaHei"/>
                 <w:b w:val="0"/>
-                <w:sz w:val="20"/>
+                <w:color w:val="202020"/>
+                <w:sz w:val="21"/>
               </w:rPr>
               <w:t>83.63%</w:t>
             </w:r>
@@ -416,7 +468,7 @@
         </w:tc>
         <w:tc>
           <w:tcPr>
-            <w:tcW w:type="dxa" w:w="2098"/>
+            <w:tcW w:type="dxa" w:w="1984"/>
             <w:vAlign w:val="center"/>
             <w:tcBorders>
               <w:top w:val="single" w:sz="4" w:color="D9D9D9"/>
@@ -424,22 +476,26 @@
               <w:bottom w:val="single" w:sz="4" w:color="D9D9D9"/>
               <w:right w:val="single" w:sz="4" w:color="D9D9D9"/>
             </w:tcBorders>
+            <w:shd w:fill="FFFFFF"/>
             <w:tcMar>
-              <w:top w:w="90" w:type="dxa"/>
-              <w:left w:w="90" w:type="dxa"/>
-              <w:bottom w:w="90" w:type="dxa"/>
-              <w:right w:w="90" w:type="dxa"/>
+              <w:top w:w="135" w:type="dxa"/>
+              <w:bottom w:w="135" w:type="dxa"/>
+              <w:left w:w="125" w:type="dxa"/>
+              <w:right w:w="125" w:type="dxa"/>
             </w:tcMar>
           </w:tcPr>
           <w:p>
             <w:pPr>
-              <w:spacing w:after="0" w:line="269" w:lineRule="auto"/>
+              <w:keepNext/>
+              <w:spacing w:after="0" w:line="280" w:lineRule="exact"/>
               <w:jc w:val="center"/>
             </w:pPr>
             <w:r>
               <w:rPr>
+                <w:rFonts w:ascii="Arial" w:hAnsi="Arial" w:eastAsia="Microsoft YaHei"/>
                 <w:b w:val="0"/>
-                <w:sz w:val="20"/>
+                <w:color w:val="202020"/>
+                <w:sz w:val="21"/>
               </w:rPr>
               <w:t>+0.44点</w:t>
             </w:r>
@@ -452,7 +508,7 @@
         </w:trPr>
         <w:tc>
           <w:tcPr>
-            <w:tcW w:type="dxa" w:w="3685"/>
+            <w:tcW w:type="dxa" w:w="3572"/>
             <w:vAlign w:val="center"/>
             <w:tcBorders>
               <w:top w:val="single" w:sz="4" w:color="D9D9D9"/>
@@ -460,22 +516,26 @@
               <w:bottom w:val="single" w:sz="4" w:color="D9D9D9"/>
               <w:right w:val="single" w:sz="4" w:color="D9D9D9"/>
             </w:tcBorders>
+            <w:shd w:fill="F0F4F7"/>
             <w:tcMar>
-              <w:top w:w="90" w:type="dxa"/>
-              <w:left w:w="90" w:type="dxa"/>
-              <w:bottom w:w="90" w:type="dxa"/>
-              <w:right w:w="90" w:type="dxa"/>
+              <w:top w:w="135" w:type="dxa"/>
+              <w:bottom w:w="135" w:type="dxa"/>
+              <w:left w:w="125" w:type="dxa"/>
+              <w:right w:w="125" w:type="dxa"/>
             </w:tcMar>
           </w:tcPr>
           <w:p>
             <w:pPr>
-              <w:spacing w:after="0" w:line="269" w:lineRule="auto"/>
+              <w:keepNext w:val="0"/>
+              <w:spacing w:after="0" w:line="280" w:lineRule="exact"/>
               <w:jc w:val="left"/>
             </w:pPr>
             <w:r>
               <w:rPr>
-                <w:b w:val="0"/>
-                <w:sz w:val="20"/>
+                <w:rFonts w:ascii="Arial" w:hAnsi="Arial" w:eastAsia="Microsoft YaHei"/>
+                <w:b/>
+                <w:color w:val="202020"/>
+                <w:sz w:val="21"/>
               </w:rPr>
               <w:t>合计  1672题</w:t>
             </w:r>
@@ -483,7 +543,7 @@
         </w:tc>
         <w:tc>
           <w:tcPr>
-            <w:tcW w:type="dxa" w:w="1871"/>
+            <w:tcW w:type="dxa" w:w="1928"/>
             <w:vAlign w:val="center"/>
             <w:tcBorders>
               <w:top w:val="single" w:sz="4" w:color="D9D9D9"/>
@@ -491,22 +551,26 @@
               <w:bottom w:val="single" w:sz="4" w:color="D9D9D9"/>
               <w:right w:val="single" w:sz="4" w:color="D9D9D9"/>
             </w:tcBorders>
+            <w:shd w:fill="F0F4F7"/>
             <w:tcMar>
-              <w:top w:w="90" w:type="dxa"/>
-              <w:left w:w="90" w:type="dxa"/>
-              <w:bottom w:w="90" w:type="dxa"/>
-              <w:right w:w="90" w:type="dxa"/>
+              <w:top w:w="135" w:type="dxa"/>
+              <w:bottom w:w="135" w:type="dxa"/>
+              <w:left w:w="125" w:type="dxa"/>
+              <w:right w:w="125" w:type="dxa"/>
             </w:tcMar>
           </w:tcPr>
           <w:p>
             <w:pPr>
-              <w:spacing w:after="0" w:line="269" w:lineRule="auto"/>
+              <w:keepNext w:val="0"/>
+              <w:spacing w:after="0" w:line="280" w:lineRule="exact"/>
               <w:jc w:val="center"/>
             </w:pPr>
             <w:r>
               <w:rPr>
-                <w:b w:val="0"/>
-                <w:sz w:val="20"/>
+                <w:rFonts w:ascii="Arial" w:hAnsi="Arial" w:eastAsia="Microsoft YaHei"/>
+                <w:b/>
+                <w:color w:val="202020"/>
+                <w:sz w:val="21"/>
               </w:rPr>
               <w:t>81.52%</w:t>
             </w:r>
@@ -514,7 +578,7 @@
         </w:tc>
         <w:tc>
           <w:tcPr>
-            <w:tcW w:type="dxa" w:w="1871"/>
+            <w:tcW w:type="dxa" w:w="1928"/>
             <w:vAlign w:val="center"/>
             <w:tcBorders>
               <w:top w:val="single" w:sz="4" w:color="D9D9D9"/>
@@ -522,22 +586,26 @@
               <w:bottom w:val="single" w:sz="4" w:color="D9D9D9"/>
               <w:right w:val="single" w:sz="4" w:color="D9D9D9"/>
             </w:tcBorders>
+            <w:shd w:fill="F0F4F7"/>
             <w:tcMar>
-              <w:top w:w="90" w:type="dxa"/>
-              <w:left w:w="90" w:type="dxa"/>
-              <w:bottom w:w="90" w:type="dxa"/>
-              <w:right w:w="90" w:type="dxa"/>
+              <w:top w:w="135" w:type="dxa"/>
+              <w:bottom w:w="135" w:type="dxa"/>
+              <w:left w:w="125" w:type="dxa"/>
+              <w:right w:w="125" w:type="dxa"/>
             </w:tcMar>
           </w:tcPr>
           <w:p>
             <w:pPr>
-              <w:spacing w:after="0" w:line="269" w:lineRule="auto"/>
+              <w:keepNext w:val="0"/>
+              <w:spacing w:after="0" w:line="280" w:lineRule="exact"/>
               <w:jc w:val="center"/>
             </w:pPr>
             <w:r>
               <w:rPr>
-                <w:b w:val="0"/>
-                <w:sz w:val="20"/>
+                <w:rFonts w:ascii="Arial" w:hAnsi="Arial" w:eastAsia="Microsoft YaHei"/>
+                <w:b/>
+                <w:color w:val="202020"/>
+                <w:sz w:val="21"/>
               </w:rPr>
               <w:t>81.88%</w:t>
             </w:r>
@@ -545,7 +613,7 @@
         </w:tc>
         <w:tc>
           <w:tcPr>
-            <w:tcW w:type="dxa" w:w="2098"/>
+            <w:tcW w:type="dxa" w:w="1984"/>
             <w:vAlign w:val="center"/>
             <w:tcBorders>
               <w:top w:val="single" w:sz="4" w:color="D9D9D9"/>
@@ -553,22 +621,26 @@
               <w:bottom w:val="single" w:sz="4" w:color="D9D9D9"/>
               <w:right w:val="single" w:sz="4" w:color="D9D9D9"/>
             </w:tcBorders>
+            <w:shd w:fill="F0F4F7"/>
             <w:tcMar>
-              <w:top w:w="90" w:type="dxa"/>
-              <w:left w:w="90" w:type="dxa"/>
-              <w:bottom w:w="90" w:type="dxa"/>
-              <w:right w:w="90" w:type="dxa"/>
+              <w:top w:w="135" w:type="dxa"/>
+              <w:bottom w:w="135" w:type="dxa"/>
+              <w:left w:w="125" w:type="dxa"/>
+              <w:right w:w="125" w:type="dxa"/>
             </w:tcMar>
           </w:tcPr>
           <w:p>
             <w:pPr>
-              <w:spacing w:after="0" w:line="269" w:lineRule="auto"/>
+              <w:keepNext w:val="0"/>
+              <w:spacing w:after="0" w:line="280" w:lineRule="exact"/>
               <w:jc w:val="center"/>
             </w:pPr>
             <w:r>
               <w:rPr>
-                <w:b w:val="0"/>
-                <w:sz w:val="20"/>
+                <w:rFonts w:ascii="Arial" w:hAnsi="Arial" w:eastAsia="Microsoft YaHei"/>
+                <w:b/>
+                <w:color w:val="202020"/>
+                <w:sz w:val="21"/>
               </w:rPr>
               <w:t>+0.36点</w:t>
             </w:r>
@@ -577,7 +649,15 @@
       </w:tr>
     </w:tbl>
     <w:p>
+      <w:pPr>
+        <w:spacing w:line="280" w:lineRule="exact" w:before="140"/>
+        <w:jc w:val="both"/>
+      </w:pPr>
       <w:r>
+        <w:rPr>
+          <w:color w:val="595959"/>
+          <w:sz w:val="18"/>
+        </w:rPr>
         <w:t>注：变化按未四舍五入的原始分数计算，单位为百分点。SC-bench 的100道工具题不在本表内。主比较采用相同 BF16 精度、温度0、关闭 thinking 和严格答案集合评分。</w:t>
       </w:r>
     </w:p>
@@ -586,20 +666,33 @@
         <w:pStyle w:val="Heading2"/>
       </w:pPr>
       <w:r>
+        <w:rPr>
+          <w:rFonts w:eastAsia="Microsoft YaHei"/>
+        </w:rPr>
         <w:t>问题判断</w:t>
       </w:r>
     </w:p>
     <w:p>
+      <w:pPr>
+        <w:jc w:val="both"/>
+      </w:pPr>
       <w:r>
         <w:t>这一结果说明，既有训练尚未形成明显的物流知识问答增益，垂域 Agent 优化没有自动转化为同等幅度的知识问答优势。Step120 共答对1369题，仍有303题答错；但仅凭总分不能判断这些错误究竟来自知识缺口、概念调用、情景应用，还是输入与评分问题。</w:t>
       </w:r>
     </w:p>
     <w:p>
+      <w:pPr>
+        <w:jc w:val="both"/>
+      </w:pPr>
       <w:r>
         <w:t>本轮主比较净增6题，低于项目此前设定的物流知识提升3个百分点的实用门槛。以下实验用于拆解差距，不把“80多分”直接等同于“缺知识”。</w:t>
       </w:r>
     </w:p>
     <w:p>
+      <w:pPr>
+        <w:spacing w:after="0" w:line="240" w:lineRule="exact"/>
+        <w:jc w:val="both"/>
+      </w:pPr>
       <w:r>
         <w:br w:type="page"/>
       </w:r>
@@ -609,10 +702,16 @@
         <w:pStyle w:val="Heading1"/>
       </w:pPr>
       <w:r>
+        <w:rPr>
+          <w:rFonts w:eastAsia="Microsoft YaHei"/>
+        </w:rPr>
         <w:t>二 探测方法与已完成结果</w:t>
       </w:r>
     </w:p>
     <w:p>
+      <w:pPr>
+        <w:jc w:val="both"/>
+      </w:pPr>
       <w:r>
         <w:t>探测按“评测是否可靠 → 资料是否充分 → 基础知识能否调用 → 原问题能否应用 → 训练信号是否转成答案”逐层展开。各层分别设置对照，避免只看总分或训练 loss 就判定根因。</w:t>
       </w:r>
@@ -622,10 +721,16 @@
         <w:pStyle w:val="Heading2"/>
       </w:pPr>
       <w:r>
+        <w:rPr>
+          <w:rFonts w:eastAsia="Microsoft YaHei"/>
+        </w:rPr>
         <w:t>1 固定错题和正确对照做四条件探测</w:t>
       </w:r>
     </w:p>
     <w:p>
+      <w:pPr>
+        <w:jc w:val="both"/>
+      </w:pPr>
       <w:r>
         <w:t>冻结 Step120 的303道历史错题，再匹配60道原答对题，共363题。原始模型分别回答原题闭卷、原题加教材、基础知识题闭卷、基础知识题加教材，每个条件重复3轮。教材检索不接收金答案，基础题仅在自动门禁通过的子集评测。[3]</w:t>
       </w:r>
@@ -639,8 +744,8 @@
       </w:tblPr>
       <w:tblGrid>
         <w:gridCol w:w="5102"/>
-        <w:gridCol w:w="2211"/>
-        <w:gridCol w:w="2211"/>
+        <w:gridCol w:w="2154"/>
+        <w:gridCol w:w="2154"/>
       </w:tblGrid>
       <w:tr>
         <w:trPr>
@@ -657,23 +762,26 @@
               <w:bottom w:val="single" w:sz="4" w:color="D9D9D9"/>
               <w:right w:val="single" w:sz="4" w:color="D9D9D9"/>
             </w:tcBorders>
+            <w:shd w:fill="243E56"/>
             <w:tcMar>
-              <w:top w:w="90" w:type="dxa"/>
-              <w:left w:w="90" w:type="dxa"/>
-              <w:bottom w:w="90" w:type="dxa"/>
-              <w:right w:w="90" w:type="dxa"/>
+              <w:top w:w="135" w:type="dxa"/>
+              <w:bottom w:w="135" w:type="dxa"/>
+              <w:left w:w="125" w:type="dxa"/>
+              <w:right w:w="125" w:type="dxa"/>
             </w:tcMar>
-            <w:shd w:fill="DCE6EF"/>
           </w:tcPr>
           <w:p>
             <w:pPr>
-              <w:spacing w:after="0" w:line="269" w:lineRule="auto"/>
+              <w:keepNext/>
+              <w:spacing w:after="0" w:line="280" w:lineRule="exact"/>
               <w:jc w:val="left"/>
             </w:pPr>
             <w:r>
               <w:rPr>
+                <w:rFonts w:ascii="Arial" w:hAnsi="Arial" w:eastAsia="Microsoft YaHei"/>
                 <w:b/>
-                <w:sz w:val="20"/>
+                <w:color w:val="FFFFFF"/>
+                <w:sz w:val="21"/>
               </w:rPr>
               <w:t>样本与条件</w:t>
             </w:r>
@@ -681,7 +789,7 @@
         </w:tc>
         <w:tc>
           <w:tcPr>
-            <w:tcW w:type="dxa" w:w="2211"/>
+            <w:tcW w:type="dxa" w:w="2154"/>
             <w:vAlign w:val="center"/>
             <w:tcBorders>
               <w:top w:val="single" w:sz="4" w:color="D9D9D9"/>
@@ -689,23 +797,26 @@
               <w:bottom w:val="single" w:sz="4" w:color="D9D9D9"/>
               <w:right w:val="single" w:sz="4" w:color="D9D9D9"/>
             </w:tcBorders>
+            <w:shd w:fill="243E56"/>
             <w:tcMar>
-              <w:top w:w="90" w:type="dxa"/>
-              <w:left w:w="90" w:type="dxa"/>
-              <w:bottom w:w="90" w:type="dxa"/>
-              <w:right w:w="90" w:type="dxa"/>
+              <w:top w:w="135" w:type="dxa"/>
+              <w:bottom w:w="135" w:type="dxa"/>
+              <w:left w:w="125" w:type="dxa"/>
+              <w:right w:w="125" w:type="dxa"/>
             </w:tcMar>
-            <w:shd w:fill="DCE6EF"/>
           </w:tcPr>
           <w:p>
             <w:pPr>
-              <w:spacing w:after="0" w:line="269" w:lineRule="auto"/>
+              <w:keepNext/>
+              <w:spacing w:after="0" w:line="280" w:lineRule="exact"/>
               <w:jc w:val="center"/>
             </w:pPr>
             <w:r>
               <w:rPr>
+                <w:rFonts w:ascii="Arial" w:hAnsi="Arial" w:eastAsia="Microsoft YaHei"/>
                 <w:b/>
-                <w:sz w:val="20"/>
+                <w:color w:val="FFFFFF"/>
+                <w:sz w:val="21"/>
               </w:rPr>
               <w:t>闭卷答对</w:t>
             </w:r>
@@ -713,7 +824,7 @@
         </w:tc>
         <w:tc>
           <w:tcPr>
-            <w:tcW w:type="dxa" w:w="2211"/>
+            <w:tcW w:type="dxa" w:w="2154"/>
             <w:vAlign w:val="center"/>
             <w:tcBorders>
               <w:top w:val="single" w:sz="4" w:color="D9D9D9"/>
@@ -721,23 +832,26 @@
               <w:bottom w:val="single" w:sz="4" w:color="D9D9D9"/>
               <w:right w:val="single" w:sz="4" w:color="D9D9D9"/>
             </w:tcBorders>
+            <w:shd w:fill="243E56"/>
             <w:tcMar>
-              <w:top w:w="90" w:type="dxa"/>
-              <w:left w:w="90" w:type="dxa"/>
-              <w:bottom w:w="90" w:type="dxa"/>
-              <w:right w:w="90" w:type="dxa"/>
+              <w:top w:w="135" w:type="dxa"/>
+              <w:bottom w:w="135" w:type="dxa"/>
+              <w:left w:w="125" w:type="dxa"/>
+              <w:right w:w="125" w:type="dxa"/>
             </w:tcMar>
-            <w:shd w:fill="DCE6EF"/>
           </w:tcPr>
           <w:p>
             <w:pPr>
-              <w:spacing w:after="0" w:line="269" w:lineRule="auto"/>
+              <w:keepNext/>
+              <w:spacing w:after="0" w:line="280" w:lineRule="exact"/>
               <w:jc w:val="center"/>
             </w:pPr>
             <w:r>
               <w:rPr>
+                <w:rFonts w:ascii="Arial" w:hAnsi="Arial" w:eastAsia="Microsoft YaHei"/>
                 <w:b/>
-                <w:sz w:val="20"/>
+                <w:color w:val="FFFFFF"/>
+                <w:sz w:val="21"/>
               </w:rPr>
               <w:t>加教材答对</w:t>
             </w:r>
@@ -758,22 +872,26 @@
               <w:bottom w:val="single" w:sz="4" w:color="D9D9D9"/>
               <w:right w:val="single" w:sz="4" w:color="D9D9D9"/>
             </w:tcBorders>
+            <w:shd w:fill="F0F4F7"/>
             <w:tcMar>
-              <w:top w:w="90" w:type="dxa"/>
-              <w:left w:w="90" w:type="dxa"/>
-              <w:bottom w:w="90" w:type="dxa"/>
-              <w:right w:w="90" w:type="dxa"/>
+              <w:top w:w="135" w:type="dxa"/>
+              <w:bottom w:w="135" w:type="dxa"/>
+              <w:left w:w="125" w:type="dxa"/>
+              <w:right w:w="125" w:type="dxa"/>
             </w:tcMar>
           </w:tcPr>
           <w:p>
             <w:pPr>
-              <w:spacing w:after="0" w:line="269" w:lineRule="auto"/>
+              <w:keepNext/>
+              <w:spacing w:after="0" w:line="280" w:lineRule="exact"/>
               <w:jc w:val="left"/>
             </w:pPr>
             <w:r>
               <w:rPr>
+                <w:rFonts w:ascii="Arial" w:hAnsi="Arial" w:eastAsia="Microsoft YaHei"/>
                 <w:b w:val="0"/>
-                <w:sz w:val="20"/>
+                <w:color w:val="202020"/>
+                <w:sz w:val="21"/>
               </w:rPr>
               <w:t>历史错题  303题</w:t>
             </w:r>
@@ -781,7 +899,7 @@
         </w:tc>
         <w:tc>
           <w:tcPr>
-            <w:tcW w:type="dxa" w:w="2211"/>
+            <w:tcW w:type="dxa" w:w="2154"/>
             <w:vAlign w:val="center"/>
             <w:tcBorders>
               <w:top w:val="single" w:sz="4" w:color="D9D9D9"/>
@@ -789,22 +907,26 @@
               <w:bottom w:val="single" w:sz="4" w:color="D9D9D9"/>
               <w:right w:val="single" w:sz="4" w:color="D9D9D9"/>
             </w:tcBorders>
+            <w:shd w:fill="F0F4F7"/>
             <w:tcMar>
-              <w:top w:w="90" w:type="dxa"/>
-              <w:left w:w="90" w:type="dxa"/>
-              <w:bottom w:w="90" w:type="dxa"/>
-              <w:right w:w="90" w:type="dxa"/>
+              <w:top w:w="135" w:type="dxa"/>
+              <w:bottom w:w="135" w:type="dxa"/>
+              <w:left w:w="125" w:type="dxa"/>
+              <w:right w:w="125" w:type="dxa"/>
             </w:tcMar>
           </w:tcPr>
           <w:p>
             <w:pPr>
-              <w:spacing w:after="0" w:line="269" w:lineRule="auto"/>
+              <w:keepNext/>
+              <w:spacing w:after="0" w:line="280" w:lineRule="exact"/>
               <w:jc w:val="center"/>
             </w:pPr>
             <w:r>
               <w:rPr>
+                <w:rFonts w:ascii="Arial" w:hAnsi="Arial" w:eastAsia="Microsoft YaHei"/>
                 <w:b w:val="0"/>
-                <w:sz w:val="20"/>
+                <w:color w:val="202020"/>
+                <w:sz w:val="21"/>
               </w:rPr>
               <w:t>6/303</w:t>
             </w:r>
@@ -812,7 +934,7 @@
         </w:tc>
         <w:tc>
           <w:tcPr>
-            <w:tcW w:type="dxa" w:w="2211"/>
+            <w:tcW w:type="dxa" w:w="2154"/>
             <w:vAlign w:val="center"/>
             <w:tcBorders>
               <w:top w:val="single" w:sz="4" w:color="D9D9D9"/>
@@ -820,22 +942,26 @@
               <w:bottom w:val="single" w:sz="4" w:color="D9D9D9"/>
               <w:right w:val="single" w:sz="4" w:color="D9D9D9"/>
             </w:tcBorders>
+            <w:shd w:fill="F0F4F7"/>
             <w:tcMar>
-              <w:top w:w="90" w:type="dxa"/>
-              <w:left w:w="90" w:type="dxa"/>
-              <w:bottom w:w="90" w:type="dxa"/>
-              <w:right w:w="90" w:type="dxa"/>
+              <w:top w:w="135" w:type="dxa"/>
+              <w:bottom w:w="135" w:type="dxa"/>
+              <w:left w:w="125" w:type="dxa"/>
+              <w:right w:w="125" w:type="dxa"/>
             </w:tcMar>
           </w:tcPr>
           <w:p>
             <w:pPr>
-              <w:spacing w:after="0" w:line="269" w:lineRule="auto"/>
+              <w:keepNext/>
+              <w:spacing w:after="0" w:line="280" w:lineRule="exact"/>
               <w:jc w:val="center"/>
             </w:pPr>
             <w:r>
               <w:rPr>
+                <w:rFonts w:ascii="Arial" w:hAnsi="Arial" w:eastAsia="Microsoft YaHei"/>
                 <w:b w:val="0"/>
-                <w:sz w:val="20"/>
+                <w:color w:val="202020"/>
+                <w:sz w:val="21"/>
               </w:rPr>
               <w:t>58/303</w:t>
             </w:r>
@@ -856,22 +982,26 @@
               <w:bottom w:val="single" w:sz="4" w:color="D9D9D9"/>
               <w:right w:val="single" w:sz="4" w:color="D9D9D9"/>
             </w:tcBorders>
+            <w:shd w:fill="FFFFFF"/>
             <w:tcMar>
-              <w:top w:w="90" w:type="dxa"/>
-              <w:left w:w="90" w:type="dxa"/>
-              <w:bottom w:w="90" w:type="dxa"/>
-              <w:right w:w="90" w:type="dxa"/>
+              <w:top w:w="135" w:type="dxa"/>
+              <w:bottom w:w="135" w:type="dxa"/>
+              <w:left w:w="125" w:type="dxa"/>
+              <w:right w:w="125" w:type="dxa"/>
             </w:tcMar>
           </w:tcPr>
           <w:p>
             <w:pPr>
-              <w:spacing w:after="0" w:line="269" w:lineRule="auto"/>
+              <w:keepNext/>
+              <w:spacing w:after="0" w:line="280" w:lineRule="exact"/>
               <w:jc w:val="left"/>
             </w:pPr>
             <w:r>
               <w:rPr>
+                <w:rFonts w:ascii="Arial" w:hAnsi="Arial" w:eastAsia="Microsoft YaHei"/>
                 <w:b w:val="0"/>
-                <w:sz w:val="20"/>
+                <w:color w:val="202020"/>
+                <w:sz w:val="21"/>
               </w:rPr>
               <w:t>原答对对照  60题</w:t>
             </w:r>
@@ -879,7 +1009,7 @@
         </w:tc>
         <w:tc>
           <w:tcPr>
-            <w:tcW w:type="dxa" w:w="2211"/>
+            <w:tcW w:type="dxa" w:w="2154"/>
             <w:vAlign w:val="center"/>
             <w:tcBorders>
               <w:top w:val="single" w:sz="4" w:color="D9D9D9"/>
@@ -887,22 +1017,26 @@
               <w:bottom w:val="single" w:sz="4" w:color="D9D9D9"/>
               <w:right w:val="single" w:sz="4" w:color="D9D9D9"/>
             </w:tcBorders>
+            <w:shd w:fill="FFFFFF"/>
             <w:tcMar>
-              <w:top w:w="90" w:type="dxa"/>
-              <w:left w:w="90" w:type="dxa"/>
-              <w:bottom w:w="90" w:type="dxa"/>
-              <w:right w:w="90" w:type="dxa"/>
+              <w:top w:w="135" w:type="dxa"/>
+              <w:bottom w:w="135" w:type="dxa"/>
+              <w:left w:w="125" w:type="dxa"/>
+              <w:right w:w="125" w:type="dxa"/>
             </w:tcMar>
           </w:tcPr>
           <w:p>
             <w:pPr>
-              <w:spacing w:after="0" w:line="269" w:lineRule="auto"/>
+              <w:keepNext/>
+              <w:spacing w:after="0" w:line="280" w:lineRule="exact"/>
               <w:jc w:val="center"/>
             </w:pPr>
             <w:r>
               <w:rPr>
+                <w:rFonts w:ascii="Arial" w:hAnsi="Arial" w:eastAsia="Microsoft YaHei"/>
                 <w:b w:val="0"/>
-                <w:sz w:val="20"/>
+                <w:color w:val="202020"/>
+                <w:sz w:val="21"/>
               </w:rPr>
               <w:t>57/60</w:t>
             </w:r>
@@ -910,7 +1044,7 @@
         </w:tc>
         <w:tc>
           <w:tcPr>
-            <w:tcW w:type="dxa" w:w="2211"/>
+            <w:tcW w:type="dxa" w:w="2154"/>
             <w:vAlign w:val="center"/>
             <w:tcBorders>
               <w:top w:val="single" w:sz="4" w:color="D9D9D9"/>
@@ -918,22 +1052,26 @@
               <w:bottom w:val="single" w:sz="4" w:color="D9D9D9"/>
               <w:right w:val="single" w:sz="4" w:color="D9D9D9"/>
             </w:tcBorders>
+            <w:shd w:fill="FFFFFF"/>
             <w:tcMar>
-              <w:top w:w="90" w:type="dxa"/>
-              <w:left w:w="90" w:type="dxa"/>
-              <w:bottom w:w="90" w:type="dxa"/>
-              <w:right w:w="90" w:type="dxa"/>
+              <w:top w:w="135" w:type="dxa"/>
+              <w:bottom w:w="135" w:type="dxa"/>
+              <w:left w:w="125" w:type="dxa"/>
+              <w:right w:w="125" w:type="dxa"/>
             </w:tcMar>
           </w:tcPr>
           <w:p>
             <w:pPr>
-              <w:spacing w:after="0" w:line="269" w:lineRule="auto"/>
+              <w:keepNext/>
+              <w:spacing w:after="0" w:line="280" w:lineRule="exact"/>
               <w:jc w:val="center"/>
             </w:pPr>
             <w:r>
               <w:rPr>
+                <w:rFonts w:ascii="Arial" w:hAnsi="Arial" w:eastAsia="Microsoft YaHei"/>
                 <w:b w:val="0"/>
-                <w:sz w:val="20"/>
+                <w:color w:val="202020"/>
+                <w:sz w:val="21"/>
               </w:rPr>
               <w:t>54/60</w:t>
             </w:r>
@@ -954,22 +1092,26 @@
               <w:bottom w:val="single" w:sz="4" w:color="D9D9D9"/>
               <w:right w:val="single" w:sz="4" w:color="D9D9D9"/>
             </w:tcBorders>
+            <w:shd w:fill="F0F4F7"/>
             <w:tcMar>
-              <w:top w:w="90" w:type="dxa"/>
-              <w:left w:w="90" w:type="dxa"/>
-              <w:bottom w:w="90" w:type="dxa"/>
-              <w:right w:w="90" w:type="dxa"/>
+              <w:top w:w="135" w:type="dxa"/>
+              <w:bottom w:w="135" w:type="dxa"/>
+              <w:left w:w="125" w:type="dxa"/>
+              <w:right w:w="125" w:type="dxa"/>
             </w:tcMar>
           </w:tcPr>
           <w:p>
             <w:pPr>
-              <w:spacing w:after="0" w:line="269" w:lineRule="auto"/>
+              <w:keepNext w:val="0"/>
+              <w:spacing w:after="0" w:line="280" w:lineRule="exact"/>
               <w:jc w:val="left"/>
             </w:pPr>
             <w:r>
               <w:rPr>
+                <w:rFonts w:ascii="Arial" w:hAnsi="Arial" w:eastAsia="Microsoft YaHei"/>
                 <w:b w:val="0"/>
-                <w:sz w:val="20"/>
+                <w:color w:val="202020"/>
+                <w:sz w:val="21"/>
               </w:rPr>
               <w:t>历史错题中的有效基础题  65题</w:t>
             </w:r>
@@ -977,7 +1119,7 @@
         </w:tc>
         <w:tc>
           <w:tcPr>
-            <w:tcW w:type="dxa" w:w="2211"/>
+            <w:tcW w:type="dxa" w:w="2154"/>
             <w:vAlign w:val="center"/>
             <w:tcBorders>
               <w:top w:val="single" w:sz="4" w:color="D9D9D9"/>
@@ -985,22 +1127,26 @@
               <w:bottom w:val="single" w:sz="4" w:color="D9D9D9"/>
               <w:right w:val="single" w:sz="4" w:color="D9D9D9"/>
             </w:tcBorders>
+            <w:shd w:fill="F0F4F7"/>
             <w:tcMar>
-              <w:top w:w="90" w:type="dxa"/>
-              <w:left w:w="90" w:type="dxa"/>
-              <w:bottom w:w="90" w:type="dxa"/>
-              <w:right w:w="90" w:type="dxa"/>
+              <w:top w:w="135" w:type="dxa"/>
+              <w:bottom w:w="135" w:type="dxa"/>
+              <w:left w:w="125" w:type="dxa"/>
+              <w:right w:w="125" w:type="dxa"/>
             </w:tcMar>
           </w:tcPr>
           <w:p>
             <w:pPr>
-              <w:spacing w:after="0" w:line="269" w:lineRule="auto"/>
+              <w:keepNext w:val="0"/>
+              <w:spacing w:after="0" w:line="280" w:lineRule="exact"/>
               <w:jc w:val="center"/>
             </w:pPr>
             <w:r>
               <w:rPr>
+                <w:rFonts w:ascii="Arial" w:hAnsi="Arial" w:eastAsia="Microsoft YaHei"/>
                 <w:b w:val="0"/>
-                <w:sz w:val="20"/>
+                <w:color w:val="202020"/>
+                <w:sz w:val="21"/>
               </w:rPr>
               <w:t>59/65</w:t>
             </w:r>
@@ -1008,7 +1154,7 @@
         </w:tc>
         <w:tc>
           <w:tcPr>
-            <w:tcW w:type="dxa" w:w="2211"/>
+            <w:tcW w:type="dxa" w:w="2154"/>
             <w:vAlign w:val="center"/>
             <w:tcBorders>
               <w:top w:val="single" w:sz="4" w:color="D9D9D9"/>
@@ -1016,22 +1162,26 @@
               <w:bottom w:val="single" w:sz="4" w:color="D9D9D9"/>
               <w:right w:val="single" w:sz="4" w:color="D9D9D9"/>
             </w:tcBorders>
+            <w:shd w:fill="F0F4F7"/>
             <w:tcMar>
-              <w:top w:w="90" w:type="dxa"/>
-              <w:left w:w="90" w:type="dxa"/>
-              <w:bottom w:w="90" w:type="dxa"/>
-              <w:right w:w="90" w:type="dxa"/>
+              <w:top w:w="135" w:type="dxa"/>
+              <w:bottom w:w="135" w:type="dxa"/>
+              <w:left w:w="125" w:type="dxa"/>
+              <w:right w:w="125" w:type="dxa"/>
             </w:tcMar>
           </w:tcPr>
           <w:p>
             <w:pPr>
-              <w:spacing w:after="0" w:line="269" w:lineRule="auto"/>
+              <w:keepNext w:val="0"/>
+              <w:spacing w:after="0" w:line="280" w:lineRule="exact"/>
               <w:jc w:val="center"/>
             </w:pPr>
             <w:r>
               <w:rPr>
+                <w:rFonts w:ascii="Arial" w:hAnsi="Arial" w:eastAsia="Microsoft YaHei"/>
                 <w:b w:val="0"/>
-                <w:sz w:val="20"/>
+                <w:color w:val="202020"/>
+                <w:sz w:val="21"/>
               </w:rPr>
               <w:t>64/65</w:t>
             </w:r>
@@ -1040,6 +1190,10 @@
       </w:tr>
     </w:tbl>
     <w:p>
+      <w:pPr>
+        <w:spacing w:before="140"/>
+        <w:jc w:val="both"/>
+      </w:pPr>
       <w:r>
         <w:t>诊断提示与历史正式评测不同，因此303道历史错题本轮闭卷答对6题并不矛盾。资料能帮助部分题目，也可能干扰原答对题；基础题的分母和难度均不同，不能直接与303题正确率相减。</w:t>
       </w:r>
@@ -1049,15 +1203,24 @@
         <w:pStyle w:val="Heading2"/>
       </w:pPr>
       <w:r>
+        <w:rPr>
+          <w:rFonts w:eastAsia="Microsoft YaHei"/>
+        </w:rPr>
         <w:t>2 复核资料质量并增加闭卷知识探针</w:t>
       </w:r>
     </w:p>
     <w:p>
+      <w:pPr>
+        <w:jc w:val="both"/>
+      </w:pPr>
       <w:r>
         <w:t>363题中259题自动审核缺失或无效，不能据此判为教材不覆盖。后续复核8题，发现探针过浅、资料不充分、缺图、重复选项等问题。在获得定向补证的同4题上，闭卷及原教材均为0/4，补充已核对资料后为4/4，三轮一致；单加题型提示在8题上仍为0/8。[4]</w:t>
       </w:r>
     </w:p>
     <w:p>
+      <w:pPr>
+        <w:jc w:val="both"/>
+      </w:pPr>
       <w:r>
         <w:t>对上述4个知识点再做定义、辨析、应用各1问，共12问、每问3轮。预先冻结的核心标准通过6/12，其中定义2/4、辨析3/4、应用1/4。这表明部分知识可以调用，但概念范围、术语对应和情景应用并不稳定。[5]</w:t>
       </w:r>
@@ -1067,15 +1230,25 @@
         <w:pStyle w:val="Heading2"/>
       </w:pPr>
       <w:r>
+        <w:rPr>
+          <w:rFonts w:eastAsia="Microsoft YaHei"/>
+        </w:rPr>
         <w:t>3 由探测结果确定优化方向</w:t>
       </w:r>
     </w:p>
     <w:p>
+      <w:pPr>
+        <w:jc w:val="both"/>
+      </w:pPr>
       <w:r>
         <w:t>知识范围不完整的题目，应补充可靠来源与知识校准；定义可答、应用不稳的题目，应重点训练概念辨析和情景问答；资料或题面存在问题的样本，应先修复评测依据。上述小样本属于机制探测，不能外推为全部303题的根因比例。</w:t>
       </w:r>
     </w:p>
     <w:p>
+      <w:pPr>
+        <w:spacing w:after="0" w:line="240" w:lineRule="exact"/>
+        <w:jc w:val="both"/>
+      </w:pPr>
       <w:r>
         <w:br w:type="page"/>
       </w:r>
@@ -1085,6 +1258,9 @@
         <w:pStyle w:val="Heading1"/>
       </w:pPr>
       <w:r>
+        <w:rPr>
+          <w:rFonts w:eastAsia="Microsoft YaHei"/>
+        </w:rPr>
         <w:t>三 方案一 评测基准转语料开展CPT</w:t>
       </w:r>
     </w:p>
@@ -1093,15 +1269,24 @@
         <w:pStyle w:val="Heading2"/>
       </w:pPr>
       <w:r>
+        <w:rPr>
+          <w:rFonts w:eastAsia="Microsoft YaHei"/>
+        </w:rPr>
         <w:t>目的与设计</w:t>
       </w:r>
     </w:p>
     <w:p>
+      <w:pPr>
+        <w:jc w:val="both"/>
+      </w:pPr>
       <w:r>
         <w:t>为检验“把所需知识显式加入训练，是否就能提高得分”，我们将1672道评测题转成普通因果语言建模语料，并设置直接题面与改写题面两组。两组均从同一 Step120 权重独立初始化新优化器，各训练4遍、64步，再用冻结原题做三轮多数票评测。[6]</w:t>
       </w:r>
     </w:p>
     <w:p>
+      <w:pPr>
+        <w:jc w:val="both"/>
+      </w:pPr>
       <w:r>
         <w:t>直接组保留题干和正确答案正文，去除选项字母、索引及干扰项；改写组改写题干、保留正确答案。1625题通过自动改写门禁，47题回退到原题。历史判断题保留原命题并追加真假结论，并未全部转成纠正后的正向知识陈述，这是该次制数的限制。</w:t>
       </w:r>
@@ -1114,620 +1299,10 @@
         <w:tblLook w:firstColumn="1" w:firstRow="1" w:lastColumn="0" w:lastRow="0" w:noHBand="0" w:noVBand="1" w:val="04A0"/>
       </w:tblPr>
       <w:tblGrid>
-        <w:gridCol w:w="3685"/>
-        <w:gridCol w:w="1928"/>
-        <w:gridCol w:w="1814"/>
-        <w:gridCol w:w="2098"/>
-      </w:tblGrid>
-      <w:tr>
-        <w:trPr>
-          <w:cantSplit/>
-          <w:tblHeader/>
-        </w:trPr>
-        <w:tc>
-          <w:tcPr>
-            <w:tcW w:type="dxa" w:w="3685"/>
-            <w:vAlign w:val="center"/>
-            <w:tcBorders>
-              <w:top w:val="single" w:sz="4" w:color="D9D9D9"/>
-              <w:left w:val="single" w:sz="4" w:color="D9D9D9"/>
-              <w:bottom w:val="single" w:sz="4" w:color="D9D9D9"/>
-              <w:right w:val="single" w:sz="4" w:color="D9D9D9"/>
-            </w:tcBorders>
-            <w:tcMar>
-              <w:top w:w="90" w:type="dxa"/>
-              <w:left w:w="90" w:type="dxa"/>
-              <w:bottom w:w="90" w:type="dxa"/>
-              <w:right w:w="90" w:type="dxa"/>
-            </w:tcMar>
-            <w:shd w:fill="DCE6EF"/>
-          </w:tcPr>
-          <w:p>
-            <w:pPr>
-              <w:spacing w:after="0" w:line="269" w:lineRule="auto"/>
-              <w:jc w:val="left"/>
-            </w:pPr>
-            <w:r>
-              <w:rPr>
-                <w:b/>
-                <w:sz w:val="20"/>
-              </w:rPr>
-              <w:t>模型</w:t>
-            </w:r>
-          </w:p>
-        </w:tc>
-        <w:tc>
-          <w:tcPr>
-            <w:tcW w:type="dxa" w:w="1928"/>
-            <w:vAlign w:val="center"/>
-            <w:tcBorders>
-              <w:top w:val="single" w:sz="4" w:color="D9D9D9"/>
-              <w:left w:val="single" w:sz="4" w:color="D9D9D9"/>
-              <w:bottom w:val="single" w:sz="4" w:color="D9D9D9"/>
-              <w:right w:val="single" w:sz="4" w:color="D9D9D9"/>
-            </w:tcBorders>
-            <w:tcMar>
-              <w:top w:w="90" w:type="dxa"/>
-              <w:left w:w="90" w:type="dxa"/>
-              <w:bottom w:w="90" w:type="dxa"/>
-              <w:right w:w="90" w:type="dxa"/>
-            </w:tcMar>
-            <w:shd w:fill="DCE6EF"/>
-          </w:tcPr>
-          <w:p>
-            <w:pPr>
-              <w:spacing w:after="0" w:line="269" w:lineRule="auto"/>
-              <w:jc w:val="center"/>
-            </w:pPr>
-            <w:r>
-              <w:rPr>
-                <w:b/>
-                <w:sz w:val="20"/>
-              </w:rPr>
-              <w:t>答对数</w:t>
-            </w:r>
-          </w:p>
-        </w:tc>
-        <w:tc>
-          <w:tcPr>
-            <w:tcW w:type="dxa" w:w="1814"/>
-            <w:vAlign w:val="center"/>
-            <w:tcBorders>
-              <w:top w:val="single" w:sz="4" w:color="D9D9D9"/>
-              <w:left w:val="single" w:sz="4" w:color="D9D9D9"/>
-              <w:bottom w:val="single" w:sz="4" w:color="D9D9D9"/>
-              <w:right w:val="single" w:sz="4" w:color="D9D9D9"/>
-            </w:tcBorders>
-            <w:tcMar>
-              <w:top w:w="90" w:type="dxa"/>
-              <w:left w:w="90" w:type="dxa"/>
-              <w:bottom w:w="90" w:type="dxa"/>
-              <w:right w:w="90" w:type="dxa"/>
-            </w:tcMar>
-            <w:shd w:fill="DCE6EF"/>
-          </w:tcPr>
-          <w:p>
-            <w:pPr>
-              <w:spacing w:after="0" w:line="269" w:lineRule="auto"/>
-              <w:jc w:val="center"/>
-            </w:pPr>
-            <w:r>
-              <w:rPr>
-                <w:b/>
-                <w:sz w:val="20"/>
-              </w:rPr>
-              <w:t>准确率</w:t>
-            </w:r>
-          </w:p>
-        </w:tc>
-        <w:tc>
-          <w:tcPr>
-            <w:tcW w:type="dxa" w:w="2098"/>
-            <w:vAlign w:val="center"/>
-            <w:tcBorders>
-              <w:top w:val="single" w:sz="4" w:color="D9D9D9"/>
-              <w:left w:val="single" w:sz="4" w:color="D9D9D9"/>
-              <w:bottom w:val="single" w:sz="4" w:color="D9D9D9"/>
-              <w:right w:val="single" w:sz="4" w:color="D9D9D9"/>
-            </w:tcBorders>
-            <w:tcMar>
-              <w:top w:w="90" w:type="dxa"/>
-              <w:left w:w="90" w:type="dxa"/>
-              <w:bottom w:w="90" w:type="dxa"/>
-              <w:right w:w="90" w:type="dxa"/>
-            </w:tcMar>
-            <w:shd w:fill="DCE6EF"/>
-          </w:tcPr>
-          <w:p>
-            <w:pPr>
-              <w:spacing w:after="0" w:line="269" w:lineRule="auto"/>
-              <w:jc w:val="center"/>
-            </w:pPr>
-            <w:r>
-              <w:rPr>
-                <w:b/>
-                <w:sz w:val="20"/>
-              </w:rPr>
-              <w:t>相对Step120</w:t>
-            </w:r>
-          </w:p>
-        </w:tc>
-      </w:tr>
-      <w:tr>
-        <w:trPr>
-          <w:cantSplit/>
-        </w:trPr>
-        <w:tc>
-          <w:tcPr>
-            <w:tcW w:type="dxa" w:w="3685"/>
-            <w:vAlign w:val="center"/>
-            <w:tcBorders>
-              <w:top w:val="single" w:sz="4" w:color="D9D9D9"/>
-              <w:left w:val="single" w:sz="4" w:color="D9D9D9"/>
-              <w:bottom w:val="single" w:sz="4" w:color="D9D9D9"/>
-              <w:right w:val="single" w:sz="4" w:color="D9D9D9"/>
-            </w:tcBorders>
-            <w:tcMar>
-              <w:top w:w="90" w:type="dxa"/>
-              <w:left w:w="90" w:type="dxa"/>
-              <w:bottom w:w="90" w:type="dxa"/>
-              <w:right w:w="90" w:type="dxa"/>
-            </w:tcMar>
-          </w:tcPr>
-          <w:p>
-            <w:pPr>
-              <w:spacing w:after="0" w:line="269" w:lineRule="auto"/>
-              <w:jc w:val="left"/>
-            </w:pPr>
-            <w:r>
-              <w:rPr>
-                <w:b w:val="0"/>
-                <w:sz w:val="20"/>
-              </w:rPr>
-              <w:t>原始Step120</w:t>
-            </w:r>
-          </w:p>
-        </w:tc>
-        <w:tc>
-          <w:tcPr>
-            <w:tcW w:type="dxa" w:w="1928"/>
-            <w:vAlign w:val="center"/>
-            <w:tcBorders>
-              <w:top w:val="single" w:sz="4" w:color="D9D9D9"/>
-              <w:left w:val="single" w:sz="4" w:color="D9D9D9"/>
-              <w:bottom w:val="single" w:sz="4" w:color="D9D9D9"/>
-              <w:right w:val="single" w:sz="4" w:color="D9D9D9"/>
-            </w:tcBorders>
-            <w:tcMar>
-              <w:top w:w="90" w:type="dxa"/>
-              <w:left w:w="90" w:type="dxa"/>
-              <w:bottom w:w="90" w:type="dxa"/>
-              <w:right w:w="90" w:type="dxa"/>
-            </w:tcMar>
-          </w:tcPr>
-          <w:p>
-            <w:pPr>
-              <w:spacing w:after="0" w:line="269" w:lineRule="auto"/>
-              <w:jc w:val="center"/>
-            </w:pPr>
-            <w:r>
-              <w:rPr>
-                <w:b w:val="0"/>
-                <w:sz w:val="20"/>
-              </w:rPr>
-              <w:t>1369/1672</w:t>
-            </w:r>
-          </w:p>
-        </w:tc>
-        <w:tc>
-          <w:tcPr>
-            <w:tcW w:type="dxa" w:w="1814"/>
-            <w:vAlign w:val="center"/>
-            <w:tcBorders>
-              <w:top w:val="single" w:sz="4" w:color="D9D9D9"/>
-              <w:left w:val="single" w:sz="4" w:color="D9D9D9"/>
-              <w:bottom w:val="single" w:sz="4" w:color="D9D9D9"/>
-              <w:right w:val="single" w:sz="4" w:color="D9D9D9"/>
-            </w:tcBorders>
-            <w:tcMar>
-              <w:top w:w="90" w:type="dxa"/>
-              <w:left w:w="90" w:type="dxa"/>
-              <w:bottom w:w="90" w:type="dxa"/>
-              <w:right w:w="90" w:type="dxa"/>
-            </w:tcMar>
-          </w:tcPr>
-          <w:p>
-            <w:pPr>
-              <w:spacing w:after="0" w:line="269" w:lineRule="auto"/>
-              <w:jc w:val="center"/>
-            </w:pPr>
-            <w:r>
-              <w:rPr>
-                <w:b w:val="0"/>
-                <w:sz w:val="20"/>
-              </w:rPr>
-              <w:t>81.878%</w:t>
-            </w:r>
-          </w:p>
-        </w:tc>
-        <w:tc>
-          <w:tcPr>
-            <w:tcW w:type="dxa" w:w="2098"/>
-            <w:vAlign w:val="center"/>
-            <w:tcBorders>
-              <w:top w:val="single" w:sz="4" w:color="D9D9D9"/>
-              <w:left w:val="single" w:sz="4" w:color="D9D9D9"/>
-              <w:bottom w:val="single" w:sz="4" w:color="D9D9D9"/>
-              <w:right w:val="single" w:sz="4" w:color="D9D9D9"/>
-            </w:tcBorders>
-            <w:tcMar>
-              <w:top w:w="90" w:type="dxa"/>
-              <w:left w:w="90" w:type="dxa"/>
-              <w:bottom w:w="90" w:type="dxa"/>
-              <w:right w:w="90" w:type="dxa"/>
-            </w:tcMar>
-          </w:tcPr>
-          <w:p>
-            <w:pPr>
-              <w:spacing w:after="0" w:line="269" w:lineRule="auto"/>
-              <w:jc w:val="center"/>
-            </w:pPr>
-            <w:r>
-              <w:rPr>
-                <w:b w:val="0"/>
-                <w:sz w:val="20"/>
-              </w:rPr>
-              <w:t>—</w:t>
-            </w:r>
-          </w:p>
-        </w:tc>
-      </w:tr>
-      <w:tr>
-        <w:trPr>
-          <w:cantSplit/>
-        </w:trPr>
-        <w:tc>
-          <w:tcPr>
-            <w:tcW w:type="dxa" w:w="3685"/>
-            <w:vAlign w:val="center"/>
-            <w:tcBorders>
-              <w:top w:val="single" w:sz="4" w:color="D9D9D9"/>
-              <w:left w:val="single" w:sz="4" w:color="D9D9D9"/>
-              <w:bottom w:val="single" w:sz="4" w:color="D9D9D9"/>
-              <w:right w:val="single" w:sz="4" w:color="D9D9D9"/>
-            </w:tcBorders>
-            <w:tcMar>
-              <w:top w:w="90" w:type="dxa"/>
-              <w:left w:w="90" w:type="dxa"/>
-              <w:bottom w:w="90" w:type="dxa"/>
-              <w:right w:w="90" w:type="dxa"/>
-            </w:tcMar>
-          </w:tcPr>
-          <w:p>
-            <w:pPr>
-              <w:spacing w:after="0" w:line="269" w:lineRule="auto"/>
-              <w:jc w:val="left"/>
-            </w:pPr>
-            <w:r>
-              <w:rPr>
-                <w:b w:val="0"/>
-                <w:sz w:val="20"/>
-              </w:rPr>
-              <w:t>直接题面CPT  4遍</w:t>
-            </w:r>
-          </w:p>
-        </w:tc>
-        <w:tc>
-          <w:tcPr>
-            <w:tcW w:type="dxa" w:w="1928"/>
-            <w:vAlign w:val="center"/>
-            <w:tcBorders>
-              <w:top w:val="single" w:sz="4" w:color="D9D9D9"/>
-              <w:left w:val="single" w:sz="4" w:color="D9D9D9"/>
-              <w:bottom w:val="single" w:sz="4" w:color="D9D9D9"/>
-              <w:right w:val="single" w:sz="4" w:color="D9D9D9"/>
-            </w:tcBorders>
-            <w:tcMar>
-              <w:top w:w="90" w:type="dxa"/>
-              <w:left w:w="90" w:type="dxa"/>
-              <w:bottom w:w="90" w:type="dxa"/>
-              <w:right w:w="90" w:type="dxa"/>
-            </w:tcMar>
-          </w:tcPr>
-          <w:p>
-            <w:pPr>
-              <w:spacing w:after="0" w:line="269" w:lineRule="auto"/>
-              <w:jc w:val="center"/>
-            </w:pPr>
-            <w:r>
-              <w:rPr>
-                <w:b w:val="0"/>
-                <w:sz w:val="20"/>
-              </w:rPr>
-              <w:t>1381/1672</w:t>
-            </w:r>
-          </w:p>
-        </w:tc>
-        <w:tc>
-          <w:tcPr>
-            <w:tcW w:type="dxa" w:w="1814"/>
-            <w:vAlign w:val="center"/>
-            <w:tcBorders>
-              <w:top w:val="single" w:sz="4" w:color="D9D9D9"/>
-              <w:left w:val="single" w:sz="4" w:color="D9D9D9"/>
-              <w:bottom w:val="single" w:sz="4" w:color="D9D9D9"/>
-              <w:right w:val="single" w:sz="4" w:color="D9D9D9"/>
-            </w:tcBorders>
-            <w:tcMar>
-              <w:top w:w="90" w:type="dxa"/>
-              <w:left w:w="90" w:type="dxa"/>
-              <w:bottom w:w="90" w:type="dxa"/>
-              <w:right w:w="90" w:type="dxa"/>
-            </w:tcMar>
-          </w:tcPr>
-          <w:p>
-            <w:pPr>
-              <w:spacing w:after="0" w:line="269" w:lineRule="auto"/>
-              <w:jc w:val="center"/>
-            </w:pPr>
-            <w:r>
-              <w:rPr>
-                <w:b w:val="0"/>
-                <w:sz w:val="20"/>
-              </w:rPr>
-              <w:t>82.596%</w:t>
-            </w:r>
-          </w:p>
-        </w:tc>
-        <w:tc>
-          <w:tcPr>
-            <w:tcW w:type="dxa" w:w="2098"/>
-            <w:vAlign w:val="center"/>
-            <w:tcBorders>
-              <w:top w:val="single" w:sz="4" w:color="D9D9D9"/>
-              <w:left w:val="single" w:sz="4" w:color="D9D9D9"/>
-              <w:bottom w:val="single" w:sz="4" w:color="D9D9D9"/>
-              <w:right w:val="single" w:sz="4" w:color="D9D9D9"/>
-            </w:tcBorders>
-            <w:tcMar>
-              <w:top w:w="90" w:type="dxa"/>
-              <w:left w:w="90" w:type="dxa"/>
-              <w:bottom w:w="90" w:type="dxa"/>
-              <w:right w:w="90" w:type="dxa"/>
-            </w:tcMar>
-          </w:tcPr>
-          <w:p>
-            <w:pPr>
-              <w:spacing w:after="0" w:line="269" w:lineRule="auto"/>
-              <w:jc w:val="center"/>
-            </w:pPr>
-            <w:r>
-              <w:rPr>
-                <w:b w:val="0"/>
-                <w:sz w:val="20"/>
-              </w:rPr>
-              <w:t>+0.7177点</w:t>
-            </w:r>
-          </w:p>
-        </w:tc>
-      </w:tr>
-      <w:tr>
-        <w:trPr>
-          <w:cantSplit/>
-        </w:trPr>
-        <w:tc>
-          <w:tcPr>
-            <w:tcW w:type="dxa" w:w="3685"/>
-            <w:vAlign w:val="center"/>
-            <w:tcBorders>
-              <w:top w:val="single" w:sz="4" w:color="D9D9D9"/>
-              <w:left w:val="single" w:sz="4" w:color="D9D9D9"/>
-              <w:bottom w:val="single" w:sz="4" w:color="D9D9D9"/>
-              <w:right w:val="single" w:sz="4" w:color="D9D9D9"/>
-            </w:tcBorders>
-            <w:tcMar>
-              <w:top w:w="90" w:type="dxa"/>
-              <w:left w:w="90" w:type="dxa"/>
-              <w:bottom w:w="90" w:type="dxa"/>
-              <w:right w:w="90" w:type="dxa"/>
-            </w:tcMar>
-          </w:tcPr>
-          <w:p>
-            <w:pPr>
-              <w:spacing w:after="0" w:line="269" w:lineRule="auto"/>
-              <w:jc w:val="left"/>
-            </w:pPr>
-            <w:r>
-              <w:rPr>
-                <w:b w:val="0"/>
-                <w:sz w:val="20"/>
-              </w:rPr>
-              <w:t>改写题面CPT  4遍</w:t>
-            </w:r>
-          </w:p>
-        </w:tc>
-        <w:tc>
-          <w:tcPr>
-            <w:tcW w:type="dxa" w:w="1928"/>
-            <w:vAlign w:val="center"/>
-            <w:tcBorders>
-              <w:top w:val="single" w:sz="4" w:color="D9D9D9"/>
-              <w:left w:val="single" w:sz="4" w:color="D9D9D9"/>
-              <w:bottom w:val="single" w:sz="4" w:color="D9D9D9"/>
-              <w:right w:val="single" w:sz="4" w:color="D9D9D9"/>
-            </w:tcBorders>
-            <w:tcMar>
-              <w:top w:w="90" w:type="dxa"/>
-              <w:left w:w="90" w:type="dxa"/>
-              <w:bottom w:w="90" w:type="dxa"/>
-              <w:right w:w="90" w:type="dxa"/>
-            </w:tcMar>
-          </w:tcPr>
-          <w:p>
-            <w:pPr>
-              <w:spacing w:after="0" w:line="269" w:lineRule="auto"/>
-              <w:jc w:val="center"/>
-            </w:pPr>
-            <w:r>
-              <w:rPr>
-                <w:b w:val="0"/>
-                <w:sz w:val="20"/>
-              </w:rPr>
-              <w:t>1373/1672</w:t>
-            </w:r>
-          </w:p>
-        </w:tc>
-        <w:tc>
-          <w:tcPr>
-            <w:tcW w:type="dxa" w:w="1814"/>
-            <w:vAlign w:val="center"/>
-            <w:tcBorders>
-              <w:top w:val="single" w:sz="4" w:color="D9D9D9"/>
-              <w:left w:val="single" w:sz="4" w:color="D9D9D9"/>
-              <w:bottom w:val="single" w:sz="4" w:color="D9D9D9"/>
-              <w:right w:val="single" w:sz="4" w:color="D9D9D9"/>
-            </w:tcBorders>
-            <w:tcMar>
-              <w:top w:w="90" w:type="dxa"/>
-              <w:left w:w="90" w:type="dxa"/>
-              <w:bottom w:w="90" w:type="dxa"/>
-              <w:right w:w="90" w:type="dxa"/>
-            </w:tcMar>
-          </w:tcPr>
-          <w:p>
-            <w:pPr>
-              <w:spacing w:after="0" w:line="269" w:lineRule="auto"/>
-              <w:jc w:val="center"/>
-            </w:pPr>
-            <w:r>
-              <w:rPr>
-                <w:b w:val="0"/>
-                <w:sz w:val="20"/>
-              </w:rPr>
-              <w:t>82.117%</w:t>
-            </w:r>
-          </w:p>
-        </w:tc>
-        <w:tc>
-          <w:tcPr>
-            <w:tcW w:type="dxa" w:w="2098"/>
-            <w:vAlign w:val="center"/>
-            <w:tcBorders>
-              <w:top w:val="single" w:sz="4" w:color="D9D9D9"/>
-              <w:left w:val="single" w:sz="4" w:color="D9D9D9"/>
-              <w:bottom w:val="single" w:sz="4" w:color="D9D9D9"/>
-              <w:right w:val="single" w:sz="4" w:color="D9D9D9"/>
-            </w:tcBorders>
-            <w:tcMar>
-              <w:top w:w="90" w:type="dxa"/>
-              <w:left w:w="90" w:type="dxa"/>
-              <w:bottom w:w="90" w:type="dxa"/>
-              <w:right w:w="90" w:type="dxa"/>
-            </w:tcMar>
-          </w:tcPr>
-          <w:p>
-            <w:pPr>
-              <w:spacing w:after="0" w:line="269" w:lineRule="auto"/>
-              <w:jc w:val="center"/>
-            </w:pPr>
-            <w:r>
-              <w:rPr>
-                <w:b w:val="0"/>
-                <w:sz w:val="20"/>
-              </w:rPr>
-              <w:t>+0.2392点</w:t>
-            </w:r>
-          </w:p>
-        </w:tc>
-      </w:tr>
-    </w:tbl>
-    <w:p>
-      <w:r>
-        <w:t>直接组21题改对、9题改错，净增12题；改写组10题改对、6题改错，净增4题。直接组的未校正配对检验 p=0.0428，改写组 p=0.4545。准确表述是“有小幅提升，但实用增益有限”，不能笼统写成两组均统计不显著。</w:t>
-      </w:r>
-    </w:p>
-    <w:p>
-      <w:pPr>
-        <w:pStyle w:val="Heading2"/>
-      </w:pPr>
-      <w:r>
-        <w:t>训练发生了 为什么得分变化仍小</w:t>
-      </w:r>
-    </w:p>
-    <w:p>
-      <w:r>
-        <w:t>直接组第1至第4遍平均 loss 从3.8054降至2.1378，改写组从3.4648降至2.1423；训练和权重导出均通过校验。进一步只测答案位置，直接 CPT 在原训练块中的答案 NLL 从4.7873降到2.4873，但独立题面仅从2.8990降到2.6632，改善明显依赖上下文。[7]</w:t>
-      </w:r>
-    </w:p>
-    <w:p>
-      <w:r>
-        <w:t>书籍原文 CPT 的独立对照也呈现类似现象：增加至4遍后，书内 NLL 相对改善4.126%，但200道书内改写知识题仍为189/200；公开题三轮多数票仅从1369增至1371，提升0.1196个百分点。[8]</w:t>
-      </w:r>
-    </w:p>
-    <w:p>
-      <w:pPr>
-        <w:pStyle w:val="Heading2"/>
-      </w:pPr>
-      <w:r>
-        <w:t>阶段结论</w:t>
-      </w:r>
-    </w:p>
-    <w:p>
-      <w:r>
-        <w:t>文本预测能力的改善没有充分转化为问答得分，支持进一步检查知识吸收方式、答案监督位置和实际调用过程。不过，小幅增益既可能包含写入不足，也可能包含利用不足；结合闭卷探针，不宜下“知识无缺失”的确定结论。更准确的表述是：模型已有较多领域知识，但知识边界与应用仍不稳定。</w:t>
-      </w:r>
-    </w:p>
-    <w:p>
-      <w:r>
-        <w:t>本方案训练接触了评测题及答案，结果仅用于受控同题诊断，不能作为独立泛化成绩或交付能力证明。</w:t>
-      </w:r>
-    </w:p>
-    <w:p>
-      <w:r>
-        <w:br w:type="page"/>
-      </w:r>
-    </w:p>
-    <w:p>
-      <w:pPr>
-        <w:pStyle w:val="Heading1"/>
-      </w:pPr>
-      <w:r>
-        <w:t>四 方案二 书籍转问答对进行SFT</w:t>
-      </w:r>
-    </w:p>
-    <w:p>
-      <w:r>
-        <w:t>尚未开展训练  本节预留</w:t>
-      </w:r>
-    </w:p>
-    <w:p/>
-    <w:p/>
-    <w:p/>
-    <w:p>
-      <w:pPr>
-        <w:pStyle w:val="Heading1"/>
-      </w:pPr>
-      <w:r>
-        <w:t>五 方案三 原始模型对照</w:t>
-      </w:r>
-    </w:p>
-    <w:p>
-      <w:r>
-        <w:t>本方案保留未接受本轮 CPT 或 SFT 的原始 Step120，作为全部后续实验的共同起点。这里“原始”指8月25日完成开源数据续训的 Step120，并非完全未经后训练的原生开源模型；原生模型另列为背景参考。[1][2]</w:t>
-      </w:r>
-    </w:p>
-    <w:tbl>
-      <w:tblPr>
-        <w:tblW w:type="auto" w:w="0"/>
-        <w:jc w:val="center"/>
-        <w:tblLayout w:type="fixed"/>
-        <w:tblLook w:firstColumn="1" w:firstRow="1" w:lastColumn="0" w:lastRow="0" w:noHBand="0" w:noVBand="1" w:val="04A0"/>
-      </w:tblPr>
-      <w:tblGrid>
         <w:gridCol w:w="3572"/>
         <w:gridCol w:w="1984"/>
-        <w:gridCol w:w="1984"/>
-        <w:gridCol w:w="1984"/>
+        <w:gridCol w:w="1928"/>
+        <w:gridCol w:w="1928"/>
       </w:tblGrid>
       <w:tr>
         <w:trPr>
@@ -1744,25 +1319,28 @@
               <w:bottom w:val="single" w:sz="4" w:color="D9D9D9"/>
               <w:right w:val="single" w:sz="4" w:color="D9D9D9"/>
             </w:tcBorders>
+            <w:shd w:fill="243E56"/>
             <w:tcMar>
-              <w:top w:w="90" w:type="dxa"/>
-              <w:left w:w="90" w:type="dxa"/>
-              <w:bottom w:w="90" w:type="dxa"/>
-              <w:right w:w="90" w:type="dxa"/>
+              <w:top w:w="135" w:type="dxa"/>
+              <w:bottom w:w="135" w:type="dxa"/>
+              <w:left w:w="125" w:type="dxa"/>
+              <w:right w:w="125" w:type="dxa"/>
             </w:tcMar>
-            <w:shd w:fill="DCE6EF"/>
           </w:tcPr>
           <w:p>
             <w:pPr>
-              <w:spacing w:after="0" w:line="269" w:lineRule="auto"/>
+              <w:keepNext/>
+              <w:spacing w:after="0" w:line="280" w:lineRule="exact"/>
               <w:jc w:val="left"/>
             </w:pPr>
             <w:r>
               <w:rPr>
+                <w:rFonts w:ascii="Arial" w:hAnsi="Arial" w:eastAsia="Microsoft YaHei"/>
                 <w:b/>
-                <w:sz w:val="20"/>
+                <w:color w:val="FFFFFF"/>
+                <w:sz w:val="21"/>
               </w:rPr>
-              <w:t>对照对象</w:t>
+              <w:t>模型</w:t>
             </w:r>
           </w:p>
         </w:tc>
@@ -1776,31 +1354,34 @@
               <w:bottom w:val="single" w:sz="4" w:color="D9D9D9"/>
               <w:right w:val="single" w:sz="4" w:color="D9D9D9"/>
             </w:tcBorders>
+            <w:shd w:fill="243E56"/>
             <w:tcMar>
-              <w:top w:w="90" w:type="dxa"/>
-              <w:left w:w="90" w:type="dxa"/>
-              <w:bottom w:w="90" w:type="dxa"/>
-              <w:right w:w="90" w:type="dxa"/>
+              <w:top w:w="135" w:type="dxa"/>
+              <w:bottom w:w="135" w:type="dxa"/>
+              <w:left w:w="125" w:type="dxa"/>
+              <w:right w:w="125" w:type="dxa"/>
             </w:tcMar>
-            <w:shd w:fill="DCE6EF"/>
           </w:tcPr>
           <w:p>
             <w:pPr>
-              <w:spacing w:after="0" w:line="269" w:lineRule="auto"/>
+              <w:keepNext/>
+              <w:spacing w:after="0" w:line="280" w:lineRule="exact"/>
               <w:jc w:val="center"/>
             </w:pPr>
             <w:r>
               <w:rPr>
+                <w:rFonts w:ascii="Arial" w:hAnsi="Arial" w:eastAsia="Microsoft YaHei"/>
                 <w:b/>
-                <w:sz w:val="20"/>
+                <w:color w:val="FFFFFF"/>
+                <w:sz w:val="21"/>
               </w:rPr>
-              <w:t>LogistikaBench</w:t>
+              <w:t>答对数</w:t>
             </w:r>
           </w:p>
         </w:tc>
         <w:tc>
           <w:tcPr>
-            <w:tcW w:type="dxa" w:w="1984"/>
+            <w:tcW w:type="dxa" w:w="1928"/>
             <w:vAlign w:val="center"/>
             <w:tcBorders>
               <w:top w:val="single" w:sz="4" w:color="D9D9D9"/>
@@ -1808,31 +1389,34 @@
               <w:bottom w:val="single" w:sz="4" w:color="D9D9D9"/>
               <w:right w:val="single" w:sz="4" w:color="D9D9D9"/>
             </w:tcBorders>
+            <w:shd w:fill="243E56"/>
             <w:tcMar>
-              <w:top w:w="90" w:type="dxa"/>
-              <w:left w:w="90" w:type="dxa"/>
-              <w:bottom w:w="90" w:type="dxa"/>
-              <w:right w:w="90" w:type="dxa"/>
+              <w:top w:w="135" w:type="dxa"/>
+              <w:bottom w:w="135" w:type="dxa"/>
+              <w:left w:w="125" w:type="dxa"/>
+              <w:right w:w="125" w:type="dxa"/>
             </w:tcMar>
-            <w:shd w:fill="DCE6EF"/>
           </w:tcPr>
           <w:p>
             <w:pPr>
-              <w:spacing w:after="0" w:line="269" w:lineRule="auto"/>
+              <w:keepNext/>
+              <w:spacing w:after="0" w:line="280" w:lineRule="exact"/>
               <w:jc w:val="center"/>
             </w:pPr>
             <w:r>
               <w:rPr>
+                <w:rFonts w:ascii="Arial" w:hAnsi="Arial" w:eastAsia="Microsoft YaHei"/>
                 <w:b/>
-                <w:sz w:val="20"/>
+                <w:color w:val="FFFFFF"/>
+                <w:sz w:val="21"/>
               </w:rPr>
-              <w:t>SC-bench知识题</w:t>
+              <w:t>准确率</w:t>
             </w:r>
           </w:p>
         </w:tc>
         <w:tc>
           <w:tcPr>
-            <w:tcW w:type="dxa" w:w="1984"/>
+            <w:tcW w:type="dxa" w:w="1928"/>
             <w:vAlign w:val="center"/>
             <w:tcBorders>
               <w:top w:val="single" w:sz="4" w:color="D9D9D9"/>
@@ -1840,25 +1424,28 @@
               <w:bottom w:val="single" w:sz="4" w:color="D9D9D9"/>
               <w:right w:val="single" w:sz="4" w:color="D9D9D9"/>
             </w:tcBorders>
+            <w:shd w:fill="243E56"/>
             <w:tcMar>
-              <w:top w:w="90" w:type="dxa"/>
-              <w:left w:w="90" w:type="dxa"/>
-              <w:bottom w:w="90" w:type="dxa"/>
-              <w:right w:w="90" w:type="dxa"/>
+              <w:top w:w="135" w:type="dxa"/>
+              <w:bottom w:w="135" w:type="dxa"/>
+              <w:left w:w="125" w:type="dxa"/>
+              <w:right w:w="125" w:type="dxa"/>
             </w:tcMar>
-            <w:shd w:fill="DCE6EF"/>
           </w:tcPr>
           <w:p>
             <w:pPr>
-              <w:spacing w:after="0" w:line="269" w:lineRule="auto"/>
+              <w:keepNext/>
+              <w:spacing w:after="0" w:line="280" w:lineRule="exact"/>
               <w:jc w:val="center"/>
             </w:pPr>
             <w:r>
               <w:rPr>
+                <w:rFonts w:ascii="Arial" w:hAnsi="Arial" w:eastAsia="Microsoft YaHei"/>
                 <w:b/>
-                <w:sz w:val="20"/>
+                <w:color w:val="FFFFFF"/>
+                <w:sz w:val="21"/>
               </w:rPr>
-              <w:t>总体</w:t>
+              <w:t>相对Step120</w:t>
             </w:r>
           </w:p>
         </w:tc>
@@ -1877,24 +1464,28 @@
               <w:bottom w:val="single" w:sz="4" w:color="D9D9D9"/>
               <w:right w:val="single" w:sz="4" w:color="D9D9D9"/>
             </w:tcBorders>
+            <w:shd w:fill="F0F4F7"/>
             <w:tcMar>
-              <w:top w:w="90" w:type="dxa"/>
-              <w:left w:w="90" w:type="dxa"/>
-              <w:bottom w:w="90" w:type="dxa"/>
-              <w:right w:w="90" w:type="dxa"/>
+              <w:top w:w="135" w:type="dxa"/>
+              <w:bottom w:w="135" w:type="dxa"/>
+              <w:left w:w="125" w:type="dxa"/>
+              <w:right w:w="125" w:type="dxa"/>
             </w:tcMar>
           </w:tcPr>
           <w:p>
             <w:pPr>
-              <w:spacing w:after="0" w:line="269" w:lineRule="auto"/>
+              <w:keepNext/>
+              <w:spacing w:after="0" w:line="280" w:lineRule="exact"/>
               <w:jc w:val="left"/>
             </w:pPr>
             <w:r>
               <w:rPr>
+                <w:rFonts w:ascii="Arial" w:hAnsi="Arial" w:eastAsia="Microsoft YaHei"/>
                 <w:b w:val="0"/>
-                <w:sz w:val="20"/>
+                <w:color w:val="202020"/>
+                <w:sz w:val="21"/>
               </w:rPr>
-              <w:t>原生Qwen3.6-27B</w:t>
+              <w:t>原始Step120</w:t>
             </w:r>
           </w:p>
         </w:tc>
@@ -1908,30 +1499,34 @@
               <w:bottom w:val="single" w:sz="4" w:color="D9D9D9"/>
               <w:right w:val="single" w:sz="4" w:color="D9D9D9"/>
             </w:tcBorders>
+            <w:shd w:fill="F0F4F7"/>
             <w:tcMar>
-              <w:top w:w="90" w:type="dxa"/>
-              <w:left w:w="90" w:type="dxa"/>
-              <w:bottom w:w="90" w:type="dxa"/>
-              <w:right w:w="90" w:type="dxa"/>
+              <w:top w:w="135" w:type="dxa"/>
+              <w:bottom w:w="135" w:type="dxa"/>
+              <w:left w:w="125" w:type="dxa"/>
+              <w:right w:w="125" w:type="dxa"/>
             </w:tcMar>
           </w:tcPr>
           <w:p>
             <w:pPr>
-              <w:spacing w:after="0" w:line="269" w:lineRule="auto"/>
+              <w:keepNext/>
+              <w:spacing w:after="0" w:line="280" w:lineRule="exact"/>
               <w:jc w:val="center"/>
             </w:pPr>
             <w:r>
               <w:rPr>
+                <w:rFonts w:ascii="Arial" w:hAnsi="Arial" w:eastAsia="Microsoft YaHei"/>
                 <w:b w:val="0"/>
-                <w:sz w:val="20"/>
+                <w:color w:val="202020"/>
+                <w:sz w:val="21"/>
               </w:rPr>
-              <w:t>1175/1446</w:t>
+              <w:t>1369/1672</w:t>
             </w:r>
           </w:p>
         </w:tc>
         <w:tc>
           <w:tcPr>
-            <w:tcW w:type="dxa" w:w="1984"/>
+            <w:tcW w:type="dxa" w:w="1928"/>
             <w:vAlign w:val="center"/>
             <w:tcBorders>
               <w:top w:val="single" w:sz="4" w:color="D9D9D9"/>
@@ -1939,30 +1534,34 @@
               <w:bottom w:val="single" w:sz="4" w:color="D9D9D9"/>
               <w:right w:val="single" w:sz="4" w:color="D9D9D9"/>
             </w:tcBorders>
+            <w:shd w:fill="F0F4F7"/>
             <w:tcMar>
-              <w:top w:w="90" w:type="dxa"/>
-              <w:left w:w="90" w:type="dxa"/>
-              <w:bottom w:w="90" w:type="dxa"/>
-              <w:right w:w="90" w:type="dxa"/>
+              <w:top w:w="135" w:type="dxa"/>
+              <w:bottom w:w="135" w:type="dxa"/>
+              <w:left w:w="125" w:type="dxa"/>
+              <w:right w:w="125" w:type="dxa"/>
             </w:tcMar>
           </w:tcPr>
           <w:p>
             <w:pPr>
-              <w:spacing w:after="0" w:line="269" w:lineRule="auto"/>
+              <w:keepNext/>
+              <w:spacing w:after="0" w:line="280" w:lineRule="exact"/>
               <w:jc w:val="center"/>
             </w:pPr>
             <w:r>
               <w:rPr>
+                <w:rFonts w:ascii="Arial" w:hAnsi="Arial" w:eastAsia="Microsoft YaHei"/>
                 <w:b w:val="0"/>
-                <w:sz w:val="20"/>
+                <w:color w:val="202020"/>
+                <w:sz w:val="21"/>
               </w:rPr>
-              <w:t>188/226</w:t>
+              <w:t>81.878%</w:t>
             </w:r>
           </w:p>
         </w:tc>
         <w:tc>
           <w:tcPr>
-            <w:tcW w:type="dxa" w:w="1984"/>
+            <w:tcW w:type="dxa" w:w="1928"/>
             <w:vAlign w:val="center"/>
             <w:tcBorders>
               <w:top w:val="single" w:sz="4" w:color="D9D9D9"/>
@@ -1970,24 +1569,28 @@
               <w:bottom w:val="single" w:sz="4" w:color="D9D9D9"/>
               <w:right w:val="single" w:sz="4" w:color="D9D9D9"/>
             </w:tcBorders>
+            <w:shd w:fill="F0F4F7"/>
             <w:tcMar>
-              <w:top w:w="90" w:type="dxa"/>
-              <w:left w:w="90" w:type="dxa"/>
-              <w:bottom w:w="90" w:type="dxa"/>
-              <w:right w:w="90" w:type="dxa"/>
+              <w:top w:w="135" w:type="dxa"/>
+              <w:bottom w:w="135" w:type="dxa"/>
+              <w:left w:w="125" w:type="dxa"/>
+              <w:right w:w="125" w:type="dxa"/>
             </w:tcMar>
           </w:tcPr>
           <w:p>
             <w:pPr>
-              <w:spacing w:after="0" w:line="269" w:lineRule="auto"/>
+              <w:keepNext/>
+              <w:spacing w:after="0" w:line="280" w:lineRule="exact"/>
               <w:jc w:val="center"/>
             </w:pPr>
             <w:r>
               <w:rPr>
+                <w:rFonts w:ascii="Arial" w:hAnsi="Arial" w:eastAsia="Microsoft YaHei"/>
                 <w:b w:val="0"/>
-                <w:sz w:val="20"/>
+                <w:color w:val="202020"/>
+                <w:sz w:val="21"/>
               </w:rPr>
-              <w:t>1363/1672</w:t>
+              <w:t>—</w:t>
             </w:r>
           </w:p>
         </w:tc>
@@ -2006,22 +1609,755 @@
               <w:bottom w:val="single" w:sz="4" w:color="D9D9D9"/>
               <w:right w:val="single" w:sz="4" w:color="D9D9D9"/>
             </w:tcBorders>
+            <w:shd w:fill="FFFFFF"/>
             <w:tcMar>
-              <w:top w:w="90" w:type="dxa"/>
-              <w:left w:w="90" w:type="dxa"/>
-              <w:bottom w:w="90" w:type="dxa"/>
-              <w:right w:w="90" w:type="dxa"/>
+              <w:top w:w="135" w:type="dxa"/>
+              <w:bottom w:w="135" w:type="dxa"/>
+              <w:left w:w="125" w:type="dxa"/>
+              <w:right w:w="125" w:type="dxa"/>
             </w:tcMar>
           </w:tcPr>
           <w:p>
             <w:pPr>
-              <w:spacing w:after="0" w:line="269" w:lineRule="auto"/>
+              <w:keepNext/>
+              <w:spacing w:after="0" w:line="280" w:lineRule="exact"/>
               <w:jc w:val="left"/>
             </w:pPr>
             <w:r>
               <w:rPr>
+                <w:rFonts w:ascii="Arial" w:hAnsi="Arial" w:eastAsia="Microsoft YaHei"/>
                 <w:b w:val="0"/>
-                <w:sz w:val="20"/>
+                <w:color w:val="202020"/>
+                <w:sz w:val="21"/>
+              </w:rPr>
+              <w:t>直接题面CPT  4遍</w:t>
+            </w:r>
+          </w:p>
+        </w:tc>
+        <w:tc>
+          <w:tcPr>
+            <w:tcW w:type="dxa" w:w="1984"/>
+            <w:vAlign w:val="center"/>
+            <w:tcBorders>
+              <w:top w:val="single" w:sz="4" w:color="D9D9D9"/>
+              <w:left w:val="single" w:sz="4" w:color="D9D9D9"/>
+              <w:bottom w:val="single" w:sz="4" w:color="D9D9D9"/>
+              <w:right w:val="single" w:sz="4" w:color="D9D9D9"/>
+            </w:tcBorders>
+            <w:shd w:fill="FFFFFF"/>
+            <w:tcMar>
+              <w:top w:w="135" w:type="dxa"/>
+              <w:bottom w:w="135" w:type="dxa"/>
+              <w:left w:w="125" w:type="dxa"/>
+              <w:right w:w="125" w:type="dxa"/>
+            </w:tcMar>
+          </w:tcPr>
+          <w:p>
+            <w:pPr>
+              <w:keepNext/>
+              <w:spacing w:after="0" w:line="280" w:lineRule="exact"/>
+              <w:jc w:val="center"/>
+            </w:pPr>
+            <w:r>
+              <w:rPr>
+                <w:rFonts w:ascii="Arial" w:hAnsi="Arial" w:eastAsia="Microsoft YaHei"/>
+                <w:b w:val="0"/>
+                <w:color w:val="202020"/>
+                <w:sz w:val="21"/>
+              </w:rPr>
+              <w:t>1381/1672</w:t>
+            </w:r>
+          </w:p>
+        </w:tc>
+        <w:tc>
+          <w:tcPr>
+            <w:tcW w:type="dxa" w:w="1928"/>
+            <w:vAlign w:val="center"/>
+            <w:tcBorders>
+              <w:top w:val="single" w:sz="4" w:color="D9D9D9"/>
+              <w:left w:val="single" w:sz="4" w:color="D9D9D9"/>
+              <w:bottom w:val="single" w:sz="4" w:color="D9D9D9"/>
+              <w:right w:val="single" w:sz="4" w:color="D9D9D9"/>
+            </w:tcBorders>
+            <w:shd w:fill="FFFFFF"/>
+            <w:tcMar>
+              <w:top w:w="135" w:type="dxa"/>
+              <w:bottom w:w="135" w:type="dxa"/>
+              <w:left w:w="125" w:type="dxa"/>
+              <w:right w:w="125" w:type="dxa"/>
+            </w:tcMar>
+          </w:tcPr>
+          <w:p>
+            <w:pPr>
+              <w:keepNext/>
+              <w:spacing w:after="0" w:line="280" w:lineRule="exact"/>
+              <w:jc w:val="center"/>
+            </w:pPr>
+            <w:r>
+              <w:rPr>
+                <w:rFonts w:ascii="Arial" w:hAnsi="Arial" w:eastAsia="Microsoft YaHei"/>
+                <w:b w:val="0"/>
+                <w:color w:val="202020"/>
+                <w:sz w:val="21"/>
+              </w:rPr>
+              <w:t>82.596%</w:t>
+            </w:r>
+          </w:p>
+        </w:tc>
+        <w:tc>
+          <w:tcPr>
+            <w:tcW w:type="dxa" w:w="1928"/>
+            <w:vAlign w:val="center"/>
+            <w:tcBorders>
+              <w:top w:val="single" w:sz="4" w:color="D9D9D9"/>
+              <w:left w:val="single" w:sz="4" w:color="D9D9D9"/>
+              <w:bottom w:val="single" w:sz="4" w:color="D9D9D9"/>
+              <w:right w:val="single" w:sz="4" w:color="D9D9D9"/>
+            </w:tcBorders>
+            <w:shd w:fill="FFFFFF"/>
+            <w:tcMar>
+              <w:top w:w="135" w:type="dxa"/>
+              <w:bottom w:w="135" w:type="dxa"/>
+              <w:left w:w="125" w:type="dxa"/>
+              <w:right w:w="125" w:type="dxa"/>
+            </w:tcMar>
+          </w:tcPr>
+          <w:p>
+            <w:pPr>
+              <w:keepNext/>
+              <w:spacing w:after="0" w:line="280" w:lineRule="exact"/>
+              <w:jc w:val="center"/>
+            </w:pPr>
+            <w:r>
+              <w:rPr>
+                <w:rFonts w:ascii="Arial" w:hAnsi="Arial" w:eastAsia="Microsoft YaHei"/>
+                <w:b w:val="0"/>
+                <w:color w:val="202020"/>
+                <w:sz w:val="21"/>
+              </w:rPr>
+              <w:t>+0.7177点</w:t>
+            </w:r>
+          </w:p>
+        </w:tc>
+      </w:tr>
+      <w:tr>
+        <w:trPr>
+          <w:cantSplit/>
+        </w:trPr>
+        <w:tc>
+          <w:tcPr>
+            <w:tcW w:type="dxa" w:w="3572"/>
+            <w:vAlign w:val="center"/>
+            <w:tcBorders>
+              <w:top w:val="single" w:sz="4" w:color="D9D9D9"/>
+              <w:left w:val="single" w:sz="4" w:color="D9D9D9"/>
+              <w:bottom w:val="single" w:sz="4" w:color="D9D9D9"/>
+              <w:right w:val="single" w:sz="4" w:color="D9D9D9"/>
+            </w:tcBorders>
+            <w:shd w:fill="F0F4F7"/>
+            <w:tcMar>
+              <w:top w:w="135" w:type="dxa"/>
+              <w:bottom w:w="135" w:type="dxa"/>
+              <w:left w:w="125" w:type="dxa"/>
+              <w:right w:w="125" w:type="dxa"/>
+            </w:tcMar>
+          </w:tcPr>
+          <w:p>
+            <w:pPr>
+              <w:keepNext w:val="0"/>
+              <w:spacing w:after="0" w:line="280" w:lineRule="exact"/>
+              <w:jc w:val="left"/>
+            </w:pPr>
+            <w:r>
+              <w:rPr>
+                <w:rFonts w:ascii="Arial" w:hAnsi="Arial" w:eastAsia="Microsoft YaHei"/>
+                <w:b w:val="0"/>
+                <w:color w:val="202020"/>
+                <w:sz w:val="21"/>
+              </w:rPr>
+              <w:t>改写题面CPT  4遍</w:t>
+            </w:r>
+          </w:p>
+        </w:tc>
+        <w:tc>
+          <w:tcPr>
+            <w:tcW w:type="dxa" w:w="1984"/>
+            <w:vAlign w:val="center"/>
+            <w:tcBorders>
+              <w:top w:val="single" w:sz="4" w:color="D9D9D9"/>
+              <w:left w:val="single" w:sz="4" w:color="D9D9D9"/>
+              <w:bottom w:val="single" w:sz="4" w:color="D9D9D9"/>
+              <w:right w:val="single" w:sz="4" w:color="D9D9D9"/>
+            </w:tcBorders>
+            <w:shd w:fill="F0F4F7"/>
+            <w:tcMar>
+              <w:top w:w="135" w:type="dxa"/>
+              <w:bottom w:w="135" w:type="dxa"/>
+              <w:left w:w="125" w:type="dxa"/>
+              <w:right w:w="125" w:type="dxa"/>
+            </w:tcMar>
+          </w:tcPr>
+          <w:p>
+            <w:pPr>
+              <w:keepNext w:val="0"/>
+              <w:spacing w:after="0" w:line="280" w:lineRule="exact"/>
+              <w:jc w:val="center"/>
+            </w:pPr>
+            <w:r>
+              <w:rPr>
+                <w:rFonts w:ascii="Arial" w:hAnsi="Arial" w:eastAsia="Microsoft YaHei"/>
+                <w:b w:val="0"/>
+                <w:color w:val="202020"/>
+                <w:sz w:val="21"/>
+              </w:rPr>
+              <w:t>1373/1672</w:t>
+            </w:r>
+          </w:p>
+        </w:tc>
+        <w:tc>
+          <w:tcPr>
+            <w:tcW w:type="dxa" w:w="1928"/>
+            <w:vAlign w:val="center"/>
+            <w:tcBorders>
+              <w:top w:val="single" w:sz="4" w:color="D9D9D9"/>
+              <w:left w:val="single" w:sz="4" w:color="D9D9D9"/>
+              <w:bottom w:val="single" w:sz="4" w:color="D9D9D9"/>
+              <w:right w:val="single" w:sz="4" w:color="D9D9D9"/>
+            </w:tcBorders>
+            <w:shd w:fill="F0F4F7"/>
+            <w:tcMar>
+              <w:top w:w="135" w:type="dxa"/>
+              <w:bottom w:w="135" w:type="dxa"/>
+              <w:left w:w="125" w:type="dxa"/>
+              <w:right w:w="125" w:type="dxa"/>
+            </w:tcMar>
+          </w:tcPr>
+          <w:p>
+            <w:pPr>
+              <w:keepNext w:val="0"/>
+              <w:spacing w:after="0" w:line="280" w:lineRule="exact"/>
+              <w:jc w:val="center"/>
+            </w:pPr>
+            <w:r>
+              <w:rPr>
+                <w:rFonts w:ascii="Arial" w:hAnsi="Arial" w:eastAsia="Microsoft YaHei"/>
+                <w:b w:val="0"/>
+                <w:color w:val="202020"/>
+                <w:sz w:val="21"/>
+              </w:rPr>
+              <w:t>82.117%</w:t>
+            </w:r>
+          </w:p>
+        </w:tc>
+        <w:tc>
+          <w:tcPr>
+            <w:tcW w:type="dxa" w:w="1928"/>
+            <w:vAlign w:val="center"/>
+            <w:tcBorders>
+              <w:top w:val="single" w:sz="4" w:color="D9D9D9"/>
+              <w:left w:val="single" w:sz="4" w:color="D9D9D9"/>
+              <w:bottom w:val="single" w:sz="4" w:color="D9D9D9"/>
+              <w:right w:val="single" w:sz="4" w:color="D9D9D9"/>
+            </w:tcBorders>
+            <w:shd w:fill="F0F4F7"/>
+            <w:tcMar>
+              <w:top w:w="135" w:type="dxa"/>
+              <w:bottom w:w="135" w:type="dxa"/>
+              <w:left w:w="125" w:type="dxa"/>
+              <w:right w:w="125" w:type="dxa"/>
+            </w:tcMar>
+          </w:tcPr>
+          <w:p>
+            <w:pPr>
+              <w:keepNext w:val="0"/>
+              <w:spacing w:after="0" w:line="280" w:lineRule="exact"/>
+              <w:jc w:val="center"/>
+            </w:pPr>
+            <w:r>
+              <w:rPr>
+                <w:rFonts w:ascii="Arial" w:hAnsi="Arial" w:eastAsia="Microsoft YaHei"/>
+                <w:b w:val="0"/>
+                <w:color w:val="202020"/>
+                <w:sz w:val="21"/>
+              </w:rPr>
+              <w:t>+0.2392点</w:t>
+            </w:r>
+          </w:p>
+        </w:tc>
+      </w:tr>
+    </w:tbl>
+    <w:p>
+      <w:pPr>
+        <w:spacing w:before="140"/>
+        <w:jc w:val="both"/>
+      </w:pPr>
+      <w:r>
+        <w:t>直接组21题改对、9题改错，净增12题；改写组10题改对、6题改错，净增4题。直接组的未校正配对检验 p=0.0428，改写组 p=0.4545。准确表述是“有小幅提升，但实用增益有限”，不能笼统写成两组均统计不显著。</w:t>
+      </w:r>
+    </w:p>
+    <w:p>
+      <w:pPr>
+        <w:pStyle w:val="Heading2"/>
+      </w:pPr>
+      <w:r>
+        <w:rPr>
+          <w:rFonts w:eastAsia="Microsoft YaHei"/>
+        </w:rPr>
+        <w:t>训练发生了 为什么得分变化仍小</w:t>
+      </w:r>
+    </w:p>
+    <w:p>
+      <w:pPr>
+        <w:jc w:val="both"/>
+      </w:pPr>
+      <w:r>
+        <w:t>直接组第1至第4遍平均 loss 从3.8054降至2.1378，改写组从3.4648降至2.1423；训练和权重导出均通过校验。进一步只测答案位置，直接 CPT 在原训练块中的答案 NLL 从4.7873降到2.4873，但独立题面仅从2.8990降到2.6632，改善明显依赖上下文。[7]</w:t>
+      </w:r>
+    </w:p>
+    <w:p>
+      <w:pPr>
+        <w:jc w:val="both"/>
+      </w:pPr>
+      <w:r>
+        <w:rPr>
+          <w:sz w:val="21"/>
+        </w:rPr>
+        <w:t>书籍原文 CPT 的独立对照也呈现类似现象：增加至4遍后，书内 NLL 相对改善4.126%，但200道书内改写知识题仍为189/200；公开题三轮多数票仅从1369增至1371，提升0.1196个百分点。[8]</w:t>
+      </w:r>
+    </w:p>
+    <w:p>
+      <w:pPr>
+        <w:pStyle w:val="Heading2"/>
+      </w:pPr>
+      <w:r>
+        <w:rPr>
+          <w:rFonts w:eastAsia="Microsoft YaHei"/>
+        </w:rPr>
+        <w:t>阶段结论</w:t>
+      </w:r>
+    </w:p>
+    <w:p>
+      <w:pPr>
+        <w:jc w:val="both"/>
+      </w:pPr>
+      <w:r>
+        <w:t>文本预测能力的改善没有充分转化为问答得分，支持进一步检查知识吸收方式、答案监督位置和实际调用过程。不过，小幅增益既可能包含写入不足，也可能包含利用不足；结合闭卷探针，不宜下“知识无缺失”的确定结论。更准确的表述是：模型已有较多领域知识，但知识边界与应用仍不稳定。</w:t>
+      </w:r>
+    </w:p>
+    <w:p>
+      <w:pPr>
+        <w:jc w:val="both"/>
+      </w:pPr>
+      <w:r>
+        <w:t>本方案训练接触了评测题及答案，结果仅用于受控同题诊断，不能作为独立泛化成绩或交付能力证明。</w:t>
+      </w:r>
+    </w:p>
+    <w:p>
+      <w:pPr>
+        <w:spacing w:after="0" w:line="240" w:lineRule="exact"/>
+        <w:jc w:val="both"/>
+      </w:pPr>
+      <w:r>
+        <w:br w:type="page"/>
+      </w:r>
+    </w:p>
+    <w:p>
+      <w:pPr>
+        <w:pStyle w:val="Heading1"/>
+      </w:pPr>
+      <w:r>
+        <w:rPr>
+          <w:rFonts w:eastAsia="Microsoft YaHei"/>
+        </w:rPr>
+        <w:t>四 方案二 书籍转问答对进行SFT</w:t>
+      </w:r>
+    </w:p>
+    <w:p>
+      <w:pPr>
+        <w:jc w:val="both"/>
+      </w:pPr>
+      <w:r>
+        <w:rPr>
+          <w:color w:val="666666"/>
+        </w:rPr>
+        <w:t>尚未开展训练  本节预留</w:t>
+      </w:r>
+    </w:p>
+    <w:p>
+      <w:pPr>
+        <w:spacing w:after="0" w:line="240" w:lineRule="exact"/>
+        <w:jc w:val="both"/>
+      </w:pPr>
+    </w:p>
+    <w:p>
+      <w:pPr>
+        <w:spacing w:after="0" w:line="240" w:lineRule="exact"/>
+        <w:jc w:val="both"/>
+      </w:pPr>
+    </w:p>
+    <w:p>
+      <w:pPr>
+        <w:spacing w:after="0" w:line="240" w:lineRule="exact"/>
+        <w:jc w:val="both"/>
+      </w:pPr>
+    </w:p>
+    <w:p>
+      <w:pPr>
+        <w:pStyle w:val="Heading1"/>
+      </w:pPr>
+      <w:r>
+        <w:rPr>
+          <w:rFonts w:eastAsia="Microsoft YaHei"/>
+        </w:rPr>
+        <w:t>五 方案三 原始模型对照</w:t>
+      </w:r>
+    </w:p>
+    <w:p>
+      <w:pPr>
+        <w:jc w:val="both"/>
+      </w:pPr>
+      <w:r>
+        <w:t>本方案保留未接受本轮 CPT 或 SFT 的原始 Step120，作为全部后续实验的共同起点。这里“原始”指8月25日完成开源数据续训的 Step120，并非完全未经后训练的原生开源模型；原生模型另列为背景参考。[1][2]</w:t>
+      </w:r>
+    </w:p>
+    <w:tbl>
+      <w:tblPr>
+        <w:tblW w:type="auto" w:w="0"/>
+        <w:jc w:val="center"/>
+        <w:tblLayout w:type="fixed"/>
+        <w:tblLook w:firstColumn="1" w:firstRow="1" w:lastColumn="0" w:lastRow="0" w:noHBand="0" w:noVBand="1" w:val="04A0"/>
+      </w:tblPr>
+      <w:tblGrid>
+        <w:gridCol w:w="3458"/>
+        <w:gridCol w:w="1984"/>
+        <w:gridCol w:w="1984"/>
+        <w:gridCol w:w="1984"/>
+      </w:tblGrid>
+      <w:tr>
+        <w:trPr>
+          <w:cantSplit/>
+          <w:tblHeader/>
+        </w:trPr>
+        <w:tc>
+          <w:tcPr>
+            <w:tcW w:type="dxa" w:w="3458"/>
+            <w:vAlign w:val="center"/>
+            <w:tcBorders>
+              <w:top w:val="single" w:sz="4" w:color="D9D9D9"/>
+              <w:left w:val="single" w:sz="4" w:color="D9D9D9"/>
+              <w:bottom w:val="single" w:sz="4" w:color="D9D9D9"/>
+              <w:right w:val="single" w:sz="4" w:color="D9D9D9"/>
+            </w:tcBorders>
+            <w:shd w:fill="243E56"/>
+            <w:tcMar>
+              <w:top w:w="135" w:type="dxa"/>
+              <w:bottom w:w="135" w:type="dxa"/>
+              <w:left w:w="125" w:type="dxa"/>
+              <w:right w:w="125" w:type="dxa"/>
+            </w:tcMar>
+          </w:tcPr>
+          <w:p>
+            <w:pPr>
+              <w:keepNext/>
+              <w:spacing w:after="0" w:line="280" w:lineRule="exact"/>
+              <w:jc w:val="left"/>
+            </w:pPr>
+            <w:r>
+              <w:rPr>
+                <w:rFonts w:ascii="Arial" w:hAnsi="Arial" w:eastAsia="Microsoft YaHei"/>
+                <w:b/>
+                <w:color w:val="FFFFFF"/>
+                <w:sz w:val="21"/>
+              </w:rPr>
+              <w:t>对照对象</w:t>
+            </w:r>
+          </w:p>
+        </w:tc>
+        <w:tc>
+          <w:tcPr>
+            <w:tcW w:type="dxa" w:w="1984"/>
+            <w:vAlign w:val="center"/>
+            <w:tcBorders>
+              <w:top w:val="single" w:sz="4" w:color="D9D9D9"/>
+              <w:left w:val="single" w:sz="4" w:color="D9D9D9"/>
+              <w:bottom w:val="single" w:sz="4" w:color="D9D9D9"/>
+              <w:right w:val="single" w:sz="4" w:color="D9D9D9"/>
+            </w:tcBorders>
+            <w:shd w:fill="243E56"/>
+            <w:tcMar>
+              <w:top w:w="135" w:type="dxa"/>
+              <w:bottom w:w="135" w:type="dxa"/>
+              <w:left w:w="125" w:type="dxa"/>
+              <w:right w:w="125" w:type="dxa"/>
+            </w:tcMar>
+          </w:tcPr>
+          <w:p>
+            <w:pPr>
+              <w:keepNext/>
+              <w:spacing w:after="0" w:line="280" w:lineRule="exact"/>
+              <w:jc w:val="center"/>
+            </w:pPr>
+            <w:r>
+              <w:rPr>
+                <w:rFonts w:ascii="Arial" w:hAnsi="Arial" w:eastAsia="Microsoft YaHei"/>
+                <w:b/>
+                <w:color w:val="FFFFFF"/>
+                <w:sz w:val="21"/>
+              </w:rPr>
+              <w:t>LogistikaBench</w:t>
+            </w:r>
+          </w:p>
+        </w:tc>
+        <w:tc>
+          <w:tcPr>
+            <w:tcW w:type="dxa" w:w="1984"/>
+            <w:vAlign w:val="center"/>
+            <w:tcBorders>
+              <w:top w:val="single" w:sz="4" w:color="D9D9D9"/>
+              <w:left w:val="single" w:sz="4" w:color="D9D9D9"/>
+              <w:bottom w:val="single" w:sz="4" w:color="D9D9D9"/>
+              <w:right w:val="single" w:sz="4" w:color="D9D9D9"/>
+            </w:tcBorders>
+            <w:shd w:fill="243E56"/>
+            <w:tcMar>
+              <w:top w:w="135" w:type="dxa"/>
+              <w:bottom w:w="135" w:type="dxa"/>
+              <w:left w:w="125" w:type="dxa"/>
+              <w:right w:w="125" w:type="dxa"/>
+            </w:tcMar>
+          </w:tcPr>
+          <w:p>
+            <w:pPr>
+              <w:keepNext/>
+              <w:spacing w:after="0" w:line="280" w:lineRule="exact"/>
+              <w:jc w:val="center"/>
+            </w:pPr>
+            <w:r>
+              <w:rPr>
+                <w:rFonts w:ascii="Arial" w:hAnsi="Arial" w:eastAsia="Microsoft YaHei"/>
+                <w:b/>
+                <w:color w:val="FFFFFF"/>
+                <w:sz w:val="21"/>
+              </w:rPr>
+              <w:t>SC-bench知识题</w:t>
+            </w:r>
+          </w:p>
+        </w:tc>
+        <w:tc>
+          <w:tcPr>
+            <w:tcW w:type="dxa" w:w="1984"/>
+            <w:vAlign w:val="center"/>
+            <w:tcBorders>
+              <w:top w:val="single" w:sz="4" w:color="D9D9D9"/>
+              <w:left w:val="single" w:sz="4" w:color="D9D9D9"/>
+              <w:bottom w:val="single" w:sz="4" w:color="D9D9D9"/>
+              <w:right w:val="single" w:sz="4" w:color="D9D9D9"/>
+            </w:tcBorders>
+            <w:shd w:fill="243E56"/>
+            <w:tcMar>
+              <w:top w:w="135" w:type="dxa"/>
+              <w:bottom w:w="135" w:type="dxa"/>
+              <w:left w:w="125" w:type="dxa"/>
+              <w:right w:w="125" w:type="dxa"/>
+            </w:tcMar>
+          </w:tcPr>
+          <w:p>
+            <w:pPr>
+              <w:keepNext/>
+              <w:spacing w:after="0" w:line="280" w:lineRule="exact"/>
+              <w:jc w:val="center"/>
+            </w:pPr>
+            <w:r>
+              <w:rPr>
+                <w:rFonts w:ascii="Arial" w:hAnsi="Arial" w:eastAsia="Microsoft YaHei"/>
+                <w:b/>
+                <w:color w:val="FFFFFF"/>
+                <w:sz w:val="21"/>
+              </w:rPr>
+              <w:t>总体</w:t>
+            </w:r>
+          </w:p>
+        </w:tc>
+      </w:tr>
+      <w:tr>
+        <w:trPr>
+          <w:cantSplit/>
+        </w:trPr>
+        <w:tc>
+          <w:tcPr>
+            <w:tcW w:type="dxa" w:w="3458"/>
+            <w:vAlign w:val="center"/>
+            <w:tcBorders>
+              <w:top w:val="single" w:sz="4" w:color="D9D9D9"/>
+              <w:left w:val="single" w:sz="4" w:color="D9D9D9"/>
+              <w:bottom w:val="single" w:sz="4" w:color="D9D9D9"/>
+              <w:right w:val="single" w:sz="4" w:color="D9D9D9"/>
+            </w:tcBorders>
+            <w:shd w:fill="F0F4F7"/>
+            <w:tcMar>
+              <w:top w:w="135" w:type="dxa"/>
+              <w:bottom w:w="135" w:type="dxa"/>
+              <w:left w:w="125" w:type="dxa"/>
+              <w:right w:w="125" w:type="dxa"/>
+            </w:tcMar>
+          </w:tcPr>
+          <w:p>
+            <w:pPr>
+              <w:keepNext/>
+              <w:spacing w:after="0" w:line="280" w:lineRule="exact"/>
+              <w:jc w:val="left"/>
+            </w:pPr>
+            <w:r>
+              <w:rPr>
+                <w:rFonts w:ascii="Arial" w:hAnsi="Arial" w:eastAsia="Microsoft YaHei"/>
+                <w:b w:val="0"/>
+                <w:color w:val="202020"/>
+                <w:sz w:val="21"/>
+              </w:rPr>
+              <w:t>原生Qwen3.6-27B</w:t>
+            </w:r>
+          </w:p>
+        </w:tc>
+        <w:tc>
+          <w:tcPr>
+            <w:tcW w:type="dxa" w:w="1984"/>
+            <w:vAlign w:val="center"/>
+            <w:tcBorders>
+              <w:top w:val="single" w:sz="4" w:color="D9D9D9"/>
+              <w:left w:val="single" w:sz="4" w:color="D9D9D9"/>
+              <w:bottom w:val="single" w:sz="4" w:color="D9D9D9"/>
+              <w:right w:val="single" w:sz="4" w:color="D9D9D9"/>
+            </w:tcBorders>
+            <w:shd w:fill="F0F4F7"/>
+            <w:tcMar>
+              <w:top w:w="135" w:type="dxa"/>
+              <w:bottom w:w="135" w:type="dxa"/>
+              <w:left w:w="125" w:type="dxa"/>
+              <w:right w:w="125" w:type="dxa"/>
+            </w:tcMar>
+          </w:tcPr>
+          <w:p>
+            <w:pPr>
+              <w:keepNext/>
+              <w:spacing w:after="0" w:line="280" w:lineRule="exact"/>
+              <w:jc w:val="center"/>
+            </w:pPr>
+            <w:r>
+              <w:rPr>
+                <w:rFonts w:ascii="Arial" w:hAnsi="Arial" w:eastAsia="Microsoft YaHei"/>
+                <w:b w:val="0"/>
+                <w:color w:val="202020"/>
+                <w:sz w:val="21"/>
+              </w:rPr>
+              <w:t>1175/1446</w:t>
+            </w:r>
+          </w:p>
+        </w:tc>
+        <w:tc>
+          <w:tcPr>
+            <w:tcW w:type="dxa" w:w="1984"/>
+            <w:vAlign w:val="center"/>
+            <w:tcBorders>
+              <w:top w:val="single" w:sz="4" w:color="D9D9D9"/>
+              <w:left w:val="single" w:sz="4" w:color="D9D9D9"/>
+              <w:bottom w:val="single" w:sz="4" w:color="D9D9D9"/>
+              <w:right w:val="single" w:sz="4" w:color="D9D9D9"/>
+            </w:tcBorders>
+            <w:shd w:fill="F0F4F7"/>
+            <w:tcMar>
+              <w:top w:w="135" w:type="dxa"/>
+              <w:bottom w:w="135" w:type="dxa"/>
+              <w:left w:w="125" w:type="dxa"/>
+              <w:right w:w="125" w:type="dxa"/>
+            </w:tcMar>
+          </w:tcPr>
+          <w:p>
+            <w:pPr>
+              <w:keepNext/>
+              <w:spacing w:after="0" w:line="280" w:lineRule="exact"/>
+              <w:jc w:val="center"/>
+            </w:pPr>
+            <w:r>
+              <w:rPr>
+                <w:rFonts w:ascii="Arial" w:hAnsi="Arial" w:eastAsia="Microsoft YaHei"/>
+                <w:b w:val="0"/>
+                <w:color w:val="202020"/>
+                <w:sz w:val="21"/>
+              </w:rPr>
+              <w:t>188/226</w:t>
+            </w:r>
+          </w:p>
+        </w:tc>
+        <w:tc>
+          <w:tcPr>
+            <w:tcW w:type="dxa" w:w="1984"/>
+            <w:vAlign w:val="center"/>
+            <w:tcBorders>
+              <w:top w:val="single" w:sz="4" w:color="D9D9D9"/>
+              <w:left w:val="single" w:sz="4" w:color="D9D9D9"/>
+              <w:bottom w:val="single" w:sz="4" w:color="D9D9D9"/>
+              <w:right w:val="single" w:sz="4" w:color="D9D9D9"/>
+            </w:tcBorders>
+            <w:shd w:fill="F0F4F7"/>
+            <w:tcMar>
+              <w:top w:w="135" w:type="dxa"/>
+              <w:bottom w:w="135" w:type="dxa"/>
+              <w:left w:w="125" w:type="dxa"/>
+              <w:right w:w="125" w:type="dxa"/>
+            </w:tcMar>
+          </w:tcPr>
+          <w:p>
+            <w:pPr>
+              <w:keepNext/>
+              <w:spacing w:after="0" w:line="280" w:lineRule="exact"/>
+              <w:jc w:val="center"/>
+            </w:pPr>
+            <w:r>
+              <w:rPr>
+                <w:rFonts w:ascii="Arial" w:hAnsi="Arial" w:eastAsia="Microsoft YaHei"/>
+                <w:b w:val="0"/>
+                <w:color w:val="202020"/>
+                <w:sz w:val="21"/>
+              </w:rPr>
+              <w:t>1363/1672</w:t>
+            </w:r>
+          </w:p>
+        </w:tc>
+      </w:tr>
+      <w:tr>
+        <w:trPr>
+          <w:cantSplit/>
+        </w:trPr>
+        <w:tc>
+          <w:tcPr>
+            <w:tcW w:type="dxa" w:w="3458"/>
+            <w:vAlign w:val="center"/>
+            <w:tcBorders>
+              <w:top w:val="single" w:sz="4" w:color="D9D9D9"/>
+              <w:left w:val="single" w:sz="4" w:color="D9D9D9"/>
+              <w:bottom w:val="single" w:sz="4" w:color="D9D9D9"/>
+              <w:right w:val="single" w:sz="4" w:color="D9D9D9"/>
+            </w:tcBorders>
+            <w:shd w:fill="FFFFFF"/>
+            <w:tcMar>
+              <w:top w:w="135" w:type="dxa"/>
+              <w:bottom w:w="135" w:type="dxa"/>
+              <w:left w:w="125" w:type="dxa"/>
+              <w:right w:w="125" w:type="dxa"/>
+            </w:tcMar>
+          </w:tcPr>
+          <w:p>
+            <w:pPr>
+              <w:keepNext w:val="0"/>
+              <w:spacing w:after="0" w:line="280" w:lineRule="exact"/>
+              <w:jc w:val="left"/>
+            </w:pPr>
+            <w:r>
+              <w:rPr>
+                <w:rFonts w:ascii="Arial" w:hAnsi="Arial" w:eastAsia="Microsoft YaHei"/>
+                <w:b w:val="0"/>
+                <w:color w:val="202020"/>
+                <w:sz w:val="21"/>
               </w:rPr>
               <w:t>原始Step120</w:t>
             </w:r>
@@ -2037,22 +2373,26 @@
               <w:bottom w:val="single" w:sz="4" w:color="D9D9D9"/>
               <w:right w:val="single" w:sz="4" w:color="D9D9D9"/>
             </w:tcBorders>
+            <w:shd w:fill="FFFFFF"/>
             <w:tcMar>
-              <w:top w:w="90" w:type="dxa"/>
-              <w:left w:w="90" w:type="dxa"/>
-              <w:bottom w:w="90" w:type="dxa"/>
-              <w:right w:w="90" w:type="dxa"/>
+              <w:top w:w="135" w:type="dxa"/>
+              <w:bottom w:w="135" w:type="dxa"/>
+              <w:left w:w="125" w:type="dxa"/>
+              <w:right w:w="125" w:type="dxa"/>
             </w:tcMar>
           </w:tcPr>
           <w:p>
             <w:pPr>
-              <w:spacing w:after="0" w:line="269" w:lineRule="auto"/>
+              <w:keepNext w:val="0"/>
+              <w:spacing w:after="0" w:line="280" w:lineRule="exact"/>
               <w:jc w:val="center"/>
             </w:pPr>
             <w:r>
               <w:rPr>
+                <w:rFonts w:ascii="Arial" w:hAnsi="Arial" w:eastAsia="Microsoft YaHei"/>
                 <w:b w:val="0"/>
-                <w:sz w:val="20"/>
+                <w:color w:val="202020"/>
+                <w:sz w:val="21"/>
               </w:rPr>
               <w:t>1180/1446</w:t>
             </w:r>
@@ -2068,22 +2408,26 @@
               <w:bottom w:val="single" w:sz="4" w:color="D9D9D9"/>
               <w:right w:val="single" w:sz="4" w:color="D9D9D9"/>
             </w:tcBorders>
+            <w:shd w:fill="FFFFFF"/>
             <w:tcMar>
-              <w:top w:w="90" w:type="dxa"/>
-              <w:left w:w="90" w:type="dxa"/>
-              <w:bottom w:w="90" w:type="dxa"/>
-              <w:right w:w="90" w:type="dxa"/>
+              <w:top w:w="135" w:type="dxa"/>
+              <w:bottom w:w="135" w:type="dxa"/>
+              <w:left w:w="125" w:type="dxa"/>
+              <w:right w:w="125" w:type="dxa"/>
             </w:tcMar>
           </w:tcPr>
           <w:p>
             <w:pPr>
-              <w:spacing w:after="0" w:line="269" w:lineRule="auto"/>
+              <w:keepNext w:val="0"/>
+              <w:spacing w:after="0" w:line="280" w:lineRule="exact"/>
               <w:jc w:val="center"/>
             </w:pPr>
             <w:r>
               <w:rPr>
+                <w:rFonts w:ascii="Arial" w:hAnsi="Arial" w:eastAsia="Microsoft YaHei"/>
                 <w:b w:val="0"/>
-                <w:sz w:val="20"/>
+                <w:color w:val="202020"/>
+                <w:sz w:val="21"/>
               </w:rPr>
               <w:t>189/226</w:t>
             </w:r>
@@ -2099,22 +2443,26 @@
               <w:bottom w:val="single" w:sz="4" w:color="D9D9D9"/>
               <w:right w:val="single" w:sz="4" w:color="D9D9D9"/>
             </w:tcBorders>
+            <w:shd w:fill="FFFFFF"/>
             <w:tcMar>
-              <w:top w:w="90" w:type="dxa"/>
-              <w:left w:w="90" w:type="dxa"/>
-              <w:bottom w:w="90" w:type="dxa"/>
-              <w:right w:w="90" w:type="dxa"/>
+              <w:top w:w="135" w:type="dxa"/>
+              <w:bottom w:w="135" w:type="dxa"/>
+              <w:left w:w="125" w:type="dxa"/>
+              <w:right w:w="125" w:type="dxa"/>
             </w:tcMar>
           </w:tcPr>
           <w:p>
             <w:pPr>
-              <w:spacing w:after="0" w:line="269" w:lineRule="auto"/>
+              <w:keepNext w:val="0"/>
+              <w:spacing w:after="0" w:line="280" w:lineRule="exact"/>
               <w:jc w:val="center"/>
             </w:pPr>
             <w:r>
               <w:rPr>
+                <w:rFonts w:ascii="Arial" w:hAnsi="Arial" w:eastAsia="Microsoft YaHei"/>
                 <w:b w:val="0"/>
-                <w:sz w:val="20"/>
+                <w:color w:val="202020"/>
+                <w:sz w:val="21"/>
               </w:rPr>
               <w:t>1369/1672</w:t>
             </w:r>
@@ -2123,6 +2471,10 @@
       </w:tr>
     </w:tbl>
     <w:p>
+      <w:pPr>
+        <w:spacing w:before="140"/>
+        <w:jc w:val="both"/>
+      </w:pPr>
       <w:r>
         <w:t>原始 Step120 的三轮多数票基线为81.878%。方案一的直接 CPT 和改写 CPT 分别对照这个基线计算增益。363题诊断、8题复核及12问闭卷探针也均使用原始 Step120，不使用已经接触评测答案的候选。</w:t>
       </w:r>
@@ -2132,15 +2484,24 @@
         <w:pStyle w:val="Heading2"/>
       </w:pPr>
       <w:r>
+        <w:rPr>
+          <w:rFonts w:eastAsia="Microsoft YaHei"/>
+        </w:rPr>
         <w:t>已完成的同题答案SFT仅作为辅助诊断</w:t>
       </w:r>
     </w:p>
     <w:p>
+      <w:pPr>
+        <w:jc w:val="both"/>
+      </w:pPr>
       <w:r>
         <w:t>另一组已完成实验使用全部1672道原题、完整选项及正确答案 JSON，仅监督答案与结束标记。训练1遍和2遍后，总体同题成绩分别为93.18%和94.44%，对照原始 Step120 的81.88%，说明直接匹配作答目标的监督可以显著提高同题拟合。[9]</w:t>
       </w:r>
     </w:p>
     <w:p>
+      <w:pPr>
+        <w:jc w:val="both"/>
+      </w:pPr>
       <w:r>
         <w:t>这组实验属于“评测题答案 SFT”，不是方案二的“独立书籍问答对 SFT”。它不能证明未见问题上的能力提升，也不能单独证明模型原先已拥有全部知识。方案二后续结果应与原始 Step120 在独立问题上比较。</w:t>
       </w:r>
@@ -2150,15 +2511,25 @@
         <w:pStyle w:val="Heading2"/>
       </w:pPr>
       <w:r>
+        <w:rPr>
+          <w:rFonts w:eastAsia="Microsoft YaHei"/>
+        </w:rPr>
         <w:t>当前可用于汇报的判断</w:t>
       </w:r>
     </w:p>
     <w:p>
+      <w:pPr>
+        <w:jc w:val="both"/>
+      </w:pPr>
       <w:r>
         <w:t>现有 GRPO 训练在物流知识问答上的新增收益有限。CPT 能改变文本与答案概率，但本轮转换方式产生的问答提升较小；直接答案监督能提高同题拟合。结合无训练探测，下一阶段值得验证独立书籍问答监督能否改善概念辨析和情景应用，同时继续保留知识校准、输入质量及原 Agent 能力回归检查。</w:t>
       </w:r>
     </w:p>
     <w:p>
+      <w:pPr>
+        <w:spacing w:after="0" w:line="240" w:lineRule="exact"/>
+        <w:jc w:val="both"/>
+      </w:pPr>
       <w:r>
         <w:br w:type="page"/>
       </w:r>
@@ -2168,10 +2539,16 @@
         <w:pStyle w:val="Heading1"/>
       </w:pPr>
       <w:r>
+        <w:rPr>
+          <w:rFonts w:eastAsia="Microsoft YaHei"/>
+        </w:rPr>
         <w:t>附录 实验身份与证据索引</w:t>
       </w:r>
     </w:p>
     <w:p>
+      <w:pPr>
+        <w:jc w:val="both"/>
+      </w:pPr>
       <w:r>
         <w:t>本报告对应2026年9月3日至7日物流知识实验。早期长程 Agent 实验中的同名 Step120、Qwen3.8 Step70／Step120 及其他沙箱奖励实验不并入本文分数。原生与Step120主比较采用同机同栈；不混用百炼 API 分数与本地模型归因。</w:t>
       </w:r>
@@ -2179,17 +2556,24 @@
     <w:p>
       <w:pPr>
         <w:pStyle w:val="Heading2"/>
+        <w:spacing w:before="160" w:after="60"/>
       </w:pPr>
       <w:r>
+        <w:rPr>
+          <w:rFonts w:eastAsia="Microsoft YaHei"/>
+          <w:sz w:val="22"/>
+        </w:rPr>
         <w:t>[1] 模型身份与训练起点</w:t>
       </w:r>
     </w:p>
     <w:p>
       <w:pPr>
-        <w:spacing w:after="80"/>
+        <w:spacing w:after="80" w:line="280" w:lineRule="exact" w:before="100"/>
+        <w:jc w:val="left"/>
       </w:pPr>
       <w:r>
         <w:rPr>
+          <w:color w:val="595959"/>
           <w:sz w:val="18"/>
         </w:rPr>
         <w:t>docs/qwen36_step120_logistics_adaptation_decision_20260903.md</w:t>
@@ -2198,17 +2582,24 @@
     <w:p>
       <w:pPr>
         <w:pStyle w:val="Heading2"/>
+        <w:spacing w:before="160" w:after="60"/>
       </w:pPr>
       <w:r>
+        <w:rPr>
+          <w:rFonts w:eastAsia="Microsoft YaHei"/>
+          <w:sz w:val="22"/>
+        </w:rPr>
         <w:t>[2] 原生与Step120正式基线</w:t>
       </w:r>
     </w:p>
     <w:p>
       <w:pPr>
-        <w:spacing w:after="80"/>
+        <w:spacing w:after="80" w:line="280" w:lineRule="exact" w:before="100"/>
+        <w:jc w:val="left"/>
       </w:pPr>
       <w:r>
         <w:rPr>
+          <w:color w:val="595959"/>
           <w:sz w:val="18"/>
         </w:rPr>
         <w:t>docs/qwen36_step120_logistics_stage0_evaluation_20260903.md</w:t>
@@ -2217,17 +2608,24 @@
     <w:p>
       <w:pPr>
         <w:pStyle w:val="Heading2"/>
+        <w:spacing w:before="160" w:after="60"/>
       </w:pPr>
       <w:r>
+        <w:rPr>
+          <w:rFonts w:eastAsia="Microsoft YaHei"/>
+          <w:sz w:val="22"/>
+        </w:rPr>
         <w:t>[3] 363题四条件诊断协议</w:t>
       </w:r>
     </w:p>
     <w:p>
       <w:pPr>
-        <w:spacing w:after="80"/>
+        <w:spacing w:after="80" w:line="280" w:lineRule="exact" w:before="100"/>
+        <w:jc w:val="left"/>
       </w:pPr>
       <w:r>
         <w:rPr>
+          <w:color w:val="595959"/>
           <w:sz w:val="18"/>
         </w:rPr>
         <w:t>docs/step120_qa_diagnostic_20260907.md</w:t>
@@ -2236,17 +2634,24 @@
     <w:p>
       <w:pPr>
         <w:pStyle w:val="Heading2"/>
+        <w:spacing w:before="160" w:after="60"/>
       </w:pPr>
       <w:r>
+        <w:rPr>
+          <w:rFonts w:eastAsia="Microsoft YaHei"/>
+          <w:sz w:val="22"/>
+        </w:rPr>
         <w:t>[4] 363题复算及8题补证结果</w:t>
       </w:r>
     </w:p>
     <w:p>
       <w:pPr>
-        <w:spacing w:after="80"/>
+        <w:spacing w:after="80" w:line="280" w:lineRule="exact" w:before="100"/>
+        <w:jc w:val="left"/>
       </w:pPr>
       <w:r>
         <w:rPr>
+          <w:color w:val="595959"/>
           <w:sz w:val="18"/>
         </w:rPr>
         <w:t>docs/step120_evidence_review_20260907.md</w:t>
@@ -2255,17 +2660,24 @@
     <w:p>
       <w:pPr>
         <w:pStyle w:val="Heading2"/>
+        <w:spacing w:before="160" w:after="60"/>
       </w:pPr>
       <w:r>
+        <w:rPr>
+          <w:rFonts w:eastAsia="Microsoft YaHei"/>
+          <w:sz w:val="22"/>
+        </w:rPr>
         <w:t>[5] 4个知识点的12问闭卷诊断</w:t>
       </w:r>
     </w:p>
     <w:p>
       <w:pPr>
-        <w:spacing w:after="80"/>
+        <w:spacing w:after="80" w:line="280" w:lineRule="exact" w:before="100"/>
+        <w:jc w:val="left"/>
       </w:pPr>
       <w:r>
         <w:rPr>
+          <w:color w:val="595959"/>
           <w:sz w:val="18"/>
         </w:rPr>
         <w:t>docs/step120_closed_knowledge_20260907.md</w:t>
@@ -2274,17 +2686,24 @@
     <w:p>
       <w:pPr>
         <w:pStyle w:val="Heading2"/>
+        <w:spacing w:before="160" w:after="60"/>
       </w:pPr>
       <w:r>
+        <w:rPr>
+          <w:rFonts w:eastAsia="Microsoft YaHei"/>
+          <w:sz w:val="22"/>
+        </w:rPr>
         <w:t>[6] 直接与改写CPT结果及历史更正</w:t>
       </w:r>
     </w:p>
     <w:p>
       <w:pPr>
-        <w:spacing w:after="80"/>
+        <w:spacing w:after="80" w:line="280" w:lineRule="exact" w:before="100"/>
+        <w:jc w:val="left"/>
       </w:pPr>
       <w:r>
         <w:rPr>
+          <w:color w:val="595959"/>
           <w:sz w:val="18"/>
         </w:rPr>
         <w:t>docs/qwen36_step120_logistics_exam_cpt_direct_vs_rewritten_20260904.md</w:t>
@@ -2293,17 +2712,24 @@
     <w:p>
       <w:pPr>
         <w:pStyle w:val="Heading2"/>
+        <w:spacing w:before="160" w:after="60"/>
       </w:pPr>
       <w:r>
+        <w:rPr>
+          <w:rFonts w:eastAsia="Microsoft YaHei"/>
+          <w:sz w:val="22"/>
+        </w:rPr>
         <w:t>[7] 答案吸收与上下文依赖补测</w:t>
       </w:r>
     </w:p>
     <w:p>
       <w:pPr>
-        <w:spacing w:after="80"/>
+        <w:spacing w:after="80" w:line="280" w:lineRule="exact" w:before="100"/>
+        <w:jc w:val="left"/>
       </w:pPr>
       <w:r>
         <w:rPr>
+          <w:color w:val="595959"/>
           <w:sz w:val="18"/>
         </w:rPr>
         <w:t>docs/logistics_cpt_answer_learning_followup_20260905.md</w:t>
@@ -2312,17 +2738,24 @@
     <w:p>
       <w:pPr>
         <w:pStyle w:val="Heading2"/>
+        <w:spacing w:before="160" w:after="60"/>
       </w:pPr>
       <w:r>
+        <w:rPr>
+          <w:rFonts w:eastAsia="Microsoft YaHei"/>
+          <w:sz w:val="22"/>
+        </w:rPr>
         <w:t>[8] 单书2遍与4遍曝光对照</w:t>
       </w:r>
     </w:p>
     <w:p>
       <w:pPr>
-        <w:spacing w:after="80"/>
+        <w:spacing w:after="80" w:line="280" w:lineRule="exact" w:before="100"/>
+        <w:jc w:val="left"/>
       </w:pPr>
       <w:r>
         <w:rPr>
+          <w:color w:val="595959"/>
           <w:sz w:val="18"/>
         </w:rPr>
         <w:t>docs/qwen36_step120_logistics_cpt_exposure_curve_2x4x_20260904.md</w:t>
@@ -2331,23 +2764,33 @@
     <w:p>
       <w:pPr>
         <w:pStyle w:val="Heading2"/>
+        <w:spacing w:before="160" w:after="60"/>
       </w:pPr>
       <w:r>
+        <w:rPr>
+          <w:rFonts w:eastAsia="Microsoft YaHei"/>
+          <w:sz w:val="22"/>
+        </w:rPr>
         <w:t>[9] 同题答案SFT最终结果</w:t>
       </w:r>
     </w:p>
     <w:p>
       <w:pPr>
-        <w:spacing w:after="80"/>
+        <w:spacing w:after="80" w:line="280" w:lineRule="exact" w:before="100"/>
+        <w:jc w:val="left"/>
       </w:pPr>
       <w:r>
         <w:rPr>
+          <w:color w:val="595959"/>
           <w:sz w:val="18"/>
         </w:rPr>
         <w:t>docs/logistics_mcq_fit_results_20260907.md</w:t>
       </w:r>
     </w:p>
     <w:p>
+      <w:pPr>
+        <w:jc w:val="left"/>
+      </w:pPr>
       <w:r>
         <w:t>主要任务记录  CPT 工程实现-Step120垂域知识首训</w:t>
         <w:br/>
@@ -2355,6 +2798,9 @@
       </w:r>
     </w:p>
     <w:p>
+      <w:pPr>
+        <w:jc w:val="both"/>
+      </w:pPr>
       <w:r>
         <w:t>本文仅保留聚合计数、方法和结论，不含评测题面、标准答案、书籍原文或模型逐条输出。</w:t>
       </w:r>
@@ -2362,7 +2808,7 @@
     <w:sectPr>
       <w:footerReference w:type="default" r:id="rId9"/>
       <w:pgSz w:w="11906" w:h="16838"/>
-      <w:pgMar w:top="1134" w:right="1191" w:bottom="1020" w:left="1191" w:header="720" w:footer="720" w:gutter="0"/>
+      <w:pgMar w:top="1134" w:right="1247" w:bottom="1020" w:left="1247" w:header="720" w:footer="720" w:gutter="0"/>
       <w:cols w:space="720"/>
       <w:docGrid w:linePitch="360"/>
     </w:sectPr>
@@ -2378,6 +2824,10 @@
       <w:jc w:val="right"/>
     </w:pPr>
     <w:r>
+      <w:rPr>
+        <w:color w:val="777777"/>
+        <w:sz w:val="18"/>
+      </w:rPr>
       <w:fldSimple w:instr="PAGE"/>
     </w:r>
   </w:p>
@@ -2748,12 +3198,14 @@
     <w:qFormat/>
     <w:rsid w:val="00FC693F"/>
     <w:pPr>
-      <w:spacing w:after="120" w:line="269" w:lineRule="auto"/>
+      <w:widowControl/>
+      <w:spacing w:after="140" w:line="340" w:lineRule="exact"/>
     </w:pPr>
     <w:rPr>
-      <w:rFonts w:ascii="Arial" w:hAnsi="Arial" w:eastAsia="Microsoft YaHei"/>
+      <w:rFonts w:ascii="Arial" w:hAnsi="Arial" w:eastAsia="SimSun"/>
+      <w:b w:val="0"/>
       <w:color w:val="000000"/>
-      <w:sz w:val="21"/>
+      <w:sz w:val="22"/>
     </w:rPr>
   </w:style>
   <w:style w:type="paragraph" w:styleId="Header">
@@ -2811,7 +3263,7 @@
     <w:pPr>
       <w:keepNext/>
       <w:keepLines/>
-      <w:spacing w:before="200" w:after="120" w:line="269" w:lineRule="auto"/>
+      <w:spacing w:before="240" w:after="160" w:line="276" w:lineRule="auto"/>
       <w:outlineLvl w:val="0"/>
     </w:pPr>
     <w:rPr>
@@ -2835,7 +3287,7 @@
     <w:pPr>
       <w:keepNext/>
       <w:keepLines/>
-      <w:spacing w:before="200" w:after="120" w:line="269" w:lineRule="auto"/>
+      <w:spacing w:before="240" w:after="160" w:line="276" w:lineRule="auto"/>
       <w:outlineLvl w:val="1"/>
     </w:pPr>
     <w:rPr>
@@ -3097,15 +3549,16 @@
     <w:qFormat/>
     <w:rsid w:val="00FC693F"/>
     <w:pPr>
-      <w:spacing w:after="120" w:line="269" w:lineRule="auto"/>
+      <w:spacing w:after="200" w:line="276" w:lineRule="auto"/>
       <w:contextualSpacing/>
     </w:pPr>
     <w:rPr>
       <w:rFonts w:asciiTheme="majorHAnsi" w:eastAsiaTheme="majorEastAsia" w:hAnsiTheme="majorHAnsi" w:cstheme="majorBidi" w:ascii="Arial" w:hAnsi="Arial" w:eastAsia="Microsoft YaHei"/>
+      <w:b/>
       <w:color w:val="000000"/>
       <w:spacing w:val="5"/>
       <w:kern w:val="28"/>
-      <w:sz w:val="44"/>
+      <w:sz w:val="46"/>
       <w:szCs w:val="52"/>
     </w:rPr>
   </w:style>
@@ -3136,15 +3589,16 @@
       <w:numPr>
         <w:ilvl w:val="1"/>
       </w:numPr>
-      <w:spacing w:after="120" w:line="269" w:lineRule="auto"/>
+      <w:spacing w:after="320" w:line="269" w:lineRule="auto"/>
     </w:pPr>
     <w:rPr>
       <w:rFonts w:asciiTheme="majorHAnsi" w:eastAsiaTheme="majorEastAsia" w:hAnsiTheme="majorHAnsi" w:cstheme="majorBidi" w:ascii="Arial" w:hAnsi="Arial" w:eastAsia="Microsoft YaHei"/>
+      <w:b w:val="0"/>
       <w:i w:val="0"/>
       <w:iCs/>
       <w:color w:val="000000"/>
       <w:spacing w:val="15"/>
-      <w:sz w:val="22"/>
+      <w:sz w:val="20"/>
       <w:szCs w:val="24"/>
     </w:rPr>
   </w:style>

</xml_diff>

<commit_message>
docs: correct experiment three as untrained Step120 error diagnosis
</commit_message>
<xml_diff>
--- a/汇报材料/Step120物流知识能力诊断与优化实验阶段报告_20260907.docx
+++ b/汇报材料/Step120物流知识能力诊断与优化实验阶段报告_20260907.docx
@@ -778,7 +778,7 @@
           <w:b/>
           <w:sz w:val="40"/>
         </w:rPr>
-        <w:t>二 探测方法与已完成结果</w:t>
+        <w:t>二 探测方法与优化思路</w:t>
       </w:r>
     </w:p>
     <w:p>
@@ -793,7 +793,7 @@
           <w:b w:val="0"/>
           <w:sz w:val="30"/>
         </w:rPr>
-        <w:t>探测按“评测是否可靠 → 资料是否充分 → 基础知识能否调用 → 原问题能否应用 → 训练信号是否转成答案”逐层展开。各层分别设置对照，避免只看总分或训练 loss 就判定根因。</w:t>
+        <w:t>探测的目标是区分知识储备、知识调用与情景应用问题。先检查评测输入和评分是否可靠，再围绕同一知识点设置不同条件，观察模型在哪个环节恢复正确。探测方法在本节说明，实际无训练对照结果见实验三。</w:t>
       </w:r>
     </w:p>
     <w:p>
@@ -809,7 +809,7 @@
           <w:b/>
           <w:sz w:val="32"/>
         </w:rPr>
-        <w:t>1 固定错题和正确对照做四条件探测</w:t>
+        <w:t>1 在同一模型上改变作答条件</w:t>
       </w:r>
     </w:p>
     <w:p>
@@ -824,476 +824,7 @@
           <w:b w:val="0"/>
           <w:sz w:val="30"/>
         </w:rPr>
-        <w:t>冻结 Step120 的303道历史错题，再匹配60道原答对题，共363题。原始模型分别回答原题闭卷、原题加教材、基础知识题闭卷、基础知识题加教材，每个条件重复3轮。教材检索不接收金答案，基础题仅在自动门禁通过的子集评测。[3]</w:t>
-      </w:r>
-    </w:p>
-    <w:tbl>
-      <w:tblPr>
-        <w:tblW w:type="auto" w:w="0"/>
-        <w:jc w:val="center"/>
-        <w:tblLayout w:type="fixed"/>
-        <w:tblLook w:firstColumn="1" w:firstRow="1" w:lastColumn="0" w:lastRow="0" w:noHBand="0" w:noVBand="1" w:val="04A0"/>
-      </w:tblPr>
-      <w:tblGrid>
-        <w:gridCol w:w="4876"/>
-        <w:gridCol w:w="2268"/>
-        <w:gridCol w:w="2268"/>
-      </w:tblGrid>
-      <w:tr>
-        <w:trPr>
-          <w:cantSplit/>
-          <w:tblHeader/>
-        </w:trPr>
-        <w:tc>
-          <w:tcPr>
-            <w:tcW w:type="dxa" w:w="4876"/>
-            <w:vAlign w:val="center"/>
-            <w:tcBorders>
-              <w:top w:val="single" w:sz="4" w:color="D9D9D9"/>
-              <w:left w:val="single" w:sz="4" w:color="D9D9D9"/>
-              <w:bottom w:val="single" w:sz="4" w:color="D9D9D9"/>
-              <w:right w:val="single" w:sz="4" w:color="D9D9D9"/>
-            </w:tcBorders>
-            <w:shd w:fill="243E56"/>
-            <w:tcMar>
-              <w:top w:w="135" w:type="dxa"/>
-              <w:bottom w:w="135" w:type="dxa"/>
-              <w:left w:w="125" w:type="dxa"/>
-              <w:right w:w="125" w:type="dxa"/>
-            </w:tcMar>
-          </w:tcPr>
-          <w:p>
-            <w:pPr>
-              <w:keepNext/>
-              <w:spacing w:after="0" w:line="360" w:lineRule="auto"/>
-              <w:jc w:val="left"/>
-            </w:pPr>
-            <w:r>
-              <w:rPr>
-                <w:rFonts w:ascii="Times New Roman" w:hAnsi="Times New Roman" w:eastAsia="SimSun"/>
-                <w:b/>
-                <w:color w:val="FFFFFF"/>
-                <w:sz w:val="30"/>
-              </w:rPr>
-              <w:t>样本与条件</w:t>
-            </w:r>
-          </w:p>
-        </w:tc>
-        <w:tc>
-          <w:tcPr>
-            <w:tcW w:type="dxa" w:w="2268"/>
-            <w:vAlign w:val="center"/>
-            <w:tcBorders>
-              <w:top w:val="single" w:sz="4" w:color="D9D9D9"/>
-              <w:left w:val="single" w:sz="4" w:color="D9D9D9"/>
-              <w:bottom w:val="single" w:sz="4" w:color="D9D9D9"/>
-              <w:right w:val="single" w:sz="4" w:color="D9D9D9"/>
-            </w:tcBorders>
-            <w:shd w:fill="243E56"/>
-            <w:tcMar>
-              <w:top w:w="135" w:type="dxa"/>
-              <w:bottom w:w="135" w:type="dxa"/>
-              <w:left w:w="125" w:type="dxa"/>
-              <w:right w:w="125" w:type="dxa"/>
-            </w:tcMar>
-          </w:tcPr>
-          <w:p>
-            <w:pPr>
-              <w:keepNext/>
-              <w:spacing w:after="0" w:line="360" w:lineRule="auto"/>
-              <w:jc w:val="center"/>
-            </w:pPr>
-            <w:r>
-              <w:rPr>
-                <w:rFonts w:ascii="Times New Roman" w:hAnsi="Times New Roman" w:eastAsia="SimSun"/>
-                <w:b/>
-                <w:color w:val="FFFFFF"/>
-                <w:sz w:val="30"/>
-              </w:rPr>
-              <w:t>闭卷答对</w:t>
-            </w:r>
-          </w:p>
-        </w:tc>
-        <w:tc>
-          <w:tcPr>
-            <w:tcW w:type="dxa" w:w="2268"/>
-            <w:vAlign w:val="center"/>
-            <w:tcBorders>
-              <w:top w:val="single" w:sz="4" w:color="D9D9D9"/>
-              <w:left w:val="single" w:sz="4" w:color="D9D9D9"/>
-              <w:bottom w:val="single" w:sz="4" w:color="D9D9D9"/>
-              <w:right w:val="single" w:sz="4" w:color="D9D9D9"/>
-            </w:tcBorders>
-            <w:shd w:fill="243E56"/>
-            <w:tcMar>
-              <w:top w:w="135" w:type="dxa"/>
-              <w:bottom w:w="135" w:type="dxa"/>
-              <w:left w:w="125" w:type="dxa"/>
-              <w:right w:w="125" w:type="dxa"/>
-            </w:tcMar>
-          </w:tcPr>
-          <w:p>
-            <w:pPr>
-              <w:keepNext/>
-              <w:spacing w:after="0" w:line="360" w:lineRule="auto"/>
-              <w:jc w:val="center"/>
-            </w:pPr>
-            <w:r>
-              <w:rPr>
-                <w:rFonts w:ascii="Times New Roman" w:hAnsi="Times New Roman" w:eastAsia="SimSun"/>
-                <w:b/>
-                <w:color w:val="FFFFFF"/>
-                <w:sz w:val="30"/>
-              </w:rPr>
-              <w:t>加教材答对</w:t>
-            </w:r>
-          </w:p>
-        </w:tc>
-      </w:tr>
-      <w:tr>
-        <w:trPr>
-          <w:cantSplit/>
-        </w:trPr>
-        <w:tc>
-          <w:tcPr>
-            <w:tcW w:type="dxa" w:w="4876"/>
-            <w:vAlign w:val="center"/>
-            <w:tcBorders>
-              <w:top w:val="single" w:sz="4" w:color="D9D9D9"/>
-              <w:left w:val="single" w:sz="4" w:color="D9D9D9"/>
-              <w:bottom w:val="single" w:sz="4" w:color="D9D9D9"/>
-              <w:right w:val="single" w:sz="4" w:color="D9D9D9"/>
-            </w:tcBorders>
-            <w:shd w:fill="F0F4F7"/>
-            <w:tcMar>
-              <w:top w:w="135" w:type="dxa"/>
-              <w:bottom w:w="135" w:type="dxa"/>
-              <w:left w:w="125" w:type="dxa"/>
-              <w:right w:w="125" w:type="dxa"/>
-            </w:tcMar>
-          </w:tcPr>
-          <w:p>
-            <w:pPr>
-              <w:keepNext w:val="0"/>
-              <w:spacing w:after="0" w:line="360" w:lineRule="auto"/>
-              <w:jc w:val="left"/>
-            </w:pPr>
-            <w:r>
-              <w:rPr>
-                <w:rFonts w:ascii="Times New Roman" w:hAnsi="Times New Roman" w:eastAsia="SimSun"/>
-                <w:b w:val="0"/>
-                <w:color w:val="202020"/>
-                <w:sz w:val="30"/>
-              </w:rPr>
-              <w:t>历史错题  303题</w:t>
-            </w:r>
-          </w:p>
-        </w:tc>
-        <w:tc>
-          <w:tcPr>
-            <w:tcW w:type="dxa" w:w="2268"/>
-            <w:vAlign w:val="center"/>
-            <w:tcBorders>
-              <w:top w:val="single" w:sz="4" w:color="D9D9D9"/>
-              <w:left w:val="single" w:sz="4" w:color="D9D9D9"/>
-              <w:bottom w:val="single" w:sz="4" w:color="D9D9D9"/>
-              <w:right w:val="single" w:sz="4" w:color="D9D9D9"/>
-            </w:tcBorders>
-            <w:shd w:fill="F0F4F7"/>
-            <w:tcMar>
-              <w:top w:w="135" w:type="dxa"/>
-              <w:bottom w:w="135" w:type="dxa"/>
-              <w:left w:w="125" w:type="dxa"/>
-              <w:right w:w="125" w:type="dxa"/>
-            </w:tcMar>
-          </w:tcPr>
-          <w:p>
-            <w:pPr>
-              <w:keepNext w:val="0"/>
-              <w:spacing w:after="0" w:line="360" w:lineRule="auto"/>
-              <w:jc w:val="center"/>
-            </w:pPr>
-            <w:r>
-              <w:rPr>
-                <w:rFonts w:ascii="Times New Roman" w:hAnsi="Times New Roman" w:eastAsia="SimSun"/>
-                <w:b w:val="0"/>
-                <w:color w:val="202020"/>
-                <w:sz w:val="30"/>
-              </w:rPr>
-              <w:t>6/303</w:t>
-            </w:r>
-          </w:p>
-        </w:tc>
-        <w:tc>
-          <w:tcPr>
-            <w:tcW w:type="dxa" w:w="2268"/>
-            <w:vAlign w:val="center"/>
-            <w:tcBorders>
-              <w:top w:val="single" w:sz="4" w:color="D9D9D9"/>
-              <w:left w:val="single" w:sz="4" w:color="D9D9D9"/>
-              <w:bottom w:val="single" w:sz="4" w:color="D9D9D9"/>
-              <w:right w:val="single" w:sz="4" w:color="D9D9D9"/>
-            </w:tcBorders>
-            <w:shd w:fill="F0F4F7"/>
-            <w:tcMar>
-              <w:top w:w="135" w:type="dxa"/>
-              <w:bottom w:w="135" w:type="dxa"/>
-              <w:left w:w="125" w:type="dxa"/>
-              <w:right w:w="125" w:type="dxa"/>
-            </w:tcMar>
-          </w:tcPr>
-          <w:p>
-            <w:pPr>
-              <w:keepNext w:val="0"/>
-              <w:spacing w:after="0" w:line="360" w:lineRule="auto"/>
-              <w:jc w:val="center"/>
-            </w:pPr>
-            <w:r>
-              <w:rPr>
-                <w:rFonts w:ascii="Times New Roman" w:hAnsi="Times New Roman" w:eastAsia="SimSun"/>
-                <w:b w:val="0"/>
-                <w:color w:val="202020"/>
-                <w:sz w:val="30"/>
-              </w:rPr>
-              <w:t>58/303</w:t>
-            </w:r>
-          </w:p>
-        </w:tc>
-      </w:tr>
-      <w:tr>
-        <w:trPr>
-          <w:cantSplit/>
-        </w:trPr>
-        <w:tc>
-          <w:tcPr>
-            <w:tcW w:type="dxa" w:w="4876"/>
-            <w:vAlign w:val="center"/>
-            <w:tcBorders>
-              <w:top w:val="single" w:sz="4" w:color="D9D9D9"/>
-              <w:left w:val="single" w:sz="4" w:color="D9D9D9"/>
-              <w:bottom w:val="single" w:sz="4" w:color="D9D9D9"/>
-              <w:right w:val="single" w:sz="4" w:color="D9D9D9"/>
-            </w:tcBorders>
-            <w:shd w:fill="FFFFFF"/>
-            <w:tcMar>
-              <w:top w:w="135" w:type="dxa"/>
-              <w:bottom w:w="135" w:type="dxa"/>
-              <w:left w:w="125" w:type="dxa"/>
-              <w:right w:w="125" w:type="dxa"/>
-            </w:tcMar>
-          </w:tcPr>
-          <w:p>
-            <w:pPr>
-              <w:keepNext w:val="0"/>
-              <w:spacing w:after="0" w:line="360" w:lineRule="auto"/>
-              <w:jc w:val="left"/>
-            </w:pPr>
-            <w:r>
-              <w:rPr>
-                <w:rFonts w:ascii="Times New Roman" w:hAnsi="Times New Roman" w:eastAsia="SimSun"/>
-                <w:b w:val="0"/>
-                <w:color w:val="202020"/>
-                <w:sz w:val="30"/>
-              </w:rPr>
-              <w:t>原答对对照  60题</w:t>
-            </w:r>
-          </w:p>
-        </w:tc>
-        <w:tc>
-          <w:tcPr>
-            <w:tcW w:type="dxa" w:w="2268"/>
-            <w:vAlign w:val="center"/>
-            <w:tcBorders>
-              <w:top w:val="single" w:sz="4" w:color="D9D9D9"/>
-              <w:left w:val="single" w:sz="4" w:color="D9D9D9"/>
-              <w:bottom w:val="single" w:sz="4" w:color="D9D9D9"/>
-              <w:right w:val="single" w:sz="4" w:color="D9D9D9"/>
-            </w:tcBorders>
-            <w:shd w:fill="FFFFFF"/>
-            <w:tcMar>
-              <w:top w:w="135" w:type="dxa"/>
-              <w:bottom w:w="135" w:type="dxa"/>
-              <w:left w:w="125" w:type="dxa"/>
-              <w:right w:w="125" w:type="dxa"/>
-            </w:tcMar>
-          </w:tcPr>
-          <w:p>
-            <w:pPr>
-              <w:keepNext w:val="0"/>
-              <w:spacing w:after="0" w:line="360" w:lineRule="auto"/>
-              <w:jc w:val="center"/>
-            </w:pPr>
-            <w:r>
-              <w:rPr>
-                <w:rFonts w:ascii="Times New Roman" w:hAnsi="Times New Roman" w:eastAsia="SimSun"/>
-                <w:b w:val="0"/>
-                <w:color w:val="202020"/>
-                <w:sz w:val="30"/>
-              </w:rPr>
-              <w:t>57/60</w:t>
-            </w:r>
-          </w:p>
-        </w:tc>
-        <w:tc>
-          <w:tcPr>
-            <w:tcW w:type="dxa" w:w="2268"/>
-            <w:vAlign w:val="center"/>
-            <w:tcBorders>
-              <w:top w:val="single" w:sz="4" w:color="D9D9D9"/>
-              <w:left w:val="single" w:sz="4" w:color="D9D9D9"/>
-              <w:bottom w:val="single" w:sz="4" w:color="D9D9D9"/>
-              <w:right w:val="single" w:sz="4" w:color="D9D9D9"/>
-            </w:tcBorders>
-            <w:shd w:fill="FFFFFF"/>
-            <w:tcMar>
-              <w:top w:w="135" w:type="dxa"/>
-              <w:bottom w:w="135" w:type="dxa"/>
-              <w:left w:w="125" w:type="dxa"/>
-              <w:right w:w="125" w:type="dxa"/>
-            </w:tcMar>
-          </w:tcPr>
-          <w:p>
-            <w:pPr>
-              <w:keepNext w:val="0"/>
-              <w:spacing w:after="0" w:line="360" w:lineRule="auto"/>
-              <w:jc w:val="center"/>
-            </w:pPr>
-            <w:r>
-              <w:rPr>
-                <w:rFonts w:ascii="Times New Roman" w:hAnsi="Times New Roman" w:eastAsia="SimSun"/>
-                <w:b w:val="0"/>
-                <w:color w:val="202020"/>
-                <w:sz w:val="30"/>
-              </w:rPr>
-              <w:t>54/60</w:t>
-            </w:r>
-          </w:p>
-        </w:tc>
-      </w:tr>
-      <w:tr>
-        <w:trPr>
-          <w:cantSplit/>
-        </w:trPr>
-        <w:tc>
-          <w:tcPr>
-            <w:tcW w:type="dxa" w:w="4876"/>
-            <w:vAlign w:val="center"/>
-            <w:tcBorders>
-              <w:top w:val="single" w:sz="4" w:color="D9D9D9"/>
-              <w:left w:val="single" w:sz="4" w:color="D9D9D9"/>
-              <w:bottom w:val="single" w:sz="4" w:color="D9D9D9"/>
-              <w:right w:val="single" w:sz="4" w:color="D9D9D9"/>
-            </w:tcBorders>
-            <w:shd w:fill="F0F4F7"/>
-            <w:tcMar>
-              <w:top w:w="135" w:type="dxa"/>
-              <w:bottom w:w="135" w:type="dxa"/>
-              <w:left w:w="125" w:type="dxa"/>
-              <w:right w:w="125" w:type="dxa"/>
-            </w:tcMar>
-          </w:tcPr>
-          <w:p>
-            <w:pPr>
-              <w:keepNext w:val="0"/>
-              <w:spacing w:after="0" w:line="360" w:lineRule="auto"/>
-              <w:jc w:val="left"/>
-            </w:pPr>
-            <w:r>
-              <w:rPr>
-                <w:rFonts w:ascii="Times New Roman" w:hAnsi="Times New Roman" w:eastAsia="SimSun"/>
-                <w:b w:val="0"/>
-                <w:color w:val="202020"/>
-                <w:sz w:val="30"/>
-              </w:rPr>
-              <w:t>历史错题中的有效基础题  65题</w:t>
-            </w:r>
-          </w:p>
-        </w:tc>
-        <w:tc>
-          <w:tcPr>
-            <w:tcW w:type="dxa" w:w="2268"/>
-            <w:vAlign w:val="center"/>
-            <w:tcBorders>
-              <w:top w:val="single" w:sz="4" w:color="D9D9D9"/>
-              <w:left w:val="single" w:sz="4" w:color="D9D9D9"/>
-              <w:bottom w:val="single" w:sz="4" w:color="D9D9D9"/>
-              <w:right w:val="single" w:sz="4" w:color="D9D9D9"/>
-            </w:tcBorders>
-            <w:shd w:fill="F0F4F7"/>
-            <w:tcMar>
-              <w:top w:w="135" w:type="dxa"/>
-              <w:bottom w:w="135" w:type="dxa"/>
-              <w:left w:w="125" w:type="dxa"/>
-              <w:right w:w="125" w:type="dxa"/>
-            </w:tcMar>
-          </w:tcPr>
-          <w:p>
-            <w:pPr>
-              <w:keepNext w:val="0"/>
-              <w:spacing w:after="0" w:line="360" w:lineRule="auto"/>
-              <w:jc w:val="center"/>
-            </w:pPr>
-            <w:r>
-              <w:rPr>
-                <w:rFonts w:ascii="Times New Roman" w:hAnsi="Times New Roman" w:eastAsia="SimSun"/>
-                <w:b w:val="0"/>
-                <w:color w:val="202020"/>
-                <w:sz w:val="30"/>
-              </w:rPr>
-              <w:t>59/65</w:t>
-            </w:r>
-          </w:p>
-        </w:tc>
-        <w:tc>
-          <w:tcPr>
-            <w:tcW w:type="dxa" w:w="2268"/>
-            <w:vAlign w:val="center"/>
-            <w:tcBorders>
-              <w:top w:val="single" w:sz="4" w:color="D9D9D9"/>
-              <w:left w:val="single" w:sz="4" w:color="D9D9D9"/>
-              <w:bottom w:val="single" w:sz="4" w:color="D9D9D9"/>
-              <w:right w:val="single" w:sz="4" w:color="D9D9D9"/>
-            </w:tcBorders>
-            <w:shd w:fill="F0F4F7"/>
-            <w:tcMar>
-              <w:top w:w="135" w:type="dxa"/>
-              <w:bottom w:w="135" w:type="dxa"/>
-              <w:left w:w="125" w:type="dxa"/>
-              <w:right w:w="125" w:type="dxa"/>
-            </w:tcMar>
-          </w:tcPr>
-          <w:p>
-            <w:pPr>
-              <w:keepNext w:val="0"/>
-              <w:spacing w:after="0" w:line="360" w:lineRule="auto"/>
-              <w:jc w:val="center"/>
-            </w:pPr>
-            <w:r>
-              <w:rPr>
-                <w:rFonts w:ascii="Times New Roman" w:hAnsi="Times New Roman" w:eastAsia="SimSun"/>
-                <w:b w:val="0"/>
-                <w:color w:val="202020"/>
-                <w:sz w:val="30"/>
-              </w:rPr>
-              <w:t>64/65</w:t>
-            </w:r>
-          </w:p>
-        </w:tc>
-      </w:tr>
-    </w:tbl>
-    <w:p>
-      <w:pPr>
-        <w:widowControl/>
-        <w:spacing w:before="0" w:line="360" w:lineRule="auto" w:after="120"/>
-        <w:jc w:val="both"/>
-      </w:pPr>
-      <w:r>
-        <w:rPr>
-          <w:rFonts w:ascii="Times New Roman" w:hAnsi="Times New Roman" w:eastAsia="SimSun"/>
-          <w:b w:val="0"/>
-          <w:sz w:val="30"/>
-        </w:rPr>
-        <w:t>诊断提示与历史正式评测不同，因此303道历史错题本轮闭卷答对6题并不矛盾。资料能帮助部分题目，也可能干扰原答对题；基础题的分母和难度均不同，不能直接与303题正确率相减。</w:t>
+        <w:t>以原始 Step120 的历史错题为主要样本，并匹配少量原答对题作对照。设置原题闭卷、原题加独立教材、相关基础知识题闭卷、基础知识题加教材四个条件，每个条件重复3轮。检索不接收金答案，基础题与资料充分性分别审核；未通过的样本不强行归因。[3]</w:t>
       </w:r>
     </w:p>
     <w:p>
@@ -1309,7 +840,7 @@
           <w:b/>
           <w:sz w:val="32"/>
         </w:rPr>
-        <w:t>2 复核资料质量并增加闭卷知识探针</w:t>
+        <w:t>2 用补证与开放问答核查知识边界</w:t>
       </w:r>
     </w:p>
     <w:p>
@@ -1324,23 +855,7 @@
           <w:b w:val="0"/>
           <w:sz w:val="30"/>
         </w:rPr>
-        <w:t>363题中259题自动审核缺失或无效，不能据此判为教材不覆盖。后续复核8题，发现探针过浅、资料不充分、缺图、重复选项等问题。在获得定向补证的同4题上，闭卷及原教材均为0/4，补充已核对资料后为4/4，三轮一致；单加题型提示在8题上仍为0/8。[4]</w:t>
-      </w:r>
-    </w:p>
-    <w:p>
-      <w:pPr>
-        <w:widowControl/>
-        <w:spacing w:line="360" w:lineRule="auto" w:before="0" w:after="120"/>
-        <w:jc w:val="both"/>
-      </w:pPr>
-      <w:r>
-        <w:rPr>
-          <w:rFonts w:ascii="Times New Roman" w:hAnsi="Times New Roman" w:eastAsia="SimSun"/>
-          <w:b w:val="0"/>
-          <w:sz w:val="30"/>
-          <w:spacing w:val="-3"/>
-        </w:rPr>
-        <w:t>对上述4个知识点再做定义、辨析、应用各1问，共12问、每问3轮。预先冻结的核心标准通过6/12，其中定义2/4、辨析3/4、应用1/4。这表明部分知识可以调用，但概念范围、术语对应和情景应用并不稳定。[5]</w:t>
+        <w:t>对有代表性的疑难案例核查资料是否真正足够、输入是否缺图或存在选项歧义。再对同一知识点设计定义、辨析、应用问答，检查模型能否在不提供资料和选项时主动表达并使用知识。定向补证与闭卷探针用于定位原因，不改写原正式成绩。[4][5]</w:t>
       </w:r>
     </w:p>
     <w:p>
@@ -1356,7 +871,7 @@
           <w:b/>
           <w:sz w:val="32"/>
         </w:rPr>
-        <w:t>3 由探测结果确定优化方向</w:t>
+        <w:t>3 根据证据选择优化方向</w:t>
       </w:r>
     </w:p>
     <w:p>
@@ -1371,21 +886,7 @@
           <w:b w:val="0"/>
           <w:sz w:val="30"/>
         </w:rPr>
-        <w:t>知识范围不完整的题目，应补充可靠来源与知识校准；定义可答、应用不稳的题目，应重点训练概念辨析和情景问答；资料或题面存在问题的样本，应先修复评测依据。上述小样本属于机制探测，不能外推为全部303题的根因比例。</w:t>
-      </w:r>
-    </w:p>
-    <w:p>
-      <w:pPr>
-        <w:widowControl/>
-        <w:spacing w:after="0" w:line="360" w:lineRule="auto" w:before="0"/>
-        <w:jc w:val="both"/>
-      </w:pPr>
-      <w:r>
-        <w:rPr>
-          <w:rFonts w:ascii="Times New Roman" w:hAnsi="Times New Roman" w:eastAsia="SimSun"/>
-          <w:b w:val="0"/>
-          <w:sz w:val="12"/>
-        </w:rPr>
+        <w:t>闭卷答错、加资料答对，提示知识补充或调用改善可能有效，但不能证明参数中完全没有知识；定义可答而应用不稳，应重点检查概念辨析、条件理解与情景映射；输入或标签有问题，应先核对评测依据。训练侧再用 CPT 与答案监督检查文本学习是否转化为问答表现，避免仅凭总分或训练 loss 判定根因。</w:t>
       </w:r>
     </w:p>
     <w:p>
@@ -2168,6 +1669,52 @@
     </w:p>
     <w:p>
       <w:pPr>
+        <w:pStyle w:val="Heading2"/>
+        <w:keepNext/>
+        <w:widowControl/>
+        <w:spacing w:line="360" w:lineRule="auto" w:before="240" w:after="120"/>
+      </w:pPr>
+      <w:r>
+        <w:rPr>
+          <w:rFonts w:eastAsia="SimHei" w:ascii="Times New Roman" w:hAnsi="Times New Roman"/>
+          <w:b/>
+          <w:sz w:val="32"/>
+        </w:rPr>
+        <w:t>补充诊断 同题答案SFT</w:t>
+      </w:r>
+    </w:p>
+    <w:p>
+      <w:pPr>
+        <w:widowControl/>
+        <w:spacing w:line="360" w:lineRule="auto" w:before="0" w:after="120"/>
+        <w:jc w:val="both"/>
+      </w:pPr>
+      <w:r>
+        <w:rPr>
+          <w:rFonts w:ascii="Times New Roman" w:hAnsi="Times New Roman" w:eastAsia="SimSun"/>
+          <w:b w:val="0"/>
+          <w:sz w:val="30"/>
+        </w:rPr>
+        <w:t>另一组已完成实验使用全部1672道原题、完整选项及正确答案 JSON，仅监督答案与结束标记。训练1遍和2遍后，总体同题成绩分别为93.18%和94.44%，对照原始 Step120 的81.88%，说明直接匹配作答目标的监督可以显著提高同题拟合。[9]</w:t>
+      </w:r>
+    </w:p>
+    <w:p>
+      <w:pPr>
+        <w:widowControl/>
+        <w:spacing w:line="360" w:lineRule="auto" w:before="0" w:after="120"/>
+        <w:jc w:val="both"/>
+      </w:pPr>
+      <w:r>
+        <w:rPr>
+          <w:rFonts w:ascii="Times New Roman" w:hAnsi="Times New Roman" w:eastAsia="SimSun"/>
+          <w:b w:val="0"/>
+          <w:sz w:val="30"/>
+        </w:rPr>
+        <w:t>这组实验属于“评测题答案 SFT”，不是方案二的“独立书籍问答对 SFT”。它不能证明未见问题上的能力提升，也不能单独证明模型原先已拥有全部知识。方案二后续结果应与原始 Step120 在独立问题上比较。</w:t>
+      </w:r>
+    </w:p>
+    <w:p>
+      <w:pPr>
         <w:pStyle w:val="Heading1"/>
         <w:keepNext/>
         <w:widowControl/>
@@ -2232,7 +1779,23 @@
           <w:b/>
           <w:sz w:val="40"/>
         </w:rPr>
-        <w:t>五 方案三 原始模型对照</w:t>
+        <w:t>五 实验三 原始Step120的无训练错题诊断</w:t>
+      </w:r>
+    </w:p>
+    <w:p>
+      <w:pPr>
+        <w:pStyle w:val="Heading2"/>
+        <w:keepNext/>
+        <w:widowControl/>
+        <w:spacing w:line="360" w:lineRule="auto" w:before="240" w:after="120"/>
+      </w:pPr>
+      <w:r>
+        <w:rPr>
+          <w:rFonts w:eastAsia="SimHei" w:ascii="Times New Roman" w:hAnsi="Times New Roman"/>
+          <w:b/>
+          <w:sz w:val="32"/>
+        </w:rPr>
+        <w:t>实验目的与模型</w:t>
       </w:r>
     </w:p>
     <w:p>
@@ -2247,7 +1810,38 @@
           <w:b w:val="0"/>
           <w:sz w:val="30"/>
         </w:rPr>
-        <w:t>本方案保留未接受本轮 CPT 或 SFT 的原始 Step120，作为全部后续实验的共同起点。这里“原始”指8月25日完成开源数据续训的 Step120，并非完全未经后训练的原生开源模型；原生模型另列为背景参考。[1][2]</w:t>
+        <w:t>本实验回答“Step120 为什么答错”，不重复背景中的原生模型与 Step120 总分比较。固定未接受本轮评测题 CPT 或 SFT 的原始 Step120，仅改变题目呈现和参考资料，不更新参数。比较对象是同一模型在不同条件下的表现；此前接受评测题训练的候选不参与本轮诊断。[3]</w:t>
+      </w:r>
+    </w:p>
+    <w:p>
+      <w:pPr>
+        <w:pStyle w:val="Heading2"/>
+        <w:keepNext/>
+        <w:widowControl/>
+        <w:spacing w:line="360" w:lineRule="auto" w:before="240" w:after="120"/>
+      </w:pPr>
+      <w:r>
+        <w:rPr>
+          <w:rFonts w:eastAsia="SimHei" w:ascii="Times New Roman" w:hAnsi="Times New Roman"/>
+          <w:b/>
+          <w:sz w:val="32"/>
+        </w:rPr>
+        <w:t>1 四条件诊断结果</w:t>
+      </w:r>
+    </w:p>
+    <w:p>
+      <w:pPr>
+        <w:widowControl/>
+        <w:spacing w:line="360" w:lineRule="auto" w:before="0" w:after="120"/>
+        <w:jc w:val="both"/>
+      </w:pPr>
+      <w:r>
+        <w:rPr>
+          <w:rFonts w:ascii="Times New Roman" w:hAnsi="Times New Roman" w:eastAsia="SimSun"/>
+          <w:b w:val="0"/>
+          <w:sz w:val="30"/>
+        </w:rPr>
+        <w:t>冻结303道历史错题，其中 LogistikaBench 266题、SC-bench知识题37题；另匹配60道原答对题，共363题。按第二部分的四条件协议分别运行3轮，以严格多数票计分。下表列出原题结果及历史错题中65道有效基础题的结果，分母分别保留。[3][4]</w:t>
       </w:r>
     </w:p>
     <w:tbl>
@@ -2258,10 +1852,9 @@
         <w:tblLook w:firstColumn="1" w:firstRow="1" w:lastColumn="0" w:lastRow="0" w:noHBand="0" w:noVBand="1" w:val="04A0"/>
       </w:tblPr>
       <w:tblGrid>
-        <w:gridCol w:w="3061"/>
+        <w:gridCol w:w="4876"/>
         <w:gridCol w:w="2268"/>
         <w:gridCol w:w="2268"/>
-        <w:gridCol w:w="1814"/>
       </w:tblGrid>
       <w:tr>
         <w:trPr>
@@ -2270,7 +1863,7 @@
         </w:trPr>
         <w:tc>
           <w:tcPr>
-            <w:tcW w:type="dxa" w:w="3061"/>
+            <w:tcW w:type="dxa" w:w="4876"/>
             <w:vAlign w:val="center"/>
             <w:tcBorders>
               <w:top w:val="single" w:sz="4" w:color="D9D9D9"/>
@@ -2299,7 +1892,7 @@
                 <w:color w:val="FFFFFF"/>
                 <w:sz w:val="30"/>
               </w:rPr>
-              <w:t>对照对象</w:t>
+              <w:t>样本与条件</w:t>
             </w:r>
           </w:p>
         </w:tc>
@@ -2334,7 +1927,7 @@
                 <w:color w:val="FFFFFF"/>
                 <w:sz w:val="30"/>
               </w:rPr>
-              <w:t>LogistikaBench</w:t>
+              <w:t>闭卷答对</w:t>
             </w:r>
           </w:p>
         </w:tc>
@@ -2369,44 +1962,7 @@
                 <w:color w:val="FFFFFF"/>
                 <w:sz w:val="30"/>
               </w:rPr>
-              <w:t>SC-bench</w:t>
-              <w:br/>
-              <w:t>知识题</w:t>
-            </w:r>
-          </w:p>
-        </w:tc>
-        <w:tc>
-          <w:tcPr>
-            <w:tcW w:type="dxa" w:w="1814"/>
-            <w:vAlign w:val="center"/>
-            <w:tcBorders>
-              <w:top w:val="single" w:sz="4" w:color="D9D9D9"/>
-              <w:left w:val="single" w:sz="4" w:color="D9D9D9"/>
-              <w:bottom w:val="single" w:sz="4" w:color="D9D9D9"/>
-              <w:right w:val="single" w:sz="4" w:color="D9D9D9"/>
-            </w:tcBorders>
-            <w:shd w:fill="243E56"/>
-            <w:tcMar>
-              <w:top w:w="135" w:type="dxa"/>
-              <w:bottom w:w="135" w:type="dxa"/>
-              <w:left w:w="125" w:type="dxa"/>
-              <w:right w:w="125" w:type="dxa"/>
-            </w:tcMar>
-          </w:tcPr>
-          <w:p>
-            <w:pPr>
-              <w:keepNext/>
-              <w:spacing w:after="0" w:line="360" w:lineRule="auto"/>
-              <w:jc w:val="center"/>
-            </w:pPr>
-            <w:r>
-              <w:rPr>
-                <w:rFonts w:ascii="Times New Roman" w:hAnsi="Times New Roman" w:eastAsia="SimSun"/>
-                <w:b/>
-                <w:color w:val="FFFFFF"/>
-                <w:sz w:val="30"/>
-              </w:rPr>
-              <w:t>总体</w:t>
+              <w:t>加教材答对</w:t>
             </w:r>
           </w:p>
         </w:tc>
@@ -2417,7 +1973,7 @@
         </w:trPr>
         <w:tc>
           <w:tcPr>
-            <w:tcW w:type="dxa" w:w="3061"/>
+            <w:tcW w:type="dxa" w:w="4876"/>
             <w:vAlign w:val="center"/>
             <w:tcBorders>
               <w:top w:val="single" w:sz="4" w:color="D9D9D9"/>
@@ -2446,7 +2002,7 @@
                 <w:color w:val="202020"/>
                 <w:sz w:val="30"/>
               </w:rPr>
-              <w:t>原生Qwen3.6-27B</w:t>
+              <w:t>历史错题  303题</w:t>
             </w:r>
           </w:p>
         </w:tc>
@@ -2481,7 +2037,7 @@
                 <w:color w:val="202020"/>
                 <w:sz w:val="30"/>
               </w:rPr>
-              <w:t>1175/1446</w:t>
+              <w:t>6/303</w:t>
             </w:r>
           </w:p>
         </w:tc>
@@ -2516,42 +2072,7 @@
                 <w:color w:val="202020"/>
                 <w:sz w:val="30"/>
               </w:rPr>
-              <w:t>188/226</w:t>
-            </w:r>
-          </w:p>
-        </w:tc>
-        <w:tc>
-          <w:tcPr>
-            <w:tcW w:type="dxa" w:w="1814"/>
-            <w:vAlign w:val="center"/>
-            <w:tcBorders>
-              <w:top w:val="single" w:sz="4" w:color="D9D9D9"/>
-              <w:left w:val="single" w:sz="4" w:color="D9D9D9"/>
-              <w:bottom w:val="single" w:sz="4" w:color="D9D9D9"/>
-              <w:right w:val="single" w:sz="4" w:color="D9D9D9"/>
-            </w:tcBorders>
-            <w:shd w:fill="F0F4F7"/>
-            <w:tcMar>
-              <w:top w:w="135" w:type="dxa"/>
-              <w:bottom w:w="135" w:type="dxa"/>
-              <w:left w:w="125" w:type="dxa"/>
-              <w:right w:w="125" w:type="dxa"/>
-            </w:tcMar>
-          </w:tcPr>
-          <w:p>
-            <w:pPr>
-              <w:keepNext w:val="0"/>
-              <w:spacing w:after="0" w:line="360" w:lineRule="auto"/>
-              <w:jc w:val="center"/>
-            </w:pPr>
-            <w:r>
-              <w:rPr>
-                <w:rFonts w:ascii="Times New Roman" w:hAnsi="Times New Roman" w:eastAsia="SimSun"/>
-                <w:b w:val="0"/>
-                <w:color w:val="202020"/>
-                <w:sz w:val="30"/>
-              </w:rPr>
-              <w:t>1363/1672</w:t>
+              <w:t>58/303</w:t>
             </w:r>
           </w:p>
         </w:tc>
@@ -2562,7 +2083,7 @@
         </w:trPr>
         <w:tc>
           <w:tcPr>
-            <w:tcW w:type="dxa" w:w="3061"/>
+            <w:tcW w:type="dxa" w:w="4876"/>
             <w:vAlign w:val="center"/>
             <w:tcBorders>
               <w:top w:val="single" w:sz="4" w:color="D9D9D9"/>
@@ -2591,7 +2112,7 @@
                 <w:color w:val="202020"/>
                 <w:sz w:val="30"/>
               </w:rPr>
-              <w:t>原始Step120</w:t>
+              <w:t>原答对对照  60题</w:t>
             </w:r>
           </w:p>
         </w:tc>
@@ -2626,7 +2147,7 @@
                 <w:color w:val="202020"/>
                 <w:sz w:val="30"/>
               </w:rPr>
-              <w:t>1180/1446</w:t>
+              <w:t>57/60</w:t>
             </w:r>
           </w:p>
         </w:tc>
@@ -2661,13 +2182,18 @@
                 <w:color w:val="202020"/>
                 <w:sz w:val="30"/>
               </w:rPr>
-              <w:t>189/226</w:t>
+              <w:t>54/60</w:t>
             </w:r>
           </w:p>
         </w:tc>
+      </w:tr>
+      <w:tr>
+        <w:trPr>
+          <w:cantSplit/>
+        </w:trPr>
         <w:tc>
           <w:tcPr>
-            <w:tcW w:type="dxa" w:w="1814"/>
+            <w:tcW w:type="dxa" w:w="4876"/>
             <w:vAlign w:val="center"/>
             <w:tcBorders>
               <w:top w:val="single" w:sz="4" w:color="D9D9D9"/>
@@ -2675,7 +2201,42 @@
               <w:bottom w:val="single" w:sz="4" w:color="D9D9D9"/>
               <w:right w:val="single" w:sz="4" w:color="D9D9D9"/>
             </w:tcBorders>
-            <w:shd w:fill="FFFFFF"/>
+            <w:shd w:fill="F0F4F7"/>
+            <w:tcMar>
+              <w:top w:w="135" w:type="dxa"/>
+              <w:bottom w:w="135" w:type="dxa"/>
+              <w:left w:w="125" w:type="dxa"/>
+              <w:right w:w="125" w:type="dxa"/>
+            </w:tcMar>
+          </w:tcPr>
+          <w:p>
+            <w:pPr>
+              <w:keepNext w:val="0"/>
+              <w:spacing w:after="0" w:line="360" w:lineRule="auto"/>
+              <w:jc w:val="left"/>
+            </w:pPr>
+            <w:r>
+              <w:rPr>
+                <w:rFonts w:ascii="Times New Roman" w:hAnsi="Times New Roman" w:eastAsia="SimSun"/>
+                <w:b w:val="0"/>
+                <w:color w:val="202020"/>
+                <w:sz w:val="30"/>
+              </w:rPr>
+              <w:t>历史错题中的有效基础题  65题</w:t>
+            </w:r>
+          </w:p>
+        </w:tc>
+        <w:tc>
+          <w:tcPr>
+            <w:tcW w:type="dxa" w:w="2268"/>
+            <w:vAlign w:val="center"/>
+            <w:tcBorders>
+              <w:top w:val="single" w:sz="4" w:color="D9D9D9"/>
+              <w:left w:val="single" w:sz="4" w:color="D9D9D9"/>
+              <w:bottom w:val="single" w:sz="4" w:color="D9D9D9"/>
+              <w:right w:val="single" w:sz="4" w:color="D9D9D9"/>
+            </w:tcBorders>
+            <w:shd w:fill="F0F4F7"/>
             <w:tcMar>
               <w:top w:w="135" w:type="dxa"/>
               <w:bottom w:w="135" w:type="dxa"/>
@@ -2696,7 +2257,42 @@
                 <w:color w:val="202020"/>
                 <w:sz w:val="30"/>
               </w:rPr>
-              <w:t>1369/1672</w:t>
+              <w:t>59/65</w:t>
+            </w:r>
+          </w:p>
+        </w:tc>
+        <w:tc>
+          <w:tcPr>
+            <w:tcW w:type="dxa" w:w="2268"/>
+            <w:vAlign w:val="center"/>
+            <w:tcBorders>
+              <w:top w:val="single" w:sz="4" w:color="D9D9D9"/>
+              <w:left w:val="single" w:sz="4" w:color="D9D9D9"/>
+              <w:bottom w:val="single" w:sz="4" w:color="D9D9D9"/>
+              <w:right w:val="single" w:sz="4" w:color="D9D9D9"/>
+            </w:tcBorders>
+            <w:shd w:fill="F0F4F7"/>
+            <w:tcMar>
+              <w:top w:w="135" w:type="dxa"/>
+              <w:bottom w:w="135" w:type="dxa"/>
+              <w:left w:w="125" w:type="dxa"/>
+              <w:right w:w="125" w:type="dxa"/>
+            </w:tcMar>
+          </w:tcPr>
+          <w:p>
+            <w:pPr>
+              <w:keepNext w:val="0"/>
+              <w:spacing w:after="0" w:line="360" w:lineRule="auto"/>
+              <w:jc w:val="center"/>
+            </w:pPr>
+            <w:r>
+              <w:rPr>
+                <w:rFonts w:ascii="Times New Roman" w:hAnsi="Times New Roman" w:eastAsia="SimSun"/>
+                <w:b w:val="0"/>
+                <w:color w:val="202020"/>
+                <w:sz w:val="30"/>
+              </w:rPr>
+              <w:t>64/65</w:t>
             </w:r>
           </w:p>
         </w:tc>
@@ -2714,7 +2310,7 @@
           <w:b w:val="0"/>
           <w:sz w:val="30"/>
         </w:rPr>
-        <w:t>原始 Step120 的三轮多数票基线为81.878%。方案一的直接 CPT 和改写 CPT 分别对照这个基线计算增益。363题诊断、8题复核及12问闭卷探针也均使用原始 Step120，不使用已经接触评测答案的候选。</w:t>
+        <w:t>诊断提示与历史正式评测不同，因此303道历史错题本轮闭卷答对6题并不矛盾。资料能帮助部分题目，也可能干扰原答对题；基础题的分母和难度均不同，不能直接与303题正确率相减。</w:t>
       </w:r>
     </w:p>
     <w:p>
@@ -2730,7 +2326,7 @@
           <w:b/>
           <w:sz w:val="32"/>
         </w:rPr>
-        <w:t>已完成的同题答案SFT仅作为辅助诊断</w:t>
+        <w:t>2 八题复核与四题补证</w:t>
       </w:r>
     </w:p>
     <w:p>
@@ -2745,7 +2341,7 @@
           <w:b w:val="0"/>
           <w:sz w:val="30"/>
         </w:rPr>
-        <w:t>另一组已完成实验使用全部1672道原题、完整选项及正确答案 JSON，仅监督答案与结束标记。训练1遍和2遍后，总体同题成绩分别为93.18%和94.44%，对照原始 Step120 的81.88%，说明直接匹配作答目标的监督可以显著提高同题拟合。[9]</w:t>
+        <w:t>363题中259题自动审核缺失或无效，不能据此判为教材不覆盖。后续复核8题，发现探针过浅、资料不充分、缺图、重复选项等问题。在获得定向补证的同4题上，闭卷及原教材均为0/4，补充已核对资料后为4/4，三轮一致；单加题型提示在8题上仍为0/8。[4]</w:t>
       </w:r>
     </w:p>
     <w:p>
@@ -2760,7 +2356,7 @@
           <w:b w:val="0"/>
           <w:sz w:val="30"/>
         </w:rPr>
-        <w:t>这组实验属于“评测题答案 SFT”，不是方案二的“独立书籍问答对 SFT”。它不能证明未见问题上的能力提升，也不能单独证明模型原先已拥有全部知识。方案二后续结果应与原始 Step120 在独立问题上比较。</w:t>
+        <w:t>补证比较仅限同4题，并非全量错题或盲检索结果。补充资料是在看过金标签后按缺失概念定向核查的独立来源，不能据4/4外推到303题。该结果说明这4题的错误可由明确资料辅助纠正，不能单独区分原先缺知识还是调用困难。[4]</w:t>
       </w:r>
     </w:p>
     <w:p>
@@ -2776,7 +2372,23 @@
           <w:b/>
           <w:sz w:val="32"/>
         </w:rPr>
-        <w:t>当前可用于汇报的判断</w:t>
+        <w:t>3 四个知识点的闭卷诊断</w:t>
+      </w:r>
+    </w:p>
+    <w:p>
+      <w:pPr>
+        <w:widowControl/>
+        <w:spacing w:line="360" w:lineRule="auto" w:before="0" w:after="120"/>
+        <w:jc w:val="both"/>
+      </w:pPr>
+      <w:r>
+        <w:rPr>
+          <w:rFonts w:ascii="Times New Roman" w:hAnsi="Times New Roman" w:eastAsia="SimSun"/>
+          <w:b w:val="0"/>
+          <w:sz w:val="30"/>
+          <w:spacing w:val="-3"/>
+        </w:rPr>
+        <w:t>对上述4个知识点再做定义、辨析、应用各1问，共12问、每问3轮。预先冻结的核心标准通过6/12，其中定义2/4、辨析3/4、应用1/4。这表明部分知识可以调用，但概念范围、术语对应和情景应用并不稳定。[5]</w:t>
       </w:r>
     </w:p>
     <w:p>
@@ -2791,21 +2403,38 @@
           <w:b w:val="0"/>
           <w:sz w:val="30"/>
         </w:rPr>
-        <w:t>现有 GRPO 训练在物流知识问答上的新增收益有限。CPT 能改变文本与答案概率，但本轮转换方式产生的问答提升较小；直接答案监督能提高同题拟合。结合无训练探测，下一阶段值得验证独立书籍问答监督能否改善概念辨析和情景应用，同时继续保留知识校准、输入质量及原 Agent 能力回归检查。</w:t>
+        <w:t>每个知识点包含定义、辨析、应用各1问；12问仅涉及4个相关知识点，不是12个独立知识领域。每问至少2/3轮达到预先冻结的核心要点才记通过。主评分6/12不等于整段回答事实完全可靠；若同时否决已发现的附加事实错误，事后敏感性结果为5/12。[5]</w:t>
+      </w:r>
+    </w:p>
+    <w:p>
+      <w:pPr>
+        <w:pStyle w:val="Heading2"/>
+        <w:keepNext/>
+        <w:widowControl/>
+        <w:spacing w:line="360" w:lineRule="auto" w:before="240" w:after="120"/>
+      </w:pPr>
+      <w:r>
+        <w:rPr>
+          <w:rFonts w:eastAsia="SimHei" w:ascii="Times New Roman" w:hAnsi="Times New Roman"/>
+          <w:b/>
+          <w:sz w:val="32"/>
+        </w:rPr>
+        <w:t>实验结论与后续方向</w:t>
       </w:r>
     </w:p>
     <w:p>
       <w:pPr>
         <w:widowControl/>
-        <w:spacing w:after="0" w:line="360" w:lineRule="auto" w:before="0"/>
+        <w:spacing w:line="360" w:lineRule="auto" w:before="0" w:after="120"/>
         <w:jc w:val="both"/>
       </w:pPr>
       <w:r>
         <w:rPr>
           <w:rFonts w:ascii="Times New Roman" w:hAnsi="Times New Roman" w:eastAsia="SimSun"/>
           <w:b w:val="0"/>
-          <w:sz w:val="12"/>
+          <w:sz w:val="30"/>
         </w:rPr>
+        <w:t>无训练对照支持“部分知识可调用，但知识边界、术语对应与情景应用不稳定”的混合解释。它既不同于背景的得分比较，也不构成参数训练后的能力提升。结合方案一，下一步应使用独立书籍问答验证知识校准、概念辨析和应用监督的效果；不能把当前结果概括为“知识全部具备，只缺推理”。方案二的书籍问答 SFT 仍保留待实施状态。</w:t>
       </w:r>
     </w:p>
     <w:p>

</xml_diff>

<commit_message>
docs: clarify book CPT to SFT route and three-model comparison
</commit_message>
<xml_diff>
--- a/汇报材料/Step120物流知识能力诊断与优化实验阶段报告_20260907.docx
+++ b/汇报材料/Step120物流知识能力诊断与优化实验阶段报告_20260907.docx
@@ -45,7 +45,7 @@
           <w:b w:val="0"/>
           <w:sz w:val="30"/>
         </w:rPr>
-        <w:t>Step120 已完成既有 GRPO 训练，但在物流知识问答上与原生开源模型仍处于相近水平。我们围绕知识储备、知识吸收和问答利用开展了分层探测，并完成评测题语料 CPT 及原始模型对照。现有证据支持知识利用不足是重要问题，但不能排除局部知识范围和概念掌握不完整。</w:t>
+        <w:t>本阶段围绕物流知识问答增益有限的问题，依次开展 CPT 尝试与无训练根因诊断。结果显示，文本学习尚未充分转化为问答收益，知识边界、概念辨析和情景应用仍不稳定。下一阶段将从书籍 CPT 最佳候选出发开展书籍问答 SFT，并与原始 Step120 和该 CPT 候选比较，验证问答监督的增量效果。</w:t>
       </w:r>
     </w:p>
     <w:p>
@@ -793,7 +793,7 @@
           <w:b w:val="0"/>
           <w:sz w:val="30"/>
         </w:rPr>
-        <w:t>探测的目标是区分知识储备、知识调用与情景应用问题。先检查评测输入和评分是否可靠，再围绕同一知识点设置不同条件，观察模型在哪个环节恢复正确。探测方法在本节说明，实际无训练对照结果见实验三。</w:t>
+        <w:t>探测的目标是区分知识储备、知识调用与情景应用问题。整体逻辑是：发现问答增益不足，先尝试知识文本训练；当 CPT 收益有限时，再通过同一模型的无训练对照定位问题，最后据此设计书籍问答 SFT。本节说明判断方法，第四部分呈现诊断结果，第五部分明确训练路线与比较对象。</w:t>
       </w:r>
     </w:p>
     <w:p>
@@ -1710,7 +1710,7 @@
           <w:b w:val="0"/>
           <w:sz w:val="30"/>
         </w:rPr>
-        <w:t>这组实验属于“评测题答案 SFT”，不是方案二的“独立书籍问答对 SFT”。它不能证明未见问题上的能力提升，也不能单独证明模型原先已拥有全部知识。方案二后续结果应与原始 Step120 在独立问题上比较。</w:t>
+        <w:t>这组实验属于“评测题答案 SFT”，与后续独立书籍问答 SFT 的数据来源不同。它说明同题答案可以被拟合，但不能证明未见问题上的能力提升，也不能单独证明模型原先已拥有全部知识。其作用是提供监督目标方面的线索，不作为后续三模型比较的候选。</w:t>
       </w:r>
     </w:p>
     <w:p>
@@ -1726,60 +1726,7 @@
           <w:b/>
           <w:sz w:val="40"/>
         </w:rPr>
-        <w:t>四 方案二 书籍转问答对进行SFT</w:t>
-      </w:r>
-    </w:p>
-    <w:p>
-      <w:pPr>
-        <w:widowControl/>
-        <w:spacing w:line="360" w:lineRule="auto" w:before="0" w:after="120"/>
-        <w:jc w:val="both"/>
-      </w:pPr>
-      <w:r>
-        <w:rPr>
-          <w:rFonts w:ascii="Times New Roman" w:hAnsi="Times New Roman" w:eastAsia="SimSun"/>
-          <w:b w:val="0"/>
-          <w:color w:val="666666"/>
-          <w:sz w:val="30"/>
-        </w:rPr>
-        <w:t>尚未开展训练  本节预留</w:t>
-      </w:r>
-    </w:p>
-    <w:p>
-      <w:pPr>
-        <w:widowControl/>
-        <w:spacing w:after="0" w:line="360" w:lineRule="auto" w:before="0"/>
-        <w:jc w:val="both"/>
-      </w:pPr>
-    </w:p>
-    <w:p>
-      <w:pPr>
-        <w:widowControl/>
-        <w:spacing w:after="0" w:line="360" w:lineRule="auto" w:before="0"/>
-        <w:jc w:val="both"/>
-      </w:pPr>
-    </w:p>
-    <w:p>
-      <w:pPr>
-        <w:widowControl/>
-        <w:spacing w:after="0" w:line="360" w:lineRule="auto" w:before="0"/>
-        <w:jc w:val="both"/>
-      </w:pPr>
-    </w:p>
-    <w:p>
-      <w:pPr>
-        <w:pStyle w:val="Heading1"/>
-        <w:keepNext/>
-        <w:widowControl/>
-        <w:spacing w:line="360" w:lineRule="auto" w:before="240" w:after="120"/>
-      </w:pPr>
-      <w:r>
-        <w:rPr>
-          <w:rFonts w:eastAsia="SimHei" w:ascii="Times New Roman" w:hAnsi="Times New Roman"/>
-          <w:b/>
-          <w:sz w:val="40"/>
-        </w:rPr>
-        <w:t>五 实验三 原始Step120的无训练错题诊断</w:t>
+        <w:t>四 无训练诊断 定位知识与应用问题</w:t>
       </w:r>
     </w:p>
     <w:p>
@@ -2434,7 +2381,7 @@
           <w:b w:val="0"/>
           <w:sz w:val="30"/>
         </w:rPr>
-        <w:t>无训练对照支持“部分知识可调用，但知识边界、术语对应与情景应用不稳定”的混合解释。它既不同于背景的得分比较，也不构成参数训练后的能力提升。结合方案一，下一步应使用独立书籍问答验证知识校准、概念辨析和应用监督的效果；不能把当前结果概括为“知识全部具备，只缺推理”。方案二的书籍问答 SFT 仍保留待实施状态。</w:t>
+        <w:t>无训练对照支持“部分知识可调用，但知识边界、术语对应与情景应用不稳定”的混合解释。它把优化重点进一步落到知识校准、概念辨析和情景问答监督，因此提出下一阶段书籍 SFT。该方向有诊断依据，但是否有效仍需训练后比较，不能概括为“知识全部具备，只缺推理”。</w:t>
       </w:r>
     </w:p>
     <w:p>
@@ -2450,13 +2397,683 @@
           <w:b/>
           <w:sz w:val="40"/>
         </w:rPr>
+        <w:t>五 书籍问答SFT方案与验证计划</w:t>
+      </w:r>
+    </w:p>
+    <w:p>
+      <w:pPr>
+        <w:pStyle w:val="Heading2"/>
+        <w:keepNext/>
+        <w:widowControl/>
+        <w:spacing w:line="360" w:lineRule="auto" w:before="240" w:after="120"/>
+      </w:pPr>
+      <w:r>
+        <w:rPr>
+          <w:rFonts w:eastAsia="SimHei" w:ascii="Times New Roman" w:hAnsi="Times New Roman"/>
+          <w:b/>
+          <w:sz w:val="32"/>
+        </w:rPr>
+        <w:t>训练路线与起点</w:t>
+      </w:r>
+    </w:p>
+    <w:p>
+      <w:pPr>
+        <w:widowControl/>
+        <w:spacing w:line="360" w:lineRule="auto" w:before="0" w:after="120"/>
+        <w:jc w:val="both"/>
+      </w:pPr>
+      <w:r>
+        <w:rPr>
+          <w:rFonts w:ascii="Times New Roman" w:hAnsi="Times New Roman" w:eastAsia="SimSun"/>
+          <w:b w:val="0"/>
+          <w:sz w:val="30"/>
+        </w:rPr>
+        <w:t>训练路线确定为：原始 Step120 → 书籍原文 CPT → 书籍问答 SFT。SFT 从当前已测书籍 CPT 候选中公开题总答对数最高的4遍模型开始，标识为 qwen3.6-27b-step120-handbook8e-cpt-4x，对应本轮书籍 CPT 第116步。它不是评测题直接 CPT 或改写 CPT 模型。[8]</w:t>
+      </w:r>
+    </w:p>
+    <w:p>
+      <w:pPr>
+        <w:widowControl/>
+        <w:spacing w:line="360" w:lineRule="auto" w:before="0" w:after="120"/>
+        <w:jc w:val="both"/>
+      </w:pPr>
+      <w:r>
+        <w:rPr>
+          <w:rFonts w:ascii="Times New Roman" w:hAnsi="Times New Roman" w:eastAsia="SimSun"/>
+          <w:b w:val="0"/>
+          <w:sz w:val="30"/>
+        </w:rPr>
+        <w:t>在统一三轮多数票口径下，书籍1遍、2遍、4遍候选分别答对1370、1366、1371题；4遍为1371/1672（81.998%），原始 Step120 为1369/1672（81.878%）。4遍的净增只有2题，尚未通过此前的实用提升门槛；选择它作为后续训练起点，不等于认定其知识问答能力已有可靠提升。[8][10]</w:t>
+      </w:r>
+    </w:p>
+    <w:p>
+      <w:pPr>
+        <w:widowControl/>
+        <w:spacing w:line="360" w:lineRule="auto" w:before="0" w:after="120"/>
+        <w:jc w:val="both"/>
+      </w:pPr>
+      <w:r>
+        <w:rPr>
+          <w:rFonts w:ascii="Times New Roman" w:hAnsi="Times New Roman" w:eastAsia="SimSun"/>
+          <w:b w:val="0"/>
+          <w:sz w:val="30"/>
+        </w:rPr>
+        <w:t>SFT 从该模型权重初始化新的优化器与训练日程，不恢复书籍 CPT 的优化器状态。书籍 CPT 参数已经改变，但原有 Agent 和通用能力回归尚未完成，应在后续验证中补齐。[8]</w:t>
+      </w:r>
+    </w:p>
+    <w:p>
+      <w:pPr>
+        <w:pStyle w:val="Heading2"/>
+        <w:keepNext/>
+        <w:widowControl/>
+        <w:spacing w:line="360" w:lineRule="auto" w:before="240" w:after="120"/>
+      </w:pPr>
+      <w:r>
+        <w:rPr>
+          <w:rFonts w:eastAsia="SimHei" w:ascii="Times New Roman" w:hAnsi="Times New Roman"/>
+          <w:b/>
+          <w:sz w:val="32"/>
+        </w:rPr>
+        <w:t>训练数据与针对性</w:t>
+      </w:r>
+    </w:p>
+    <w:p>
+      <w:pPr>
+        <w:widowControl/>
+        <w:spacing w:line="360" w:lineRule="auto" w:before="0" w:after="120"/>
+        <w:jc w:val="both"/>
+      </w:pPr>
+      <w:r>
+        <w:rPr>
+          <w:rFonts w:ascii="Times New Roman" w:hAnsi="Times New Roman" w:eastAsia="SimSun"/>
+          <w:b w:val="0"/>
+          <w:sz w:val="30"/>
+        </w:rPr>
+        <w:t>从独立于评测题的书籍内容构造有出处、经复核的问答对，覆盖定义与事实校准、相近概念辨析、条件判断和情景应用。训练目标是把书籍知识转化为稳定回答；不使用公开评测题答案、错题派生探针或定向补证资料包生成训练样本。书籍 QA 数据准备与模型 SFT 训练分开记录，当前不填报训练效果。</w:t>
+      </w:r>
+    </w:p>
+    <w:p>
+      <w:pPr>
+        <w:pStyle w:val="Heading2"/>
+        <w:keepNext/>
+        <w:widowControl/>
+        <w:spacing w:line="360" w:lineRule="auto" w:before="240" w:after="120"/>
+      </w:pPr>
+      <w:r>
+        <w:rPr>
+          <w:rFonts w:eastAsia="SimHei" w:ascii="Times New Roman" w:hAnsi="Times New Roman"/>
+          <w:b/>
+          <w:sz w:val="32"/>
+        </w:rPr>
+        <w:t>三模型对照</w:t>
+      </w:r>
+    </w:p>
+    <w:tbl>
+      <w:tblPr>
+        <w:tblW w:type="auto" w:w="0"/>
+        <w:jc w:val="center"/>
+        <w:tblLayout w:type="fixed"/>
+        <w:tblLook w:firstColumn="1" w:firstRow="1" w:lastColumn="0" w:lastRow="0" w:noHBand="0" w:noVBand="1" w:val="04A0"/>
+      </w:tblPr>
+      <w:tblGrid>
+        <w:gridCol w:w="2721"/>
+        <w:gridCol w:w="2835"/>
+        <w:gridCol w:w="3855"/>
+      </w:tblGrid>
+      <w:tr>
+        <w:trPr>
+          <w:cantSplit/>
+          <w:tblHeader/>
+        </w:trPr>
+        <w:tc>
+          <w:tcPr>
+            <w:tcW w:type="dxa" w:w="2721"/>
+            <w:vAlign w:val="center"/>
+            <w:tcBorders>
+              <w:top w:val="single" w:sz="4" w:color="D9D9D9"/>
+              <w:left w:val="single" w:sz="4" w:color="D9D9D9"/>
+              <w:bottom w:val="single" w:sz="4" w:color="D9D9D9"/>
+              <w:right w:val="single" w:sz="4" w:color="D9D9D9"/>
+            </w:tcBorders>
+            <w:shd w:fill="243E56"/>
+            <w:tcMar>
+              <w:top w:w="135" w:type="dxa"/>
+              <w:bottom w:w="135" w:type="dxa"/>
+              <w:left w:w="125" w:type="dxa"/>
+              <w:right w:w="125" w:type="dxa"/>
+            </w:tcMar>
+          </w:tcPr>
+          <w:p>
+            <w:pPr>
+              <w:keepNext/>
+              <w:spacing w:after="0" w:line="360" w:lineRule="auto"/>
+              <w:jc w:val="left"/>
+            </w:pPr>
+            <w:r>
+              <w:rPr>
+                <w:rFonts w:ascii="Times New Roman" w:hAnsi="Times New Roman" w:eastAsia="SimSun"/>
+                <w:b/>
+                <w:color w:val="FFFFFF"/>
+                <w:sz w:val="30"/>
+              </w:rPr>
+              <w:t>比较对象</w:t>
+            </w:r>
+          </w:p>
+        </w:tc>
+        <w:tc>
+          <w:tcPr>
+            <w:tcW w:type="dxa" w:w="2835"/>
+            <w:vAlign w:val="center"/>
+            <w:tcBorders>
+              <w:top w:val="single" w:sz="4" w:color="D9D9D9"/>
+              <w:left w:val="single" w:sz="4" w:color="D9D9D9"/>
+              <w:bottom w:val="single" w:sz="4" w:color="D9D9D9"/>
+              <w:right w:val="single" w:sz="4" w:color="D9D9D9"/>
+            </w:tcBorders>
+            <w:shd w:fill="243E56"/>
+            <w:tcMar>
+              <w:top w:w="135" w:type="dxa"/>
+              <w:bottom w:w="135" w:type="dxa"/>
+              <w:left w:w="125" w:type="dxa"/>
+              <w:right w:w="125" w:type="dxa"/>
+            </w:tcMar>
+          </w:tcPr>
+          <w:p>
+            <w:pPr>
+              <w:keepNext/>
+              <w:spacing w:after="0" w:line="360" w:lineRule="auto"/>
+              <w:jc w:val="center"/>
+            </w:pPr>
+            <w:r>
+              <w:rPr>
+                <w:rFonts w:ascii="Times New Roman" w:hAnsi="Times New Roman" w:eastAsia="SimSun"/>
+                <w:b/>
+                <w:color w:val="FFFFFF"/>
+                <w:sz w:val="30"/>
+              </w:rPr>
+              <w:t>模型状态</w:t>
+            </w:r>
+          </w:p>
+        </w:tc>
+        <w:tc>
+          <w:tcPr>
+            <w:tcW w:type="dxa" w:w="3855"/>
+            <w:vAlign w:val="center"/>
+            <w:tcBorders>
+              <w:top w:val="single" w:sz="4" w:color="D9D9D9"/>
+              <w:left w:val="single" w:sz="4" w:color="D9D9D9"/>
+              <w:bottom w:val="single" w:sz="4" w:color="D9D9D9"/>
+              <w:right w:val="single" w:sz="4" w:color="D9D9D9"/>
+            </w:tcBorders>
+            <w:shd w:fill="243E56"/>
+            <w:tcMar>
+              <w:top w:w="135" w:type="dxa"/>
+              <w:bottom w:w="135" w:type="dxa"/>
+              <w:left w:w="125" w:type="dxa"/>
+              <w:right w:w="125" w:type="dxa"/>
+            </w:tcMar>
+          </w:tcPr>
+          <w:p>
+            <w:pPr>
+              <w:keepNext/>
+              <w:spacing w:after="0" w:line="360" w:lineRule="auto"/>
+              <w:jc w:val="center"/>
+            </w:pPr>
+            <w:r>
+              <w:rPr>
+                <w:rFonts w:ascii="Times New Roman" w:hAnsi="Times New Roman" w:eastAsia="SimSun"/>
+                <w:b/>
+                <w:color w:val="FFFFFF"/>
+                <w:sz w:val="30"/>
+              </w:rPr>
+              <w:t>比较目的</w:t>
+            </w:r>
+          </w:p>
+        </w:tc>
+      </w:tr>
+      <w:tr>
+        <w:trPr>
+          <w:cantSplit/>
+        </w:trPr>
+        <w:tc>
+          <w:tcPr>
+            <w:tcW w:type="dxa" w:w="2721"/>
+            <w:vAlign w:val="center"/>
+            <w:tcBorders>
+              <w:top w:val="single" w:sz="4" w:color="D9D9D9"/>
+              <w:left w:val="single" w:sz="4" w:color="D9D9D9"/>
+              <w:bottom w:val="single" w:sz="4" w:color="D9D9D9"/>
+              <w:right w:val="single" w:sz="4" w:color="D9D9D9"/>
+            </w:tcBorders>
+            <w:shd w:fill="F0F4F7"/>
+            <w:tcMar>
+              <w:top w:w="135" w:type="dxa"/>
+              <w:bottom w:w="135" w:type="dxa"/>
+              <w:left w:w="125" w:type="dxa"/>
+              <w:right w:w="125" w:type="dxa"/>
+            </w:tcMar>
+          </w:tcPr>
+          <w:p>
+            <w:pPr>
+              <w:keepNext w:val="0"/>
+              <w:spacing w:after="0" w:line="360" w:lineRule="auto"/>
+              <w:jc w:val="left"/>
+            </w:pPr>
+            <w:r>
+              <w:rPr>
+                <w:rFonts w:ascii="Times New Roman" w:hAnsi="Times New Roman" w:eastAsia="SimSun"/>
+                <w:b w:val="0"/>
+                <w:color w:val="202020"/>
+                <w:sz w:val="30"/>
+              </w:rPr>
+              <w:t>A  原始Step120</w:t>
+            </w:r>
+          </w:p>
+        </w:tc>
+        <w:tc>
+          <w:tcPr>
+            <w:tcW w:type="dxa" w:w="2835"/>
+            <w:vAlign w:val="center"/>
+            <w:tcBorders>
+              <w:top w:val="single" w:sz="4" w:color="D9D9D9"/>
+              <w:left w:val="single" w:sz="4" w:color="D9D9D9"/>
+              <w:bottom w:val="single" w:sz="4" w:color="D9D9D9"/>
+              <w:right w:val="single" w:sz="4" w:color="D9D9D9"/>
+            </w:tcBorders>
+            <w:shd w:fill="F0F4F7"/>
+            <w:tcMar>
+              <w:top w:w="135" w:type="dxa"/>
+              <w:bottom w:w="135" w:type="dxa"/>
+              <w:left w:w="125" w:type="dxa"/>
+              <w:right w:w="125" w:type="dxa"/>
+            </w:tcMar>
+          </w:tcPr>
+          <w:p>
+            <w:pPr>
+              <w:keepNext w:val="0"/>
+              <w:spacing w:after="0" w:line="360" w:lineRule="auto"/>
+              <w:jc w:val="center"/>
+            </w:pPr>
+            <w:r>
+              <w:rPr>
+                <w:rFonts w:ascii="Times New Roman" w:hAnsi="Times New Roman" w:eastAsia="SimSun"/>
+                <w:b w:val="0"/>
+                <w:color w:val="202020"/>
+                <w:sz w:val="30"/>
+              </w:rPr>
+              <w:t>本轮CPT及SFT前</w:t>
+            </w:r>
+          </w:p>
+        </w:tc>
+        <w:tc>
+          <w:tcPr>
+            <w:tcW w:type="dxa" w:w="3855"/>
+            <w:vAlign w:val="center"/>
+            <w:tcBorders>
+              <w:top w:val="single" w:sz="4" w:color="D9D9D9"/>
+              <w:left w:val="single" w:sz="4" w:color="D9D9D9"/>
+              <w:bottom w:val="single" w:sz="4" w:color="D9D9D9"/>
+              <w:right w:val="single" w:sz="4" w:color="D9D9D9"/>
+            </w:tcBorders>
+            <w:shd w:fill="F0F4F7"/>
+            <w:tcMar>
+              <w:top w:w="135" w:type="dxa"/>
+              <w:bottom w:w="135" w:type="dxa"/>
+              <w:left w:w="125" w:type="dxa"/>
+              <w:right w:w="125" w:type="dxa"/>
+            </w:tcMar>
+          </w:tcPr>
+          <w:p>
+            <w:pPr>
+              <w:keepNext w:val="0"/>
+              <w:spacing w:after="0" w:line="360" w:lineRule="auto"/>
+              <w:jc w:val="center"/>
+            </w:pPr>
+            <w:r>
+              <w:rPr>
+                <w:rFonts w:ascii="Times New Roman" w:hAnsi="Times New Roman" w:eastAsia="SimSun"/>
+                <w:b w:val="0"/>
+                <w:color w:val="202020"/>
+                <w:sz w:val="30"/>
+              </w:rPr>
+              <w:t>衡量整条训练路线的总收益</w:t>
+            </w:r>
+          </w:p>
+        </w:tc>
+      </w:tr>
+      <w:tr>
+        <w:trPr>
+          <w:cantSplit/>
+        </w:trPr>
+        <w:tc>
+          <w:tcPr>
+            <w:tcW w:type="dxa" w:w="2721"/>
+            <w:vAlign w:val="center"/>
+            <w:tcBorders>
+              <w:top w:val="single" w:sz="4" w:color="D9D9D9"/>
+              <w:left w:val="single" w:sz="4" w:color="D9D9D9"/>
+              <w:bottom w:val="single" w:sz="4" w:color="D9D9D9"/>
+              <w:right w:val="single" w:sz="4" w:color="D9D9D9"/>
+            </w:tcBorders>
+            <w:shd w:fill="FFFFFF"/>
+            <w:tcMar>
+              <w:top w:w="135" w:type="dxa"/>
+              <w:bottom w:w="135" w:type="dxa"/>
+              <w:left w:w="125" w:type="dxa"/>
+              <w:right w:w="125" w:type="dxa"/>
+            </w:tcMar>
+          </w:tcPr>
+          <w:p>
+            <w:pPr>
+              <w:keepNext w:val="0"/>
+              <w:spacing w:after="0" w:line="360" w:lineRule="auto"/>
+              <w:jc w:val="left"/>
+            </w:pPr>
+            <w:r>
+              <w:rPr>
+                <w:rFonts w:ascii="Times New Roman" w:hAnsi="Times New Roman" w:eastAsia="SimSun"/>
+                <w:b w:val="0"/>
+                <w:color w:val="202020"/>
+                <w:sz w:val="30"/>
+              </w:rPr>
+              <w:t>B  最佳书籍CPT</w:t>
+            </w:r>
+          </w:p>
+        </w:tc>
+        <w:tc>
+          <w:tcPr>
+            <w:tcW w:type="dxa" w:w="2835"/>
+            <w:vAlign w:val="center"/>
+            <w:tcBorders>
+              <w:top w:val="single" w:sz="4" w:color="D9D9D9"/>
+              <w:left w:val="single" w:sz="4" w:color="D9D9D9"/>
+              <w:bottom w:val="single" w:sz="4" w:color="D9D9D9"/>
+              <w:right w:val="single" w:sz="4" w:color="D9D9D9"/>
+            </w:tcBorders>
+            <w:shd w:fill="FFFFFF"/>
+            <w:tcMar>
+              <w:top w:w="135" w:type="dxa"/>
+              <w:bottom w:w="135" w:type="dxa"/>
+              <w:left w:w="125" w:type="dxa"/>
+              <w:right w:w="125" w:type="dxa"/>
+            </w:tcMar>
+          </w:tcPr>
+          <w:p>
+            <w:pPr>
+              <w:keepNext w:val="0"/>
+              <w:spacing w:after="0" w:line="360" w:lineRule="auto"/>
+              <w:jc w:val="center"/>
+            </w:pPr>
+            <w:r>
+              <w:rPr>
+                <w:rFonts w:ascii="Times New Roman" w:hAnsi="Times New Roman" w:eastAsia="SimSun"/>
+                <w:b w:val="0"/>
+                <w:color w:val="202020"/>
+                <w:sz w:val="30"/>
+              </w:rPr>
+              <w:t>书籍4遍 第116步</w:t>
+            </w:r>
+          </w:p>
+        </w:tc>
+        <w:tc>
+          <w:tcPr>
+            <w:tcW w:type="dxa" w:w="3855"/>
+            <w:vAlign w:val="center"/>
+            <w:tcBorders>
+              <w:top w:val="single" w:sz="4" w:color="D9D9D9"/>
+              <w:left w:val="single" w:sz="4" w:color="D9D9D9"/>
+              <w:bottom w:val="single" w:sz="4" w:color="D9D9D9"/>
+              <w:right w:val="single" w:sz="4" w:color="D9D9D9"/>
+            </w:tcBorders>
+            <w:shd w:fill="FFFFFF"/>
+            <w:tcMar>
+              <w:top w:w="135" w:type="dxa"/>
+              <w:bottom w:w="135" w:type="dxa"/>
+              <w:left w:w="125" w:type="dxa"/>
+              <w:right w:w="125" w:type="dxa"/>
+            </w:tcMar>
+          </w:tcPr>
+          <w:p>
+            <w:pPr>
+              <w:keepNext w:val="0"/>
+              <w:spacing w:after="0" w:line="360" w:lineRule="auto"/>
+              <w:jc w:val="center"/>
+            </w:pPr>
+            <w:r>
+              <w:rPr>
+                <w:rFonts w:ascii="Times New Roman" w:hAnsi="Times New Roman" w:eastAsia="SimSun"/>
+                <w:b w:val="0"/>
+                <w:color w:val="202020"/>
+                <w:sz w:val="30"/>
+              </w:rPr>
+              <w:t>衡量书籍CPT阶段的变化</w:t>
+            </w:r>
+          </w:p>
+        </w:tc>
+      </w:tr>
+      <w:tr>
+        <w:trPr>
+          <w:cantSplit/>
+        </w:trPr>
+        <w:tc>
+          <w:tcPr>
+            <w:tcW w:type="dxa" w:w="2721"/>
+            <w:vAlign w:val="center"/>
+            <w:tcBorders>
+              <w:top w:val="single" w:sz="4" w:color="D9D9D9"/>
+              <w:left w:val="single" w:sz="4" w:color="D9D9D9"/>
+              <w:bottom w:val="single" w:sz="4" w:color="D9D9D9"/>
+              <w:right w:val="single" w:sz="4" w:color="D9D9D9"/>
+            </w:tcBorders>
+            <w:shd w:fill="F0F4F7"/>
+            <w:tcMar>
+              <w:top w:w="135" w:type="dxa"/>
+              <w:bottom w:w="135" w:type="dxa"/>
+              <w:left w:w="125" w:type="dxa"/>
+              <w:right w:w="125" w:type="dxa"/>
+            </w:tcMar>
+          </w:tcPr>
+          <w:p>
+            <w:pPr>
+              <w:keepNext w:val="0"/>
+              <w:spacing w:after="0" w:line="360" w:lineRule="auto"/>
+              <w:jc w:val="left"/>
+            </w:pPr>
+            <w:r>
+              <w:rPr>
+                <w:rFonts w:ascii="Times New Roman" w:hAnsi="Times New Roman" w:eastAsia="SimSun"/>
+                <w:b w:val="0"/>
+                <w:color w:val="202020"/>
+                <w:sz w:val="30"/>
+              </w:rPr>
+              <w:t>C  书籍CPT后SFT</w:t>
+            </w:r>
+          </w:p>
+        </w:tc>
+        <w:tc>
+          <w:tcPr>
+            <w:tcW w:type="dxa" w:w="2835"/>
+            <w:vAlign w:val="center"/>
+            <w:tcBorders>
+              <w:top w:val="single" w:sz="4" w:color="D9D9D9"/>
+              <w:left w:val="single" w:sz="4" w:color="D9D9D9"/>
+              <w:bottom w:val="single" w:sz="4" w:color="D9D9D9"/>
+              <w:right w:val="single" w:sz="4" w:color="D9D9D9"/>
+            </w:tcBorders>
+            <w:shd w:fill="F0F4F7"/>
+            <w:tcMar>
+              <w:top w:w="135" w:type="dxa"/>
+              <w:bottom w:w="135" w:type="dxa"/>
+              <w:left w:w="125" w:type="dxa"/>
+              <w:right w:w="125" w:type="dxa"/>
+            </w:tcMar>
+          </w:tcPr>
+          <w:p>
+            <w:pPr>
+              <w:keepNext w:val="0"/>
+              <w:spacing w:after="0" w:line="360" w:lineRule="auto"/>
+              <w:jc w:val="center"/>
+            </w:pPr>
+            <w:r>
+              <w:rPr>
+                <w:rFonts w:ascii="Times New Roman" w:hAnsi="Times New Roman" w:eastAsia="SimSun"/>
+                <w:b w:val="0"/>
+                <w:color w:val="202020"/>
+                <w:sz w:val="30"/>
+              </w:rPr>
+              <w:t>从B继续开展QA训练</w:t>
+            </w:r>
+          </w:p>
+        </w:tc>
+        <w:tc>
+          <w:tcPr>
+            <w:tcW w:type="dxa" w:w="3855"/>
+            <w:vAlign w:val="center"/>
+            <w:tcBorders>
+              <w:top w:val="single" w:sz="4" w:color="D9D9D9"/>
+              <w:left w:val="single" w:sz="4" w:color="D9D9D9"/>
+              <w:bottom w:val="single" w:sz="4" w:color="D9D9D9"/>
+              <w:right w:val="single" w:sz="4" w:color="D9D9D9"/>
+            </w:tcBorders>
+            <w:shd w:fill="F0F4F7"/>
+            <w:tcMar>
+              <w:top w:w="135" w:type="dxa"/>
+              <w:bottom w:w="135" w:type="dxa"/>
+              <w:left w:w="125" w:type="dxa"/>
+              <w:right w:w="125" w:type="dxa"/>
+            </w:tcMar>
+          </w:tcPr>
+          <w:p>
+            <w:pPr>
+              <w:keepNext w:val="0"/>
+              <w:spacing w:after="0" w:line="360" w:lineRule="auto"/>
+              <w:jc w:val="center"/>
+            </w:pPr>
+            <w:r>
+              <w:rPr>
+                <w:rFonts w:ascii="Times New Roman" w:hAnsi="Times New Roman" w:eastAsia="SimSun"/>
+                <w:b w:val="0"/>
+                <w:color w:val="202020"/>
+                <w:sz w:val="30"/>
+              </w:rPr>
+              <w:t>相对B衡量SFT增量 相对A衡量总收益</w:t>
+            </w:r>
+          </w:p>
+        </w:tc>
+      </w:tr>
+    </w:tbl>
+    <w:p>
+      <w:pPr>
+        <w:widowControl/>
+        <w:spacing w:line="360" w:lineRule="auto" w:before="0" w:after="120"/>
+        <w:jc w:val="both"/>
+      </w:pPr>
+      <w:r>
+        <w:rPr>
+          <w:rFonts w:ascii="Times New Roman" w:hAnsi="Times New Roman" w:eastAsia="SimSun"/>
+          <w:b w:val="0"/>
+          <w:sz w:val="30"/>
+        </w:rPr>
+        <w:t>A、B、C 使用同一冻结评测集、推理配置与评分协议，分别报告每个数据集的准确率、答对数、错转对及对转错。C相对B的变化用于衡量在当前书籍 CPT 起点上追加 SFT 的效果；C相对A的变化用于衡量整条路线的总收益。</w:t>
+      </w:r>
+    </w:p>
+    <w:p>
+      <w:pPr>
+        <w:pStyle w:val="Heading2"/>
+        <w:keepNext/>
+        <w:widowControl/>
+        <w:spacing w:line="360" w:lineRule="auto" w:before="240" w:after="120"/>
+      </w:pPr>
+      <w:r>
+        <w:rPr>
+          <w:rFonts w:eastAsia="SimHei" w:ascii="Times New Roman" w:hAnsi="Times New Roman"/>
+          <w:b/>
+          <w:sz w:val="32"/>
+        </w:rPr>
+        <w:t>验证标准与解释边界</w:t>
+      </w:r>
+    </w:p>
+    <w:p>
+      <w:pPr>
+        <w:widowControl/>
+        <w:spacing w:line="360" w:lineRule="auto" w:before="0" w:after="120"/>
+        <w:jc w:val="both"/>
+      </w:pPr>
+      <w:r>
+        <w:rPr>
+          <w:rFonts w:ascii="Times New Roman" w:hAnsi="Times New Roman" w:eastAsia="SimSun"/>
+          <w:b w:val="0"/>
+          <w:sz w:val="30"/>
+        </w:rPr>
+        <w:t>实际能力验证以未参与 CPT、SFT 制数或调参的独立问答题为主，按来源和概念隔离并在训练前冻结；SC-bench 和 LogistikaBench 保留为已多次使用的公开参考集。三模型采用相同条件重复评测，结合配对变化、实际提升幅度和原 Agent／通用能力回归判断，避免仅凭单轮多答对几题宣布成功。</w:t>
+      </w:r>
+    </w:p>
+    <w:p>
+      <w:pPr>
+        <w:widowControl/>
+        <w:spacing w:line="360" w:lineRule="auto" w:before="0" w:after="120"/>
+        <w:jc w:val="both"/>
+      </w:pPr>
+      <w:r>
+        <w:rPr>
+          <w:rFonts w:ascii="Times New Roman" w:hAnsi="Times New Roman" w:eastAsia="SimSun"/>
+          <w:b w:val="0"/>
+          <w:sz w:val="30"/>
+        </w:rPr>
+        <w:t>只有C相对B有稳定增益、相对A有实际收益，且原有能力无明显退化，才支持当前路线有效。若C优于B却未超过A，只能说明弥补了中间阶段损失。本轮未设置“Step120直接SFT”训练臂，因此不能据三模型比较证明 CPT 是必要前置步骤，也不能证明 CPT 后接 SFT 优于直接 SFT。</w:t>
+      </w:r>
+    </w:p>
+    <w:p>
+      <w:pPr>
+        <w:pStyle w:val="Heading2"/>
+        <w:keepNext/>
+        <w:widowControl/>
+        <w:spacing w:line="360" w:lineRule="auto" w:before="240" w:after="120"/>
+      </w:pPr>
+      <w:r>
+        <w:rPr>
+          <w:rFonts w:eastAsia="SimHei" w:ascii="Times New Roman" w:hAnsi="Times New Roman"/>
+          <w:b/>
+          <w:sz w:val="32"/>
+        </w:rPr>
+        <w:t>实施状态与结果预留</w:t>
+      </w:r>
+    </w:p>
+    <w:p>
+      <w:pPr>
+        <w:widowControl/>
+        <w:spacing w:line="360" w:lineRule="auto" w:before="0" w:after="120"/>
+        <w:jc w:val="both"/>
+      </w:pPr>
+      <w:r>
+        <w:rPr>
+          <w:rFonts w:ascii="Times New Roman" w:hAnsi="Times New Roman" w:eastAsia="SimSun"/>
+          <w:b w:val="0"/>
+          <w:sz w:val="30"/>
+        </w:rPr>
+        <w:t>书籍问答 SFT 尚未开展。本节已明确训练起点与比较设计，训练配置、实际成绩和最终结论待实验完成后填写。</w:t>
+      </w:r>
+    </w:p>
+    <w:p>
+      <w:pPr>
+        <w:pStyle w:val="Heading1"/>
+        <w:keepNext/>
+        <w:widowControl/>
+        <w:spacing w:line="360" w:lineRule="auto" w:before="0" w:after="60"/>
+      </w:pPr>
+      <w:r>
+        <w:rPr>
+          <w:rFonts w:eastAsia="SimHei" w:ascii="Times New Roman" w:hAnsi="Times New Roman"/>
+          <w:b/>
+          <w:sz w:val="40"/>
+        </w:rPr>
         <w:t>附录 实验身份与证据索引</w:t>
       </w:r>
     </w:p>
     <w:p>
       <w:pPr>
         <w:widowControl/>
-        <w:spacing w:line="360" w:lineRule="auto" w:before="0" w:after="120"/>
+        <w:spacing w:line="360" w:lineRule="auto" w:before="0" w:after="60"/>
         <w:jc w:val="both"/>
       </w:pPr>
       <w:r>
@@ -2473,7 +3090,7 @@
         <w:pStyle w:val="Heading2"/>
         <w:keepNext/>
         <w:widowControl/>
-        <w:spacing w:before="240" w:after="120" w:line="360" w:lineRule="auto"/>
+        <w:spacing w:before="100" w:after="60" w:line="360" w:lineRule="auto"/>
       </w:pPr>
       <w:r>
         <w:rPr>
@@ -2487,7 +3104,7 @@
     <w:p>
       <w:pPr>
         <w:widowControl/>
-        <w:spacing w:after="120" w:line="360" w:lineRule="auto" w:before="0"/>
+        <w:spacing w:after="60" w:line="360" w:lineRule="auto" w:before="0"/>
         <w:jc w:val="left"/>
       </w:pPr>
       <w:r>
@@ -2505,7 +3122,7 @@
         <w:pStyle w:val="Heading2"/>
         <w:keepNext/>
         <w:widowControl/>
-        <w:spacing w:before="240" w:after="120" w:line="360" w:lineRule="auto"/>
+        <w:spacing w:before="100" w:after="60" w:line="360" w:lineRule="auto"/>
       </w:pPr>
       <w:r>
         <w:rPr>
@@ -2519,7 +3136,7 @@
     <w:p>
       <w:pPr>
         <w:widowControl/>
-        <w:spacing w:after="120" w:line="360" w:lineRule="auto" w:before="0"/>
+        <w:spacing w:after="60" w:line="360" w:lineRule="auto" w:before="0"/>
         <w:jc w:val="left"/>
       </w:pPr>
       <w:r>
@@ -2537,7 +3154,7 @@
         <w:pStyle w:val="Heading2"/>
         <w:keepNext/>
         <w:widowControl/>
-        <w:spacing w:before="240" w:after="120" w:line="360" w:lineRule="auto"/>
+        <w:spacing w:before="100" w:after="60" w:line="360" w:lineRule="auto"/>
       </w:pPr>
       <w:r>
         <w:rPr>
@@ -2551,7 +3168,7 @@
     <w:p>
       <w:pPr>
         <w:widowControl/>
-        <w:spacing w:after="120" w:line="360" w:lineRule="auto" w:before="0"/>
+        <w:spacing w:after="60" w:line="360" w:lineRule="auto" w:before="0"/>
         <w:jc w:val="left"/>
       </w:pPr>
       <w:r>
@@ -2569,7 +3186,7 @@
         <w:pStyle w:val="Heading2"/>
         <w:keepNext/>
         <w:widowControl/>
-        <w:spacing w:before="240" w:after="120" w:line="360" w:lineRule="auto"/>
+        <w:spacing w:before="100" w:after="60" w:line="360" w:lineRule="auto"/>
       </w:pPr>
       <w:r>
         <w:rPr>
@@ -2583,7 +3200,7 @@
     <w:p>
       <w:pPr>
         <w:widowControl/>
-        <w:spacing w:after="120" w:line="360" w:lineRule="auto" w:before="0"/>
+        <w:spacing w:after="60" w:line="360" w:lineRule="auto" w:before="0"/>
         <w:jc w:val="left"/>
       </w:pPr>
       <w:r>
@@ -2601,7 +3218,7 @@
         <w:pStyle w:val="Heading2"/>
         <w:keepNext/>
         <w:widowControl/>
-        <w:spacing w:before="240" w:after="120" w:line="360" w:lineRule="auto"/>
+        <w:spacing w:before="100" w:after="60" w:line="360" w:lineRule="auto"/>
       </w:pPr>
       <w:r>
         <w:rPr>
@@ -2615,7 +3232,7 @@
     <w:p>
       <w:pPr>
         <w:widowControl/>
-        <w:spacing w:after="120" w:line="360" w:lineRule="auto" w:before="0"/>
+        <w:spacing w:after="60" w:line="360" w:lineRule="auto" w:before="0"/>
         <w:jc w:val="left"/>
       </w:pPr>
       <w:r>
@@ -2633,7 +3250,7 @@
         <w:pStyle w:val="Heading2"/>
         <w:keepNext/>
         <w:widowControl/>
-        <w:spacing w:before="240" w:after="120" w:line="360" w:lineRule="auto"/>
+        <w:spacing w:before="100" w:after="60" w:line="360" w:lineRule="auto"/>
       </w:pPr>
       <w:r>
         <w:rPr>
@@ -2647,7 +3264,7 @@
     <w:p>
       <w:pPr>
         <w:widowControl/>
-        <w:spacing w:after="120" w:line="360" w:lineRule="auto" w:before="0"/>
+        <w:spacing w:after="60" w:line="360" w:lineRule="auto" w:before="0"/>
         <w:jc w:val="left"/>
       </w:pPr>
       <w:r>
@@ -2666,7 +3283,7 @@
         <w:pStyle w:val="Heading2"/>
         <w:keepNext/>
         <w:widowControl/>
-        <w:spacing w:before="240" w:after="120" w:line="360" w:lineRule="auto"/>
+        <w:spacing w:before="100" w:after="60" w:line="360" w:lineRule="auto"/>
       </w:pPr>
       <w:r>
         <w:rPr>
@@ -2680,7 +3297,7 @@
     <w:p>
       <w:pPr>
         <w:widowControl/>
-        <w:spacing w:after="120" w:line="360" w:lineRule="auto" w:before="0"/>
+        <w:spacing w:after="60" w:line="360" w:lineRule="auto" w:before="0"/>
         <w:jc w:val="left"/>
       </w:pPr>
       <w:r>
@@ -2698,7 +3315,7 @@
         <w:pStyle w:val="Heading2"/>
         <w:keepNext/>
         <w:widowControl/>
-        <w:spacing w:before="240" w:after="120" w:line="360" w:lineRule="auto"/>
+        <w:spacing w:before="100" w:after="60" w:line="360" w:lineRule="auto"/>
       </w:pPr>
       <w:r>
         <w:rPr>
@@ -2712,7 +3329,7 @@
     <w:p>
       <w:pPr>
         <w:widowControl/>
-        <w:spacing w:after="120" w:line="360" w:lineRule="auto" w:before="0"/>
+        <w:spacing w:after="60" w:line="360" w:lineRule="auto" w:before="0"/>
         <w:jc w:val="left"/>
       </w:pPr>
       <w:r>
@@ -2730,7 +3347,7 @@
         <w:pStyle w:val="Heading2"/>
         <w:keepNext/>
         <w:widowControl/>
-        <w:spacing w:before="240" w:after="120" w:line="360" w:lineRule="auto"/>
+        <w:spacing w:before="100" w:after="60" w:line="360" w:lineRule="auto"/>
       </w:pPr>
       <w:r>
         <w:rPr>
@@ -2744,7 +3361,7 @@
     <w:p>
       <w:pPr>
         <w:widowControl/>
-        <w:spacing w:after="120" w:line="360" w:lineRule="auto" w:before="0"/>
+        <w:spacing w:after="60" w:line="360" w:lineRule="auto" w:before="0"/>
         <w:jc w:val="left"/>
       </w:pPr>
       <w:r>
@@ -2759,8 +3376,39 @@
     </w:p>
     <w:p>
       <w:pPr>
+        <w:pStyle w:val="Heading2"/>
+        <w:keepNext/>
         <w:widowControl/>
-        <w:spacing w:line="360" w:lineRule="auto" w:before="0" w:after="120"/>
+        <w:spacing w:line="360" w:lineRule="auto" w:before="100" w:after="60"/>
+      </w:pPr>
+      <w:r>
+        <w:rPr>
+          <w:rFonts w:eastAsia="SimHei" w:ascii="Times New Roman" w:hAnsi="Times New Roman"/>
+          <w:b/>
+          <w:sz w:val="32"/>
+        </w:rPr>
+        <w:t>[10] 单书首遍CPT的三轮复测</w:t>
+      </w:r>
+    </w:p>
+    <w:p>
+      <w:pPr>
+        <w:widowControl/>
+        <w:spacing w:line="360" w:lineRule="auto" w:before="0" w:after="60"/>
+        <w:jc w:val="left"/>
+      </w:pPr>
+      <w:r>
+        <w:rPr>
+          <w:rFonts w:ascii="Times New Roman" w:hAnsi="Times New Roman" w:eastAsia="SimSun"/>
+          <w:b w:val="0"/>
+          <w:sz w:val="30"/>
+        </w:rPr>
+        <w:t>docs/qwen36_step120_logistics_cpt_five_test_diagnosis_20260904.md</w:t>
+      </w:r>
+    </w:p>
+    <w:p>
+      <w:pPr>
+        <w:widowControl/>
+        <w:spacing w:line="360" w:lineRule="auto" w:before="0" w:after="60"/>
         <w:jc w:val="left"/>
       </w:pPr>
       <w:r>
@@ -2777,7 +3425,7 @@
     <w:p>
       <w:pPr>
         <w:widowControl/>
-        <w:spacing w:line="360" w:lineRule="auto" w:before="0" w:after="120"/>
+        <w:spacing w:line="360" w:lineRule="auto" w:before="0" w:after="60"/>
         <w:jc w:val="both"/>
       </w:pPr>
       <w:r>

</xml_diff>

<commit_message>
docs: sharpen client-facing Step120 experiment report
</commit_message>
<xml_diff>
--- a/汇报材料/Step120物流知识能力诊断与优化实验阶段报告_20260907.docx
+++ b/汇报材料/Step120物流知识能力诊断与优化实验阶段报告_20260907.docx
@@ -17,7 +17,7 @@
           <w:sz w:val="48"/>
           <w:color w:val="000000"/>
         </w:rPr>
-        <w:t>Step120物流知识能力诊断与优化实验</w:t>
+        <w:t>Step120物流知识优化实验</w:t>
       </w:r>
     </w:p>
     <w:p>
@@ -51,7 +51,7 @@
           <w:sz w:val="30"/>
           <w:color w:val="000000"/>
         </w:rPr>
-        <w:t>本阶段围绕物流知识问答增益有限的问题，依次开展 CPT 尝试与无训练根因诊断。结果显示，文本学习尚未充分转化为问答收益，知识边界、概念辨析和情景应用仍不稳定。下一阶段将从书籍 CPT 最佳候选出发开展书籍问答 SFT，并与原始 Step120 和该 CPT 候选比较，验证问答监督的增量效果。</w:t>
+        <w:t>本阶段验证物流知识专项训练的效果，明确后续优化路径。实验表明，CPT 改善了文本学习表现，问答得分小幅提升；进一步诊断将优化重点指向知识校准、概念辨析与情景应用。下一阶段拟从最佳书籍 CPT 模型开展问答 SFT，通过三模型对照验证增量效果。</w:t>
       </w:r>
     </w:p>
     <w:p>
@@ -69,7 +69,7 @@
           <w:sz w:val="40"/>
           <w:color w:val="000000"/>
         </w:rPr>
-        <w:t>一 背景与问题</w:t>
+        <w:t>一 背景与目标</w:t>
       </w:r>
     </w:p>
     <w:p>
@@ -86,7 +86,7 @@
           <w:sz w:val="30"/>
           <w:color w:val="000000"/>
         </w:rPr>
-        <w:t>本报告的 Step120 指 2026年8月25日开源数据续训后的模型，实验标识为 llin-step120-opensource-20260825-02。按训练记录，该模型先接受100步垂域轨迹 GRPO，再完成20步开源数据更新；此前训练未专门引入本轮物流书籍知识。[1]</w:t>
+        <w:t>本报告评估2026年8月25日开源数据续训后的 Step120，实验标识为 llin-step120-opensource-20260825-02。该模型完成100步垂域轨迹 GRPO 和20步开源数据训练，尚未专门学习本轮物流书籍。[1]</w:t>
       </w:r>
     </w:p>
     <w:p>
@@ -103,7 +103,7 @@
           <w:sz w:val="30"/>
           <w:color w:val="000000"/>
         </w:rPr>
-        <w:t>为检查垂域 Agent 训练是否同时带来物流知识收益，我们比较同机、同推理栈的原生 Qwen3.6-27B 与 Step120。结果均在80多分，差距不到半个百分点。[2]</w:t>
+        <w:t>在同机、同推理配置下，原生 Qwen3.6-27B 与 Step120 的物流知识评测总准确率分别为81.52%和81.88%。本阶段在此基础上验证专项知识训练的增量价值。[2]</w:t>
       </w:r>
     </w:p>
     <w:tbl>
@@ -731,7 +731,7 @@
           <w:color w:val="000000"/>
           <w:sz w:val="30"/>
         </w:rPr>
-        <w:t>注：变化按未四舍五入的原始分数计算，单位为百分点。SC-bench 的100道工具题不在本表内。主比较采用相同 BF16 精度、温度0、关闭 thinking 和严格答案集合评分。</w:t>
+        <w:t>注：变化按原始分数计算，单位为百分点。SC-bench 仅计知识题。两模型统一采用 BF16、温度0、关闭思考模式和严格答案集合评分。</w:t>
       </w:r>
     </w:p>
     <w:p>
@@ -749,7 +749,7 @@
           <w:sz w:val="32"/>
           <w:color w:val="000000"/>
         </w:rPr>
-        <w:t>问题判断</w:t>
+        <w:t>优化目标</w:t>
       </w:r>
     </w:p>
     <w:p>
@@ -766,7 +766,7 @@
           <w:sz w:val="30"/>
           <w:color w:val="000000"/>
         </w:rPr>
-        <w:t>这一结果说明，既有训练尚未形成明显的物流知识问答增益，垂域 Agent 优化没有自动转化为同等幅度的知识问答优势。Step120 共答对1369题，仍有303题答错；但仅凭总分不能判断这些错误究竟来自知识缺口、概念调用、情景应用，还是输入与评分问题。</w:t>
+        <w:t>Step120 答对1369/1672题，较原生模型净增6题，尚未达到项目设定的提升3个百分点目标。后续以303道错题为切入点，区分知识储备、知识调用、情景应用及评测输入的影响。</w:t>
       </w:r>
     </w:p>
     <w:p>
@@ -783,23 +783,7 @@
           <w:sz w:val="30"/>
           <w:color w:val="000000"/>
         </w:rPr>
-        <w:t>本轮主比较净增6题，低于项目此前设定的物流知识提升3个百分点的实用门槛。以下实验用于拆解差距，不把“80多分”直接等同于“缺知识”。</w:t>
-      </w:r>
-    </w:p>
-    <w:p>
-      <w:pPr>
-        <w:widowControl/>
-        <w:spacing w:after="0" w:line="360" w:lineRule="auto" w:before="0"/>
-        <w:ind w:firstLine="0" w:firstLineChars="0"/>
-        <w:jc w:val="both"/>
-      </w:pPr>
-      <w:r>
-        <w:rPr>
-          <w:rFonts w:ascii="Times New Roman" w:hAnsi="Times New Roman" w:eastAsia="SimSun"/>
-          <w:b w:val="0"/>
-          <w:sz w:val="12"/>
-          <w:color w:val="000000"/>
-        </w:rPr>
+        <w:t>总分用于衡量效果，错题对照用于定位原因；不能仅凭得分判断知识是否缺失。</w:t>
       </w:r>
     </w:p>
     <w:p>
@@ -817,7 +801,7 @@
           <w:sz w:val="40"/>
           <w:color w:val="000000"/>
         </w:rPr>
-        <w:t>二 探测方法与优化思路</w:t>
+        <w:t>二 诊断方法与优化思路</w:t>
       </w:r>
     </w:p>
     <w:p>
@@ -834,7 +818,7 @@
           <w:sz w:val="30"/>
           <w:color w:val="000000"/>
         </w:rPr>
-        <w:t>探测的目标是区分知识储备、知识调用与情景应用问题。整体逻辑是：发现问答增益不足，先尝试知识文本训练；当 CPT 收益有限时，再通过同一模型的无训练对照定位问题，最后据此设计书籍问答 SFT。本节说明判断方法，第四部分呈现诊断结果，第五部分明确训练路线与比较对象。</w:t>
+        <w:t>先用继续预训练（CPT）验证知识文本学习的收益，再通过固定模型的条件对照定位原因，据此设计书籍问答监督微调（SFT）。核心问题是：哪些知识需要补充，哪些需要更准确地调用和应用。</w:t>
       </w:r>
     </w:p>
     <w:p>
@@ -852,7 +836,7 @@
           <w:sz w:val="32"/>
           <w:color w:val="000000"/>
         </w:rPr>
-        <w:t>1 在同一模型上改变作答条件</w:t>
+        <w:t>1 作答条件对照</w:t>
       </w:r>
     </w:p>
     <w:p>
@@ -869,7 +853,7 @@
           <w:sz w:val="30"/>
           <w:color w:val="000000"/>
         </w:rPr>
-        <w:t>以原始 Step120 的历史错题为主要样本，并匹配少量原答对题作对照。设置原题闭卷、原题加独立教材、相关基础知识题闭卷、基础知识题加教材四个条件，每个条件重复3轮。检索不接收金答案，基础题与资料充分性分别审核；未通过的样本不强行归因。[3]</w:t>
+        <w:t>以原始 Step120 历史错题为主样本，匹配原答对题作对照。设置原题闭卷、原题加教材、基础题闭卷、基础题加教材四种条件，各重复3轮。检索不使用标准答案；基础题质量与资料充分性分别审核，仅对通过审核的样本归因。[3]</w:t>
       </w:r>
     </w:p>
     <w:p>
@@ -887,7 +871,7 @@
           <w:sz w:val="32"/>
           <w:color w:val="000000"/>
         </w:rPr>
-        <w:t>2 用补证与开放问答核查知识边界</w:t>
+        <w:t>2 资料复核与闭卷问答</w:t>
       </w:r>
     </w:p>
     <w:p>
@@ -904,7 +888,7 @@
           <w:sz w:val="30"/>
           <w:color w:val="000000"/>
         </w:rPr>
-        <w:t>对有代表性的疑难案例核查资料是否真正足够、输入是否缺图或存在选项歧义。再对同一知识点设计定义、辨析、应用问答，检查模型能否在不提供资料和选项时主动表达并使用知识。定向补证与闭卷探针用于定位原因，不改写原正式成绩。[4][5]</w:t>
+        <w:t>复核代表性案例的资料充分性、缺图和选项歧义，再围绕同一知识点设置定义、辨析、应用问答，检查模型独立作答能力。补证与闭卷诊断单独计分，不计入正式评测成绩。[4][5]</w:t>
       </w:r>
     </w:p>
     <w:p>
@@ -922,7 +906,7 @@
           <w:sz w:val="32"/>
           <w:color w:val="000000"/>
         </w:rPr>
-        <w:t>3 根据证据选择优化方向</w:t>
+        <w:t>3 优化方向判定</w:t>
       </w:r>
     </w:p>
     <w:p>
@@ -939,7 +923,7 @@
           <w:sz w:val="30"/>
           <w:color w:val="000000"/>
         </w:rPr>
-        <w:t>闭卷答错、加资料答对，提示知识补充或调用改善可能有效，但不能证明参数中完全没有知识；定义可答而应用不稳，应重点检查概念辨析、条件理解与情景映射；输入或标签有问题，应先核对评测依据。训练侧再用 CPT 与答案监督检查文本学习是否转化为问答表现，避免仅凭总分或训练 loss 判定根因。</w:t>
+        <w:t>加资料后答对，提示可改善知识补充或调用；定义可答而应用失误，重点优化概念辨析和条件判断；输入或标签异常，先复核评测依据。结合 CPT 与答案监督实验判断学习效果，避免仅凭总分或训练损失归因。</w:t>
       </w:r>
     </w:p>
     <w:p>
@@ -957,7 +941,7 @@
           <w:sz w:val="40"/>
           <w:color w:val="000000"/>
         </w:rPr>
-        <w:t>三 方案一 评测基准转语料开展CPT</w:t>
+        <w:t>三 CPT 实验与结果</w:t>
       </w:r>
     </w:p>
     <w:p>
@@ -992,7 +976,7 @@
           <w:sz w:val="30"/>
           <w:color w:val="000000"/>
         </w:rPr>
-        <w:t>为检验“把所需知识显式加入训练，是否就能提高得分”，我们将1672道评测题转成普通因果语言建模语料，并设置直接题面与改写题面两组。两组均从同一 Step120 权重独立初始化新优化器，各训练4遍、64步，再用冻结原题做三轮多数票评测。[6]</w:t>
+        <w:t>将1672道评测题转为文本训练语料，设置直接题面、改写题面两组，检验显式学习相关知识后的得分变化。两组均从原始 Step120 独立启动，各训练4遍、64步，再以冻结原题进行三轮多数票评测。[6]</w:t>
       </w:r>
     </w:p>
     <w:p>
@@ -1009,7 +993,7 @@
           <w:sz w:val="30"/>
           <w:color w:val="000000"/>
         </w:rPr>
-        <w:t>直接组保留题干和正确答案正文，去除选项字母、索引及干扰项；改写组改写题干、保留正确答案。1625题通过自动改写门禁，47题回退到原题。历史判断题保留原命题并追加真假结论，并未全部转成纠正后的正向知识陈述，这是该次制数的限制。</w:t>
+        <w:t>直接组保留题干及正确答案正文，删除选项标记和干扰项；改写组改写题干并保留答案，其中1625题通过审核、47题保留原题。判断题沿用原命题并附真假结论，未全部转为正向知识陈述。</w:t>
       </w:r>
     </w:p>
     <w:tbl>
@@ -1637,7 +1621,7 @@
           <w:sz w:val="30"/>
           <w:color w:val="000000"/>
         </w:rPr>
-        <w:t>直接组21题改对、9题改错，净增12题；改写组10题改对、6题改错，净增4题。直接组的未校正配对检验 p=0.0428，改写组 p=0.4545。准确表述是“有小幅提升，但实用增益有限”，不能笼统写成两组均统计不显著。</w:t>
+        <w:t>直接组21题改对、9题改错，净增12题；改写组10题改对、6题改错，净增4题。未校正配对检验分别为 p=0.0428、p=0.4545。两组均有小幅提升，尚未达到3个百分点的项目目标。</w:t>
       </w:r>
     </w:p>
     <w:p>
@@ -1655,7 +1639,7 @@
           <w:sz w:val="32"/>
           <w:color w:val="000000"/>
         </w:rPr>
-        <w:t>训练发生了 为什么得分变化仍小</w:t>
+        <w:t>文本学习与问答表现</w:t>
       </w:r>
     </w:p>
     <w:p>
@@ -1672,7 +1656,7 @@
           <w:sz w:val="30"/>
           <w:color w:val="000000"/>
         </w:rPr>
-        <w:t>直接组第1至第4遍平均 loss 从3.8054降至2.1378，改写组从3.4648降至2.1423；训练和权重导出均通过校验。进一步只测答案位置，直接 CPT 在原训练块中的答案 NLL 从4.7873降到2.4873，但独立题面仅从2.8990降到2.6632，改善明显依赖上下文。[7]</w:t>
+        <w:t>直接组平均训练损失从3.8054降至2.1378，改写组从3.4648降至2.1423。直接组答案位置的负对数似然（NLL，越低越好）在原训练上下文中从4.7873降至2.4873，独立题面中从2.8990降至2.6632，表明学习收益较依赖上下文。[7]</w:t>
       </w:r>
     </w:p>
     <w:p>
@@ -1689,7 +1673,7 @@
           <w:sz w:val="30"/>
           <w:color w:val="000000"/>
         </w:rPr>
-        <w:t>书籍原文 CPT 的独立对照也呈现类似现象：增加至4遍后，书内 NLL 相对改善4.126%，但200道书内改写知识题仍为189/200；公开题三轮多数票仅从1369增至1371，提升0.1196个百分点。[8]</w:t>
+        <w:t>书籍原文 CPT 呈现相似结果：训练4遍后，书内 NLL 改善4.126%，200道书内改写题仍答对189题；公开评测由1369题增至1371题，提高0.1196个百分点。[8]</w:t>
       </w:r>
     </w:p>
     <w:p>
@@ -1724,7 +1708,7 @@
           <w:sz w:val="30"/>
           <w:color w:val="000000"/>
         </w:rPr>
-        <w:t>文本预测能力的改善没有充分转化为问答得分，支持进一步检查知识吸收方式、答案监督位置和实际调用过程。不过，小幅增益既可能包含写入不足，也可能包含利用不足；结合闭卷探针，不宜下“知识无缺失”的确定结论。更准确的表述是：模型已有较多领域知识，但知识边界与应用仍不稳定。</w:t>
+        <w:t>CPT 已改善文本预测，问答增益仍需进一步验证。现有结果无法区分知识吸收与调用的影响，下一步检验答案监督和情景应用训练的效果。</w:t>
       </w:r>
     </w:p>
     <w:p>
@@ -1741,23 +1725,7 @@
           <w:sz w:val="30"/>
           <w:color w:val="000000"/>
         </w:rPr>
-        <w:t>本方案训练接触了评测题及答案，结果仅用于受控同题诊断，不能作为独立泛化成绩或交付能力证明。</w:t>
-      </w:r>
-    </w:p>
-    <w:p>
-      <w:pPr>
-        <w:widowControl/>
-        <w:spacing w:after="0" w:line="360" w:lineRule="auto" w:before="0"/>
-        <w:ind w:firstLine="0" w:firstLineChars="0"/>
-        <w:jc w:val="both"/>
-      </w:pPr>
-      <w:r>
-        <w:rPr>
-          <w:rFonts w:ascii="Times New Roman" w:hAnsi="Times New Roman" w:eastAsia="SimSun"/>
-          <w:b w:val="0"/>
-          <w:sz w:val="12"/>
-          <w:color w:val="000000"/>
-        </w:rPr>
+        <w:t>本组训练使用了评测题及答案，结果仅用于同题诊断，不代表未见题目的泛化能力。</w:t>
       </w:r>
     </w:p>
     <w:p>
@@ -1775,7 +1743,7 @@
           <w:sz w:val="32"/>
           <w:color w:val="000000"/>
         </w:rPr>
-        <w:t>补充诊断 同题答案SFT</w:t>
+        <w:t>补充实验 同题答案 SFT</w:t>
       </w:r>
     </w:p>
     <w:p>
@@ -1792,7 +1760,7 @@
           <w:sz w:val="30"/>
           <w:color w:val="000000"/>
         </w:rPr>
-        <w:t>另一组已完成实验使用全部1672道原题、完整选项及正确答案 JSON，仅监督答案与结束标记。训练1遍和2遍后，总体同题成绩分别为93.18%和94.44%，对照原始 Step120 的81.88%，说明直接匹配作答目标的监督可以显著提高同题拟合。[9]</w:t>
+        <w:t>以全部1672道原题、完整选项及正确答案训练，仅监督答案与结束标记。训练1遍、2遍后，同题准确率由81.88%升至93.18%、94.44%，表明答案监督能提高同题拟合。[9]</w:t>
       </w:r>
     </w:p>
     <w:p>
@@ -1809,7 +1777,7 @@
           <w:sz w:val="30"/>
           <w:color w:val="000000"/>
         </w:rPr>
-        <w:t>这组实验属于“评测题答案 SFT”，与后续独立书籍问答 SFT 的数据来源不同。它说明同题答案可以被拟合，但不能证明未见问题上的能力提升，也不能单独证明模型原先已拥有全部知识。其作用是提供监督目标方面的线索，不作为后续三模型比较的候选。</w:t>
+        <w:t>该实验为监督方式提供线索，不能证明未见题目的能力提升或原有知识完整性。其数据来自评测题，与后续独立书籍 SFT 分开；该模型不纳入后续三模型对照。</w:t>
       </w:r>
     </w:p>
     <w:p>
@@ -1827,7 +1795,7 @@
           <w:sz w:val="40"/>
           <w:color w:val="000000"/>
         </w:rPr>
-        <w:t>四 无训练诊断 定位知识与应用问题</w:t>
+        <w:t>四 固定模型的知识与应用诊断</w:t>
       </w:r>
     </w:p>
     <w:p>
@@ -1862,7 +1830,7 @@
           <w:sz w:val="30"/>
           <w:color w:val="000000"/>
         </w:rPr>
-        <w:t>本实验回答“Step120 为什么答错”，不重复背景中的原生模型与 Step120 总分比较。固定未接受本轮评测题 CPT 或 SFT 的原始 Step120，仅改变题目呈现和参考资料，不更新参数。比较对象是同一模型在不同条件下的表现；此前接受评测题训练的候选不参与本轮诊断。[3]</w:t>
+        <w:t>固定未经本轮 CPT 或 SFT 的原始 Step120，仅改变作答条件，不更新参数，以表现差异定位知识与应用问题。[3]</w:t>
       </w:r>
     </w:p>
     <w:p>
@@ -1897,7 +1865,7 @@
           <w:sz w:val="30"/>
           <w:color w:val="000000"/>
         </w:rPr>
-        <w:t>冻结303道历史错题，其中 LogistikaBench 266题、SC-bench知识题37题；另匹配60道原答对题，共363题。按第二部分的四条件协议分别运行3轮，以严格多数票计分。下表列出原题结果及历史错题中65道有效基础题的结果，分母分别保留。[3][4]</w:t>
+        <w:t>样本包括303道历史错题（LogistikaBench 266题、SC-bench 37题）及60道原答对题。四种条件各运行3轮，以严格多数票计分；下表分别列示原题与65道审核有效的相关基础题。[3][4]</w:t>
       </w:r>
     </w:p>
     <w:tbl>
@@ -2380,7 +2348,7 @@
           <w:sz w:val="30"/>
           <w:color w:val="000000"/>
         </w:rPr>
-        <w:t>诊断提示与历史正式评测不同，因此303道历史错题本轮闭卷答对6题并不矛盾。资料能帮助部分题目，也可能干扰原答对题；基础题的分母和难度均不同，不能直接与303题正确率相减。</w:t>
+        <w:t>资料使历史错题答对数由6题增至58题，也使原答对对照由57题降至54题。诊断提示与正式评测不同，历史错题可在本轮答对；基础题与原题难度、分母不同，不直接比较正确率差值。</w:t>
       </w:r>
     </w:p>
     <w:p>
@@ -2415,7 +2383,7 @@
           <w:sz w:val="30"/>
           <w:color w:val="000000"/>
         </w:rPr>
-        <w:t>363题中259题自动审核缺失或无效，不能据此判为教材不覆盖。后续复核8题，发现探针过浅、资料不充分、缺图、重复选项等问题。在获得定向补证的同4题上，闭卷及原教材均为0/4，补充已核对资料后为4/4，三轮一致；单加题型提示在8题上仍为0/8。[4]</w:t>
+        <w:t>363题中259题的自动审核记录缺失或无效，需进一步复核。抽查8题发现资料不足、缺图、重复选项及诊断题过浅等问题。其中4题补充核实资料后，答对数由0/4升至4/4，三轮一致；仅增加题型提示，8题仍为0/8。[4]</w:t>
       </w:r>
     </w:p>
     <w:p>
@@ -2432,7 +2400,7 @@
           <w:sz w:val="30"/>
           <w:color w:val="000000"/>
         </w:rPr>
-        <w:t>补证比较仅限同4题，并非全量错题或盲检索结果。补充资料是在看过金标签后按缺失概念定向核查的独立来源，不能据4/4外推到303题。该结果说明这4题的错误可由明确资料辅助纠正，不能单独区分原先缺知识还是调用困难。[4]</w:t>
+        <w:t>补证资料在查阅标准答案后按相关概念定向选取。结果说明这4题可通过资料辅助纠正，不可外推至全部错题，也不足以区分知识缺失与调用困难。[4]</w:t>
       </w:r>
     </w:p>
     <w:p>
@@ -2468,7 +2436,7 @@
           <w:spacing w:val="-3"/>
           <w:color w:val="000000"/>
         </w:rPr>
-        <w:t>对上述4个知识点再做定义、辨析、应用各1问，共12问、每问3轮。预先冻结的核心标准通过6/12，其中定义2/4、辨析3/4、应用1/4。这表明部分知识可以调用，但概念范围、术语对应和情景应用并不稳定。[5]</w:t>
+        <w:t>对上述4个知识点各设定义、辨析、应用1问，共12问，各运行3轮。按预设核心要点评分，通过6/12：定义2/4、辨析3/4、应用1/4。样本提示，情景应用是后续需重点验证的方向。[5]</w:t>
       </w:r>
     </w:p>
     <w:p>
@@ -2485,7 +2453,7 @@
           <w:sz w:val="30"/>
           <w:color w:val="000000"/>
         </w:rPr>
-        <w:t>每个知识点包含定义、辨析、应用各1问；12问仅涉及4个相关知识点，不是12个独立知识领域。每问至少2/3轮达到预先冻结的核心要点才记通过。主评分6/12不等于整段回答事实完全可靠；若同时否决已发现的附加事实错误，事后敏感性结果为5/12。[5]</w:t>
+        <w:t>每问至少2/3轮达标才计通过；若同时排除附加事实错误，通过数为5/12（事后敏感性分析）。12问来自4个相关知识点，结果仅用于定向诊断。[5]</w:t>
       </w:r>
     </w:p>
     <w:p>
@@ -2503,7 +2471,7 @@
           <w:sz w:val="32"/>
           <w:color w:val="000000"/>
         </w:rPr>
-        <w:t>实验结论与后续方向</w:t>
+        <w:t>优化方向</w:t>
       </w:r>
     </w:p>
     <w:p>
@@ -2520,7 +2488,7 @@
           <w:sz w:val="30"/>
           <w:color w:val="000000"/>
         </w:rPr>
-        <w:t>无训练对照支持“部分知识可调用，但知识边界、术语对应与情景应用不稳定”的混合解释。它把优化重点进一步落到知识校准、概念辨析和情景问答监督，因此提出下一阶段书籍 SFT。该方向有诊断依据，但是否有效仍需训练后比较，不能概括为“知识全部具备，只缺推理”。</w:t>
+        <w:t>诊断确认部分知识可被调用，并将训练重点落到知识校准、概念辨析和情景问答。下一阶段据此开展书籍 SFT，效果由训练后的统一对照验证。</w:t>
       </w:r>
     </w:p>
     <w:p>
@@ -2538,7 +2506,7 @@
           <w:sz w:val="40"/>
           <w:color w:val="000000"/>
         </w:rPr>
-        <w:t>五 书籍问答SFT方案与验证计划</w:t>
+        <w:t>五 书籍问答 SFT 与验证计划</w:t>
       </w:r>
     </w:p>
     <w:p>
@@ -2573,7 +2541,7 @@
           <w:sz w:val="30"/>
           <w:color w:val="000000"/>
         </w:rPr>
-        <w:t>训练路线确定为：原始 Step120 → 书籍原文 CPT → 书籍问答 SFT。SFT 从当前已测书籍 CPT 候选中公开题总答对数最高的4遍模型开始，标识为 qwen3.6-27b-step120-handbook8e-cpt-4x，对应本轮书籍 CPT 第116步。它不是评测题直接 CPT 或改写 CPT 模型。[8]</w:t>
+        <w:t>训练路线：原始 Step120 → 书籍原文 CPT → 书籍问答 SFT。SFT 从已测书籍 CPT 中得分最高的4遍模型启动，对应第116步，标识为 qwen3.6-27b-step120-handbook8e-cpt-4x。[8]</w:t>
       </w:r>
     </w:p>
     <w:p>
@@ -2590,7 +2558,7 @@
           <w:sz w:val="30"/>
           <w:color w:val="000000"/>
         </w:rPr>
-        <w:t>在统一三轮多数票口径下，书籍1遍、2遍、4遍候选分别答对1370、1366、1371题；4遍为1371/1672（81.998%），原始 Step120 为1369/1672（81.878%）。4遍的净增只有2题，尚未通过此前的实用提升门槛；选择它作为后续训练起点，不等于认定其知识问答能力已有可靠提升。[8][10]</w:t>
+        <w:t>书籍 CPT 训练1遍、2遍、4遍分别答对1370、1366、1371题。所选四遍模型准确率为81.998%，较原始 Step120 的81.878%净增2题。该结果用于选择起点，稳定收益仍待验证。[8][10]</w:t>
       </w:r>
     </w:p>
     <w:p>
@@ -2607,7 +2575,7 @@
           <w:sz w:val="30"/>
           <w:color w:val="000000"/>
         </w:rPr>
-        <w:t>SFT 从该模型权重初始化新的优化器与训练日程，不恢复书籍 CPT 的优化器状态。书籍 CPT 参数已经改变，但原有 Agent 和通用能力回归尚未完成，应在后续验证中补齐。[8]</w:t>
+        <w:t>SFT 沿用该模型权重，重新初始化优化器和训练日程。后续同步检验原有 Agent 与通用能力的保持情况。[8]</w:t>
       </w:r>
     </w:p>
     <w:p>
@@ -2625,7 +2593,7 @@
           <w:sz w:val="32"/>
           <w:color w:val="000000"/>
         </w:rPr>
-        <w:t>训练数据与针对性</w:t>
+        <w:t>训练数据</w:t>
       </w:r>
     </w:p>
     <w:p>
@@ -2642,7 +2610,7 @@
           <w:sz w:val="30"/>
           <w:color w:val="000000"/>
         </w:rPr>
-        <w:t>从独立于评测题的书籍内容构造有出处、经复核的问答对，覆盖定义与事实校准、相近概念辨析、条件判断和情景应用。训练目标是把书籍知识转化为稳定回答；不使用公开评测题答案、错题派生探针或定向补证资料包生成训练样本。书籍 QA 数据准备与模型 SFT 训练分开记录，当前不填报训练效果。</w:t>
+        <w:t>从独立书籍内容构造有出处、经复核的问答对，覆盖事实校准、概念辨析、条件判断与情景应用。训练样本不使用公开评测答案、错题派生诊断题或定向补证资料。</w:t>
       </w:r>
     </w:p>
     <w:p>
@@ -3143,7 +3111,7 @@
           <w:sz w:val="30"/>
           <w:color w:val="000000"/>
         </w:rPr>
-        <w:t>A、B、C 使用同一冻结评测集、推理配置与评分协议，分别报告每个数据集的准确率、答对数、错转对及对转错。C相对B的变化用于衡量在当前书籍 CPT 起点上追加 SFT 的效果；C相对A的变化用于衡量整条路线的总收益。</w:t>
+        <w:t>三模型使用同一冻结题集、推理配置与评分协议，报告分数据集准确率、答对数及错转对、对转错数量。以 C−B 衡量 SFT 增量，以 C−A 衡量整条路线收益。</w:t>
       </w:r>
     </w:p>
     <w:p>
@@ -3161,7 +3129,7 @@
           <w:sz w:val="32"/>
           <w:color w:val="000000"/>
         </w:rPr>
-        <w:t>验证标准与解释边界</w:t>
+        <w:t>验证标准</w:t>
       </w:r>
     </w:p>
     <w:p>
@@ -3178,7 +3146,7 @@
           <w:sz w:val="30"/>
           <w:color w:val="000000"/>
         </w:rPr>
-        <w:t>实际能力验证以未参与 CPT、SFT 制数或调参的独立问答题为主，按来源和概念隔离并在训练前冻结；SC-bench 和 LogistikaBench 保留为已多次使用的公开参考集。三模型采用相同条件重复评测，结合配对变化、实际提升幅度和原 Agent／通用能力回归判断，避免仅凭单轮多答对几题宣布成功。</w:t>
+        <w:t>以训练前冻结、按来源和概念隔离的独立问答题为主要验证集，确保其不参与训练数据构造或调参。SC-bench 与 LogistikaBench 作为公开参考集；结合重复评测、逐题变化及原有能力回归综合判断。</w:t>
       </w:r>
     </w:p>
     <w:p>
@@ -3195,7 +3163,7 @@
           <w:sz w:val="30"/>
           <w:color w:val="000000"/>
         </w:rPr>
-        <w:t>只有C相对B有稳定增益、相对A有实际收益，且原有能力无明显退化，才支持当前路线有效。若C优于B却未超过A，只能说明弥补了中间阶段损失。本轮未设置“Step120直接SFT”训练臂，因此不能据三模型比较证明 CPT 是必要前置步骤，也不能证明 CPT 后接 SFT 优于直接 SFT。</w:t>
+        <w:t>有效标准：C 相对 B 稳定提升、相对 A 获得实际收益，且原有能力无明显退化。本轮未设置 Step120 直接 SFT 对照，因此不据此判断 CPT 是否必要，或是否优于直接 SFT。</w:t>
       </w:r>
     </w:p>
     <w:p>
@@ -3213,7 +3181,7 @@
           <w:sz w:val="32"/>
           <w:color w:val="000000"/>
         </w:rPr>
-        <w:t>实施状态与结果预留</w:t>
+        <w:t>结果预留</w:t>
       </w:r>
     </w:p>
     <w:p>
@@ -3230,7 +3198,7 @@
           <w:sz w:val="30"/>
           <w:color w:val="000000"/>
         </w:rPr>
-        <w:t>书籍问答 SFT 尚未开展。本节已明确训练起点与比较设计，训练配置、实际成绩和最终结论待实验完成后填写。</w:t>
+        <w:t>书籍问答 SFT 结果待填。训练配置、评测成绩与结论在实验完成后补充。</w:t>
       </w:r>
     </w:p>
     <w:p>
@@ -3248,7 +3216,7 @@
           <w:sz w:val="40"/>
           <w:color w:val="000000"/>
         </w:rPr>
-        <w:t>附录 实验身份与证据索引</w:t>
+        <w:t>附录 实验范围与证据索引</w:t>
       </w:r>
     </w:p>
     <w:p>
@@ -3265,7 +3233,7 @@
           <w:sz w:val="30"/>
           <w:color w:val="000000"/>
         </w:rPr>
-        <w:t>本报告对应2026年9月3日至7日物流知识实验。早期长程 Agent 实验中的同名 Step120、Qwen3.8 Step70／Step120 及其他沙箱奖励实验不并入本文分数。原生与Step120主比较采用同机同栈；不混用百炼 API 分数与本地模型归因。</w:t>
+        <w:t>本文汇总2026年9月3日至7日的物流知识实验，仅采用同机、同推理配置的对应模型结果。其他同名 Step120、Qwen3.8 及 API 实验分数不纳入比较。</w:t>
       </w:r>
     </w:p>
     <w:p>
@@ -3463,7 +3431,7 @@
           <w:sz w:val="32"/>
           <w:color w:val="000000"/>
         </w:rPr>
-        <w:t>[6] 直接与改写CPT结果及历史更正</w:t>
+        <w:t>[6] 直接与改写 CPT 结果</w:t>
       </w:r>
     </w:p>
     <w:p>
@@ -3535,7 +3503,7 @@
           <w:sz w:val="32"/>
           <w:color w:val="000000"/>
         </w:rPr>
-        <w:t>[8] 单书2遍与4遍曝光对照</w:t>
+        <w:t>[8] 书籍 CPT 两遍与四遍对照</w:t>
       </w:r>
     </w:p>
     <w:p>
@@ -3661,7 +3629,7 @@
           <w:sz w:val="30"/>
           <w:color w:val="000000"/>
         </w:rPr>
-        <w:t>本文仅保留聚合计数、方法和结论，不含评测题面、标准答案、书籍原文或模型逐条输出。</w:t>
+        <w:t>本文保留汇总结果与证据索引，评测题、书籍原文及逐条模型输出另存。</w:t>
       </w:r>
     </w:p>
     <w:sectPr>

</xml_diff>

<commit_message>
docs: tabulate comparisons and revise SFT report framing
</commit_message>
<xml_diff>
--- a/汇报材料/Step120物流知识能力诊断与优化实验阶段报告_20260907.docx
+++ b/汇报材料/Step120物流知识能力诊断与优化实验阶段报告_20260907.docx
@@ -51,7 +51,7 @@
           <w:sz w:val="30"/>
           <w:color w:val="000000"/>
         </w:rPr>
-        <w:t>本阶段验证物流知识专项训练的效果，明确后续优化路径。实验表明，CPT 改善了文本学习表现，问答得分小幅提升；进一步诊断将优化重点指向知识校准、概念辨析与情景应用。下一阶段拟从最佳书籍 CPT 模型开展问答 SFT，通过三模型对照验证增量效果。</w:t>
+        <w:t>本阶段围绕物流知识专项优化，开展 CPT、固定模型诊断与书籍问答 SFT。CPT 改善了文本学习表现，诊断进一步明确了知识校准、概念辨析与情景应用方向。书籍 SFT 以最佳书籍 CPT 模型为起点，通过三模型对照评估增量效果。</w:t>
       </w:r>
     </w:p>
     <w:p>
@@ -103,7 +103,7 @@
           <w:sz w:val="30"/>
           <w:color w:val="000000"/>
         </w:rPr>
-        <w:t>在同机、同推理配置下，原生 Qwen3.6-27B 与 Step120 的物流知识评测总准确率分别为81.52%和81.88%。本阶段在此基础上验证专项知识训练的增量价值。[2]</w:t>
+        <w:t>在同机、同推理配置下比较原生 Qwen3.6-27B 与 Step120，评估既有训练的物流知识收益。[2]</w:t>
       </w:r>
     </w:p>
     <w:tbl>
@@ -293,7 +293,7 @@
           </w:tcPr>
           <w:p>
             <w:pPr>
-              <w:keepNext w:val="0"/>
+              <w:keepNext/>
               <w:spacing w:after="0" w:line="360" w:lineRule="auto"/>
               <w:ind w:firstLine="0" w:firstLineChars="0"/>
               <w:jc w:val="left"/>
@@ -329,7 +329,7 @@
           </w:tcPr>
           <w:p>
             <w:pPr>
-              <w:keepNext w:val="0"/>
+              <w:keepNext/>
               <w:spacing w:after="0" w:line="360" w:lineRule="auto"/>
               <w:ind w:firstLine="0" w:firstLineChars="0"/>
               <w:jc w:val="center"/>
@@ -365,7 +365,7 @@
           </w:tcPr>
           <w:p>
             <w:pPr>
-              <w:keepNext w:val="0"/>
+              <w:keepNext/>
               <w:spacing w:after="0" w:line="360" w:lineRule="auto"/>
               <w:ind w:firstLine="0" w:firstLineChars="0"/>
               <w:jc w:val="center"/>
@@ -401,7 +401,7 @@
           </w:tcPr>
           <w:p>
             <w:pPr>
-              <w:keepNext w:val="0"/>
+              <w:keepNext/>
               <w:spacing w:after="0" w:line="360" w:lineRule="auto"/>
               <w:ind w:firstLine="0" w:firstLineChars="0"/>
               <w:jc w:val="center"/>
@@ -442,7 +442,7 @@
           </w:tcPr>
           <w:p>
             <w:pPr>
-              <w:keepNext w:val="0"/>
+              <w:keepNext/>
               <w:spacing w:after="0" w:line="360" w:lineRule="auto"/>
               <w:ind w:firstLine="0" w:firstLineChars="0"/>
               <w:jc w:val="left"/>
@@ -478,7 +478,7 @@
           </w:tcPr>
           <w:p>
             <w:pPr>
-              <w:keepNext w:val="0"/>
+              <w:keepNext/>
               <w:spacing w:after="0" w:line="360" w:lineRule="auto"/>
               <w:ind w:firstLine="0" w:firstLineChars="0"/>
               <w:jc w:val="center"/>
@@ -514,7 +514,7 @@
           </w:tcPr>
           <w:p>
             <w:pPr>
-              <w:keepNext w:val="0"/>
+              <w:keepNext/>
               <w:spacing w:after="0" w:line="360" w:lineRule="auto"/>
               <w:ind w:firstLine="0" w:firstLineChars="0"/>
               <w:jc w:val="center"/>
@@ -550,7 +550,7 @@
           </w:tcPr>
           <w:p>
             <w:pPr>
-              <w:keepNext w:val="0"/>
+              <w:keepNext/>
               <w:spacing w:after="0" w:line="360" w:lineRule="auto"/>
               <w:ind w:firstLine="0" w:firstLineChars="0"/>
               <w:jc w:val="center"/>
@@ -766,7 +766,7 @@
           <w:sz w:val="30"/>
           <w:color w:val="000000"/>
         </w:rPr>
-        <w:t>Step120 答对1369/1672题，较原生模型净增6题，尚未达到项目设定的提升3个百分点目标。后续以303道错题为切入点，区分知识储备、知识调用、情景应用及评测输入的影响。</w:t>
+        <w:t>以原始 Step120 的历史错题为切入点，区分知识储备、知识调用、情景应用及评测输入的影响。</w:t>
       </w:r>
     </w:p>
     <w:p>
@@ -818,7 +818,7 @@
           <w:sz w:val="30"/>
           <w:color w:val="000000"/>
         </w:rPr>
-        <w:t>先用继续预训练（CPT）验证知识文本学习的收益，再通过固定模型的条件对照定位原因，据此设计书籍问答监督微调（SFT）。核心问题是：哪些知识需要补充，哪些需要更准确地调用和应用。</w:t>
+        <w:t>先用继续预训练（CPT）验证知识文本学习收益，再通过固定模型对照定位原因，最后以书籍问答监督微调（SFT）验证针对性训练效果。核心问题是知识能否被准确调用和应用。</w:t>
       </w:r>
     </w:p>
     <w:p>
@@ -1183,7 +1183,7 @@
           </w:tcPr>
           <w:p>
             <w:pPr>
-              <w:keepNext w:val="0"/>
+              <w:keepNext/>
               <w:spacing w:after="0" w:line="360" w:lineRule="auto"/>
               <w:ind w:firstLine="0" w:firstLineChars="0"/>
               <w:jc w:val="left"/>
@@ -1219,7 +1219,7 @@
           </w:tcPr>
           <w:p>
             <w:pPr>
-              <w:keepNext w:val="0"/>
+              <w:keepNext/>
               <w:spacing w:after="0" w:line="360" w:lineRule="auto"/>
               <w:ind w:firstLine="0" w:firstLineChars="0"/>
               <w:jc w:val="center"/>
@@ -1255,7 +1255,7 @@
           </w:tcPr>
           <w:p>
             <w:pPr>
-              <w:keepNext w:val="0"/>
+              <w:keepNext/>
               <w:spacing w:after="0" w:line="360" w:lineRule="auto"/>
               <w:ind w:firstLine="0" w:firstLineChars="0"/>
               <w:jc w:val="center"/>
@@ -1291,7 +1291,7 @@
           </w:tcPr>
           <w:p>
             <w:pPr>
-              <w:keepNext w:val="0"/>
+              <w:keepNext/>
               <w:spacing w:after="0" w:line="360" w:lineRule="auto"/>
               <w:ind w:firstLine="0" w:firstLineChars="0"/>
               <w:jc w:val="center"/>
@@ -1332,7 +1332,7 @@
           </w:tcPr>
           <w:p>
             <w:pPr>
-              <w:keepNext w:val="0"/>
+              <w:keepNext/>
               <w:spacing w:after="0" w:line="360" w:lineRule="auto"/>
               <w:ind w:firstLine="0" w:firstLineChars="0"/>
               <w:jc w:val="left"/>
@@ -1368,7 +1368,7 @@
           </w:tcPr>
           <w:p>
             <w:pPr>
-              <w:keepNext w:val="0"/>
+              <w:keepNext/>
               <w:spacing w:after="0" w:line="360" w:lineRule="auto"/>
               <w:ind w:firstLine="0" w:firstLineChars="0"/>
               <w:jc w:val="center"/>
@@ -1404,7 +1404,7 @@
           </w:tcPr>
           <w:p>
             <w:pPr>
-              <w:keepNext w:val="0"/>
+              <w:keepNext/>
               <w:spacing w:after="0" w:line="360" w:lineRule="auto"/>
               <w:ind w:firstLine="0" w:firstLineChars="0"/>
               <w:jc w:val="center"/>
@@ -1440,7 +1440,7 @@
           </w:tcPr>
           <w:p>
             <w:pPr>
-              <w:keepNext w:val="0"/>
+              <w:keepNext/>
               <w:spacing w:after="0" w:line="360" w:lineRule="auto"/>
               <w:ind w:firstLine="0" w:firstLineChars="0"/>
               <w:jc w:val="center"/>
@@ -1609,6 +1609,7 @@
     </w:tbl>
     <w:p>
       <w:pPr>
+        <w:keepNext/>
         <w:widowControl/>
         <w:spacing w:before="0" w:line="360" w:lineRule="auto" w:after="120"/>
         <w:ind w:firstLine="600" w:firstLineChars="200"/>
@@ -1621,9 +1622,505 @@
           <w:sz w:val="30"/>
           <w:color w:val="000000"/>
         </w:rPr>
-        <w:t>直接组21题改对、9题改错，净增12题；改写组10题改对、6题改错，净增4题。未校正配对检验分别为 p=0.0428、p=0.4545。两组均有小幅提升，尚未达到3个百分点的项目目标。</w:t>
+        <w:t>两种 CPT 的逐题变化及配对检验如下。</w:t>
       </w:r>
     </w:p>
+    <w:tbl>
+      <w:tblPr>
+        <w:tblW w:type="auto" w:w="0"/>
+        <w:tblLayout w:type="fixed"/>
+        <w:tblLook w:firstColumn="1" w:firstRow="1" w:lastColumn="0" w:lastRow="0" w:noHBand="0" w:noVBand="1" w:val="04A0"/>
+        <w:tblBorders>
+          <w:top w:val="single" w:sz="4" w:color="D9D9D9"/>
+          <w:left w:val="single" w:sz="4" w:color="D9D9D9"/>
+          <w:bottom w:val="single" w:sz="4" w:color="D9D9D9"/>
+          <w:right w:val="single" w:sz="4" w:color="D9D9D9"/>
+          <w:insideH w:val="single" w:sz="4" w:color="D9D9D9"/>
+          <w:insideV w:val="single" w:sz="4" w:color="D9D9D9"/>
+        </w:tblBorders>
+      </w:tblPr>
+      <w:tblGrid>
+        <w:gridCol w:w="3312"/>
+        <w:gridCol w:w="2808"/>
+        <w:gridCol w:w="2808"/>
+      </w:tblGrid>
+      <w:tr>
+        <w:trPr>
+          <w:cantSplit/>
+          <w:tblHeader/>
+        </w:trPr>
+        <w:tc>
+          <w:tcPr>
+            <w:tcW w:type="dxa" w:w="3312"/>
+            <w:vAlign w:val="center"/>
+            <w:shd w:fill="E7E6E6"/>
+            <w:tcMar>
+              <w:top w:w="80" w:type="dxa"/>
+              <w:bottom w:w="80" w:type="dxa"/>
+              <w:left w:w="80" w:type="dxa"/>
+              <w:right w:w="80" w:type="dxa"/>
+            </w:tcMar>
+          </w:tcPr>
+          <w:p>
+            <w:pPr>
+              <w:keepNext/>
+              <w:spacing w:line="360" w:lineRule="auto" w:before="60" w:after="60"/>
+              <w:ind w:firstLine="0" w:firstLineChars="0"/>
+              <w:jc w:val="left"/>
+            </w:pPr>
+            <w:r>
+              <w:rPr>
+                <w:rFonts w:ascii="Times New Roman" w:hAnsi="Times New Roman" w:eastAsia="SimSun"/>
+                <w:b/>
+                <w:color w:val="000000"/>
+                <w:sz w:val="30"/>
+              </w:rPr>
+              <w:t>指标</w:t>
+            </w:r>
+          </w:p>
+        </w:tc>
+        <w:tc>
+          <w:tcPr>
+            <w:tcW w:type="dxa" w:w="2808"/>
+            <w:vAlign w:val="center"/>
+            <w:shd w:fill="E7E6E6"/>
+            <w:tcMar>
+              <w:top w:w="80" w:type="dxa"/>
+              <w:bottom w:w="80" w:type="dxa"/>
+              <w:left w:w="80" w:type="dxa"/>
+              <w:right w:w="80" w:type="dxa"/>
+            </w:tcMar>
+          </w:tcPr>
+          <w:p>
+            <w:pPr>
+              <w:keepNext/>
+              <w:spacing w:line="360" w:lineRule="auto" w:before="60" w:after="60"/>
+              <w:ind w:firstLine="0" w:firstLineChars="0"/>
+              <w:jc w:val="center"/>
+            </w:pPr>
+            <w:r>
+              <w:rPr>
+                <w:rFonts w:ascii="Times New Roman" w:hAnsi="Times New Roman" w:eastAsia="SimSun"/>
+                <w:b/>
+                <w:color w:val="000000"/>
+                <w:sz w:val="30"/>
+              </w:rPr>
+              <w:t>直接题面 CPT</w:t>
+            </w:r>
+          </w:p>
+        </w:tc>
+        <w:tc>
+          <w:tcPr>
+            <w:tcW w:type="dxa" w:w="2808"/>
+            <w:vAlign w:val="center"/>
+            <w:shd w:fill="E7E6E6"/>
+            <w:tcMar>
+              <w:top w:w="80" w:type="dxa"/>
+              <w:bottom w:w="80" w:type="dxa"/>
+              <w:left w:w="80" w:type="dxa"/>
+              <w:right w:w="80" w:type="dxa"/>
+            </w:tcMar>
+          </w:tcPr>
+          <w:p>
+            <w:pPr>
+              <w:keepNext/>
+              <w:spacing w:line="360" w:lineRule="auto" w:before="60" w:after="60"/>
+              <w:ind w:firstLine="0" w:firstLineChars="0"/>
+              <w:jc w:val="center"/>
+            </w:pPr>
+            <w:r>
+              <w:rPr>
+                <w:rFonts w:ascii="Times New Roman" w:hAnsi="Times New Roman" w:eastAsia="SimSun"/>
+                <w:b/>
+                <w:color w:val="000000"/>
+                <w:sz w:val="30"/>
+              </w:rPr>
+              <w:t>改写题面 CPT</w:t>
+            </w:r>
+          </w:p>
+        </w:tc>
+      </w:tr>
+      <w:tr>
+        <w:trPr>
+          <w:cantSplit/>
+        </w:trPr>
+        <w:tc>
+          <w:tcPr>
+            <w:tcW w:type="dxa" w:w="3312"/>
+            <w:vAlign w:val="center"/>
+            <w:shd w:fill="FFFFFF"/>
+            <w:tcMar>
+              <w:top w:w="80" w:type="dxa"/>
+              <w:bottom w:w="80" w:type="dxa"/>
+              <w:left w:w="80" w:type="dxa"/>
+              <w:right w:w="80" w:type="dxa"/>
+            </w:tcMar>
+          </w:tcPr>
+          <w:p>
+            <w:pPr>
+              <w:keepNext/>
+              <w:spacing w:line="360" w:lineRule="auto" w:before="60" w:after="60"/>
+              <w:ind w:firstLine="0" w:firstLineChars="0"/>
+              <w:jc w:val="left"/>
+            </w:pPr>
+            <w:r>
+              <w:rPr>
+                <w:rFonts w:ascii="Times New Roman" w:hAnsi="Times New Roman" w:eastAsia="SimSun"/>
+                <w:b w:val="0"/>
+                <w:color w:val="000000"/>
+                <w:sz w:val="30"/>
+              </w:rPr>
+              <w:t>错转对</w:t>
+            </w:r>
+          </w:p>
+        </w:tc>
+        <w:tc>
+          <w:tcPr>
+            <w:tcW w:type="dxa" w:w="2808"/>
+            <w:vAlign w:val="center"/>
+            <w:shd w:fill="FFFFFF"/>
+            <w:tcMar>
+              <w:top w:w="80" w:type="dxa"/>
+              <w:bottom w:w="80" w:type="dxa"/>
+              <w:left w:w="80" w:type="dxa"/>
+              <w:right w:w="80" w:type="dxa"/>
+            </w:tcMar>
+          </w:tcPr>
+          <w:p>
+            <w:pPr>
+              <w:keepNext/>
+              <w:spacing w:line="360" w:lineRule="auto" w:before="60" w:after="60"/>
+              <w:ind w:firstLine="0" w:firstLineChars="0"/>
+              <w:jc w:val="center"/>
+            </w:pPr>
+            <w:r>
+              <w:rPr>
+                <w:rFonts w:ascii="Times New Roman" w:hAnsi="Times New Roman" w:eastAsia="SimSun"/>
+                <w:b w:val="0"/>
+                <w:color w:val="000000"/>
+                <w:sz w:val="30"/>
+              </w:rPr>
+              <w:t>21</w:t>
+            </w:r>
+          </w:p>
+        </w:tc>
+        <w:tc>
+          <w:tcPr>
+            <w:tcW w:type="dxa" w:w="2808"/>
+            <w:vAlign w:val="center"/>
+            <w:shd w:fill="FFFFFF"/>
+            <w:tcMar>
+              <w:top w:w="80" w:type="dxa"/>
+              <w:bottom w:w="80" w:type="dxa"/>
+              <w:left w:w="80" w:type="dxa"/>
+              <w:right w:w="80" w:type="dxa"/>
+            </w:tcMar>
+          </w:tcPr>
+          <w:p>
+            <w:pPr>
+              <w:keepNext/>
+              <w:spacing w:line="360" w:lineRule="auto" w:before="60" w:after="60"/>
+              <w:ind w:firstLine="0" w:firstLineChars="0"/>
+              <w:jc w:val="center"/>
+            </w:pPr>
+            <w:r>
+              <w:rPr>
+                <w:rFonts w:ascii="Times New Roman" w:hAnsi="Times New Roman" w:eastAsia="SimSun"/>
+                <w:b w:val="0"/>
+                <w:color w:val="000000"/>
+                <w:sz w:val="30"/>
+              </w:rPr>
+              <w:t>10</w:t>
+            </w:r>
+          </w:p>
+        </w:tc>
+      </w:tr>
+      <w:tr>
+        <w:trPr>
+          <w:cantSplit/>
+        </w:trPr>
+        <w:tc>
+          <w:tcPr>
+            <w:tcW w:type="dxa" w:w="3312"/>
+            <w:vAlign w:val="center"/>
+            <w:shd w:fill="FFFFFF"/>
+            <w:tcMar>
+              <w:top w:w="80" w:type="dxa"/>
+              <w:bottom w:w="80" w:type="dxa"/>
+              <w:left w:w="80" w:type="dxa"/>
+              <w:right w:w="80" w:type="dxa"/>
+            </w:tcMar>
+          </w:tcPr>
+          <w:p>
+            <w:pPr>
+              <w:keepNext/>
+              <w:spacing w:line="360" w:lineRule="auto" w:before="60" w:after="60"/>
+              <w:ind w:firstLine="0" w:firstLineChars="0"/>
+              <w:jc w:val="left"/>
+            </w:pPr>
+            <w:r>
+              <w:rPr>
+                <w:rFonts w:ascii="Times New Roman" w:hAnsi="Times New Roman" w:eastAsia="SimSun"/>
+                <w:b w:val="0"/>
+                <w:color w:val="000000"/>
+                <w:sz w:val="30"/>
+              </w:rPr>
+              <w:t>对转错</w:t>
+            </w:r>
+          </w:p>
+        </w:tc>
+        <w:tc>
+          <w:tcPr>
+            <w:tcW w:type="dxa" w:w="2808"/>
+            <w:vAlign w:val="center"/>
+            <w:shd w:fill="FFFFFF"/>
+            <w:tcMar>
+              <w:top w:w="80" w:type="dxa"/>
+              <w:bottom w:w="80" w:type="dxa"/>
+              <w:left w:w="80" w:type="dxa"/>
+              <w:right w:w="80" w:type="dxa"/>
+            </w:tcMar>
+          </w:tcPr>
+          <w:p>
+            <w:pPr>
+              <w:keepNext/>
+              <w:spacing w:line="360" w:lineRule="auto" w:before="60" w:after="60"/>
+              <w:ind w:firstLine="0" w:firstLineChars="0"/>
+              <w:jc w:val="center"/>
+            </w:pPr>
+            <w:r>
+              <w:rPr>
+                <w:rFonts w:ascii="Times New Roman" w:hAnsi="Times New Roman" w:eastAsia="SimSun"/>
+                <w:b w:val="0"/>
+                <w:color w:val="000000"/>
+                <w:sz w:val="30"/>
+              </w:rPr>
+              <w:t>9</w:t>
+            </w:r>
+          </w:p>
+        </w:tc>
+        <w:tc>
+          <w:tcPr>
+            <w:tcW w:type="dxa" w:w="2808"/>
+            <w:vAlign w:val="center"/>
+            <w:shd w:fill="FFFFFF"/>
+            <w:tcMar>
+              <w:top w:w="80" w:type="dxa"/>
+              <w:bottom w:w="80" w:type="dxa"/>
+              <w:left w:w="80" w:type="dxa"/>
+              <w:right w:w="80" w:type="dxa"/>
+            </w:tcMar>
+          </w:tcPr>
+          <w:p>
+            <w:pPr>
+              <w:keepNext/>
+              <w:spacing w:line="360" w:lineRule="auto" w:before="60" w:after="60"/>
+              <w:ind w:firstLine="0" w:firstLineChars="0"/>
+              <w:jc w:val="center"/>
+            </w:pPr>
+            <w:r>
+              <w:rPr>
+                <w:rFonts w:ascii="Times New Roman" w:hAnsi="Times New Roman" w:eastAsia="SimSun"/>
+                <w:b w:val="0"/>
+                <w:color w:val="000000"/>
+                <w:sz w:val="30"/>
+              </w:rPr>
+              <w:t>6</w:t>
+            </w:r>
+          </w:p>
+        </w:tc>
+      </w:tr>
+      <w:tr>
+        <w:trPr>
+          <w:cantSplit/>
+        </w:trPr>
+        <w:tc>
+          <w:tcPr>
+            <w:tcW w:type="dxa" w:w="3312"/>
+            <w:vAlign w:val="center"/>
+            <w:shd w:fill="FFFFFF"/>
+            <w:tcMar>
+              <w:top w:w="80" w:type="dxa"/>
+              <w:bottom w:w="80" w:type="dxa"/>
+              <w:left w:w="80" w:type="dxa"/>
+              <w:right w:w="80" w:type="dxa"/>
+            </w:tcMar>
+          </w:tcPr>
+          <w:p>
+            <w:pPr>
+              <w:keepNext/>
+              <w:spacing w:line="360" w:lineRule="auto" w:before="60" w:after="60"/>
+              <w:ind w:firstLine="0" w:firstLineChars="0"/>
+              <w:jc w:val="left"/>
+            </w:pPr>
+            <w:r>
+              <w:rPr>
+                <w:rFonts w:ascii="Times New Roman" w:hAnsi="Times New Roman" w:eastAsia="SimSun"/>
+                <w:b w:val="0"/>
+                <w:color w:val="000000"/>
+                <w:sz w:val="30"/>
+              </w:rPr>
+              <w:t>净增答对</w:t>
+            </w:r>
+          </w:p>
+        </w:tc>
+        <w:tc>
+          <w:tcPr>
+            <w:tcW w:type="dxa" w:w="2808"/>
+            <w:vAlign w:val="center"/>
+            <w:shd w:fill="FFFFFF"/>
+            <w:tcMar>
+              <w:top w:w="80" w:type="dxa"/>
+              <w:bottom w:w="80" w:type="dxa"/>
+              <w:left w:w="80" w:type="dxa"/>
+              <w:right w:w="80" w:type="dxa"/>
+            </w:tcMar>
+          </w:tcPr>
+          <w:p>
+            <w:pPr>
+              <w:keepNext/>
+              <w:spacing w:line="360" w:lineRule="auto" w:before="60" w:after="60"/>
+              <w:ind w:firstLine="0" w:firstLineChars="0"/>
+              <w:jc w:val="center"/>
+            </w:pPr>
+            <w:r>
+              <w:rPr>
+                <w:rFonts w:ascii="Times New Roman" w:hAnsi="Times New Roman" w:eastAsia="SimSun"/>
+                <w:b w:val="0"/>
+                <w:color w:val="000000"/>
+                <w:sz w:val="30"/>
+              </w:rPr>
+              <w:t>12</w:t>
+            </w:r>
+          </w:p>
+        </w:tc>
+        <w:tc>
+          <w:tcPr>
+            <w:tcW w:type="dxa" w:w="2808"/>
+            <w:vAlign w:val="center"/>
+            <w:shd w:fill="FFFFFF"/>
+            <w:tcMar>
+              <w:top w:w="80" w:type="dxa"/>
+              <w:bottom w:w="80" w:type="dxa"/>
+              <w:left w:w="80" w:type="dxa"/>
+              <w:right w:w="80" w:type="dxa"/>
+            </w:tcMar>
+          </w:tcPr>
+          <w:p>
+            <w:pPr>
+              <w:keepNext/>
+              <w:spacing w:line="360" w:lineRule="auto" w:before="60" w:after="60"/>
+              <w:ind w:firstLine="0" w:firstLineChars="0"/>
+              <w:jc w:val="center"/>
+            </w:pPr>
+            <w:r>
+              <w:rPr>
+                <w:rFonts w:ascii="Times New Roman" w:hAnsi="Times New Roman" w:eastAsia="SimSun"/>
+                <w:b w:val="0"/>
+                <w:color w:val="000000"/>
+                <w:sz w:val="30"/>
+              </w:rPr>
+              <w:t>4</w:t>
+            </w:r>
+          </w:p>
+        </w:tc>
+      </w:tr>
+      <w:tr>
+        <w:trPr>
+          <w:cantSplit/>
+        </w:trPr>
+        <w:tc>
+          <w:tcPr>
+            <w:tcW w:type="dxa" w:w="3312"/>
+            <w:vAlign w:val="center"/>
+            <w:shd w:fill="FFFFFF"/>
+            <w:tcMar>
+              <w:top w:w="80" w:type="dxa"/>
+              <w:bottom w:w="80" w:type="dxa"/>
+              <w:left w:w="80" w:type="dxa"/>
+              <w:right w:w="80" w:type="dxa"/>
+            </w:tcMar>
+          </w:tcPr>
+          <w:p>
+            <w:pPr>
+              <w:keepNext w:val="0"/>
+              <w:spacing w:line="360" w:lineRule="auto" w:before="60" w:after="60"/>
+              <w:ind w:firstLine="0" w:firstLineChars="0"/>
+              <w:jc w:val="left"/>
+            </w:pPr>
+            <w:r>
+              <w:rPr>
+                <w:rFonts w:ascii="Times New Roman" w:hAnsi="Times New Roman" w:eastAsia="SimSun"/>
+                <w:b w:val="0"/>
+                <w:color w:val="000000"/>
+                <w:sz w:val="30"/>
+              </w:rPr>
+              <w:t>未校正检验 p 值</w:t>
+            </w:r>
+          </w:p>
+        </w:tc>
+        <w:tc>
+          <w:tcPr>
+            <w:tcW w:type="dxa" w:w="2808"/>
+            <w:vAlign w:val="center"/>
+            <w:shd w:fill="FFFFFF"/>
+            <w:tcMar>
+              <w:top w:w="80" w:type="dxa"/>
+              <w:bottom w:w="80" w:type="dxa"/>
+              <w:left w:w="80" w:type="dxa"/>
+              <w:right w:w="80" w:type="dxa"/>
+            </w:tcMar>
+          </w:tcPr>
+          <w:p>
+            <w:pPr>
+              <w:keepNext w:val="0"/>
+              <w:spacing w:line="360" w:lineRule="auto" w:before="60" w:after="60"/>
+              <w:ind w:firstLine="0" w:firstLineChars="0"/>
+              <w:jc w:val="center"/>
+            </w:pPr>
+            <w:r>
+              <w:rPr>
+                <w:rFonts w:ascii="Times New Roman" w:hAnsi="Times New Roman" w:eastAsia="SimSun"/>
+                <w:b w:val="0"/>
+                <w:color w:val="000000"/>
+                <w:sz w:val="30"/>
+              </w:rPr>
+              <w:t>0.0428</w:t>
+            </w:r>
+          </w:p>
+        </w:tc>
+        <w:tc>
+          <w:tcPr>
+            <w:tcW w:type="dxa" w:w="2808"/>
+            <w:vAlign w:val="center"/>
+            <w:shd w:fill="FFFFFF"/>
+            <w:tcMar>
+              <w:top w:w="80" w:type="dxa"/>
+              <w:bottom w:w="80" w:type="dxa"/>
+              <w:left w:w="80" w:type="dxa"/>
+              <w:right w:w="80" w:type="dxa"/>
+            </w:tcMar>
+          </w:tcPr>
+          <w:p>
+            <w:pPr>
+              <w:keepNext w:val="0"/>
+              <w:spacing w:line="360" w:lineRule="auto" w:before="60" w:after="60"/>
+              <w:ind w:firstLine="0" w:firstLineChars="0"/>
+              <w:jc w:val="center"/>
+            </w:pPr>
+            <w:r>
+              <w:rPr>
+                <w:rFonts w:ascii="Times New Roman" w:hAnsi="Times New Roman" w:eastAsia="SimSun"/>
+                <w:b w:val="0"/>
+                <w:color w:val="000000"/>
+                <w:sz w:val="30"/>
+              </w:rPr>
+              <w:t>0.4545</w:t>
+            </w:r>
+          </w:p>
+        </w:tc>
+      </w:tr>
+    </w:tbl>
     <w:p>
       <w:pPr>
         <w:pStyle w:val="Heading2"/>
@@ -1644,6 +2141,7 @@
     </w:p>
     <w:p>
       <w:pPr>
+        <w:keepNext/>
         <w:widowControl/>
         <w:spacing w:line="360" w:lineRule="auto" w:before="0" w:after="120"/>
         <w:ind w:firstLine="600" w:firstLineChars="200"/>
@@ -1656,11 +2154,659 @@
           <w:sz w:val="30"/>
           <w:color w:val="000000"/>
         </w:rPr>
-        <w:t>直接组平均训练损失从3.8054降至2.1378，改写组从3.4648降至2.1423。直接组答案位置的负对数似然（NLL，越低越好）在原训练上下文中从4.7873降至2.4873，独立题面中从2.8990降至2.6632，表明学习收益较依赖上下文。[7]</w:t>
+        <w:t>训练损失与答案位置负对数似然（NLL，越低越好）如下。答案学习收益较依赖上下文。[7]</w:t>
       </w:r>
     </w:p>
+    <w:tbl>
+      <w:tblPr>
+        <w:tblW w:type="auto" w:w="0"/>
+        <w:tblLayout w:type="fixed"/>
+        <w:tblLook w:firstColumn="1" w:firstRow="1" w:lastColumn="0" w:lastRow="0" w:noHBand="0" w:noVBand="1" w:val="04A0"/>
+        <w:tblBorders>
+          <w:top w:val="single" w:sz="4" w:color="D9D9D9"/>
+          <w:left w:val="single" w:sz="4" w:color="D9D9D9"/>
+          <w:bottom w:val="single" w:sz="4" w:color="D9D9D9"/>
+          <w:right w:val="single" w:sz="4" w:color="D9D9D9"/>
+          <w:insideH w:val="single" w:sz="4" w:color="D9D9D9"/>
+          <w:insideV w:val="single" w:sz="4" w:color="D9D9D9"/>
+        </w:tblBorders>
+      </w:tblPr>
+      <w:tblGrid>
+        <w:gridCol w:w="2016"/>
+        <w:gridCol w:w="3168"/>
+        <w:gridCol w:w="1872"/>
+        <w:gridCol w:w="1872"/>
+      </w:tblGrid>
+      <w:tr>
+        <w:trPr>
+          <w:cantSplit/>
+          <w:tblHeader/>
+        </w:trPr>
+        <w:tc>
+          <w:tcPr>
+            <w:tcW w:type="dxa" w:w="2016"/>
+            <w:vAlign w:val="center"/>
+            <w:shd w:fill="E7E6E6"/>
+            <w:tcMar>
+              <w:top w:w="80" w:type="dxa"/>
+              <w:bottom w:w="80" w:type="dxa"/>
+              <w:left w:w="80" w:type="dxa"/>
+              <w:right w:w="80" w:type="dxa"/>
+            </w:tcMar>
+          </w:tcPr>
+          <w:p>
+            <w:pPr>
+              <w:keepNext/>
+              <w:spacing w:line="360" w:lineRule="auto" w:before="60" w:after="60"/>
+              <w:ind w:firstLine="0" w:firstLineChars="0"/>
+              <w:jc w:val="left"/>
+            </w:pPr>
+            <w:r>
+              <w:rPr>
+                <w:rFonts w:ascii="Times New Roman" w:hAnsi="Times New Roman" w:eastAsia="SimSun"/>
+                <w:b/>
+                <w:color w:val="000000"/>
+                <w:sz w:val="30"/>
+              </w:rPr>
+              <w:t>指标</w:t>
+            </w:r>
+          </w:p>
+        </w:tc>
+        <w:tc>
+          <w:tcPr>
+            <w:tcW w:type="dxa" w:w="3168"/>
+            <w:vAlign w:val="center"/>
+            <w:shd w:fill="E7E6E6"/>
+            <w:tcMar>
+              <w:top w:w="80" w:type="dxa"/>
+              <w:bottom w:w="80" w:type="dxa"/>
+              <w:left w:w="80" w:type="dxa"/>
+              <w:right w:w="80" w:type="dxa"/>
+            </w:tcMar>
+          </w:tcPr>
+          <w:p>
+            <w:pPr>
+              <w:keepNext/>
+              <w:spacing w:line="360" w:lineRule="auto" w:before="60" w:after="60"/>
+              <w:ind w:firstLine="0" w:firstLineChars="0"/>
+              <w:jc w:val="center"/>
+            </w:pPr>
+            <w:r>
+              <w:rPr>
+                <w:rFonts w:ascii="Times New Roman" w:hAnsi="Times New Roman" w:eastAsia="SimSun"/>
+                <w:b/>
+                <w:color w:val="000000"/>
+                <w:sz w:val="30"/>
+              </w:rPr>
+              <w:t>比较口径</w:t>
+            </w:r>
+          </w:p>
+        </w:tc>
+        <w:tc>
+          <w:tcPr>
+            <w:tcW w:type="dxa" w:w="1872"/>
+            <w:vAlign w:val="center"/>
+            <w:shd w:fill="E7E6E6"/>
+            <w:tcMar>
+              <w:top w:w="80" w:type="dxa"/>
+              <w:bottom w:w="80" w:type="dxa"/>
+              <w:left w:w="80" w:type="dxa"/>
+              <w:right w:w="80" w:type="dxa"/>
+            </w:tcMar>
+          </w:tcPr>
+          <w:p>
+            <w:pPr>
+              <w:keepNext/>
+              <w:spacing w:line="360" w:lineRule="auto" w:before="60" w:after="60"/>
+              <w:ind w:firstLine="0" w:firstLineChars="0"/>
+              <w:jc w:val="center"/>
+            </w:pPr>
+            <w:r>
+              <w:rPr>
+                <w:rFonts w:ascii="Times New Roman" w:hAnsi="Times New Roman" w:eastAsia="SimSun"/>
+                <w:b/>
+                <w:color w:val="000000"/>
+                <w:sz w:val="30"/>
+              </w:rPr>
+              <w:t>起始值</w:t>
+            </w:r>
+          </w:p>
+        </w:tc>
+        <w:tc>
+          <w:tcPr>
+            <w:tcW w:type="dxa" w:w="1872"/>
+            <w:vAlign w:val="center"/>
+            <w:shd w:fill="E7E6E6"/>
+            <w:tcMar>
+              <w:top w:w="80" w:type="dxa"/>
+              <w:bottom w:w="80" w:type="dxa"/>
+              <w:left w:w="80" w:type="dxa"/>
+              <w:right w:w="80" w:type="dxa"/>
+            </w:tcMar>
+          </w:tcPr>
+          <w:p>
+            <w:pPr>
+              <w:keepNext/>
+              <w:spacing w:line="360" w:lineRule="auto" w:before="60" w:after="60"/>
+              <w:ind w:firstLine="0" w:firstLineChars="0"/>
+              <w:jc w:val="center"/>
+            </w:pPr>
+            <w:r>
+              <w:rPr>
+                <w:rFonts w:ascii="Times New Roman" w:hAnsi="Times New Roman" w:eastAsia="SimSun"/>
+                <w:b/>
+                <w:color w:val="000000"/>
+                <w:sz w:val="30"/>
+              </w:rPr>
+              <w:t>结束值</w:t>
+            </w:r>
+          </w:p>
+        </w:tc>
+      </w:tr>
+      <w:tr>
+        <w:trPr>
+          <w:cantSplit/>
+        </w:trPr>
+        <w:tc>
+          <w:tcPr>
+            <w:tcW w:type="dxa" w:w="2016"/>
+            <w:vAlign w:val="center"/>
+            <w:shd w:fill="FFFFFF"/>
+            <w:tcMar>
+              <w:top w:w="80" w:type="dxa"/>
+              <w:bottom w:w="80" w:type="dxa"/>
+              <w:left w:w="80" w:type="dxa"/>
+              <w:right w:w="80" w:type="dxa"/>
+            </w:tcMar>
+          </w:tcPr>
+          <w:p>
+            <w:pPr>
+              <w:keepNext/>
+              <w:spacing w:line="360" w:lineRule="auto" w:before="60" w:after="60"/>
+              <w:ind w:firstLine="0" w:firstLineChars="0"/>
+              <w:jc w:val="left"/>
+            </w:pPr>
+            <w:r>
+              <w:rPr>
+                <w:rFonts w:ascii="Times New Roman" w:hAnsi="Times New Roman" w:eastAsia="SimSun"/>
+                <w:b w:val="0"/>
+                <w:color w:val="000000"/>
+                <w:sz w:val="30"/>
+              </w:rPr>
+              <w:t>训练损失</w:t>
+            </w:r>
+          </w:p>
+        </w:tc>
+        <w:tc>
+          <w:tcPr>
+            <w:tcW w:type="dxa" w:w="3168"/>
+            <w:vAlign w:val="center"/>
+            <w:shd w:fill="FFFFFF"/>
+            <w:tcMar>
+              <w:top w:w="80" w:type="dxa"/>
+              <w:bottom w:w="80" w:type="dxa"/>
+              <w:left w:w="80" w:type="dxa"/>
+              <w:right w:w="80" w:type="dxa"/>
+            </w:tcMar>
+          </w:tcPr>
+          <w:p>
+            <w:pPr>
+              <w:keepNext/>
+              <w:spacing w:line="360" w:lineRule="auto" w:before="60" w:after="60"/>
+              <w:ind w:firstLine="0" w:firstLineChars="0"/>
+              <w:jc w:val="center"/>
+            </w:pPr>
+            <w:r>
+              <w:rPr>
+                <w:rFonts w:ascii="Times New Roman" w:hAnsi="Times New Roman" w:eastAsia="SimSun"/>
+                <w:b w:val="0"/>
+                <w:color w:val="000000"/>
+                <w:sz w:val="30"/>
+              </w:rPr>
+              <w:t>直接组 第1至4遍</w:t>
+            </w:r>
+          </w:p>
+        </w:tc>
+        <w:tc>
+          <w:tcPr>
+            <w:tcW w:type="dxa" w:w="1872"/>
+            <w:vAlign w:val="center"/>
+            <w:shd w:fill="FFFFFF"/>
+            <w:tcMar>
+              <w:top w:w="80" w:type="dxa"/>
+              <w:bottom w:w="80" w:type="dxa"/>
+              <w:left w:w="80" w:type="dxa"/>
+              <w:right w:w="80" w:type="dxa"/>
+            </w:tcMar>
+          </w:tcPr>
+          <w:p>
+            <w:pPr>
+              <w:keepNext/>
+              <w:spacing w:line="360" w:lineRule="auto" w:before="60" w:after="60"/>
+              <w:ind w:firstLine="0" w:firstLineChars="0"/>
+              <w:jc w:val="center"/>
+            </w:pPr>
+            <w:r>
+              <w:rPr>
+                <w:rFonts w:ascii="Times New Roman" w:hAnsi="Times New Roman" w:eastAsia="SimSun"/>
+                <w:b w:val="0"/>
+                <w:color w:val="000000"/>
+                <w:sz w:val="30"/>
+              </w:rPr>
+              <w:t>3.8054</w:t>
+            </w:r>
+          </w:p>
+        </w:tc>
+        <w:tc>
+          <w:tcPr>
+            <w:tcW w:type="dxa" w:w="1872"/>
+            <w:vAlign w:val="center"/>
+            <w:shd w:fill="FFFFFF"/>
+            <w:tcMar>
+              <w:top w:w="80" w:type="dxa"/>
+              <w:bottom w:w="80" w:type="dxa"/>
+              <w:left w:w="80" w:type="dxa"/>
+              <w:right w:w="80" w:type="dxa"/>
+            </w:tcMar>
+          </w:tcPr>
+          <w:p>
+            <w:pPr>
+              <w:keepNext/>
+              <w:spacing w:line="360" w:lineRule="auto" w:before="60" w:after="60"/>
+              <w:ind w:firstLine="0" w:firstLineChars="0"/>
+              <w:jc w:val="center"/>
+            </w:pPr>
+            <w:r>
+              <w:rPr>
+                <w:rFonts w:ascii="Times New Roman" w:hAnsi="Times New Roman" w:eastAsia="SimSun"/>
+                <w:b w:val="0"/>
+                <w:color w:val="000000"/>
+                <w:sz w:val="30"/>
+              </w:rPr>
+              <w:t>2.1378</w:t>
+            </w:r>
+          </w:p>
+        </w:tc>
+      </w:tr>
+      <w:tr>
+        <w:trPr>
+          <w:cantSplit/>
+        </w:trPr>
+        <w:tc>
+          <w:tcPr>
+            <w:tcW w:type="dxa" w:w="2016"/>
+            <w:vAlign w:val="center"/>
+            <w:shd w:fill="FFFFFF"/>
+            <w:tcMar>
+              <w:top w:w="80" w:type="dxa"/>
+              <w:bottom w:w="80" w:type="dxa"/>
+              <w:left w:w="80" w:type="dxa"/>
+              <w:right w:w="80" w:type="dxa"/>
+            </w:tcMar>
+          </w:tcPr>
+          <w:p>
+            <w:pPr>
+              <w:keepNext/>
+              <w:spacing w:line="360" w:lineRule="auto" w:before="60" w:after="60"/>
+              <w:ind w:firstLine="0" w:firstLineChars="0"/>
+              <w:jc w:val="left"/>
+            </w:pPr>
+            <w:r>
+              <w:rPr>
+                <w:rFonts w:ascii="Times New Roman" w:hAnsi="Times New Roman" w:eastAsia="SimSun"/>
+                <w:b w:val="0"/>
+                <w:color w:val="000000"/>
+                <w:sz w:val="30"/>
+              </w:rPr>
+              <w:t>训练损失</w:t>
+            </w:r>
+          </w:p>
+        </w:tc>
+        <w:tc>
+          <w:tcPr>
+            <w:tcW w:type="dxa" w:w="3168"/>
+            <w:vAlign w:val="center"/>
+            <w:shd w:fill="FFFFFF"/>
+            <w:tcMar>
+              <w:top w:w="80" w:type="dxa"/>
+              <w:bottom w:w="80" w:type="dxa"/>
+              <w:left w:w="80" w:type="dxa"/>
+              <w:right w:w="80" w:type="dxa"/>
+            </w:tcMar>
+          </w:tcPr>
+          <w:p>
+            <w:pPr>
+              <w:keepNext/>
+              <w:spacing w:line="360" w:lineRule="auto" w:before="60" w:after="60"/>
+              <w:ind w:firstLine="0" w:firstLineChars="0"/>
+              <w:jc w:val="center"/>
+            </w:pPr>
+            <w:r>
+              <w:rPr>
+                <w:rFonts w:ascii="Times New Roman" w:hAnsi="Times New Roman" w:eastAsia="SimSun"/>
+                <w:b w:val="0"/>
+                <w:color w:val="000000"/>
+                <w:sz w:val="30"/>
+              </w:rPr>
+              <w:t>改写组 第1至4遍</w:t>
+            </w:r>
+          </w:p>
+        </w:tc>
+        <w:tc>
+          <w:tcPr>
+            <w:tcW w:type="dxa" w:w="1872"/>
+            <w:vAlign w:val="center"/>
+            <w:shd w:fill="FFFFFF"/>
+            <w:tcMar>
+              <w:top w:w="80" w:type="dxa"/>
+              <w:bottom w:w="80" w:type="dxa"/>
+              <w:left w:w="80" w:type="dxa"/>
+              <w:right w:w="80" w:type="dxa"/>
+            </w:tcMar>
+          </w:tcPr>
+          <w:p>
+            <w:pPr>
+              <w:keepNext/>
+              <w:spacing w:line="360" w:lineRule="auto" w:before="60" w:after="60"/>
+              <w:ind w:firstLine="0" w:firstLineChars="0"/>
+              <w:jc w:val="center"/>
+            </w:pPr>
+            <w:r>
+              <w:rPr>
+                <w:rFonts w:ascii="Times New Roman" w:hAnsi="Times New Roman" w:eastAsia="SimSun"/>
+                <w:b w:val="0"/>
+                <w:color w:val="000000"/>
+                <w:sz w:val="30"/>
+              </w:rPr>
+              <w:t>3.4648</w:t>
+            </w:r>
+          </w:p>
+        </w:tc>
+        <w:tc>
+          <w:tcPr>
+            <w:tcW w:type="dxa" w:w="1872"/>
+            <w:vAlign w:val="center"/>
+            <w:shd w:fill="FFFFFF"/>
+            <w:tcMar>
+              <w:top w:w="80" w:type="dxa"/>
+              <w:bottom w:w="80" w:type="dxa"/>
+              <w:left w:w="80" w:type="dxa"/>
+              <w:right w:w="80" w:type="dxa"/>
+            </w:tcMar>
+          </w:tcPr>
+          <w:p>
+            <w:pPr>
+              <w:keepNext/>
+              <w:spacing w:line="360" w:lineRule="auto" w:before="60" w:after="60"/>
+              <w:ind w:firstLine="0" w:firstLineChars="0"/>
+              <w:jc w:val="center"/>
+            </w:pPr>
+            <w:r>
+              <w:rPr>
+                <w:rFonts w:ascii="Times New Roman" w:hAnsi="Times New Roman" w:eastAsia="SimSun"/>
+                <w:b w:val="0"/>
+                <w:color w:val="000000"/>
+                <w:sz w:val="30"/>
+              </w:rPr>
+              <w:t>2.1423</w:t>
+            </w:r>
+          </w:p>
+        </w:tc>
+      </w:tr>
+      <w:tr>
+        <w:trPr>
+          <w:cantSplit/>
+        </w:trPr>
+        <w:tc>
+          <w:tcPr>
+            <w:tcW w:type="dxa" w:w="2016"/>
+            <w:vAlign w:val="center"/>
+            <w:shd w:fill="FFFFFF"/>
+            <w:tcMar>
+              <w:top w:w="80" w:type="dxa"/>
+              <w:bottom w:w="80" w:type="dxa"/>
+              <w:left w:w="80" w:type="dxa"/>
+              <w:right w:w="80" w:type="dxa"/>
+            </w:tcMar>
+          </w:tcPr>
+          <w:p>
+            <w:pPr>
+              <w:keepNext/>
+              <w:spacing w:line="360" w:lineRule="auto" w:before="60" w:after="60"/>
+              <w:ind w:firstLine="0" w:firstLineChars="0"/>
+              <w:jc w:val="left"/>
+            </w:pPr>
+            <w:r>
+              <w:rPr>
+                <w:rFonts w:ascii="Times New Roman" w:hAnsi="Times New Roman" w:eastAsia="SimSun"/>
+                <w:b w:val="0"/>
+                <w:color w:val="000000"/>
+                <w:sz w:val="30"/>
+              </w:rPr>
+              <w:t>答案 NLL</w:t>
+            </w:r>
+          </w:p>
+        </w:tc>
+        <w:tc>
+          <w:tcPr>
+            <w:tcW w:type="dxa" w:w="3168"/>
+            <w:vAlign w:val="center"/>
+            <w:shd w:fill="FFFFFF"/>
+            <w:tcMar>
+              <w:top w:w="80" w:type="dxa"/>
+              <w:bottom w:w="80" w:type="dxa"/>
+              <w:left w:w="80" w:type="dxa"/>
+              <w:right w:w="80" w:type="dxa"/>
+            </w:tcMar>
+          </w:tcPr>
+          <w:p>
+            <w:pPr>
+              <w:keepNext/>
+              <w:spacing w:line="360" w:lineRule="auto" w:before="60" w:after="60"/>
+              <w:ind w:firstLine="0" w:firstLineChars="0"/>
+              <w:jc w:val="center"/>
+            </w:pPr>
+            <w:r>
+              <w:rPr>
+                <w:rFonts w:ascii="Times New Roman" w:hAnsi="Times New Roman" w:eastAsia="SimSun"/>
+                <w:b w:val="0"/>
+                <w:color w:val="000000"/>
+                <w:sz w:val="30"/>
+              </w:rPr>
+              <w:t>原训练上下文</w:t>
+            </w:r>
+          </w:p>
+        </w:tc>
+        <w:tc>
+          <w:tcPr>
+            <w:tcW w:type="dxa" w:w="1872"/>
+            <w:vAlign w:val="center"/>
+            <w:shd w:fill="FFFFFF"/>
+            <w:tcMar>
+              <w:top w:w="80" w:type="dxa"/>
+              <w:bottom w:w="80" w:type="dxa"/>
+              <w:left w:w="80" w:type="dxa"/>
+              <w:right w:w="80" w:type="dxa"/>
+            </w:tcMar>
+          </w:tcPr>
+          <w:p>
+            <w:pPr>
+              <w:keepNext/>
+              <w:spacing w:line="360" w:lineRule="auto" w:before="60" w:after="60"/>
+              <w:ind w:firstLine="0" w:firstLineChars="0"/>
+              <w:jc w:val="center"/>
+            </w:pPr>
+            <w:r>
+              <w:rPr>
+                <w:rFonts w:ascii="Times New Roman" w:hAnsi="Times New Roman" w:eastAsia="SimSun"/>
+                <w:b w:val="0"/>
+                <w:color w:val="000000"/>
+                <w:sz w:val="30"/>
+              </w:rPr>
+              <w:t>4.7873</w:t>
+            </w:r>
+          </w:p>
+        </w:tc>
+        <w:tc>
+          <w:tcPr>
+            <w:tcW w:type="dxa" w:w="1872"/>
+            <w:vAlign w:val="center"/>
+            <w:shd w:fill="FFFFFF"/>
+            <w:tcMar>
+              <w:top w:w="80" w:type="dxa"/>
+              <w:bottom w:w="80" w:type="dxa"/>
+              <w:left w:w="80" w:type="dxa"/>
+              <w:right w:w="80" w:type="dxa"/>
+            </w:tcMar>
+          </w:tcPr>
+          <w:p>
+            <w:pPr>
+              <w:keepNext/>
+              <w:spacing w:line="360" w:lineRule="auto" w:before="60" w:after="60"/>
+              <w:ind w:firstLine="0" w:firstLineChars="0"/>
+              <w:jc w:val="center"/>
+            </w:pPr>
+            <w:r>
+              <w:rPr>
+                <w:rFonts w:ascii="Times New Roman" w:hAnsi="Times New Roman" w:eastAsia="SimSun"/>
+                <w:b w:val="0"/>
+                <w:color w:val="000000"/>
+                <w:sz w:val="30"/>
+              </w:rPr>
+              <w:t>2.4873</w:t>
+            </w:r>
+          </w:p>
+        </w:tc>
+      </w:tr>
+      <w:tr>
+        <w:trPr>
+          <w:cantSplit/>
+        </w:trPr>
+        <w:tc>
+          <w:tcPr>
+            <w:tcW w:type="dxa" w:w="2016"/>
+            <w:vAlign w:val="center"/>
+            <w:shd w:fill="FFFFFF"/>
+            <w:tcMar>
+              <w:top w:w="80" w:type="dxa"/>
+              <w:bottom w:w="80" w:type="dxa"/>
+              <w:left w:w="80" w:type="dxa"/>
+              <w:right w:w="80" w:type="dxa"/>
+            </w:tcMar>
+          </w:tcPr>
+          <w:p>
+            <w:pPr>
+              <w:keepNext w:val="0"/>
+              <w:spacing w:line="360" w:lineRule="auto" w:before="60" w:after="60"/>
+              <w:ind w:firstLine="0" w:firstLineChars="0"/>
+              <w:jc w:val="left"/>
+            </w:pPr>
+            <w:r>
+              <w:rPr>
+                <w:rFonts w:ascii="Times New Roman" w:hAnsi="Times New Roman" w:eastAsia="SimSun"/>
+                <w:b w:val="0"/>
+                <w:color w:val="000000"/>
+                <w:sz w:val="30"/>
+              </w:rPr>
+              <w:t>答案 NLL</w:t>
+            </w:r>
+          </w:p>
+        </w:tc>
+        <w:tc>
+          <w:tcPr>
+            <w:tcW w:type="dxa" w:w="3168"/>
+            <w:vAlign w:val="center"/>
+            <w:shd w:fill="FFFFFF"/>
+            <w:tcMar>
+              <w:top w:w="80" w:type="dxa"/>
+              <w:bottom w:w="80" w:type="dxa"/>
+              <w:left w:w="80" w:type="dxa"/>
+              <w:right w:w="80" w:type="dxa"/>
+            </w:tcMar>
+          </w:tcPr>
+          <w:p>
+            <w:pPr>
+              <w:keepNext w:val="0"/>
+              <w:spacing w:line="360" w:lineRule="auto" w:before="60" w:after="60"/>
+              <w:ind w:firstLine="0" w:firstLineChars="0"/>
+              <w:jc w:val="center"/>
+            </w:pPr>
+            <w:r>
+              <w:rPr>
+                <w:rFonts w:ascii="Times New Roman" w:hAnsi="Times New Roman" w:eastAsia="SimSun"/>
+                <w:b w:val="0"/>
+                <w:color w:val="000000"/>
+                <w:sz w:val="30"/>
+              </w:rPr>
+              <w:t>独立题面</w:t>
+            </w:r>
+          </w:p>
+        </w:tc>
+        <w:tc>
+          <w:tcPr>
+            <w:tcW w:type="dxa" w:w="1872"/>
+            <w:vAlign w:val="center"/>
+            <w:shd w:fill="FFFFFF"/>
+            <w:tcMar>
+              <w:top w:w="80" w:type="dxa"/>
+              <w:bottom w:w="80" w:type="dxa"/>
+              <w:left w:w="80" w:type="dxa"/>
+              <w:right w:w="80" w:type="dxa"/>
+            </w:tcMar>
+          </w:tcPr>
+          <w:p>
+            <w:pPr>
+              <w:keepNext w:val="0"/>
+              <w:spacing w:line="360" w:lineRule="auto" w:before="60" w:after="60"/>
+              <w:ind w:firstLine="0" w:firstLineChars="0"/>
+              <w:jc w:val="center"/>
+            </w:pPr>
+            <w:r>
+              <w:rPr>
+                <w:rFonts w:ascii="Times New Roman" w:hAnsi="Times New Roman" w:eastAsia="SimSun"/>
+                <w:b w:val="0"/>
+                <w:color w:val="000000"/>
+                <w:sz w:val="30"/>
+              </w:rPr>
+              <w:t>2.8990</w:t>
+            </w:r>
+          </w:p>
+        </w:tc>
+        <w:tc>
+          <w:tcPr>
+            <w:tcW w:type="dxa" w:w="1872"/>
+            <w:vAlign w:val="center"/>
+            <w:shd w:fill="FFFFFF"/>
+            <w:tcMar>
+              <w:top w:w="80" w:type="dxa"/>
+              <w:bottom w:w="80" w:type="dxa"/>
+              <w:left w:w="80" w:type="dxa"/>
+              <w:right w:w="80" w:type="dxa"/>
+            </w:tcMar>
+          </w:tcPr>
+          <w:p>
+            <w:pPr>
+              <w:keepNext w:val="0"/>
+              <w:spacing w:line="360" w:lineRule="auto" w:before="60" w:after="60"/>
+              <w:ind w:firstLine="0" w:firstLineChars="0"/>
+              <w:jc w:val="center"/>
+            </w:pPr>
+            <w:r>
+              <w:rPr>
+                <w:rFonts w:ascii="Times New Roman" w:hAnsi="Times New Roman" w:eastAsia="SimSun"/>
+                <w:b w:val="0"/>
+                <w:color w:val="000000"/>
+                <w:sz w:val="30"/>
+              </w:rPr>
+              <w:t>2.6632</w:t>
+            </w:r>
+          </w:p>
+        </w:tc>
+      </w:tr>
+    </w:tbl>
     <w:p>
       <w:pPr>
+        <w:keepNext/>
         <w:widowControl/>
         <w:spacing w:line="360" w:lineRule="auto" w:before="0" w:after="120"/>
         <w:ind w:firstLine="600" w:firstLineChars="200"/>
@@ -1673,9 +2819,505 @@
           <w:sz w:val="30"/>
           <w:color w:val="000000"/>
         </w:rPr>
-        <w:t>书籍原文 CPT 呈现相似结果：训练4遍后，书内 NLL 改善4.126%，200道书内改写题仍答对189题；公开评测由1369题增至1371题，提高0.1196个百分点。[8]</w:t>
+        <w:t>书籍原文 CPT 的文本学习与问答表现如下。[8]</w:t>
       </w:r>
     </w:p>
+    <w:tbl>
+      <w:tblPr>
+        <w:tblW w:type="auto" w:w="0"/>
+        <w:tblLayout w:type="fixed"/>
+        <w:tblLook w:firstColumn="1" w:firstRow="1" w:lastColumn="0" w:lastRow="0" w:noHBand="0" w:noVBand="1" w:val="04A0"/>
+        <w:tblBorders>
+          <w:top w:val="single" w:sz="4" w:color="D9D9D9"/>
+          <w:left w:val="single" w:sz="4" w:color="D9D9D9"/>
+          <w:bottom w:val="single" w:sz="4" w:color="D9D9D9"/>
+          <w:right w:val="single" w:sz="4" w:color="D9D9D9"/>
+          <w:insideH w:val="single" w:sz="4" w:color="D9D9D9"/>
+          <w:insideV w:val="single" w:sz="4" w:color="D9D9D9"/>
+        </w:tblBorders>
+      </w:tblPr>
+      <w:tblGrid>
+        <w:gridCol w:w="3744"/>
+        <w:gridCol w:w="2448"/>
+        <w:gridCol w:w="2736"/>
+      </w:tblGrid>
+      <w:tr>
+        <w:trPr>
+          <w:cantSplit/>
+          <w:tblHeader/>
+        </w:trPr>
+        <w:tc>
+          <w:tcPr>
+            <w:tcW w:type="dxa" w:w="3744"/>
+            <w:vAlign w:val="center"/>
+            <w:shd w:fill="E7E6E6"/>
+            <w:tcMar>
+              <w:top w:w="80" w:type="dxa"/>
+              <w:bottom w:w="80" w:type="dxa"/>
+              <w:left w:w="80" w:type="dxa"/>
+              <w:right w:w="80" w:type="dxa"/>
+            </w:tcMar>
+          </w:tcPr>
+          <w:p>
+            <w:pPr>
+              <w:keepNext/>
+              <w:spacing w:line="360" w:lineRule="auto" w:before="60" w:after="60"/>
+              <w:ind w:firstLine="0" w:firstLineChars="0"/>
+              <w:jc w:val="left"/>
+            </w:pPr>
+            <w:r>
+              <w:rPr>
+                <w:rFonts w:ascii="Times New Roman" w:hAnsi="Times New Roman" w:eastAsia="SimSun"/>
+                <w:b/>
+                <w:color w:val="000000"/>
+                <w:sz w:val="30"/>
+              </w:rPr>
+              <w:t>指标</w:t>
+            </w:r>
+          </w:p>
+        </w:tc>
+        <w:tc>
+          <w:tcPr>
+            <w:tcW w:type="dxa" w:w="2448"/>
+            <w:vAlign w:val="center"/>
+            <w:shd w:fill="E7E6E6"/>
+            <w:tcMar>
+              <w:top w:w="80" w:type="dxa"/>
+              <w:bottom w:w="80" w:type="dxa"/>
+              <w:left w:w="80" w:type="dxa"/>
+              <w:right w:w="80" w:type="dxa"/>
+            </w:tcMar>
+          </w:tcPr>
+          <w:p>
+            <w:pPr>
+              <w:keepNext/>
+              <w:spacing w:line="360" w:lineRule="auto" w:before="60" w:after="60"/>
+              <w:ind w:firstLine="0" w:firstLineChars="0"/>
+              <w:jc w:val="center"/>
+            </w:pPr>
+            <w:r>
+              <w:rPr>
+                <w:rFonts w:ascii="Times New Roman" w:hAnsi="Times New Roman" w:eastAsia="SimSun"/>
+                <w:b/>
+                <w:color w:val="000000"/>
+                <w:sz w:val="30"/>
+              </w:rPr>
+              <w:t>原始 Step120</w:t>
+            </w:r>
+          </w:p>
+        </w:tc>
+        <w:tc>
+          <w:tcPr>
+            <w:tcW w:type="dxa" w:w="2736"/>
+            <w:vAlign w:val="center"/>
+            <w:shd w:fill="E7E6E6"/>
+            <w:tcMar>
+              <w:top w:w="80" w:type="dxa"/>
+              <w:bottom w:w="80" w:type="dxa"/>
+              <w:left w:w="80" w:type="dxa"/>
+              <w:right w:w="80" w:type="dxa"/>
+            </w:tcMar>
+          </w:tcPr>
+          <w:p>
+            <w:pPr>
+              <w:keepNext/>
+              <w:spacing w:line="360" w:lineRule="auto" w:before="60" w:after="60"/>
+              <w:ind w:firstLine="0" w:firstLineChars="0"/>
+              <w:jc w:val="center"/>
+            </w:pPr>
+            <w:r>
+              <w:rPr>
+                <w:rFonts w:ascii="Times New Roman" w:hAnsi="Times New Roman" w:eastAsia="SimSun"/>
+                <w:b/>
+                <w:color w:val="000000"/>
+                <w:sz w:val="30"/>
+              </w:rPr>
+              <w:t>书籍 CPT 四遍</w:t>
+            </w:r>
+          </w:p>
+        </w:tc>
+      </w:tr>
+      <w:tr>
+        <w:trPr>
+          <w:cantSplit/>
+        </w:trPr>
+        <w:tc>
+          <w:tcPr>
+            <w:tcW w:type="dxa" w:w="3744"/>
+            <w:vAlign w:val="center"/>
+            <w:shd w:fill="FFFFFF"/>
+            <w:tcMar>
+              <w:top w:w="80" w:type="dxa"/>
+              <w:bottom w:w="80" w:type="dxa"/>
+              <w:left w:w="80" w:type="dxa"/>
+              <w:right w:w="80" w:type="dxa"/>
+            </w:tcMar>
+          </w:tcPr>
+          <w:p>
+            <w:pPr>
+              <w:keepNext/>
+              <w:spacing w:line="360" w:lineRule="auto" w:before="60" w:after="60"/>
+              <w:ind w:firstLine="0" w:firstLineChars="0"/>
+              <w:jc w:val="left"/>
+            </w:pPr>
+            <w:r>
+              <w:rPr>
+                <w:rFonts w:ascii="Times New Roman" w:hAnsi="Times New Roman" w:eastAsia="SimSun"/>
+                <w:b w:val="0"/>
+                <w:color w:val="000000"/>
+                <w:sz w:val="30"/>
+              </w:rPr>
+              <w:t>书内 NLL 相对改善</w:t>
+            </w:r>
+          </w:p>
+        </w:tc>
+        <w:tc>
+          <w:tcPr>
+            <w:tcW w:type="dxa" w:w="2448"/>
+            <w:vAlign w:val="center"/>
+            <w:shd w:fill="FFFFFF"/>
+            <w:tcMar>
+              <w:top w:w="80" w:type="dxa"/>
+              <w:bottom w:w="80" w:type="dxa"/>
+              <w:left w:w="80" w:type="dxa"/>
+              <w:right w:w="80" w:type="dxa"/>
+            </w:tcMar>
+          </w:tcPr>
+          <w:p>
+            <w:pPr>
+              <w:keepNext/>
+              <w:spacing w:line="360" w:lineRule="auto" w:before="60" w:after="60"/>
+              <w:ind w:firstLine="0" w:firstLineChars="0"/>
+              <w:jc w:val="center"/>
+            </w:pPr>
+            <w:r>
+              <w:rPr>
+                <w:rFonts w:ascii="Times New Roman" w:hAnsi="Times New Roman" w:eastAsia="SimSun"/>
+                <w:b w:val="0"/>
+                <w:color w:val="000000"/>
+                <w:sz w:val="30"/>
+              </w:rPr>
+              <w:t>基准</w:t>
+            </w:r>
+          </w:p>
+        </w:tc>
+        <w:tc>
+          <w:tcPr>
+            <w:tcW w:type="dxa" w:w="2736"/>
+            <w:vAlign w:val="center"/>
+            <w:shd w:fill="FFFFFF"/>
+            <w:tcMar>
+              <w:top w:w="80" w:type="dxa"/>
+              <w:bottom w:w="80" w:type="dxa"/>
+              <w:left w:w="80" w:type="dxa"/>
+              <w:right w:w="80" w:type="dxa"/>
+            </w:tcMar>
+          </w:tcPr>
+          <w:p>
+            <w:pPr>
+              <w:keepNext/>
+              <w:spacing w:line="360" w:lineRule="auto" w:before="60" w:after="60"/>
+              <w:ind w:firstLine="0" w:firstLineChars="0"/>
+              <w:jc w:val="center"/>
+            </w:pPr>
+            <w:r>
+              <w:rPr>
+                <w:rFonts w:ascii="Times New Roman" w:hAnsi="Times New Roman" w:eastAsia="SimSun"/>
+                <w:b w:val="0"/>
+                <w:color w:val="000000"/>
+                <w:sz w:val="30"/>
+              </w:rPr>
+              <w:t>4.126%</w:t>
+            </w:r>
+          </w:p>
+        </w:tc>
+      </w:tr>
+      <w:tr>
+        <w:trPr>
+          <w:cantSplit/>
+        </w:trPr>
+        <w:tc>
+          <w:tcPr>
+            <w:tcW w:type="dxa" w:w="3744"/>
+            <w:vAlign w:val="center"/>
+            <w:shd w:fill="FFFFFF"/>
+            <w:tcMar>
+              <w:top w:w="80" w:type="dxa"/>
+              <w:bottom w:w="80" w:type="dxa"/>
+              <w:left w:w="80" w:type="dxa"/>
+              <w:right w:w="80" w:type="dxa"/>
+            </w:tcMar>
+          </w:tcPr>
+          <w:p>
+            <w:pPr>
+              <w:keepNext/>
+              <w:spacing w:line="360" w:lineRule="auto" w:before="60" w:after="60"/>
+              <w:ind w:firstLine="0" w:firstLineChars="0"/>
+              <w:jc w:val="left"/>
+            </w:pPr>
+            <w:r>
+              <w:rPr>
+                <w:rFonts w:ascii="Times New Roman" w:hAnsi="Times New Roman" w:eastAsia="SimSun"/>
+                <w:b w:val="0"/>
+                <w:color w:val="000000"/>
+                <w:sz w:val="30"/>
+              </w:rPr>
+              <w:t>书内改写题答对</w:t>
+            </w:r>
+          </w:p>
+        </w:tc>
+        <w:tc>
+          <w:tcPr>
+            <w:tcW w:type="dxa" w:w="2448"/>
+            <w:vAlign w:val="center"/>
+            <w:shd w:fill="FFFFFF"/>
+            <w:tcMar>
+              <w:top w:w="80" w:type="dxa"/>
+              <w:bottom w:w="80" w:type="dxa"/>
+              <w:left w:w="80" w:type="dxa"/>
+              <w:right w:w="80" w:type="dxa"/>
+            </w:tcMar>
+          </w:tcPr>
+          <w:p>
+            <w:pPr>
+              <w:keepNext/>
+              <w:spacing w:line="360" w:lineRule="auto" w:before="60" w:after="60"/>
+              <w:ind w:firstLine="0" w:firstLineChars="0"/>
+              <w:jc w:val="center"/>
+            </w:pPr>
+            <w:r>
+              <w:rPr>
+                <w:rFonts w:ascii="Times New Roman" w:hAnsi="Times New Roman" w:eastAsia="SimSun"/>
+                <w:b w:val="0"/>
+                <w:color w:val="000000"/>
+                <w:sz w:val="30"/>
+              </w:rPr>
+              <w:t>189/200</w:t>
+            </w:r>
+          </w:p>
+        </w:tc>
+        <w:tc>
+          <w:tcPr>
+            <w:tcW w:type="dxa" w:w="2736"/>
+            <w:vAlign w:val="center"/>
+            <w:shd w:fill="FFFFFF"/>
+            <w:tcMar>
+              <w:top w:w="80" w:type="dxa"/>
+              <w:bottom w:w="80" w:type="dxa"/>
+              <w:left w:w="80" w:type="dxa"/>
+              <w:right w:w="80" w:type="dxa"/>
+            </w:tcMar>
+          </w:tcPr>
+          <w:p>
+            <w:pPr>
+              <w:keepNext/>
+              <w:spacing w:line="360" w:lineRule="auto" w:before="60" w:after="60"/>
+              <w:ind w:firstLine="0" w:firstLineChars="0"/>
+              <w:jc w:val="center"/>
+            </w:pPr>
+            <w:r>
+              <w:rPr>
+                <w:rFonts w:ascii="Times New Roman" w:hAnsi="Times New Roman" w:eastAsia="SimSun"/>
+                <w:b w:val="0"/>
+                <w:color w:val="000000"/>
+                <w:sz w:val="30"/>
+              </w:rPr>
+              <w:t>189/200</w:t>
+            </w:r>
+          </w:p>
+        </w:tc>
+      </w:tr>
+      <w:tr>
+        <w:trPr>
+          <w:cantSplit/>
+        </w:trPr>
+        <w:tc>
+          <w:tcPr>
+            <w:tcW w:type="dxa" w:w="3744"/>
+            <w:vAlign w:val="center"/>
+            <w:shd w:fill="FFFFFF"/>
+            <w:tcMar>
+              <w:top w:w="80" w:type="dxa"/>
+              <w:bottom w:w="80" w:type="dxa"/>
+              <w:left w:w="80" w:type="dxa"/>
+              <w:right w:w="80" w:type="dxa"/>
+            </w:tcMar>
+          </w:tcPr>
+          <w:p>
+            <w:pPr>
+              <w:keepNext/>
+              <w:spacing w:line="360" w:lineRule="auto" w:before="60" w:after="60"/>
+              <w:ind w:firstLine="0" w:firstLineChars="0"/>
+              <w:jc w:val="left"/>
+            </w:pPr>
+            <w:r>
+              <w:rPr>
+                <w:rFonts w:ascii="Times New Roman" w:hAnsi="Times New Roman" w:eastAsia="SimSun"/>
+                <w:b w:val="0"/>
+                <w:color w:val="000000"/>
+                <w:sz w:val="30"/>
+              </w:rPr>
+              <w:t>公开题答对</w:t>
+            </w:r>
+          </w:p>
+        </w:tc>
+        <w:tc>
+          <w:tcPr>
+            <w:tcW w:type="dxa" w:w="2448"/>
+            <w:vAlign w:val="center"/>
+            <w:shd w:fill="FFFFFF"/>
+            <w:tcMar>
+              <w:top w:w="80" w:type="dxa"/>
+              <w:bottom w:w="80" w:type="dxa"/>
+              <w:left w:w="80" w:type="dxa"/>
+              <w:right w:w="80" w:type="dxa"/>
+            </w:tcMar>
+          </w:tcPr>
+          <w:p>
+            <w:pPr>
+              <w:keepNext/>
+              <w:spacing w:line="360" w:lineRule="auto" w:before="60" w:after="60"/>
+              <w:ind w:firstLine="0" w:firstLineChars="0"/>
+              <w:jc w:val="center"/>
+            </w:pPr>
+            <w:r>
+              <w:rPr>
+                <w:rFonts w:ascii="Times New Roman" w:hAnsi="Times New Roman" w:eastAsia="SimSun"/>
+                <w:b w:val="0"/>
+                <w:color w:val="000000"/>
+                <w:sz w:val="30"/>
+              </w:rPr>
+              <w:t>1369/1672</w:t>
+            </w:r>
+          </w:p>
+        </w:tc>
+        <w:tc>
+          <w:tcPr>
+            <w:tcW w:type="dxa" w:w="2736"/>
+            <w:vAlign w:val="center"/>
+            <w:shd w:fill="FFFFFF"/>
+            <w:tcMar>
+              <w:top w:w="80" w:type="dxa"/>
+              <w:bottom w:w="80" w:type="dxa"/>
+              <w:left w:w="80" w:type="dxa"/>
+              <w:right w:w="80" w:type="dxa"/>
+            </w:tcMar>
+          </w:tcPr>
+          <w:p>
+            <w:pPr>
+              <w:keepNext/>
+              <w:spacing w:line="360" w:lineRule="auto" w:before="60" w:after="60"/>
+              <w:ind w:firstLine="0" w:firstLineChars="0"/>
+              <w:jc w:val="center"/>
+            </w:pPr>
+            <w:r>
+              <w:rPr>
+                <w:rFonts w:ascii="Times New Roman" w:hAnsi="Times New Roman" w:eastAsia="SimSun"/>
+                <w:b w:val="0"/>
+                <w:color w:val="000000"/>
+                <w:sz w:val="30"/>
+              </w:rPr>
+              <w:t>1371/1672</w:t>
+            </w:r>
+          </w:p>
+        </w:tc>
+      </w:tr>
+      <w:tr>
+        <w:trPr>
+          <w:cantSplit/>
+        </w:trPr>
+        <w:tc>
+          <w:tcPr>
+            <w:tcW w:type="dxa" w:w="3744"/>
+            <w:vAlign w:val="center"/>
+            <w:shd w:fill="FFFFFF"/>
+            <w:tcMar>
+              <w:top w:w="80" w:type="dxa"/>
+              <w:bottom w:w="80" w:type="dxa"/>
+              <w:left w:w="80" w:type="dxa"/>
+              <w:right w:w="80" w:type="dxa"/>
+            </w:tcMar>
+          </w:tcPr>
+          <w:p>
+            <w:pPr>
+              <w:keepNext w:val="0"/>
+              <w:spacing w:line="360" w:lineRule="auto" w:before="60" w:after="60"/>
+              <w:ind w:firstLine="0" w:firstLineChars="0"/>
+              <w:jc w:val="left"/>
+            </w:pPr>
+            <w:r>
+              <w:rPr>
+                <w:rFonts w:ascii="Times New Roman" w:hAnsi="Times New Roman" w:eastAsia="SimSun"/>
+                <w:b w:val="0"/>
+                <w:color w:val="000000"/>
+                <w:sz w:val="30"/>
+              </w:rPr>
+              <w:t>公开题准确率增量</w:t>
+            </w:r>
+          </w:p>
+        </w:tc>
+        <w:tc>
+          <w:tcPr>
+            <w:tcW w:type="dxa" w:w="2448"/>
+            <w:vAlign w:val="center"/>
+            <w:shd w:fill="FFFFFF"/>
+            <w:tcMar>
+              <w:top w:w="80" w:type="dxa"/>
+              <w:bottom w:w="80" w:type="dxa"/>
+              <w:left w:w="80" w:type="dxa"/>
+              <w:right w:w="80" w:type="dxa"/>
+            </w:tcMar>
+          </w:tcPr>
+          <w:p>
+            <w:pPr>
+              <w:keepNext w:val="0"/>
+              <w:spacing w:line="360" w:lineRule="auto" w:before="60" w:after="60"/>
+              <w:ind w:firstLine="0" w:firstLineChars="0"/>
+              <w:jc w:val="center"/>
+            </w:pPr>
+            <w:r>
+              <w:rPr>
+                <w:rFonts w:ascii="Times New Roman" w:hAnsi="Times New Roman" w:eastAsia="SimSun"/>
+                <w:b w:val="0"/>
+                <w:color w:val="000000"/>
+                <w:sz w:val="30"/>
+              </w:rPr>
+              <w:t>基准</w:t>
+            </w:r>
+          </w:p>
+        </w:tc>
+        <w:tc>
+          <w:tcPr>
+            <w:tcW w:type="dxa" w:w="2736"/>
+            <w:vAlign w:val="center"/>
+            <w:shd w:fill="FFFFFF"/>
+            <w:tcMar>
+              <w:top w:w="80" w:type="dxa"/>
+              <w:bottom w:w="80" w:type="dxa"/>
+              <w:left w:w="80" w:type="dxa"/>
+              <w:right w:w="80" w:type="dxa"/>
+            </w:tcMar>
+          </w:tcPr>
+          <w:p>
+            <w:pPr>
+              <w:keepNext w:val="0"/>
+              <w:spacing w:line="360" w:lineRule="auto" w:before="60" w:after="60"/>
+              <w:ind w:firstLine="0" w:firstLineChars="0"/>
+              <w:jc w:val="center"/>
+            </w:pPr>
+            <w:r>
+              <w:rPr>
+                <w:rFonts w:ascii="Times New Roman" w:hAnsi="Times New Roman" w:eastAsia="SimSun"/>
+                <w:b w:val="0"/>
+                <w:color w:val="000000"/>
+                <w:sz w:val="30"/>
+              </w:rPr>
+              <w:t>+0.1196个百分点</w:t>
+            </w:r>
+          </w:p>
+        </w:tc>
+      </w:tr>
+    </w:tbl>
     <w:p>
       <w:pPr>
         <w:pStyle w:val="Heading2"/>
@@ -1708,7 +3350,7 @@
           <w:sz w:val="30"/>
           <w:color w:val="000000"/>
         </w:rPr>
-        <w:t>CPT 已改善文本预测，问答增益仍需进一步验证。现有结果无法区分知识吸收与调用的影响，下一步检验答案监督和情景应用训练的效果。</w:t>
+        <w:t>CPT 改善了文本预测，问答得分小幅提升。现有结果无法区分知识吸收与调用的影响，因此进一步以答案监督和情景应用训练验证。</w:t>
       </w:r>
     </w:p>
     <w:p>
@@ -1748,6 +3390,7 @@
     </w:p>
     <w:p>
       <w:pPr>
+        <w:keepNext/>
         <w:widowControl/>
         <w:spacing w:line="360" w:lineRule="auto" w:before="0" w:after="120"/>
         <w:ind w:firstLine="600" w:firstLineChars="200"/>
@@ -1760,9 +3403,410 @@
           <w:sz w:val="30"/>
           <w:color w:val="000000"/>
         </w:rPr>
-        <w:t>以全部1672道原题、完整选项及正确答案训练，仅监督答案与结束标记。训练1遍、2遍后，同题准确率由81.88%升至93.18%、94.44%，表明答案监督能提高同题拟合。[9]</w:t>
+        <w:t>以全部1672道原题、完整选项及正确答案训练，仅监督答案与结束标记。同题结果如下。[9]</w:t>
       </w:r>
     </w:p>
+    <w:tbl>
+      <w:tblPr>
+        <w:tblW w:type="auto" w:w="0"/>
+        <w:tblLayout w:type="fixed"/>
+        <w:tblLook w:firstColumn="1" w:firstRow="1" w:lastColumn="0" w:lastRow="0" w:noHBand="0" w:noVBand="1" w:val="04A0"/>
+        <w:tblBorders>
+          <w:top w:val="single" w:sz="4" w:color="D9D9D9"/>
+          <w:left w:val="single" w:sz="4" w:color="D9D9D9"/>
+          <w:bottom w:val="single" w:sz="4" w:color="D9D9D9"/>
+          <w:right w:val="single" w:sz="4" w:color="D9D9D9"/>
+          <w:insideH w:val="single" w:sz="4" w:color="D9D9D9"/>
+          <w:insideV w:val="single" w:sz="4" w:color="D9D9D9"/>
+        </w:tblBorders>
+      </w:tblPr>
+      <w:tblGrid>
+        <w:gridCol w:w="4032"/>
+        <w:gridCol w:w="2016"/>
+        <w:gridCol w:w="2880"/>
+      </w:tblGrid>
+      <w:tr>
+        <w:trPr>
+          <w:cantSplit/>
+          <w:tblHeader/>
+        </w:trPr>
+        <w:tc>
+          <w:tcPr>
+            <w:tcW w:type="dxa" w:w="4032"/>
+            <w:vAlign w:val="center"/>
+            <w:shd w:fill="E7E6E6"/>
+            <w:tcMar>
+              <w:top w:w="80" w:type="dxa"/>
+              <w:bottom w:w="80" w:type="dxa"/>
+              <w:left w:w="80" w:type="dxa"/>
+              <w:right w:w="80" w:type="dxa"/>
+            </w:tcMar>
+          </w:tcPr>
+          <w:p>
+            <w:pPr>
+              <w:keepNext/>
+              <w:spacing w:line="360" w:lineRule="auto" w:before="60" w:after="60"/>
+              <w:ind w:firstLine="0" w:firstLineChars="0"/>
+              <w:jc w:val="left"/>
+            </w:pPr>
+            <w:r>
+              <w:rPr>
+                <w:rFonts w:ascii="Times New Roman" w:hAnsi="Times New Roman" w:eastAsia="SimSun"/>
+                <w:b/>
+                <w:color w:val="000000"/>
+                <w:sz w:val="30"/>
+              </w:rPr>
+              <w:t>模型</w:t>
+            </w:r>
+          </w:p>
+        </w:tc>
+        <w:tc>
+          <w:tcPr>
+            <w:tcW w:type="dxa" w:w="2016"/>
+            <w:vAlign w:val="center"/>
+            <w:shd w:fill="E7E6E6"/>
+            <w:tcMar>
+              <w:top w:w="80" w:type="dxa"/>
+              <w:bottom w:w="80" w:type="dxa"/>
+              <w:left w:w="80" w:type="dxa"/>
+              <w:right w:w="80" w:type="dxa"/>
+            </w:tcMar>
+          </w:tcPr>
+          <w:p>
+            <w:pPr>
+              <w:keepNext/>
+              <w:spacing w:line="360" w:lineRule="auto" w:before="60" w:after="60"/>
+              <w:ind w:firstLine="0" w:firstLineChars="0"/>
+              <w:jc w:val="center"/>
+            </w:pPr>
+            <w:r>
+              <w:rPr>
+                <w:rFonts w:ascii="Times New Roman" w:hAnsi="Times New Roman" w:eastAsia="SimSun"/>
+                <w:b/>
+                <w:color w:val="000000"/>
+                <w:sz w:val="30"/>
+              </w:rPr>
+              <w:t>训练遍数</w:t>
+            </w:r>
+          </w:p>
+        </w:tc>
+        <w:tc>
+          <w:tcPr>
+            <w:tcW w:type="dxa" w:w="2880"/>
+            <w:vAlign w:val="center"/>
+            <w:shd w:fill="E7E6E6"/>
+            <w:tcMar>
+              <w:top w:w="80" w:type="dxa"/>
+              <w:bottom w:w="80" w:type="dxa"/>
+              <w:left w:w="80" w:type="dxa"/>
+              <w:right w:w="80" w:type="dxa"/>
+            </w:tcMar>
+          </w:tcPr>
+          <w:p>
+            <w:pPr>
+              <w:keepNext/>
+              <w:spacing w:line="360" w:lineRule="auto" w:before="60" w:after="60"/>
+              <w:ind w:firstLine="0" w:firstLineChars="0"/>
+              <w:jc w:val="center"/>
+            </w:pPr>
+            <w:r>
+              <w:rPr>
+                <w:rFonts w:ascii="Times New Roman" w:hAnsi="Times New Roman" w:eastAsia="SimSun"/>
+                <w:b/>
+                <w:color w:val="000000"/>
+                <w:sz w:val="30"/>
+              </w:rPr>
+              <w:t>同题准确率</w:t>
+            </w:r>
+          </w:p>
+        </w:tc>
+      </w:tr>
+      <w:tr>
+        <w:trPr>
+          <w:cantSplit/>
+        </w:trPr>
+        <w:tc>
+          <w:tcPr>
+            <w:tcW w:type="dxa" w:w="4032"/>
+            <w:vAlign w:val="center"/>
+            <w:shd w:fill="FFFFFF"/>
+            <w:tcMar>
+              <w:top w:w="80" w:type="dxa"/>
+              <w:bottom w:w="80" w:type="dxa"/>
+              <w:left w:w="80" w:type="dxa"/>
+              <w:right w:w="80" w:type="dxa"/>
+            </w:tcMar>
+          </w:tcPr>
+          <w:p>
+            <w:pPr>
+              <w:keepNext/>
+              <w:spacing w:line="360" w:lineRule="auto" w:before="60" w:after="60"/>
+              <w:ind w:firstLine="0" w:firstLineChars="0"/>
+              <w:jc w:val="left"/>
+            </w:pPr>
+            <w:r>
+              <w:rPr>
+                <w:rFonts w:ascii="Times New Roman" w:hAnsi="Times New Roman" w:eastAsia="SimSun"/>
+                <w:b w:val="0"/>
+                <w:color w:val="000000"/>
+                <w:sz w:val="30"/>
+              </w:rPr>
+              <w:t>原始 Step120</w:t>
+            </w:r>
+          </w:p>
+        </w:tc>
+        <w:tc>
+          <w:tcPr>
+            <w:tcW w:type="dxa" w:w="2016"/>
+            <w:vAlign w:val="center"/>
+            <w:shd w:fill="FFFFFF"/>
+            <w:tcMar>
+              <w:top w:w="80" w:type="dxa"/>
+              <w:bottom w:w="80" w:type="dxa"/>
+              <w:left w:w="80" w:type="dxa"/>
+              <w:right w:w="80" w:type="dxa"/>
+            </w:tcMar>
+          </w:tcPr>
+          <w:p>
+            <w:pPr>
+              <w:keepNext/>
+              <w:spacing w:line="360" w:lineRule="auto" w:before="60" w:after="60"/>
+              <w:ind w:firstLine="0" w:firstLineChars="0"/>
+              <w:jc w:val="center"/>
+            </w:pPr>
+            <w:r>
+              <w:rPr>
+                <w:rFonts w:ascii="Times New Roman" w:hAnsi="Times New Roman" w:eastAsia="SimSun"/>
+                <w:b w:val="0"/>
+                <w:color w:val="000000"/>
+                <w:sz w:val="30"/>
+              </w:rPr>
+              <w:t>0</w:t>
+            </w:r>
+          </w:p>
+        </w:tc>
+        <w:tc>
+          <w:tcPr>
+            <w:tcW w:type="dxa" w:w="2880"/>
+            <w:vAlign w:val="center"/>
+            <w:shd w:fill="FFFFFF"/>
+            <w:tcMar>
+              <w:top w:w="80" w:type="dxa"/>
+              <w:bottom w:w="80" w:type="dxa"/>
+              <w:left w:w="80" w:type="dxa"/>
+              <w:right w:w="80" w:type="dxa"/>
+            </w:tcMar>
+          </w:tcPr>
+          <w:p>
+            <w:pPr>
+              <w:keepNext/>
+              <w:spacing w:line="360" w:lineRule="auto" w:before="60" w:after="60"/>
+              <w:ind w:firstLine="0" w:firstLineChars="0"/>
+              <w:jc w:val="center"/>
+            </w:pPr>
+            <w:r>
+              <w:rPr>
+                <w:rFonts w:ascii="Times New Roman" w:hAnsi="Times New Roman" w:eastAsia="SimSun"/>
+                <w:b w:val="0"/>
+                <w:color w:val="000000"/>
+                <w:sz w:val="30"/>
+              </w:rPr>
+              <w:t>81.88%</w:t>
+            </w:r>
+          </w:p>
+        </w:tc>
+      </w:tr>
+      <w:tr>
+        <w:trPr>
+          <w:cantSplit/>
+        </w:trPr>
+        <w:tc>
+          <w:tcPr>
+            <w:tcW w:type="dxa" w:w="4032"/>
+            <w:vAlign w:val="center"/>
+            <w:shd w:fill="FFFFFF"/>
+            <w:tcMar>
+              <w:top w:w="80" w:type="dxa"/>
+              <w:bottom w:w="80" w:type="dxa"/>
+              <w:left w:w="80" w:type="dxa"/>
+              <w:right w:w="80" w:type="dxa"/>
+            </w:tcMar>
+          </w:tcPr>
+          <w:p>
+            <w:pPr>
+              <w:keepNext/>
+              <w:spacing w:line="360" w:lineRule="auto" w:before="60" w:after="60"/>
+              <w:ind w:firstLine="0" w:firstLineChars="0"/>
+              <w:jc w:val="left"/>
+            </w:pPr>
+            <w:r>
+              <w:rPr>
+                <w:rFonts w:ascii="Times New Roman" w:hAnsi="Times New Roman" w:eastAsia="SimSun"/>
+                <w:b w:val="0"/>
+                <w:color w:val="000000"/>
+                <w:sz w:val="30"/>
+              </w:rPr>
+              <w:t>答案 SFT</w:t>
+            </w:r>
+          </w:p>
+        </w:tc>
+        <w:tc>
+          <w:tcPr>
+            <w:tcW w:type="dxa" w:w="2016"/>
+            <w:vAlign w:val="center"/>
+            <w:shd w:fill="FFFFFF"/>
+            <w:tcMar>
+              <w:top w:w="80" w:type="dxa"/>
+              <w:bottom w:w="80" w:type="dxa"/>
+              <w:left w:w="80" w:type="dxa"/>
+              <w:right w:w="80" w:type="dxa"/>
+            </w:tcMar>
+          </w:tcPr>
+          <w:p>
+            <w:pPr>
+              <w:keepNext/>
+              <w:spacing w:line="360" w:lineRule="auto" w:before="60" w:after="60"/>
+              <w:ind w:firstLine="0" w:firstLineChars="0"/>
+              <w:jc w:val="center"/>
+            </w:pPr>
+            <w:r>
+              <w:rPr>
+                <w:rFonts w:ascii="Times New Roman" w:hAnsi="Times New Roman" w:eastAsia="SimSun"/>
+                <w:b w:val="0"/>
+                <w:color w:val="000000"/>
+                <w:sz w:val="30"/>
+              </w:rPr>
+              <w:t>1</w:t>
+            </w:r>
+          </w:p>
+        </w:tc>
+        <w:tc>
+          <w:tcPr>
+            <w:tcW w:type="dxa" w:w="2880"/>
+            <w:vAlign w:val="center"/>
+            <w:shd w:fill="FFFFFF"/>
+            <w:tcMar>
+              <w:top w:w="80" w:type="dxa"/>
+              <w:bottom w:w="80" w:type="dxa"/>
+              <w:left w:w="80" w:type="dxa"/>
+              <w:right w:w="80" w:type="dxa"/>
+            </w:tcMar>
+          </w:tcPr>
+          <w:p>
+            <w:pPr>
+              <w:keepNext/>
+              <w:spacing w:line="360" w:lineRule="auto" w:before="60" w:after="60"/>
+              <w:ind w:firstLine="0" w:firstLineChars="0"/>
+              <w:jc w:val="center"/>
+            </w:pPr>
+            <w:r>
+              <w:rPr>
+                <w:rFonts w:ascii="Times New Roman" w:hAnsi="Times New Roman" w:eastAsia="SimSun"/>
+                <w:b w:val="0"/>
+                <w:color w:val="000000"/>
+                <w:sz w:val="30"/>
+              </w:rPr>
+              <w:t>93.18%</w:t>
+            </w:r>
+          </w:p>
+        </w:tc>
+      </w:tr>
+      <w:tr>
+        <w:trPr>
+          <w:cantSplit/>
+        </w:trPr>
+        <w:tc>
+          <w:tcPr>
+            <w:tcW w:type="dxa" w:w="4032"/>
+            <w:vAlign w:val="center"/>
+            <w:shd w:fill="FFFFFF"/>
+            <w:tcMar>
+              <w:top w:w="80" w:type="dxa"/>
+              <w:bottom w:w="80" w:type="dxa"/>
+              <w:left w:w="80" w:type="dxa"/>
+              <w:right w:w="80" w:type="dxa"/>
+            </w:tcMar>
+          </w:tcPr>
+          <w:p>
+            <w:pPr>
+              <w:keepNext w:val="0"/>
+              <w:spacing w:line="360" w:lineRule="auto" w:before="60" w:after="60"/>
+              <w:ind w:firstLine="0" w:firstLineChars="0"/>
+              <w:jc w:val="left"/>
+            </w:pPr>
+            <w:r>
+              <w:rPr>
+                <w:rFonts w:ascii="Times New Roman" w:hAnsi="Times New Roman" w:eastAsia="SimSun"/>
+                <w:b w:val="0"/>
+                <w:color w:val="000000"/>
+                <w:sz w:val="30"/>
+              </w:rPr>
+              <w:t>答案 SFT</w:t>
+            </w:r>
+          </w:p>
+        </w:tc>
+        <w:tc>
+          <w:tcPr>
+            <w:tcW w:type="dxa" w:w="2016"/>
+            <w:vAlign w:val="center"/>
+            <w:shd w:fill="FFFFFF"/>
+            <w:tcMar>
+              <w:top w:w="80" w:type="dxa"/>
+              <w:bottom w:w="80" w:type="dxa"/>
+              <w:left w:w="80" w:type="dxa"/>
+              <w:right w:w="80" w:type="dxa"/>
+            </w:tcMar>
+          </w:tcPr>
+          <w:p>
+            <w:pPr>
+              <w:keepNext w:val="0"/>
+              <w:spacing w:line="360" w:lineRule="auto" w:before="60" w:after="60"/>
+              <w:ind w:firstLine="0" w:firstLineChars="0"/>
+              <w:jc w:val="center"/>
+            </w:pPr>
+            <w:r>
+              <w:rPr>
+                <w:rFonts w:ascii="Times New Roman" w:hAnsi="Times New Roman" w:eastAsia="SimSun"/>
+                <w:b w:val="0"/>
+                <w:color w:val="000000"/>
+                <w:sz w:val="30"/>
+              </w:rPr>
+              <w:t>2</w:t>
+            </w:r>
+          </w:p>
+        </w:tc>
+        <w:tc>
+          <w:tcPr>
+            <w:tcW w:type="dxa" w:w="2880"/>
+            <w:vAlign w:val="center"/>
+            <w:shd w:fill="FFFFFF"/>
+            <w:tcMar>
+              <w:top w:w="80" w:type="dxa"/>
+              <w:bottom w:w="80" w:type="dxa"/>
+              <w:left w:w="80" w:type="dxa"/>
+              <w:right w:w="80" w:type="dxa"/>
+            </w:tcMar>
+          </w:tcPr>
+          <w:p>
+            <w:pPr>
+              <w:keepNext w:val="0"/>
+              <w:spacing w:line="360" w:lineRule="auto" w:before="60" w:after="60"/>
+              <w:ind w:firstLine="0" w:firstLineChars="0"/>
+              <w:jc w:val="center"/>
+            </w:pPr>
+            <w:r>
+              <w:rPr>
+                <w:rFonts w:ascii="Times New Roman" w:hAnsi="Times New Roman" w:eastAsia="SimSun"/>
+                <w:b w:val="0"/>
+                <w:color w:val="000000"/>
+                <w:sz w:val="30"/>
+              </w:rPr>
+              <w:t>94.44%</w:t>
+            </w:r>
+          </w:p>
+        </w:tc>
+      </w:tr>
+    </w:tbl>
     <w:p>
       <w:pPr>
         <w:widowControl/>
@@ -1777,7 +3821,7 @@
           <w:sz w:val="30"/>
           <w:color w:val="000000"/>
         </w:rPr>
-        <w:t>该实验为监督方式提供线索，不能证明未见题目的能力提升或原有知识完整性。其数据来自评测题，与后续独立书籍 SFT 分开；该模型不纳入后续三模型对照。</w:t>
+        <w:t>答案监督提高了同题拟合，但不能证明未见题目的能力提升或原有知识完整性。该实验使用评测题，与独立书籍 SFT 分开，其模型不纳入三模型对照。</w:t>
       </w:r>
     </w:p>
     <w:p>
@@ -2018,7 +4062,7 @@
           </w:tcPr>
           <w:p>
             <w:pPr>
-              <w:keepNext w:val="0"/>
+              <w:keepNext/>
               <w:spacing w:after="0" w:line="360" w:lineRule="auto"/>
               <w:ind w:firstLine="0" w:firstLineChars="0"/>
               <w:jc w:val="left"/>
@@ -2054,7 +4098,7 @@
           </w:tcPr>
           <w:p>
             <w:pPr>
-              <w:keepNext w:val="0"/>
+              <w:keepNext/>
               <w:spacing w:after="0" w:line="360" w:lineRule="auto"/>
               <w:ind w:firstLine="0" w:firstLineChars="0"/>
               <w:jc w:val="center"/>
@@ -2090,7 +4134,7 @@
           </w:tcPr>
           <w:p>
             <w:pPr>
-              <w:keepNext w:val="0"/>
+              <w:keepNext/>
               <w:spacing w:after="0" w:line="360" w:lineRule="auto"/>
               <w:ind w:firstLine="0" w:firstLineChars="0"/>
               <w:jc w:val="center"/>
@@ -2131,7 +4175,7 @@
           </w:tcPr>
           <w:p>
             <w:pPr>
-              <w:keepNext w:val="0"/>
+              <w:keepNext/>
               <w:spacing w:after="0" w:line="360" w:lineRule="auto"/>
               <w:ind w:firstLine="0" w:firstLineChars="0"/>
               <w:jc w:val="left"/>
@@ -2167,7 +4211,7 @@
           </w:tcPr>
           <w:p>
             <w:pPr>
-              <w:keepNext w:val="0"/>
+              <w:keepNext/>
               <w:spacing w:after="0" w:line="360" w:lineRule="auto"/>
               <w:ind w:firstLine="0" w:firstLineChars="0"/>
               <w:jc w:val="center"/>
@@ -2203,7 +4247,7 @@
           </w:tcPr>
           <w:p>
             <w:pPr>
-              <w:keepNext w:val="0"/>
+              <w:keepNext/>
               <w:spacing w:after="0" w:line="360" w:lineRule="auto"/>
               <w:ind w:firstLine="0" w:firstLineChars="0"/>
               <w:jc w:val="center"/>
@@ -2348,7 +4392,7 @@
           <w:sz w:val="30"/>
           <w:color w:val="000000"/>
         </w:rPr>
-        <w:t>资料使历史错题答对数由6题增至58题，也使原答对对照由57题降至54题。诊断提示与正式评测不同，历史错题可在本轮答对；基础题与原题难度、分母不同，不直接比较正确率差值。</w:t>
+        <w:t>教材改善了部分错题，也干扰了部分原答对题。诊断提示与正式评测不同；基础题与原题难度、分母不同，不直接比较正确率差值。</w:t>
       </w:r>
     </w:p>
     <w:p>
@@ -2371,6 +4415,7 @@
     </w:p>
     <w:p>
       <w:pPr>
+        <w:keepNext/>
         <w:widowControl/>
         <w:spacing w:line="360" w:lineRule="auto" w:before="0" w:after="120"/>
         <w:ind w:firstLine="600" w:firstLineChars="200"/>
@@ -2383,9 +4428,505 @@
           <w:sz w:val="30"/>
           <w:color w:val="000000"/>
         </w:rPr>
-        <w:t>363题中259题的自动审核记录缺失或无效，需进一步复核。抽查8题发现资料不足、缺图、重复选项及诊断题过浅等问题。其中4题补充核实资料后，答对数由0/4升至4/4，三轮一致；仅增加题型提示，8题仍为0/8。[4]</w:t>
+        <w:t>自动审核中259/363条记录缺失或无效，不能据此判断教材覆盖。复核8题发现资料不足、缺图、重复选项及诊断题过浅等问题；补证与题型提示的对照如下。[4]</w:t>
       </w:r>
     </w:p>
+    <w:tbl>
+      <w:tblPr>
+        <w:tblW w:type="auto" w:w="0"/>
+        <w:tblLayout w:type="fixed"/>
+        <w:tblLook w:firstColumn="1" w:firstRow="1" w:lastColumn="0" w:lastRow="0" w:noHBand="0" w:noVBand="1" w:val="04A0"/>
+        <w:tblBorders>
+          <w:top w:val="single" w:sz="4" w:color="D9D9D9"/>
+          <w:left w:val="single" w:sz="4" w:color="D9D9D9"/>
+          <w:bottom w:val="single" w:sz="4" w:color="D9D9D9"/>
+          <w:right w:val="single" w:sz="4" w:color="D9D9D9"/>
+          <w:insideH w:val="single" w:sz="4" w:color="D9D9D9"/>
+          <w:insideV w:val="single" w:sz="4" w:color="D9D9D9"/>
+        </w:tblBorders>
+      </w:tblPr>
+      <w:tblGrid>
+        <w:gridCol w:w="2880"/>
+        <w:gridCol w:w="3888"/>
+        <w:gridCol w:w="2160"/>
+      </w:tblGrid>
+      <w:tr>
+        <w:trPr>
+          <w:cantSplit/>
+          <w:tblHeader/>
+        </w:trPr>
+        <w:tc>
+          <w:tcPr>
+            <w:tcW w:type="dxa" w:w="2880"/>
+            <w:vAlign w:val="center"/>
+            <w:shd w:fill="E7E6E6"/>
+            <w:tcMar>
+              <w:top w:w="80" w:type="dxa"/>
+              <w:bottom w:w="80" w:type="dxa"/>
+              <w:left w:w="80" w:type="dxa"/>
+              <w:right w:w="80" w:type="dxa"/>
+            </w:tcMar>
+          </w:tcPr>
+          <w:p>
+            <w:pPr>
+              <w:keepNext/>
+              <w:spacing w:line="360" w:lineRule="auto" w:before="60" w:after="60"/>
+              <w:ind w:firstLine="0" w:firstLineChars="0"/>
+              <w:jc w:val="left"/>
+            </w:pPr>
+            <w:r>
+              <w:rPr>
+                <w:rFonts w:ascii="Times New Roman" w:hAnsi="Times New Roman" w:eastAsia="SimSun"/>
+                <w:b/>
+                <w:color w:val="000000"/>
+                <w:sz w:val="30"/>
+              </w:rPr>
+              <w:t>样本</w:t>
+            </w:r>
+          </w:p>
+        </w:tc>
+        <w:tc>
+          <w:tcPr>
+            <w:tcW w:type="dxa" w:w="3888"/>
+            <w:vAlign w:val="center"/>
+            <w:shd w:fill="E7E6E6"/>
+            <w:tcMar>
+              <w:top w:w="80" w:type="dxa"/>
+              <w:bottom w:w="80" w:type="dxa"/>
+              <w:left w:w="80" w:type="dxa"/>
+              <w:right w:w="80" w:type="dxa"/>
+            </w:tcMar>
+          </w:tcPr>
+          <w:p>
+            <w:pPr>
+              <w:keepNext/>
+              <w:spacing w:line="360" w:lineRule="auto" w:before="60" w:after="60"/>
+              <w:ind w:firstLine="0" w:firstLineChars="0"/>
+              <w:jc w:val="center"/>
+            </w:pPr>
+            <w:r>
+              <w:rPr>
+                <w:rFonts w:ascii="Times New Roman" w:hAnsi="Times New Roman" w:eastAsia="SimSun"/>
+                <w:b/>
+                <w:color w:val="000000"/>
+                <w:sz w:val="30"/>
+              </w:rPr>
+              <w:t>条件</w:t>
+            </w:r>
+          </w:p>
+        </w:tc>
+        <w:tc>
+          <w:tcPr>
+            <w:tcW w:type="dxa" w:w="2160"/>
+            <w:vAlign w:val="center"/>
+            <w:shd w:fill="E7E6E6"/>
+            <w:tcMar>
+              <w:top w:w="80" w:type="dxa"/>
+              <w:bottom w:w="80" w:type="dxa"/>
+              <w:left w:w="80" w:type="dxa"/>
+              <w:right w:w="80" w:type="dxa"/>
+            </w:tcMar>
+          </w:tcPr>
+          <w:p>
+            <w:pPr>
+              <w:keepNext/>
+              <w:spacing w:line="360" w:lineRule="auto" w:before="60" w:after="60"/>
+              <w:ind w:firstLine="0" w:firstLineChars="0"/>
+              <w:jc w:val="center"/>
+            </w:pPr>
+            <w:r>
+              <w:rPr>
+                <w:rFonts w:ascii="Times New Roman" w:hAnsi="Times New Roman" w:eastAsia="SimSun"/>
+                <w:b/>
+                <w:color w:val="000000"/>
+                <w:sz w:val="30"/>
+              </w:rPr>
+              <w:t>答对数</w:t>
+            </w:r>
+          </w:p>
+        </w:tc>
+      </w:tr>
+      <w:tr>
+        <w:trPr>
+          <w:cantSplit/>
+        </w:trPr>
+        <w:tc>
+          <w:tcPr>
+            <w:tcW w:type="dxa" w:w="2880"/>
+            <w:vAlign w:val="center"/>
+            <w:shd w:fill="FFFFFF"/>
+            <w:tcMar>
+              <w:top w:w="80" w:type="dxa"/>
+              <w:bottom w:w="80" w:type="dxa"/>
+              <w:left w:w="80" w:type="dxa"/>
+              <w:right w:w="80" w:type="dxa"/>
+            </w:tcMar>
+          </w:tcPr>
+          <w:p>
+            <w:pPr>
+              <w:keepNext/>
+              <w:spacing w:line="360" w:lineRule="auto" w:before="60" w:after="60"/>
+              <w:ind w:firstLine="0" w:firstLineChars="0"/>
+              <w:jc w:val="left"/>
+            </w:pPr>
+            <w:r>
+              <w:rPr>
+                <w:rFonts w:ascii="Times New Roman" w:hAnsi="Times New Roman" w:eastAsia="SimSun"/>
+                <w:b w:val="0"/>
+                <w:color w:val="000000"/>
+                <w:sz w:val="30"/>
+              </w:rPr>
+              <w:t>定向补证 4题</w:t>
+            </w:r>
+          </w:p>
+        </w:tc>
+        <w:tc>
+          <w:tcPr>
+            <w:tcW w:type="dxa" w:w="3888"/>
+            <w:vAlign w:val="center"/>
+            <w:shd w:fill="FFFFFF"/>
+            <w:tcMar>
+              <w:top w:w="80" w:type="dxa"/>
+              <w:bottom w:w="80" w:type="dxa"/>
+              <w:left w:w="80" w:type="dxa"/>
+              <w:right w:w="80" w:type="dxa"/>
+            </w:tcMar>
+          </w:tcPr>
+          <w:p>
+            <w:pPr>
+              <w:keepNext/>
+              <w:spacing w:line="360" w:lineRule="auto" w:before="60" w:after="60"/>
+              <w:ind w:firstLine="0" w:firstLineChars="0"/>
+              <w:jc w:val="center"/>
+            </w:pPr>
+            <w:r>
+              <w:rPr>
+                <w:rFonts w:ascii="Times New Roman" w:hAnsi="Times New Roman" w:eastAsia="SimSun"/>
+                <w:b w:val="0"/>
+                <w:color w:val="000000"/>
+                <w:sz w:val="30"/>
+              </w:rPr>
+              <w:t>闭卷</w:t>
+            </w:r>
+          </w:p>
+        </w:tc>
+        <w:tc>
+          <w:tcPr>
+            <w:tcW w:type="dxa" w:w="2160"/>
+            <w:vAlign w:val="center"/>
+            <w:shd w:fill="FFFFFF"/>
+            <w:tcMar>
+              <w:top w:w="80" w:type="dxa"/>
+              <w:bottom w:w="80" w:type="dxa"/>
+              <w:left w:w="80" w:type="dxa"/>
+              <w:right w:w="80" w:type="dxa"/>
+            </w:tcMar>
+          </w:tcPr>
+          <w:p>
+            <w:pPr>
+              <w:keepNext/>
+              <w:spacing w:line="360" w:lineRule="auto" w:before="60" w:after="60"/>
+              <w:ind w:firstLine="0" w:firstLineChars="0"/>
+              <w:jc w:val="center"/>
+            </w:pPr>
+            <w:r>
+              <w:rPr>
+                <w:rFonts w:ascii="Times New Roman" w:hAnsi="Times New Roman" w:eastAsia="SimSun"/>
+                <w:b w:val="0"/>
+                <w:color w:val="000000"/>
+                <w:sz w:val="30"/>
+              </w:rPr>
+              <w:t>0/4</w:t>
+            </w:r>
+          </w:p>
+        </w:tc>
+      </w:tr>
+      <w:tr>
+        <w:trPr>
+          <w:cantSplit/>
+        </w:trPr>
+        <w:tc>
+          <w:tcPr>
+            <w:tcW w:type="dxa" w:w="2880"/>
+            <w:vAlign w:val="center"/>
+            <w:shd w:fill="FFFFFF"/>
+            <w:tcMar>
+              <w:top w:w="80" w:type="dxa"/>
+              <w:bottom w:w="80" w:type="dxa"/>
+              <w:left w:w="80" w:type="dxa"/>
+              <w:right w:w="80" w:type="dxa"/>
+            </w:tcMar>
+          </w:tcPr>
+          <w:p>
+            <w:pPr>
+              <w:keepNext/>
+              <w:spacing w:line="360" w:lineRule="auto" w:before="60" w:after="60"/>
+              <w:ind w:firstLine="0" w:firstLineChars="0"/>
+              <w:jc w:val="left"/>
+            </w:pPr>
+            <w:r>
+              <w:rPr>
+                <w:rFonts w:ascii="Times New Roman" w:hAnsi="Times New Roman" w:eastAsia="SimSun"/>
+                <w:b w:val="0"/>
+                <w:color w:val="000000"/>
+                <w:sz w:val="30"/>
+              </w:rPr>
+              <w:t>同上</w:t>
+            </w:r>
+          </w:p>
+        </w:tc>
+        <w:tc>
+          <w:tcPr>
+            <w:tcW w:type="dxa" w:w="3888"/>
+            <w:vAlign w:val="center"/>
+            <w:shd w:fill="FFFFFF"/>
+            <w:tcMar>
+              <w:top w:w="80" w:type="dxa"/>
+              <w:bottom w:w="80" w:type="dxa"/>
+              <w:left w:w="80" w:type="dxa"/>
+              <w:right w:w="80" w:type="dxa"/>
+            </w:tcMar>
+          </w:tcPr>
+          <w:p>
+            <w:pPr>
+              <w:keepNext/>
+              <w:spacing w:line="360" w:lineRule="auto" w:before="60" w:after="60"/>
+              <w:ind w:firstLine="0" w:firstLineChars="0"/>
+              <w:jc w:val="center"/>
+            </w:pPr>
+            <w:r>
+              <w:rPr>
+                <w:rFonts w:ascii="Times New Roman" w:hAnsi="Times New Roman" w:eastAsia="SimSun"/>
+                <w:b w:val="0"/>
+                <w:color w:val="000000"/>
+                <w:sz w:val="30"/>
+              </w:rPr>
+              <w:t>原教材</w:t>
+            </w:r>
+          </w:p>
+        </w:tc>
+        <w:tc>
+          <w:tcPr>
+            <w:tcW w:type="dxa" w:w="2160"/>
+            <w:vAlign w:val="center"/>
+            <w:shd w:fill="FFFFFF"/>
+            <w:tcMar>
+              <w:top w:w="80" w:type="dxa"/>
+              <w:bottom w:w="80" w:type="dxa"/>
+              <w:left w:w="80" w:type="dxa"/>
+              <w:right w:w="80" w:type="dxa"/>
+            </w:tcMar>
+          </w:tcPr>
+          <w:p>
+            <w:pPr>
+              <w:keepNext/>
+              <w:spacing w:line="360" w:lineRule="auto" w:before="60" w:after="60"/>
+              <w:ind w:firstLine="0" w:firstLineChars="0"/>
+              <w:jc w:val="center"/>
+            </w:pPr>
+            <w:r>
+              <w:rPr>
+                <w:rFonts w:ascii="Times New Roman" w:hAnsi="Times New Roman" w:eastAsia="SimSun"/>
+                <w:b w:val="0"/>
+                <w:color w:val="000000"/>
+                <w:sz w:val="30"/>
+              </w:rPr>
+              <w:t>0/4</w:t>
+            </w:r>
+          </w:p>
+        </w:tc>
+      </w:tr>
+      <w:tr>
+        <w:trPr>
+          <w:cantSplit/>
+        </w:trPr>
+        <w:tc>
+          <w:tcPr>
+            <w:tcW w:type="dxa" w:w="2880"/>
+            <w:vAlign w:val="center"/>
+            <w:shd w:fill="FFFFFF"/>
+            <w:tcMar>
+              <w:top w:w="80" w:type="dxa"/>
+              <w:bottom w:w="80" w:type="dxa"/>
+              <w:left w:w="80" w:type="dxa"/>
+              <w:right w:w="80" w:type="dxa"/>
+            </w:tcMar>
+          </w:tcPr>
+          <w:p>
+            <w:pPr>
+              <w:keepNext/>
+              <w:spacing w:line="360" w:lineRule="auto" w:before="60" w:after="60"/>
+              <w:ind w:firstLine="0" w:firstLineChars="0"/>
+              <w:jc w:val="left"/>
+            </w:pPr>
+            <w:r>
+              <w:rPr>
+                <w:rFonts w:ascii="Times New Roman" w:hAnsi="Times New Roman" w:eastAsia="SimSun"/>
+                <w:b w:val="0"/>
+                <w:color w:val="000000"/>
+                <w:sz w:val="30"/>
+              </w:rPr>
+              <w:t>同上</w:t>
+            </w:r>
+          </w:p>
+        </w:tc>
+        <w:tc>
+          <w:tcPr>
+            <w:tcW w:type="dxa" w:w="3888"/>
+            <w:vAlign w:val="center"/>
+            <w:shd w:fill="FFFFFF"/>
+            <w:tcMar>
+              <w:top w:w="80" w:type="dxa"/>
+              <w:bottom w:w="80" w:type="dxa"/>
+              <w:left w:w="80" w:type="dxa"/>
+              <w:right w:w="80" w:type="dxa"/>
+            </w:tcMar>
+          </w:tcPr>
+          <w:p>
+            <w:pPr>
+              <w:keepNext/>
+              <w:spacing w:line="360" w:lineRule="auto" w:before="60" w:after="60"/>
+              <w:ind w:firstLine="0" w:firstLineChars="0"/>
+              <w:jc w:val="center"/>
+            </w:pPr>
+            <w:r>
+              <w:rPr>
+                <w:rFonts w:ascii="Times New Roman" w:hAnsi="Times New Roman" w:eastAsia="SimSun"/>
+                <w:b w:val="0"/>
+                <w:color w:val="000000"/>
+                <w:sz w:val="30"/>
+              </w:rPr>
+              <w:t>核实补证资料</w:t>
+            </w:r>
+          </w:p>
+        </w:tc>
+        <w:tc>
+          <w:tcPr>
+            <w:tcW w:type="dxa" w:w="2160"/>
+            <w:vAlign w:val="center"/>
+            <w:shd w:fill="FFFFFF"/>
+            <w:tcMar>
+              <w:top w:w="80" w:type="dxa"/>
+              <w:bottom w:w="80" w:type="dxa"/>
+              <w:left w:w="80" w:type="dxa"/>
+              <w:right w:w="80" w:type="dxa"/>
+            </w:tcMar>
+          </w:tcPr>
+          <w:p>
+            <w:pPr>
+              <w:keepNext/>
+              <w:spacing w:line="360" w:lineRule="auto" w:before="60" w:after="60"/>
+              <w:ind w:firstLine="0" w:firstLineChars="0"/>
+              <w:jc w:val="center"/>
+            </w:pPr>
+            <w:r>
+              <w:rPr>
+                <w:rFonts w:ascii="Times New Roman" w:hAnsi="Times New Roman" w:eastAsia="SimSun"/>
+                <w:b w:val="0"/>
+                <w:color w:val="000000"/>
+                <w:sz w:val="30"/>
+              </w:rPr>
+              <w:t>4/4</w:t>
+            </w:r>
+          </w:p>
+        </w:tc>
+      </w:tr>
+      <w:tr>
+        <w:trPr>
+          <w:cantSplit/>
+        </w:trPr>
+        <w:tc>
+          <w:tcPr>
+            <w:tcW w:type="dxa" w:w="2880"/>
+            <w:vAlign w:val="center"/>
+            <w:shd w:fill="FFFFFF"/>
+            <w:tcMar>
+              <w:top w:w="80" w:type="dxa"/>
+              <w:bottom w:w="80" w:type="dxa"/>
+              <w:left w:w="80" w:type="dxa"/>
+              <w:right w:w="80" w:type="dxa"/>
+            </w:tcMar>
+          </w:tcPr>
+          <w:p>
+            <w:pPr>
+              <w:keepNext w:val="0"/>
+              <w:spacing w:line="360" w:lineRule="auto" w:before="60" w:after="60"/>
+              <w:ind w:firstLine="0" w:firstLineChars="0"/>
+              <w:jc w:val="left"/>
+            </w:pPr>
+            <w:r>
+              <w:rPr>
+                <w:rFonts w:ascii="Times New Roman" w:hAnsi="Times New Roman" w:eastAsia="SimSun"/>
+                <w:b w:val="0"/>
+                <w:color w:val="000000"/>
+                <w:sz w:val="30"/>
+              </w:rPr>
+              <w:t>题型提示 8题</w:t>
+            </w:r>
+          </w:p>
+        </w:tc>
+        <w:tc>
+          <w:tcPr>
+            <w:tcW w:type="dxa" w:w="3888"/>
+            <w:vAlign w:val="center"/>
+            <w:shd w:fill="FFFFFF"/>
+            <w:tcMar>
+              <w:top w:w="80" w:type="dxa"/>
+              <w:bottom w:w="80" w:type="dxa"/>
+              <w:left w:w="80" w:type="dxa"/>
+              <w:right w:w="80" w:type="dxa"/>
+            </w:tcMar>
+          </w:tcPr>
+          <w:p>
+            <w:pPr>
+              <w:keepNext w:val="0"/>
+              <w:spacing w:line="360" w:lineRule="auto" w:before="60" w:after="60"/>
+              <w:ind w:firstLine="0" w:firstLineChars="0"/>
+              <w:jc w:val="center"/>
+            </w:pPr>
+            <w:r>
+              <w:rPr>
+                <w:rFonts w:ascii="Times New Roman" w:hAnsi="Times New Roman" w:eastAsia="SimSun"/>
+                <w:b w:val="0"/>
+                <w:color w:val="000000"/>
+                <w:sz w:val="30"/>
+              </w:rPr>
+              <w:t>仅增加题型提示</w:t>
+            </w:r>
+          </w:p>
+        </w:tc>
+        <w:tc>
+          <w:tcPr>
+            <w:tcW w:type="dxa" w:w="2160"/>
+            <w:vAlign w:val="center"/>
+            <w:shd w:fill="FFFFFF"/>
+            <w:tcMar>
+              <w:top w:w="80" w:type="dxa"/>
+              <w:bottom w:w="80" w:type="dxa"/>
+              <w:left w:w="80" w:type="dxa"/>
+              <w:right w:w="80" w:type="dxa"/>
+            </w:tcMar>
+          </w:tcPr>
+          <w:p>
+            <w:pPr>
+              <w:keepNext w:val="0"/>
+              <w:spacing w:line="360" w:lineRule="auto" w:before="60" w:after="60"/>
+              <w:ind w:firstLine="0" w:firstLineChars="0"/>
+              <w:jc w:val="center"/>
+            </w:pPr>
+            <w:r>
+              <w:rPr>
+                <w:rFonts w:ascii="Times New Roman" w:hAnsi="Times New Roman" w:eastAsia="SimSun"/>
+                <w:b w:val="0"/>
+                <w:color w:val="000000"/>
+                <w:sz w:val="30"/>
+              </w:rPr>
+              <w:t>0/8</w:t>
+            </w:r>
+          </w:p>
+        </w:tc>
+      </w:tr>
+    </w:tbl>
     <w:p>
       <w:pPr>
         <w:widowControl/>
@@ -2423,6 +4964,7 @@
     </w:p>
     <w:p>
       <w:pPr>
+        <w:keepNext/>
         <w:widowControl/>
         <w:spacing w:line="360" w:lineRule="auto" w:before="0" w:after="120"/>
         <w:ind w:firstLine="600" w:firstLineChars="200"/>
@@ -2436,9 +4978,600 @@
           <w:spacing w:val="-3"/>
           <w:color w:val="000000"/>
         </w:rPr>
-        <w:t>对上述4个知识点各设定义、辨析、应用1问，共12问，各运行3轮。按预设核心要点评分，通过6/12：定义2/4、辨析3/4、应用1/4。样本提示，情景应用是后续需重点验证的方向。[5]</w:t>
+        <w:t>对相关知识点分别设置定义、辨析和应用问答，各运行3轮。结果如下。[5]</w:t>
       </w:r>
     </w:p>
+    <w:tbl>
+      <w:tblPr>
+        <w:tblW w:type="auto" w:w="0"/>
+        <w:tblLayout w:type="fixed"/>
+        <w:tblLook w:firstColumn="1" w:firstRow="1" w:lastColumn="0" w:lastRow="0" w:noHBand="0" w:noVBand="1" w:val="04A0"/>
+        <w:tblBorders>
+          <w:top w:val="single" w:sz="4" w:color="D9D9D9"/>
+          <w:left w:val="single" w:sz="4" w:color="D9D9D9"/>
+          <w:bottom w:val="single" w:sz="4" w:color="D9D9D9"/>
+          <w:right w:val="single" w:sz="4" w:color="D9D9D9"/>
+          <w:insideH w:val="single" w:sz="4" w:color="D9D9D9"/>
+          <w:insideV w:val="single" w:sz="4" w:color="D9D9D9"/>
+        </w:tblBorders>
+      </w:tblPr>
+      <w:tblGrid>
+        <w:gridCol w:w="3168"/>
+        <w:gridCol w:w="1872"/>
+        <w:gridCol w:w="3888"/>
+      </w:tblGrid>
+      <w:tr>
+        <w:trPr>
+          <w:cantSplit/>
+          <w:tblHeader/>
+        </w:trPr>
+        <w:tc>
+          <w:tcPr>
+            <w:tcW w:type="dxa" w:w="3168"/>
+            <w:vAlign w:val="center"/>
+            <w:shd w:fill="E7E6E6"/>
+            <w:tcMar>
+              <w:top w:w="80" w:type="dxa"/>
+              <w:bottom w:w="80" w:type="dxa"/>
+              <w:left w:w="80" w:type="dxa"/>
+              <w:right w:w="80" w:type="dxa"/>
+            </w:tcMar>
+          </w:tcPr>
+          <w:p>
+            <w:pPr>
+              <w:keepNext/>
+              <w:spacing w:line="360" w:lineRule="auto" w:before="60" w:after="60"/>
+              <w:ind w:firstLine="0" w:firstLineChars="0"/>
+              <w:jc w:val="left"/>
+            </w:pPr>
+            <w:r>
+              <w:rPr>
+                <w:rFonts w:ascii="Times New Roman" w:hAnsi="Times New Roman" w:eastAsia="SimSun"/>
+                <w:b/>
+                <w:color w:val="000000"/>
+                <w:sz w:val="30"/>
+              </w:rPr>
+              <w:t>诊断项目</w:t>
+            </w:r>
+          </w:p>
+        </w:tc>
+        <w:tc>
+          <w:tcPr>
+            <w:tcW w:type="dxa" w:w="1872"/>
+            <w:vAlign w:val="center"/>
+            <w:shd w:fill="E7E6E6"/>
+            <w:tcMar>
+              <w:top w:w="80" w:type="dxa"/>
+              <w:bottom w:w="80" w:type="dxa"/>
+              <w:left w:w="80" w:type="dxa"/>
+              <w:right w:w="80" w:type="dxa"/>
+            </w:tcMar>
+          </w:tcPr>
+          <w:p>
+            <w:pPr>
+              <w:keepNext/>
+              <w:spacing w:line="360" w:lineRule="auto" w:before="60" w:after="60"/>
+              <w:ind w:firstLine="0" w:firstLineChars="0"/>
+              <w:jc w:val="center"/>
+            </w:pPr>
+            <w:r>
+              <w:rPr>
+                <w:rFonts w:ascii="Times New Roman" w:hAnsi="Times New Roman" w:eastAsia="SimSun"/>
+                <w:b/>
+                <w:color w:val="000000"/>
+                <w:sz w:val="30"/>
+              </w:rPr>
+              <w:t>通过数</w:t>
+            </w:r>
+          </w:p>
+        </w:tc>
+        <w:tc>
+          <w:tcPr>
+            <w:tcW w:type="dxa" w:w="3888"/>
+            <w:vAlign w:val="center"/>
+            <w:shd w:fill="E7E6E6"/>
+            <w:tcMar>
+              <w:top w:w="80" w:type="dxa"/>
+              <w:bottom w:w="80" w:type="dxa"/>
+              <w:left w:w="80" w:type="dxa"/>
+              <w:right w:w="80" w:type="dxa"/>
+            </w:tcMar>
+          </w:tcPr>
+          <w:p>
+            <w:pPr>
+              <w:keepNext/>
+              <w:spacing w:line="360" w:lineRule="auto" w:before="60" w:after="60"/>
+              <w:ind w:firstLine="0" w:firstLineChars="0"/>
+              <w:jc w:val="center"/>
+            </w:pPr>
+            <w:r>
+              <w:rPr>
+                <w:rFonts w:ascii="Times New Roman" w:hAnsi="Times New Roman" w:eastAsia="SimSun"/>
+                <w:b/>
+                <w:color w:val="000000"/>
+                <w:sz w:val="30"/>
+              </w:rPr>
+              <w:t>评分口径</w:t>
+            </w:r>
+          </w:p>
+        </w:tc>
+      </w:tr>
+      <w:tr>
+        <w:trPr>
+          <w:cantSplit/>
+        </w:trPr>
+        <w:tc>
+          <w:tcPr>
+            <w:tcW w:type="dxa" w:w="3168"/>
+            <w:vAlign w:val="center"/>
+            <w:shd w:fill="FFFFFF"/>
+            <w:tcMar>
+              <w:top w:w="80" w:type="dxa"/>
+              <w:bottom w:w="80" w:type="dxa"/>
+              <w:left w:w="80" w:type="dxa"/>
+              <w:right w:w="80" w:type="dxa"/>
+            </w:tcMar>
+          </w:tcPr>
+          <w:p>
+            <w:pPr>
+              <w:keepNext/>
+              <w:spacing w:line="360" w:lineRule="auto" w:before="60" w:after="60"/>
+              <w:ind w:firstLine="0" w:firstLineChars="0"/>
+              <w:jc w:val="left"/>
+            </w:pPr>
+            <w:r>
+              <w:rPr>
+                <w:rFonts w:ascii="Times New Roman" w:hAnsi="Times New Roman" w:eastAsia="SimSun"/>
+                <w:b w:val="0"/>
+                <w:color w:val="000000"/>
+                <w:sz w:val="30"/>
+              </w:rPr>
+              <w:t>定义</w:t>
+            </w:r>
+          </w:p>
+        </w:tc>
+        <w:tc>
+          <w:tcPr>
+            <w:tcW w:type="dxa" w:w="1872"/>
+            <w:vAlign w:val="center"/>
+            <w:shd w:fill="FFFFFF"/>
+            <w:tcMar>
+              <w:top w:w="80" w:type="dxa"/>
+              <w:bottom w:w="80" w:type="dxa"/>
+              <w:left w:w="80" w:type="dxa"/>
+              <w:right w:w="80" w:type="dxa"/>
+            </w:tcMar>
+          </w:tcPr>
+          <w:p>
+            <w:pPr>
+              <w:keepNext/>
+              <w:spacing w:line="360" w:lineRule="auto" w:before="60" w:after="60"/>
+              <w:ind w:firstLine="0" w:firstLineChars="0"/>
+              <w:jc w:val="center"/>
+            </w:pPr>
+            <w:r>
+              <w:rPr>
+                <w:rFonts w:ascii="Times New Roman" w:hAnsi="Times New Roman" w:eastAsia="SimSun"/>
+                <w:b w:val="0"/>
+                <w:color w:val="000000"/>
+                <w:sz w:val="30"/>
+              </w:rPr>
+              <w:t>2/4</w:t>
+            </w:r>
+          </w:p>
+        </w:tc>
+        <w:tc>
+          <w:tcPr>
+            <w:tcW w:type="dxa" w:w="3888"/>
+            <w:vAlign w:val="center"/>
+            <w:shd w:fill="FFFFFF"/>
+            <w:tcMar>
+              <w:top w:w="80" w:type="dxa"/>
+              <w:bottom w:w="80" w:type="dxa"/>
+              <w:left w:w="80" w:type="dxa"/>
+              <w:right w:w="80" w:type="dxa"/>
+            </w:tcMar>
+          </w:tcPr>
+          <w:p>
+            <w:pPr>
+              <w:keepNext/>
+              <w:spacing w:line="360" w:lineRule="auto" w:before="60" w:after="60"/>
+              <w:ind w:firstLine="0" w:firstLineChars="0"/>
+              <w:jc w:val="center"/>
+            </w:pPr>
+            <w:r>
+              <w:rPr>
+                <w:rFonts w:ascii="Times New Roman" w:hAnsi="Times New Roman" w:eastAsia="SimSun"/>
+                <w:b w:val="0"/>
+                <w:color w:val="000000"/>
+                <w:sz w:val="30"/>
+              </w:rPr>
+              <w:t>预设核心要点</w:t>
+            </w:r>
+          </w:p>
+        </w:tc>
+      </w:tr>
+      <w:tr>
+        <w:trPr>
+          <w:cantSplit/>
+        </w:trPr>
+        <w:tc>
+          <w:tcPr>
+            <w:tcW w:type="dxa" w:w="3168"/>
+            <w:vAlign w:val="center"/>
+            <w:shd w:fill="FFFFFF"/>
+            <w:tcMar>
+              <w:top w:w="80" w:type="dxa"/>
+              <w:bottom w:w="80" w:type="dxa"/>
+              <w:left w:w="80" w:type="dxa"/>
+              <w:right w:w="80" w:type="dxa"/>
+            </w:tcMar>
+          </w:tcPr>
+          <w:p>
+            <w:pPr>
+              <w:keepNext/>
+              <w:spacing w:line="360" w:lineRule="auto" w:before="60" w:after="60"/>
+              <w:ind w:firstLine="0" w:firstLineChars="0"/>
+              <w:jc w:val="left"/>
+            </w:pPr>
+            <w:r>
+              <w:rPr>
+                <w:rFonts w:ascii="Times New Roman" w:hAnsi="Times New Roman" w:eastAsia="SimSun"/>
+                <w:b w:val="0"/>
+                <w:color w:val="000000"/>
+                <w:sz w:val="30"/>
+              </w:rPr>
+              <w:t>辨析</w:t>
+            </w:r>
+          </w:p>
+        </w:tc>
+        <w:tc>
+          <w:tcPr>
+            <w:tcW w:type="dxa" w:w="1872"/>
+            <w:vAlign w:val="center"/>
+            <w:shd w:fill="FFFFFF"/>
+            <w:tcMar>
+              <w:top w:w="80" w:type="dxa"/>
+              <w:bottom w:w="80" w:type="dxa"/>
+              <w:left w:w="80" w:type="dxa"/>
+              <w:right w:w="80" w:type="dxa"/>
+            </w:tcMar>
+          </w:tcPr>
+          <w:p>
+            <w:pPr>
+              <w:keepNext/>
+              <w:spacing w:line="360" w:lineRule="auto" w:before="60" w:after="60"/>
+              <w:ind w:firstLine="0" w:firstLineChars="0"/>
+              <w:jc w:val="center"/>
+            </w:pPr>
+            <w:r>
+              <w:rPr>
+                <w:rFonts w:ascii="Times New Roman" w:hAnsi="Times New Roman" w:eastAsia="SimSun"/>
+                <w:b w:val="0"/>
+                <w:color w:val="000000"/>
+                <w:sz w:val="30"/>
+              </w:rPr>
+              <w:t>3/4</w:t>
+            </w:r>
+          </w:p>
+        </w:tc>
+        <w:tc>
+          <w:tcPr>
+            <w:tcW w:type="dxa" w:w="3888"/>
+            <w:vAlign w:val="center"/>
+            <w:shd w:fill="FFFFFF"/>
+            <w:tcMar>
+              <w:top w:w="80" w:type="dxa"/>
+              <w:bottom w:w="80" w:type="dxa"/>
+              <w:left w:w="80" w:type="dxa"/>
+              <w:right w:w="80" w:type="dxa"/>
+            </w:tcMar>
+          </w:tcPr>
+          <w:p>
+            <w:pPr>
+              <w:keepNext/>
+              <w:spacing w:line="360" w:lineRule="auto" w:before="60" w:after="60"/>
+              <w:ind w:firstLine="0" w:firstLineChars="0"/>
+              <w:jc w:val="center"/>
+            </w:pPr>
+            <w:r>
+              <w:rPr>
+                <w:rFonts w:ascii="Times New Roman" w:hAnsi="Times New Roman" w:eastAsia="SimSun"/>
+                <w:b w:val="0"/>
+                <w:color w:val="000000"/>
+                <w:sz w:val="30"/>
+              </w:rPr>
+              <w:t>预设核心要点</w:t>
+            </w:r>
+          </w:p>
+        </w:tc>
+      </w:tr>
+      <w:tr>
+        <w:trPr>
+          <w:cantSplit/>
+        </w:trPr>
+        <w:tc>
+          <w:tcPr>
+            <w:tcW w:type="dxa" w:w="3168"/>
+            <w:vAlign w:val="center"/>
+            <w:shd w:fill="FFFFFF"/>
+            <w:tcMar>
+              <w:top w:w="80" w:type="dxa"/>
+              <w:bottom w:w="80" w:type="dxa"/>
+              <w:left w:w="80" w:type="dxa"/>
+              <w:right w:w="80" w:type="dxa"/>
+            </w:tcMar>
+          </w:tcPr>
+          <w:p>
+            <w:pPr>
+              <w:keepNext/>
+              <w:spacing w:line="360" w:lineRule="auto" w:before="60" w:after="60"/>
+              <w:ind w:firstLine="0" w:firstLineChars="0"/>
+              <w:jc w:val="left"/>
+            </w:pPr>
+            <w:r>
+              <w:rPr>
+                <w:rFonts w:ascii="Times New Roman" w:hAnsi="Times New Roman" w:eastAsia="SimSun"/>
+                <w:b w:val="0"/>
+                <w:color w:val="000000"/>
+                <w:sz w:val="30"/>
+              </w:rPr>
+              <w:t>应用</w:t>
+            </w:r>
+          </w:p>
+        </w:tc>
+        <w:tc>
+          <w:tcPr>
+            <w:tcW w:type="dxa" w:w="1872"/>
+            <w:vAlign w:val="center"/>
+            <w:shd w:fill="FFFFFF"/>
+            <w:tcMar>
+              <w:top w:w="80" w:type="dxa"/>
+              <w:bottom w:w="80" w:type="dxa"/>
+              <w:left w:w="80" w:type="dxa"/>
+              <w:right w:w="80" w:type="dxa"/>
+            </w:tcMar>
+          </w:tcPr>
+          <w:p>
+            <w:pPr>
+              <w:keepNext/>
+              <w:spacing w:line="360" w:lineRule="auto" w:before="60" w:after="60"/>
+              <w:ind w:firstLine="0" w:firstLineChars="0"/>
+              <w:jc w:val="center"/>
+            </w:pPr>
+            <w:r>
+              <w:rPr>
+                <w:rFonts w:ascii="Times New Roman" w:hAnsi="Times New Roman" w:eastAsia="SimSun"/>
+                <w:b w:val="0"/>
+                <w:color w:val="000000"/>
+                <w:sz w:val="30"/>
+              </w:rPr>
+              <w:t>1/4</w:t>
+            </w:r>
+          </w:p>
+        </w:tc>
+        <w:tc>
+          <w:tcPr>
+            <w:tcW w:type="dxa" w:w="3888"/>
+            <w:vAlign w:val="center"/>
+            <w:shd w:fill="FFFFFF"/>
+            <w:tcMar>
+              <w:top w:w="80" w:type="dxa"/>
+              <w:bottom w:w="80" w:type="dxa"/>
+              <w:left w:w="80" w:type="dxa"/>
+              <w:right w:w="80" w:type="dxa"/>
+            </w:tcMar>
+          </w:tcPr>
+          <w:p>
+            <w:pPr>
+              <w:keepNext/>
+              <w:spacing w:line="360" w:lineRule="auto" w:before="60" w:after="60"/>
+              <w:ind w:firstLine="0" w:firstLineChars="0"/>
+              <w:jc w:val="center"/>
+            </w:pPr>
+            <w:r>
+              <w:rPr>
+                <w:rFonts w:ascii="Times New Roman" w:hAnsi="Times New Roman" w:eastAsia="SimSun"/>
+                <w:b w:val="0"/>
+                <w:color w:val="000000"/>
+                <w:sz w:val="30"/>
+              </w:rPr>
+              <w:t>预设核心要点</w:t>
+            </w:r>
+          </w:p>
+        </w:tc>
+      </w:tr>
+      <w:tr>
+        <w:trPr>
+          <w:cantSplit/>
+        </w:trPr>
+        <w:tc>
+          <w:tcPr>
+            <w:tcW w:type="dxa" w:w="3168"/>
+            <w:vAlign w:val="center"/>
+            <w:shd w:fill="FFFFFF"/>
+            <w:tcMar>
+              <w:top w:w="80" w:type="dxa"/>
+              <w:bottom w:w="80" w:type="dxa"/>
+              <w:left w:w="80" w:type="dxa"/>
+              <w:right w:w="80" w:type="dxa"/>
+            </w:tcMar>
+          </w:tcPr>
+          <w:p>
+            <w:pPr>
+              <w:keepNext/>
+              <w:spacing w:line="360" w:lineRule="auto" w:before="60" w:after="60"/>
+              <w:ind w:firstLine="0" w:firstLineChars="0"/>
+              <w:jc w:val="left"/>
+            </w:pPr>
+            <w:r>
+              <w:rPr>
+                <w:rFonts w:ascii="Times New Roman" w:hAnsi="Times New Roman" w:eastAsia="SimSun"/>
+                <w:b w:val="0"/>
+                <w:color w:val="000000"/>
+                <w:sz w:val="30"/>
+              </w:rPr>
+              <w:t>合计</w:t>
+            </w:r>
+          </w:p>
+        </w:tc>
+        <w:tc>
+          <w:tcPr>
+            <w:tcW w:type="dxa" w:w="1872"/>
+            <w:vAlign w:val="center"/>
+            <w:shd w:fill="FFFFFF"/>
+            <w:tcMar>
+              <w:top w:w="80" w:type="dxa"/>
+              <w:bottom w:w="80" w:type="dxa"/>
+              <w:left w:w="80" w:type="dxa"/>
+              <w:right w:w="80" w:type="dxa"/>
+            </w:tcMar>
+          </w:tcPr>
+          <w:p>
+            <w:pPr>
+              <w:keepNext/>
+              <w:spacing w:line="360" w:lineRule="auto" w:before="60" w:after="60"/>
+              <w:ind w:firstLine="0" w:firstLineChars="0"/>
+              <w:jc w:val="center"/>
+            </w:pPr>
+            <w:r>
+              <w:rPr>
+                <w:rFonts w:ascii="Times New Roman" w:hAnsi="Times New Roman" w:eastAsia="SimSun"/>
+                <w:b w:val="0"/>
+                <w:color w:val="000000"/>
+                <w:sz w:val="30"/>
+              </w:rPr>
+              <w:t>6/12</w:t>
+            </w:r>
+          </w:p>
+        </w:tc>
+        <w:tc>
+          <w:tcPr>
+            <w:tcW w:type="dxa" w:w="3888"/>
+            <w:vAlign w:val="center"/>
+            <w:shd w:fill="FFFFFF"/>
+            <w:tcMar>
+              <w:top w:w="80" w:type="dxa"/>
+              <w:bottom w:w="80" w:type="dxa"/>
+              <w:left w:w="80" w:type="dxa"/>
+              <w:right w:w="80" w:type="dxa"/>
+            </w:tcMar>
+          </w:tcPr>
+          <w:p>
+            <w:pPr>
+              <w:keepNext/>
+              <w:spacing w:line="360" w:lineRule="auto" w:before="60" w:after="60"/>
+              <w:ind w:firstLine="0" w:firstLineChars="0"/>
+              <w:jc w:val="center"/>
+            </w:pPr>
+            <w:r>
+              <w:rPr>
+                <w:rFonts w:ascii="Times New Roman" w:hAnsi="Times New Roman" w:eastAsia="SimSun"/>
+                <w:b w:val="0"/>
+                <w:color w:val="000000"/>
+                <w:sz w:val="30"/>
+              </w:rPr>
+              <w:t>预设核心要点</w:t>
+            </w:r>
+          </w:p>
+        </w:tc>
+      </w:tr>
+      <w:tr>
+        <w:trPr>
+          <w:cantSplit/>
+        </w:trPr>
+        <w:tc>
+          <w:tcPr>
+            <w:tcW w:type="dxa" w:w="3168"/>
+            <w:vAlign w:val="center"/>
+            <w:shd w:fill="FFFFFF"/>
+            <w:tcMar>
+              <w:top w:w="80" w:type="dxa"/>
+              <w:bottom w:w="80" w:type="dxa"/>
+              <w:left w:w="80" w:type="dxa"/>
+              <w:right w:w="80" w:type="dxa"/>
+            </w:tcMar>
+          </w:tcPr>
+          <w:p>
+            <w:pPr>
+              <w:keepNext w:val="0"/>
+              <w:spacing w:line="360" w:lineRule="auto" w:before="60" w:after="60"/>
+              <w:ind w:firstLine="0" w:firstLineChars="0"/>
+              <w:jc w:val="left"/>
+            </w:pPr>
+            <w:r>
+              <w:rPr>
+                <w:rFonts w:ascii="Times New Roman" w:hAnsi="Times New Roman" w:eastAsia="SimSun"/>
+                <w:b w:val="0"/>
+                <w:color w:val="000000"/>
+                <w:sz w:val="30"/>
+              </w:rPr>
+              <w:t>合计 严格复核</w:t>
+            </w:r>
+          </w:p>
+        </w:tc>
+        <w:tc>
+          <w:tcPr>
+            <w:tcW w:type="dxa" w:w="1872"/>
+            <w:vAlign w:val="center"/>
+            <w:shd w:fill="FFFFFF"/>
+            <w:tcMar>
+              <w:top w:w="80" w:type="dxa"/>
+              <w:bottom w:w="80" w:type="dxa"/>
+              <w:left w:w="80" w:type="dxa"/>
+              <w:right w:w="80" w:type="dxa"/>
+            </w:tcMar>
+          </w:tcPr>
+          <w:p>
+            <w:pPr>
+              <w:keepNext w:val="0"/>
+              <w:spacing w:line="360" w:lineRule="auto" w:before="60" w:after="60"/>
+              <w:ind w:firstLine="0" w:firstLineChars="0"/>
+              <w:jc w:val="center"/>
+            </w:pPr>
+            <w:r>
+              <w:rPr>
+                <w:rFonts w:ascii="Times New Roman" w:hAnsi="Times New Roman" w:eastAsia="SimSun"/>
+                <w:b w:val="0"/>
+                <w:color w:val="000000"/>
+                <w:sz w:val="30"/>
+              </w:rPr>
+              <w:t>5/12</w:t>
+            </w:r>
+          </w:p>
+        </w:tc>
+        <w:tc>
+          <w:tcPr>
+            <w:tcW w:type="dxa" w:w="3888"/>
+            <w:vAlign w:val="center"/>
+            <w:shd w:fill="FFFFFF"/>
+            <w:tcMar>
+              <w:top w:w="80" w:type="dxa"/>
+              <w:bottom w:w="80" w:type="dxa"/>
+              <w:left w:w="80" w:type="dxa"/>
+              <w:right w:w="80" w:type="dxa"/>
+            </w:tcMar>
+          </w:tcPr>
+          <w:p>
+            <w:pPr>
+              <w:keepNext w:val="0"/>
+              <w:spacing w:line="360" w:lineRule="auto" w:before="60" w:after="60"/>
+              <w:ind w:firstLine="0" w:firstLineChars="0"/>
+              <w:jc w:val="center"/>
+            </w:pPr>
+            <w:r>
+              <w:rPr>
+                <w:rFonts w:ascii="Times New Roman" w:hAnsi="Times New Roman" w:eastAsia="SimSun"/>
+                <w:b w:val="0"/>
+                <w:color w:val="000000"/>
+                <w:sz w:val="30"/>
+              </w:rPr>
+              <w:t>同时排除附加事实错误</w:t>
+            </w:r>
+          </w:p>
+        </w:tc>
+      </w:tr>
+    </w:tbl>
     <w:p>
       <w:pPr>
         <w:widowControl/>
@@ -2453,7 +5586,7 @@
           <w:sz w:val="30"/>
           <w:color w:val="000000"/>
         </w:rPr>
-        <w:t>每问至少2/3轮达标才计通过；若同时排除附加事实错误，通过数为5/12（事后敏感性分析）。12问来自4个相关知识点，结果仅用于定向诊断。[5]</w:t>
+        <w:t>每问至少2/3轮达到预设核心要点才计通过。附加事实错误核查属于事后敏感性分析；样本仅用于定向诊断，不作全领域外推。[5]</w:t>
       </w:r>
     </w:p>
     <w:p>
@@ -2488,7 +5621,7 @@
           <w:sz w:val="30"/>
           <w:color w:val="000000"/>
         </w:rPr>
-        <w:t>诊断确认部分知识可被调用，并将训练重点落到知识校准、概念辨析和情景问答。下一阶段据此开展书籍 SFT，效果由训练后的统一对照验证。</w:t>
+        <w:t>诊断确认部分知识可被调用，并将书籍 SFT 的训练重点落到知识校准、概念辨析和情景问答。训练效果通过统一对照评估。</w:t>
       </w:r>
     </w:p>
     <w:p>
@@ -2506,7 +5639,7 @@
           <w:sz w:val="40"/>
           <w:color w:val="000000"/>
         </w:rPr>
-        <w:t>五 书籍问答 SFT 与验证计划</w:t>
+        <w:t>五 书籍问答 SFT 与对照结果</w:t>
       </w:r>
     </w:p>
     <w:p>
@@ -2546,6 +5679,7 @@
     </w:p>
     <w:p>
       <w:pPr>
+        <w:keepNext/>
         <w:widowControl/>
         <w:spacing w:line="360" w:lineRule="auto" w:before="0" w:after="120"/>
         <w:ind w:firstLine="600" w:firstLineChars="200"/>
@@ -2558,9 +5692,505 @@
           <w:sz w:val="30"/>
           <w:color w:val="000000"/>
         </w:rPr>
-        <w:t>书籍 CPT 训练1遍、2遍、4遍分别答对1370、1366、1371题。所选四遍模型准确率为81.998%，较原始 Step120 的81.878%净增2题。该结果用于选择起点，稳定收益仍待验证。[8][10]</w:t>
+        <w:t>书籍 CPT 候选按统一三轮多数票口径比较，选取其中得分最高的模型作为 SFT 起点。[8][10]</w:t>
       </w:r>
     </w:p>
+    <w:tbl>
+      <w:tblPr>
+        <w:tblW w:type="auto" w:w="0"/>
+        <w:tblLayout w:type="fixed"/>
+        <w:tblLook w:firstColumn="1" w:firstRow="1" w:lastColumn="0" w:lastRow="0" w:noHBand="0" w:noVBand="1" w:val="04A0"/>
+        <w:tblBorders>
+          <w:top w:val="single" w:sz="4" w:color="D9D9D9"/>
+          <w:left w:val="single" w:sz="4" w:color="D9D9D9"/>
+          <w:bottom w:val="single" w:sz="4" w:color="D9D9D9"/>
+          <w:right w:val="single" w:sz="4" w:color="D9D9D9"/>
+          <w:insideH w:val="single" w:sz="4" w:color="D9D9D9"/>
+          <w:insideV w:val="single" w:sz="4" w:color="D9D9D9"/>
+        </w:tblBorders>
+      </w:tblPr>
+      <w:tblGrid>
+        <w:gridCol w:w="3744"/>
+        <w:gridCol w:w="2736"/>
+        <w:gridCol w:w="2448"/>
+      </w:tblGrid>
+      <w:tr>
+        <w:trPr>
+          <w:cantSplit/>
+          <w:tblHeader/>
+        </w:trPr>
+        <w:tc>
+          <w:tcPr>
+            <w:tcW w:type="dxa" w:w="3744"/>
+            <w:vAlign w:val="center"/>
+            <w:shd w:fill="E7E6E6"/>
+            <w:tcMar>
+              <w:top w:w="80" w:type="dxa"/>
+              <w:bottom w:w="80" w:type="dxa"/>
+              <w:left w:w="80" w:type="dxa"/>
+              <w:right w:w="80" w:type="dxa"/>
+            </w:tcMar>
+          </w:tcPr>
+          <w:p>
+            <w:pPr>
+              <w:keepNext/>
+              <w:spacing w:line="360" w:lineRule="auto" w:before="60" w:after="60"/>
+              <w:ind w:firstLine="0" w:firstLineChars="0"/>
+              <w:jc w:val="left"/>
+            </w:pPr>
+            <w:r>
+              <w:rPr>
+                <w:rFonts w:ascii="Times New Roman" w:hAnsi="Times New Roman" w:eastAsia="SimSun"/>
+                <w:b/>
+                <w:color w:val="000000"/>
+                <w:sz w:val="30"/>
+              </w:rPr>
+              <w:t>模型</w:t>
+            </w:r>
+          </w:p>
+        </w:tc>
+        <w:tc>
+          <w:tcPr>
+            <w:tcW w:type="dxa" w:w="2736"/>
+            <w:vAlign w:val="center"/>
+            <w:shd w:fill="E7E6E6"/>
+            <w:tcMar>
+              <w:top w:w="80" w:type="dxa"/>
+              <w:bottom w:w="80" w:type="dxa"/>
+              <w:left w:w="80" w:type="dxa"/>
+              <w:right w:w="80" w:type="dxa"/>
+            </w:tcMar>
+          </w:tcPr>
+          <w:p>
+            <w:pPr>
+              <w:keepNext/>
+              <w:spacing w:line="360" w:lineRule="auto" w:before="60" w:after="60"/>
+              <w:ind w:firstLine="0" w:firstLineChars="0"/>
+              <w:jc w:val="center"/>
+            </w:pPr>
+            <w:r>
+              <w:rPr>
+                <w:rFonts w:ascii="Times New Roman" w:hAnsi="Times New Roman" w:eastAsia="SimSun"/>
+                <w:b/>
+                <w:color w:val="000000"/>
+                <w:sz w:val="30"/>
+              </w:rPr>
+              <w:t>答对数</w:t>
+            </w:r>
+          </w:p>
+        </w:tc>
+        <w:tc>
+          <w:tcPr>
+            <w:tcW w:type="dxa" w:w="2448"/>
+            <w:vAlign w:val="center"/>
+            <w:shd w:fill="E7E6E6"/>
+            <w:tcMar>
+              <w:top w:w="80" w:type="dxa"/>
+              <w:bottom w:w="80" w:type="dxa"/>
+              <w:left w:w="80" w:type="dxa"/>
+              <w:right w:w="80" w:type="dxa"/>
+            </w:tcMar>
+          </w:tcPr>
+          <w:p>
+            <w:pPr>
+              <w:keepNext/>
+              <w:spacing w:line="360" w:lineRule="auto" w:before="60" w:after="60"/>
+              <w:ind w:firstLine="0" w:firstLineChars="0"/>
+              <w:jc w:val="center"/>
+            </w:pPr>
+            <w:r>
+              <w:rPr>
+                <w:rFonts w:ascii="Times New Roman" w:hAnsi="Times New Roman" w:eastAsia="SimSun"/>
+                <w:b/>
+                <w:color w:val="000000"/>
+                <w:sz w:val="30"/>
+              </w:rPr>
+              <w:t>相对 Step120</w:t>
+            </w:r>
+          </w:p>
+        </w:tc>
+      </w:tr>
+      <w:tr>
+        <w:trPr>
+          <w:cantSplit/>
+        </w:trPr>
+        <w:tc>
+          <w:tcPr>
+            <w:tcW w:type="dxa" w:w="3744"/>
+            <w:vAlign w:val="center"/>
+            <w:shd w:fill="FFFFFF"/>
+            <w:tcMar>
+              <w:top w:w="80" w:type="dxa"/>
+              <w:bottom w:w="80" w:type="dxa"/>
+              <w:left w:w="80" w:type="dxa"/>
+              <w:right w:w="80" w:type="dxa"/>
+            </w:tcMar>
+          </w:tcPr>
+          <w:p>
+            <w:pPr>
+              <w:keepNext/>
+              <w:spacing w:line="360" w:lineRule="auto" w:before="60" w:after="60"/>
+              <w:ind w:firstLine="0" w:firstLineChars="0"/>
+              <w:jc w:val="left"/>
+            </w:pPr>
+            <w:r>
+              <w:rPr>
+                <w:rFonts w:ascii="Times New Roman" w:hAnsi="Times New Roman" w:eastAsia="SimSun"/>
+                <w:b w:val="0"/>
+                <w:color w:val="000000"/>
+                <w:sz w:val="30"/>
+              </w:rPr>
+              <w:t>原始 Step120</w:t>
+            </w:r>
+          </w:p>
+        </w:tc>
+        <w:tc>
+          <w:tcPr>
+            <w:tcW w:type="dxa" w:w="2736"/>
+            <w:vAlign w:val="center"/>
+            <w:shd w:fill="FFFFFF"/>
+            <w:tcMar>
+              <w:top w:w="80" w:type="dxa"/>
+              <w:bottom w:w="80" w:type="dxa"/>
+              <w:left w:w="80" w:type="dxa"/>
+              <w:right w:w="80" w:type="dxa"/>
+            </w:tcMar>
+          </w:tcPr>
+          <w:p>
+            <w:pPr>
+              <w:keepNext/>
+              <w:spacing w:line="360" w:lineRule="auto" w:before="60" w:after="60"/>
+              <w:ind w:firstLine="0" w:firstLineChars="0"/>
+              <w:jc w:val="center"/>
+            </w:pPr>
+            <w:r>
+              <w:rPr>
+                <w:rFonts w:ascii="Times New Roman" w:hAnsi="Times New Roman" w:eastAsia="SimSun"/>
+                <w:b w:val="0"/>
+                <w:color w:val="000000"/>
+                <w:sz w:val="30"/>
+              </w:rPr>
+              <w:t>1369/1672</w:t>
+            </w:r>
+          </w:p>
+        </w:tc>
+        <w:tc>
+          <w:tcPr>
+            <w:tcW w:type="dxa" w:w="2448"/>
+            <w:vAlign w:val="center"/>
+            <w:shd w:fill="FFFFFF"/>
+            <w:tcMar>
+              <w:top w:w="80" w:type="dxa"/>
+              <w:bottom w:w="80" w:type="dxa"/>
+              <w:left w:w="80" w:type="dxa"/>
+              <w:right w:w="80" w:type="dxa"/>
+            </w:tcMar>
+          </w:tcPr>
+          <w:p>
+            <w:pPr>
+              <w:keepNext/>
+              <w:spacing w:line="360" w:lineRule="auto" w:before="60" w:after="60"/>
+              <w:ind w:firstLine="0" w:firstLineChars="0"/>
+              <w:jc w:val="center"/>
+            </w:pPr>
+            <w:r>
+              <w:rPr>
+                <w:rFonts w:ascii="Times New Roman" w:hAnsi="Times New Roman" w:eastAsia="SimSun"/>
+                <w:b w:val="0"/>
+                <w:color w:val="000000"/>
+                <w:sz w:val="30"/>
+              </w:rPr>
+              <w:t>基准</w:t>
+            </w:r>
+          </w:p>
+        </w:tc>
+      </w:tr>
+      <w:tr>
+        <w:trPr>
+          <w:cantSplit/>
+        </w:trPr>
+        <w:tc>
+          <w:tcPr>
+            <w:tcW w:type="dxa" w:w="3744"/>
+            <w:vAlign w:val="center"/>
+            <w:shd w:fill="FFFFFF"/>
+            <w:tcMar>
+              <w:top w:w="80" w:type="dxa"/>
+              <w:bottom w:w="80" w:type="dxa"/>
+              <w:left w:w="80" w:type="dxa"/>
+              <w:right w:w="80" w:type="dxa"/>
+            </w:tcMar>
+          </w:tcPr>
+          <w:p>
+            <w:pPr>
+              <w:keepNext/>
+              <w:spacing w:line="360" w:lineRule="auto" w:before="60" w:after="60"/>
+              <w:ind w:firstLine="0" w:firstLineChars="0"/>
+              <w:jc w:val="left"/>
+            </w:pPr>
+            <w:r>
+              <w:rPr>
+                <w:rFonts w:ascii="Times New Roman" w:hAnsi="Times New Roman" w:eastAsia="SimSun"/>
+                <w:b w:val="0"/>
+                <w:color w:val="000000"/>
+                <w:sz w:val="30"/>
+              </w:rPr>
+              <w:t>书籍 CPT 一遍</w:t>
+            </w:r>
+          </w:p>
+        </w:tc>
+        <w:tc>
+          <w:tcPr>
+            <w:tcW w:type="dxa" w:w="2736"/>
+            <w:vAlign w:val="center"/>
+            <w:shd w:fill="FFFFFF"/>
+            <w:tcMar>
+              <w:top w:w="80" w:type="dxa"/>
+              <w:bottom w:w="80" w:type="dxa"/>
+              <w:left w:w="80" w:type="dxa"/>
+              <w:right w:w="80" w:type="dxa"/>
+            </w:tcMar>
+          </w:tcPr>
+          <w:p>
+            <w:pPr>
+              <w:keepNext/>
+              <w:spacing w:line="360" w:lineRule="auto" w:before="60" w:after="60"/>
+              <w:ind w:firstLine="0" w:firstLineChars="0"/>
+              <w:jc w:val="center"/>
+            </w:pPr>
+            <w:r>
+              <w:rPr>
+                <w:rFonts w:ascii="Times New Roman" w:hAnsi="Times New Roman" w:eastAsia="SimSun"/>
+                <w:b w:val="0"/>
+                <w:color w:val="000000"/>
+                <w:sz w:val="30"/>
+              </w:rPr>
+              <w:t>1370/1672</w:t>
+            </w:r>
+          </w:p>
+        </w:tc>
+        <w:tc>
+          <w:tcPr>
+            <w:tcW w:type="dxa" w:w="2448"/>
+            <w:vAlign w:val="center"/>
+            <w:shd w:fill="FFFFFF"/>
+            <w:tcMar>
+              <w:top w:w="80" w:type="dxa"/>
+              <w:bottom w:w="80" w:type="dxa"/>
+              <w:left w:w="80" w:type="dxa"/>
+              <w:right w:w="80" w:type="dxa"/>
+            </w:tcMar>
+          </w:tcPr>
+          <w:p>
+            <w:pPr>
+              <w:keepNext/>
+              <w:spacing w:line="360" w:lineRule="auto" w:before="60" w:after="60"/>
+              <w:ind w:firstLine="0" w:firstLineChars="0"/>
+              <w:jc w:val="center"/>
+            </w:pPr>
+            <w:r>
+              <w:rPr>
+                <w:rFonts w:ascii="Times New Roman" w:hAnsi="Times New Roman" w:eastAsia="SimSun"/>
+                <w:b w:val="0"/>
+                <w:color w:val="000000"/>
+                <w:sz w:val="30"/>
+              </w:rPr>
+              <w:t>+1题</w:t>
+            </w:r>
+          </w:p>
+        </w:tc>
+      </w:tr>
+      <w:tr>
+        <w:trPr>
+          <w:cantSplit/>
+        </w:trPr>
+        <w:tc>
+          <w:tcPr>
+            <w:tcW w:type="dxa" w:w="3744"/>
+            <w:vAlign w:val="center"/>
+            <w:shd w:fill="FFFFFF"/>
+            <w:tcMar>
+              <w:top w:w="80" w:type="dxa"/>
+              <w:bottom w:w="80" w:type="dxa"/>
+              <w:left w:w="80" w:type="dxa"/>
+              <w:right w:w="80" w:type="dxa"/>
+            </w:tcMar>
+          </w:tcPr>
+          <w:p>
+            <w:pPr>
+              <w:keepNext/>
+              <w:spacing w:line="360" w:lineRule="auto" w:before="60" w:after="60"/>
+              <w:ind w:firstLine="0" w:firstLineChars="0"/>
+              <w:jc w:val="left"/>
+            </w:pPr>
+            <w:r>
+              <w:rPr>
+                <w:rFonts w:ascii="Times New Roman" w:hAnsi="Times New Roman" w:eastAsia="SimSun"/>
+                <w:b w:val="0"/>
+                <w:color w:val="000000"/>
+                <w:sz w:val="30"/>
+              </w:rPr>
+              <w:t>书籍 CPT 两遍</w:t>
+            </w:r>
+          </w:p>
+        </w:tc>
+        <w:tc>
+          <w:tcPr>
+            <w:tcW w:type="dxa" w:w="2736"/>
+            <w:vAlign w:val="center"/>
+            <w:shd w:fill="FFFFFF"/>
+            <w:tcMar>
+              <w:top w:w="80" w:type="dxa"/>
+              <w:bottom w:w="80" w:type="dxa"/>
+              <w:left w:w="80" w:type="dxa"/>
+              <w:right w:w="80" w:type="dxa"/>
+            </w:tcMar>
+          </w:tcPr>
+          <w:p>
+            <w:pPr>
+              <w:keepNext/>
+              <w:spacing w:line="360" w:lineRule="auto" w:before="60" w:after="60"/>
+              <w:ind w:firstLine="0" w:firstLineChars="0"/>
+              <w:jc w:val="center"/>
+            </w:pPr>
+            <w:r>
+              <w:rPr>
+                <w:rFonts w:ascii="Times New Roman" w:hAnsi="Times New Roman" w:eastAsia="SimSun"/>
+                <w:b w:val="0"/>
+                <w:color w:val="000000"/>
+                <w:sz w:val="30"/>
+              </w:rPr>
+              <w:t>1366/1672</w:t>
+            </w:r>
+          </w:p>
+        </w:tc>
+        <w:tc>
+          <w:tcPr>
+            <w:tcW w:type="dxa" w:w="2448"/>
+            <w:vAlign w:val="center"/>
+            <w:shd w:fill="FFFFFF"/>
+            <w:tcMar>
+              <w:top w:w="80" w:type="dxa"/>
+              <w:bottom w:w="80" w:type="dxa"/>
+              <w:left w:w="80" w:type="dxa"/>
+              <w:right w:w="80" w:type="dxa"/>
+            </w:tcMar>
+          </w:tcPr>
+          <w:p>
+            <w:pPr>
+              <w:keepNext/>
+              <w:spacing w:line="360" w:lineRule="auto" w:before="60" w:after="60"/>
+              <w:ind w:firstLine="0" w:firstLineChars="0"/>
+              <w:jc w:val="center"/>
+            </w:pPr>
+            <w:r>
+              <w:rPr>
+                <w:rFonts w:ascii="Times New Roman" w:hAnsi="Times New Roman" w:eastAsia="SimSun"/>
+                <w:b w:val="0"/>
+                <w:color w:val="000000"/>
+                <w:sz w:val="30"/>
+              </w:rPr>
+              <w:t>−3题</w:t>
+            </w:r>
+          </w:p>
+        </w:tc>
+      </w:tr>
+      <w:tr>
+        <w:trPr>
+          <w:cantSplit/>
+        </w:trPr>
+        <w:tc>
+          <w:tcPr>
+            <w:tcW w:type="dxa" w:w="3744"/>
+            <w:vAlign w:val="center"/>
+            <w:shd w:fill="FFFFFF"/>
+            <w:tcMar>
+              <w:top w:w="80" w:type="dxa"/>
+              <w:bottom w:w="80" w:type="dxa"/>
+              <w:left w:w="80" w:type="dxa"/>
+              <w:right w:w="80" w:type="dxa"/>
+            </w:tcMar>
+          </w:tcPr>
+          <w:p>
+            <w:pPr>
+              <w:keepNext w:val="0"/>
+              <w:spacing w:line="360" w:lineRule="auto" w:before="60" w:after="60"/>
+              <w:ind w:firstLine="0" w:firstLineChars="0"/>
+              <w:jc w:val="left"/>
+            </w:pPr>
+            <w:r>
+              <w:rPr>
+                <w:rFonts w:ascii="Times New Roman" w:hAnsi="Times New Roman" w:eastAsia="SimSun"/>
+                <w:b w:val="0"/>
+                <w:color w:val="000000"/>
+                <w:sz w:val="30"/>
+              </w:rPr>
+              <w:t>书籍 CPT 四遍</w:t>
+            </w:r>
+          </w:p>
+        </w:tc>
+        <w:tc>
+          <w:tcPr>
+            <w:tcW w:type="dxa" w:w="2736"/>
+            <w:vAlign w:val="center"/>
+            <w:shd w:fill="FFFFFF"/>
+            <w:tcMar>
+              <w:top w:w="80" w:type="dxa"/>
+              <w:bottom w:w="80" w:type="dxa"/>
+              <w:left w:w="80" w:type="dxa"/>
+              <w:right w:w="80" w:type="dxa"/>
+            </w:tcMar>
+          </w:tcPr>
+          <w:p>
+            <w:pPr>
+              <w:keepNext w:val="0"/>
+              <w:spacing w:line="360" w:lineRule="auto" w:before="60" w:after="60"/>
+              <w:ind w:firstLine="0" w:firstLineChars="0"/>
+              <w:jc w:val="center"/>
+            </w:pPr>
+            <w:r>
+              <w:rPr>
+                <w:rFonts w:ascii="Times New Roman" w:hAnsi="Times New Roman" w:eastAsia="SimSun"/>
+                <w:b w:val="0"/>
+                <w:color w:val="000000"/>
+                <w:sz w:val="30"/>
+              </w:rPr>
+              <w:t>1371/1672</w:t>
+            </w:r>
+          </w:p>
+        </w:tc>
+        <w:tc>
+          <w:tcPr>
+            <w:tcW w:type="dxa" w:w="2448"/>
+            <w:vAlign w:val="center"/>
+            <w:shd w:fill="FFFFFF"/>
+            <w:tcMar>
+              <w:top w:w="80" w:type="dxa"/>
+              <w:bottom w:w="80" w:type="dxa"/>
+              <w:left w:w="80" w:type="dxa"/>
+              <w:right w:w="80" w:type="dxa"/>
+            </w:tcMar>
+          </w:tcPr>
+          <w:p>
+            <w:pPr>
+              <w:keepNext w:val="0"/>
+              <w:spacing w:line="360" w:lineRule="auto" w:before="60" w:after="60"/>
+              <w:ind w:firstLine="0" w:firstLineChars="0"/>
+              <w:jc w:val="center"/>
+            </w:pPr>
+            <w:r>
+              <w:rPr>
+                <w:rFonts w:ascii="Times New Roman" w:hAnsi="Times New Roman" w:eastAsia="SimSun"/>
+                <w:b w:val="0"/>
+                <w:color w:val="000000"/>
+                <w:sz w:val="30"/>
+              </w:rPr>
+              <w:t>+2题</w:t>
+            </w:r>
+          </w:p>
+        </w:tc>
+      </w:tr>
+    </w:tbl>
     <w:p>
       <w:pPr>
         <w:widowControl/>
@@ -2575,7 +6205,7 @@
           <w:sz w:val="30"/>
           <w:color w:val="000000"/>
         </w:rPr>
-        <w:t>SFT 沿用该模型权重，重新初始化优化器和训练日程。后续同步检验原有 Agent 与通用能力的保持情况。[8]</w:t>
+        <w:t>SFT 沿用该模型权重，重新初始化优化器与训练日程；评估范围包括物流问答、原有 Agent 与通用能力。</w:t>
       </w:r>
     </w:p>
     <w:p>
@@ -2781,7 +6411,7 @@
           </w:tcPr>
           <w:p>
             <w:pPr>
-              <w:keepNext w:val="0"/>
+              <w:keepNext/>
               <w:spacing w:after="0" w:line="360" w:lineRule="auto"/>
               <w:ind w:firstLine="0" w:firstLineChars="0"/>
               <w:jc w:val="left"/>
@@ -2817,7 +6447,7 @@
           </w:tcPr>
           <w:p>
             <w:pPr>
-              <w:keepNext w:val="0"/>
+              <w:keepNext/>
               <w:spacing w:after="0" w:line="360" w:lineRule="auto"/>
               <w:ind w:firstLine="0" w:firstLineChars="0"/>
               <w:jc w:val="center"/>
@@ -2853,7 +6483,7 @@
           </w:tcPr>
           <w:p>
             <w:pPr>
-              <w:keepNext w:val="0"/>
+              <w:keepNext/>
               <w:spacing w:after="0" w:line="360" w:lineRule="auto"/>
               <w:ind w:firstLine="0" w:firstLineChars="0"/>
               <w:jc w:val="center"/>
@@ -2894,7 +6524,7 @@
           </w:tcPr>
           <w:p>
             <w:pPr>
-              <w:keepNext w:val="0"/>
+              <w:keepNext/>
               <w:spacing w:after="0" w:line="360" w:lineRule="auto"/>
               <w:ind w:firstLine="0" w:firstLineChars="0"/>
               <w:jc w:val="left"/>
@@ -2930,7 +6560,7 @@
           </w:tcPr>
           <w:p>
             <w:pPr>
-              <w:keepNext w:val="0"/>
+              <w:keepNext/>
               <w:spacing w:after="0" w:line="360" w:lineRule="auto"/>
               <w:ind w:firstLine="0" w:firstLineChars="0"/>
               <w:jc w:val="center"/>
@@ -2966,7 +6596,7 @@
           </w:tcPr>
           <w:p>
             <w:pPr>
-              <w:keepNext w:val="0"/>
+              <w:keepNext/>
               <w:spacing w:after="0" w:line="360" w:lineRule="auto"/>
               <w:ind w:firstLine="0" w:firstLineChars="0"/>
               <w:jc w:val="center"/>
@@ -3055,7 +6685,7 @@
                 <w:color w:val="000000"/>
                 <w:sz w:val="30"/>
               </w:rPr>
-              <w:t>从B继续开展QA训练</w:t>
+              <w:t>从 B 完成 QA 训练</w:t>
             </w:r>
           </w:p>
         </w:tc>
@@ -3181,7 +6811,541 @@
           <w:sz w:val="32"/>
           <w:color w:val="000000"/>
         </w:rPr>
-        <w:t>结果预留</w:t>
+        <w:t>评测准确率</w:t>
+      </w:r>
+    </w:p>
+    <w:tbl>
+      <w:tblPr>
+        <w:tblW w:type="auto" w:w="0"/>
+        <w:tblLayout w:type="fixed"/>
+        <w:tblLook w:firstColumn="1" w:firstRow="1" w:lastColumn="0" w:lastRow="0" w:noHBand="0" w:noVBand="1" w:val="04A0"/>
+        <w:tblBorders>
+          <w:top w:val="single" w:sz="4" w:color="D9D9D9"/>
+          <w:left w:val="single" w:sz="4" w:color="D9D9D9"/>
+          <w:bottom w:val="single" w:sz="4" w:color="D9D9D9"/>
+          <w:right w:val="single" w:sz="4" w:color="D9D9D9"/>
+          <w:insideH w:val="single" w:sz="4" w:color="D9D9D9"/>
+          <w:insideV w:val="single" w:sz="4" w:color="D9D9D9"/>
+        </w:tblBorders>
+      </w:tblPr>
+      <w:tblGrid>
+        <w:gridCol w:w="3168"/>
+        <w:gridCol w:w="2016"/>
+        <w:gridCol w:w="1872"/>
+        <w:gridCol w:w="1872"/>
+      </w:tblGrid>
+      <w:tr>
+        <w:trPr>
+          <w:cantSplit/>
+          <w:tblHeader/>
+        </w:trPr>
+        <w:tc>
+          <w:tcPr>
+            <w:tcW w:type="dxa" w:w="3168"/>
+            <w:vAlign w:val="center"/>
+            <w:shd w:fill="E7E6E6"/>
+            <w:tcMar>
+              <w:top w:w="80" w:type="dxa"/>
+              <w:bottom w:w="80" w:type="dxa"/>
+              <w:left w:w="80" w:type="dxa"/>
+              <w:right w:w="80" w:type="dxa"/>
+            </w:tcMar>
+          </w:tcPr>
+          <w:p>
+            <w:pPr>
+              <w:keepNext/>
+              <w:spacing w:line="360" w:lineRule="auto" w:before="60" w:after="60"/>
+              <w:ind w:firstLine="0" w:firstLineChars="0"/>
+              <w:jc w:val="left"/>
+            </w:pPr>
+            <w:r>
+              <w:rPr>
+                <w:rFonts w:ascii="Times New Roman" w:hAnsi="Times New Roman" w:eastAsia="SimSun"/>
+                <w:b/>
+                <w:color w:val="000000"/>
+                <w:sz w:val="30"/>
+              </w:rPr>
+              <w:t>评测集</w:t>
+            </w:r>
+          </w:p>
+        </w:tc>
+        <w:tc>
+          <w:tcPr>
+            <w:tcW w:type="dxa" w:w="2016"/>
+            <w:vAlign w:val="center"/>
+            <w:shd w:fill="E7E6E6"/>
+            <w:tcMar>
+              <w:top w:w="80" w:type="dxa"/>
+              <w:bottom w:w="80" w:type="dxa"/>
+              <w:left w:w="80" w:type="dxa"/>
+              <w:right w:w="80" w:type="dxa"/>
+            </w:tcMar>
+          </w:tcPr>
+          <w:p>
+            <w:pPr>
+              <w:keepNext/>
+              <w:spacing w:line="360" w:lineRule="auto" w:before="60" w:after="60"/>
+              <w:ind w:firstLine="0" w:firstLineChars="0"/>
+              <w:jc w:val="center"/>
+            </w:pPr>
+            <w:r>
+              <w:rPr>
+                <w:rFonts w:ascii="Times New Roman" w:hAnsi="Times New Roman" w:eastAsia="SimSun"/>
+                <w:b/>
+                <w:color w:val="000000"/>
+                <w:sz w:val="30"/>
+              </w:rPr>
+              <w:t>A 原始 Step120</w:t>
+            </w:r>
+          </w:p>
+        </w:tc>
+        <w:tc>
+          <w:tcPr>
+            <w:tcW w:type="dxa" w:w="1872"/>
+            <w:vAlign w:val="center"/>
+            <w:shd w:fill="E7E6E6"/>
+            <w:tcMar>
+              <w:top w:w="80" w:type="dxa"/>
+              <w:bottom w:w="80" w:type="dxa"/>
+              <w:left w:w="80" w:type="dxa"/>
+              <w:right w:w="80" w:type="dxa"/>
+            </w:tcMar>
+          </w:tcPr>
+          <w:p>
+            <w:pPr>
+              <w:keepNext/>
+              <w:spacing w:line="360" w:lineRule="auto" w:before="60" w:after="60"/>
+              <w:ind w:firstLine="0" w:firstLineChars="0"/>
+              <w:jc w:val="center"/>
+            </w:pPr>
+            <w:r>
+              <w:rPr>
+                <w:rFonts w:ascii="Times New Roman" w:hAnsi="Times New Roman" w:eastAsia="SimSun"/>
+                <w:b/>
+                <w:color w:val="000000"/>
+                <w:sz w:val="30"/>
+              </w:rPr>
+              <w:t>B 书籍 CPT</w:t>
+            </w:r>
+          </w:p>
+        </w:tc>
+        <w:tc>
+          <w:tcPr>
+            <w:tcW w:type="dxa" w:w="1872"/>
+            <w:vAlign w:val="center"/>
+            <w:shd w:fill="E7E6E6"/>
+            <w:tcMar>
+              <w:top w:w="80" w:type="dxa"/>
+              <w:bottom w:w="80" w:type="dxa"/>
+              <w:left w:w="80" w:type="dxa"/>
+              <w:right w:w="80" w:type="dxa"/>
+            </w:tcMar>
+          </w:tcPr>
+          <w:p>
+            <w:pPr>
+              <w:keepNext/>
+              <w:spacing w:line="360" w:lineRule="auto" w:before="60" w:after="60"/>
+              <w:ind w:firstLine="0" w:firstLineChars="0"/>
+              <w:jc w:val="center"/>
+            </w:pPr>
+            <w:r>
+              <w:rPr>
+                <w:rFonts w:ascii="Times New Roman" w:hAnsi="Times New Roman" w:eastAsia="SimSun"/>
+                <w:b/>
+                <w:color w:val="000000"/>
+                <w:sz w:val="30"/>
+              </w:rPr>
+              <w:t>C 书籍 SFT</w:t>
+            </w:r>
+          </w:p>
+        </w:tc>
+      </w:tr>
+      <w:tr>
+        <w:trPr>
+          <w:cantSplit/>
+        </w:trPr>
+        <w:tc>
+          <w:tcPr>
+            <w:tcW w:type="dxa" w:w="3168"/>
+            <w:vAlign w:val="center"/>
+            <w:shd w:fill="FFFFFF"/>
+            <w:tcMar>
+              <w:top w:w="80" w:type="dxa"/>
+              <w:bottom w:w="80" w:type="dxa"/>
+              <w:left w:w="80" w:type="dxa"/>
+              <w:right w:w="80" w:type="dxa"/>
+            </w:tcMar>
+          </w:tcPr>
+          <w:p>
+            <w:pPr>
+              <w:keepNext/>
+              <w:spacing w:line="360" w:lineRule="auto" w:before="60" w:after="60"/>
+              <w:ind w:firstLine="0" w:firstLineChars="0"/>
+              <w:jc w:val="left"/>
+            </w:pPr>
+            <w:r>
+              <w:rPr>
+                <w:rFonts w:ascii="Times New Roman" w:hAnsi="Times New Roman" w:eastAsia="SimSun"/>
+                <w:b w:val="0"/>
+                <w:color w:val="000000"/>
+                <w:sz w:val="30"/>
+              </w:rPr>
+              <w:t>LogistikaBench</w:t>
+            </w:r>
+          </w:p>
+        </w:tc>
+        <w:tc>
+          <w:tcPr>
+            <w:tcW w:type="dxa" w:w="2016"/>
+            <w:vAlign w:val="center"/>
+            <w:shd w:fill="FFFFFF"/>
+            <w:tcMar>
+              <w:top w:w="80" w:type="dxa"/>
+              <w:bottom w:w="80" w:type="dxa"/>
+              <w:left w:w="80" w:type="dxa"/>
+              <w:right w:w="80" w:type="dxa"/>
+            </w:tcMar>
+          </w:tcPr>
+          <w:p>
+            <w:pPr>
+              <w:keepNext/>
+              <w:spacing w:line="360" w:lineRule="auto" w:before="60" w:after="60"/>
+              <w:ind w:firstLine="0" w:firstLineChars="0"/>
+              <w:jc w:val="center"/>
+            </w:pPr>
+            <w:r>
+              <w:rPr>
+                <w:rFonts w:ascii="Times New Roman" w:hAnsi="Times New Roman" w:eastAsia="SimSun"/>
+                <w:b w:val="0"/>
+                <w:color w:val="000000"/>
+                <w:sz w:val="30"/>
+              </w:rPr>
+              <w:t>81.60%</w:t>
+            </w:r>
+          </w:p>
+        </w:tc>
+        <w:tc>
+          <w:tcPr>
+            <w:tcW w:type="dxa" w:w="1872"/>
+            <w:vAlign w:val="center"/>
+            <w:shd w:fill="FFFFFF"/>
+            <w:tcMar>
+              <w:top w:w="80" w:type="dxa"/>
+              <w:bottom w:w="80" w:type="dxa"/>
+              <w:left w:w="80" w:type="dxa"/>
+              <w:right w:w="80" w:type="dxa"/>
+            </w:tcMar>
+          </w:tcPr>
+          <w:p>
+            <w:pPr>
+              <w:keepNext/>
+              <w:spacing w:line="360" w:lineRule="auto" w:before="60" w:after="60"/>
+              <w:ind w:firstLine="0" w:firstLineChars="0"/>
+              <w:jc w:val="center"/>
+            </w:pPr>
+            <w:r>
+              <w:rPr>
+                <w:rFonts w:ascii="Times New Roman" w:hAnsi="Times New Roman" w:eastAsia="SimSun"/>
+                <w:b w:val="0"/>
+                <w:color w:val="000000"/>
+                <w:sz w:val="30"/>
+              </w:rPr>
+            </w:r>
+          </w:p>
+        </w:tc>
+        <w:tc>
+          <w:tcPr>
+            <w:tcW w:type="dxa" w:w="1872"/>
+            <w:vAlign w:val="center"/>
+            <w:shd w:fill="FFFFFF"/>
+            <w:tcMar>
+              <w:top w:w="80" w:type="dxa"/>
+              <w:bottom w:w="80" w:type="dxa"/>
+              <w:left w:w="80" w:type="dxa"/>
+              <w:right w:w="80" w:type="dxa"/>
+            </w:tcMar>
+          </w:tcPr>
+          <w:p>
+            <w:pPr>
+              <w:keepNext/>
+              <w:spacing w:line="360" w:lineRule="auto" w:before="60" w:after="60"/>
+              <w:ind w:firstLine="0" w:firstLineChars="0"/>
+              <w:jc w:val="center"/>
+            </w:pPr>
+            <w:r>
+              <w:rPr>
+                <w:rFonts w:ascii="Times New Roman" w:hAnsi="Times New Roman" w:eastAsia="SimSun"/>
+                <w:b w:val="0"/>
+                <w:color w:val="000000"/>
+                <w:sz w:val="30"/>
+              </w:rPr>
+            </w:r>
+          </w:p>
+        </w:tc>
+      </w:tr>
+      <w:tr>
+        <w:trPr>
+          <w:cantSplit/>
+        </w:trPr>
+        <w:tc>
+          <w:tcPr>
+            <w:tcW w:type="dxa" w:w="3168"/>
+            <w:vAlign w:val="center"/>
+            <w:shd w:fill="FFFFFF"/>
+            <w:tcMar>
+              <w:top w:w="80" w:type="dxa"/>
+              <w:bottom w:w="80" w:type="dxa"/>
+              <w:left w:w="80" w:type="dxa"/>
+              <w:right w:w="80" w:type="dxa"/>
+            </w:tcMar>
+          </w:tcPr>
+          <w:p>
+            <w:pPr>
+              <w:keepNext/>
+              <w:spacing w:line="360" w:lineRule="auto" w:before="60" w:after="60"/>
+              <w:ind w:firstLine="0" w:firstLineChars="0"/>
+              <w:jc w:val="left"/>
+            </w:pPr>
+            <w:r>
+              <w:rPr>
+                <w:rFonts w:ascii="Times New Roman" w:hAnsi="Times New Roman" w:eastAsia="SimSun"/>
+                <w:b w:val="0"/>
+                <w:color w:val="000000"/>
+                <w:sz w:val="30"/>
+              </w:rPr>
+              <w:t>SC-bench 知识题</w:t>
+            </w:r>
+          </w:p>
+        </w:tc>
+        <w:tc>
+          <w:tcPr>
+            <w:tcW w:type="dxa" w:w="2016"/>
+            <w:vAlign w:val="center"/>
+            <w:shd w:fill="FFFFFF"/>
+            <w:tcMar>
+              <w:top w:w="80" w:type="dxa"/>
+              <w:bottom w:w="80" w:type="dxa"/>
+              <w:left w:w="80" w:type="dxa"/>
+              <w:right w:w="80" w:type="dxa"/>
+            </w:tcMar>
+          </w:tcPr>
+          <w:p>
+            <w:pPr>
+              <w:keepNext/>
+              <w:spacing w:line="360" w:lineRule="auto" w:before="60" w:after="60"/>
+              <w:ind w:firstLine="0" w:firstLineChars="0"/>
+              <w:jc w:val="center"/>
+            </w:pPr>
+            <w:r>
+              <w:rPr>
+                <w:rFonts w:ascii="Times New Roman" w:hAnsi="Times New Roman" w:eastAsia="SimSun"/>
+                <w:b w:val="0"/>
+                <w:color w:val="000000"/>
+                <w:sz w:val="30"/>
+              </w:rPr>
+              <w:t>83.63%</w:t>
+            </w:r>
+          </w:p>
+        </w:tc>
+        <w:tc>
+          <w:tcPr>
+            <w:tcW w:type="dxa" w:w="1872"/>
+            <w:vAlign w:val="center"/>
+            <w:shd w:fill="FFFFFF"/>
+            <w:tcMar>
+              <w:top w:w="80" w:type="dxa"/>
+              <w:bottom w:w="80" w:type="dxa"/>
+              <w:left w:w="80" w:type="dxa"/>
+              <w:right w:w="80" w:type="dxa"/>
+            </w:tcMar>
+          </w:tcPr>
+          <w:p>
+            <w:pPr>
+              <w:keepNext/>
+              <w:spacing w:line="360" w:lineRule="auto" w:before="60" w:after="60"/>
+              <w:ind w:firstLine="0" w:firstLineChars="0"/>
+              <w:jc w:val="center"/>
+            </w:pPr>
+            <w:r>
+              <w:rPr>
+                <w:rFonts w:ascii="Times New Roman" w:hAnsi="Times New Roman" w:eastAsia="SimSun"/>
+                <w:b w:val="0"/>
+                <w:color w:val="000000"/>
+                <w:sz w:val="30"/>
+              </w:rPr>
+            </w:r>
+          </w:p>
+        </w:tc>
+        <w:tc>
+          <w:tcPr>
+            <w:tcW w:type="dxa" w:w="1872"/>
+            <w:vAlign w:val="center"/>
+            <w:shd w:fill="FFFFFF"/>
+            <w:tcMar>
+              <w:top w:w="80" w:type="dxa"/>
+              <w:bottom w:w="80" w:type="dxa"/>
+              <w:left w:w="80" w:type="dxa"/>
+              <w:right w:w="80" w:type="dxa"/>
+            </w:tcMar>
+          </w:tcPr>
+          <w:p>
+            <w:pPr>
+              <w:keepNext/>
+              <w:spacing w:line="360" w:lineRule="auto" w:before="60" w:after="60"/>
+              <w:ind w:firstLine="0" w:firstLineChars="0"/>
+              <w:jc w:val="center"/>
+            </w:pPr>
+            <w:r>
+              <w:rPr>
+                <w:rFonts w:ascii="Times New Roman" w:hAnsi="Times New Roman" w:eastAsia="SimSun"/>
+                <w:b w:val="0"/>
+                <w:color w:val="000000"/>
+                <w:sz w:val="30"/>
+              </w:rPr>
+            </w:r>
+          </w:p>
+        </w:tc>
+      </w:tr>
+      <w:tr>
+        <w:trPr>
+          <w:cantSplit/>
+        </w:trPr>
+        <w:tc>
+          <w:tcPr>
+            <w:tcW w:type="dxa" w:w="3168"/>
+            <w:vAlign w:val="center"/>
+            <w:shd w:fill="FFFFFF"/>
+            <w:tcMar>
+              <w:top w:w="80" w:type="dxa"/>
+              <w:bottom w:w="80" w:type="dxa"/>
+              <w:left w:w="80" w:type="dxa"/>
+              <w:right w:w="80" w:type="dxa"/>
+            </w:tcMar>
+          </w:tcPr>
+          <w:p>
+            <w:pPr>
+              <w:keepNext w:val="0"/>
+              <w:spacing w:line="360" w:lineRule="auto" w:before="60" w:after="60"/>
+              <w:ind w:firstLine="0" w:firstLineChars="0"/>
+              <w:jc w:val="left"/>
+            </w:pPr>
+            <w:r>
+              <w:rPr>
+                <w:rFonts w:ascii="Times New Roman" w:hAnsi="Times New Roman" w:eastAsia="SimSun"/>
+                <w:b w:val="0"/>
+                <w:color w:val="000000"/>
+                <w:sz w:val="30"/>
+              </w:rPr>
+              <w:t>合计</w:t>
+            </w:r>
+          </w:p>
+        </w:tc>
+        <w:tc>
+          <w:tcPr>
+            <w:tcW w:type="dxa" w:w="2016"/>
+            <w:vAlign w:val="center"/>
+            <w:shd w:fill="FFFFFF"/>
+            <w:tcMar>
+              <w:top w:w="80" w:type="dxa"/>
+              <w:bottom w:w="80" w:type="dxa"/>
+              <w:left w:w="80" w:type="dxa"/>
+              <w:right w:w="80" w:type="dxa"/>
+            </w:tcMar>
+          </w:tcPr>
+          <w:p>
+            <w:pPr>
+              <w:keepNext w:val="0"/>
+              <w:spacing w:line="360" w:lineRule="auto" w:before="60" w:after="60"/>
+              <w:ind w:firstLine="0" w:firstLineChars="0"/>
+              <w:jc w:val="center"/>
+            </w:pPr>
+            <w:r>
+              <w:rPr>
+                <w:rFonts w:ascii="Times New Roman" w:hAnsi="Times New Roman" w:eastAsia="SimSun"/>
+                <w:b w:val="0"/>
+                <w:color w:val="000000"/>
+                <w:sz w:val="30"/>
+              </w:rPr>
+              <w:t>81.878%</w:t>
+            </w:r>
+          </w:p>
+        </w:tc>
+        <w:tc>
+          <w:tcPr>
+            <w:tcW w:type="dxa" w:w="1872"/>
+            <w:vAlign w:val="center"/>
+            <w:shd w:fill="FFFFFF"/>
+            <w:tcMar>
+              <w:top w:w="80" w:type="dxa"/>
+              <w:bottom w:w="80" w:type="dxa"/>
+              <w:left w:w="80" w:type="dxa"/>
+              <w:right w:w="80" w:type="dxa"/>
+            </w:tcMar>
+          </w:tcPr>
+          <w:p>
+            <w:pPr>
+              <w:keepNext w:val="0"/>
+              <w:spacing w:line="360" w:lineRule="auto" w:before="60" w:after="60"/>
+              <w:ind w:firstLine="0" w:firstLineChars="0"/>
+              <w:jc w:val="center"/>
+            </w:pPr>
+            <w:r>
+              <w:rPr>
+                <w:rFonts w:ascii="Times New Roman" w:hAnsi="Times New Roman" w:eastAsia="SimSun"/>
+                <w:b w:val="0"/>
+                <w:color w:val="000000"/>
+                <w:sz w:val="30"/>
+              </w:rPr>
+              <w:t>81.998%</w:t>
+            </w:r>
+          </w:p>
+        </w:tc>
+        <w:tc>
+          <w:tcPr>
+            <w:tcW w:type="dxa" w:w="1872"/>
+            <w:vAlign w:val="center"/>
+            <w:shd w:fill="FFFFFF"/>
+            <w:tcMar>
+              <w:top w:w="80" w:type="dxa"/>
+              <w:bottom w:w="80" w:type="dxa"/>
+              <w:left w:w="80" w:type="dxa"/>
+              <w:right w:w="80" w:type="dxa"/>
+            </w:tcMar>
+          </w:tcPr>
+          <w:p>
+            <w:pPr>
+              <w:keepNext w:val="0"/>
+              <w:spacing w:line="360" w:lineRule="auto" w:before="60" w:after="60"/>
+              <w:ind w:firstLine="0" w:firstLineChars="0"/>
+              <w:jc w:val="center"/>
+            </w:pPr>
+            <w:r>
+              <w:rPr>
+                <w:rFonts w:ascii="Times New Roman" w:hAnsi="Times New Roman" w:eastAsia="SimSun"/>
+                <w:b w:val="0"/>
+                <w:color w:val="000000"/>
+                <w:sz w:val="30"/>
+              </w:rPr>
+            </w:r>
+          </w:p>
+        </w:tc>
+      </w:tr>
+    </w:tbl>
+    <w:p>
+      <w:pPr>
+        <w:pStyle w:val="Heading2"/>
+        <w:keepNext w:val="0"/>
+        <w:spacing w:after="960"/>
+        <w:ind w:firstLine="0"/>
+      </w:pPr>
+      <w:r>
+        <w:rPr>
+          <w:rFonts w:ascii="Times New Roman" w:hAnsi="Times New Roman" w:eastAsia="SimHei"/>
+          <w:b/>
+          <w:color w:val="000000"/>
+          <w:sz w:val="32"/>
+        </w:rPr>
+        <w:t>实验结论</w:t>
       </w:r>
     </w:p>
     <w:p>
@@ -3198,7 +7362,6 @@
           <w:sz w:val="30"/>
           <w:color w:val="000000"/>
         </w:rPr>
-        <w:t>书籍问答 SFT 结果待填。训练配置、评测成绩与结论在实验完成后补充。</w:t>
       </w:r>
     </w:p>
     <w:p>

</xml_diff>